<commit_message>
Refresh item/set data and wiki; exclude standard equipment (amulette/anneau/coiffe/cape/bottes/ceinture/arme/bouclier) that has no recipe, no monster drop, and no panoplie membership - 225 unreachable items removed
</commit_message>
<xml_diff>
--- a/docs/wiki-askawawa.docx
+++ b/docs/wiki-askawawa.docx
@@ -2533,27 +2533,13 @@
         </w:numPr>
       </w:pPr>
       <w:r>
-        <w:t xml:space="preserve">Panoplie Mousse avec taux de 27% sur les </w:t>
-      </w:r>
-      <w:proofErr w:type="spellStart"/>
-      <w:r>
-        <w:t>pichons</w:t>
-      </w:r>
-      <w:proofErr w:type="spellEnd"/>
-    </w:p>
-    <w:p>
-      <w:pPr>
-        <w:pStyle w:val="Paragraphedeliste"/>
-        <w:ind w:left="1416"/>
-      </w:pPr>
-      <w:r>
-        <w:t xml:space="preserve">Sauf le bouclier Mousse </w:t>
-      </w:r>
-      <w:r>
-        <w:t xml:space="preserve">avec taux de </w:t>
-      </w:r>
-      <w:r>
-        <w:t>75% sur Mob l’Eponge</w:t>
+        <w:t xml:space="preserve">Panoplie Paysan </w:t>
+      </w:r>
+      <w:r>
+        <w:t xml:space="preserve">avec taux de 27% sur les monstres de la famille des </w:t>
+      </w:r>
+      <w:r>
+        <w:t>plantes des champs</w:t>
       </w:r>
     </w:p>
     <w:p>
@@ -2565,21 +2551,28 @@
         </w:numPr>
       </w:pPr>
       <w:r>
-        <w:t xml:space="preserve">Panoplie Champ </w:t>
+        <w:t xml:space="preserve">Panoplie Mousse avec taux de 27% sur les </w:t>
       </w:r>
       <w:proofErr w:type="spellStart"/>
       <w:r>
-        <w:t>Champ</w:t>
+        <w:t>pichons</w:t>
       </w:r>
       <w:proofErr w:type="spellEnd"/>
-      <w:r>
-        <w:t xml:space="preserve"> avec taux de 27% sur le Champ </w:t>
-      </w:r>
-      <w:proofErr w:type="spellStart"/>
-      <w:r>
-        <w:t>Champ</w:t>
-      </w:r>
-      <w:proofErr w:type="spellEnd"/>
+    </w:p>
+    <w:p>
+      <w:pPr>
+        <w:pStyle w:val="Paragraphedeliste"/>
+        <w:ind w:left="1416"/>
+      </w:pPr>
+      <w:r>
+        <w:t xml:space="preserve">Sauf le bouclier Mousse </w:t>
+      </w:r>
+      <w:r>
+        <w:t xml:space="preserve">avec taux de </w:t>
+      </w:r>
+      <w:r>
+        <w:t>75% sur Mob l’Eponge</w:t>
+      </w:r>
     </w:p>
     <w:p>
       <w:pPr>
@@ -2590,11 +2583,21 @@
         </w:numPr>
       </w:pPr>
       <w:r>
-        <w:t>Panoplie Champêtre</w:t>
-      </w:r>
-      <w:r>
-        <w:t xml:space="preserve"> avec taux de 27% sur le Pissenlit diabolique</w:t>
-      </w:r>
+        <w:t xml:space="preserve">Panoplie Champ </w:t>
+      </w:r>
+      <w:proofErr w:type="spellStart"/>
+      <w:r>
+        <w:t>Champ</w:t>
+      </w:r>
+      <w:proofErr w:type="spellEnd"/>
+      <w:r>
+        <w:t xml:space="preserve"> avec taux de 27% sur le Champ </w:t>
+      </w:r>
+      <w:proofErr w:type="spellStart"/>
+      <w:r>
+        <w:t>Champ</w:t>
+      </w:r>
+      <w:proofErr w:type="spellEnd"/>
     </w:p>
     <w:p>
       <w:pPr>
@@ -2605,10 +2608,10 @@
         </w:numPr>
       </w:pPr>
       <w:r>
-        <w:t>Panoplie Moskito</w:t>
-      </w:r>
-      <w:r>
-        <w:t xml:space="preserve"> sur avec taux de 27% sur le Moskito</w:t>
+        <w:t>Panoplie Champêtre</w:t>
+      </w:r>
+      <w:r>
+        <w:t xml:space="preserve"> avec taux de 27% sur le Pissenlit diabolique</w:t>
       </w:r>
     </w:p>
     <w:p>
@@ -2620,10 +2623,10 @@
         </w:numPr>
       </w:pPr>
       <w:r>
-        <w:t xml:space="preserve">Panoplie du Sanglier </w:t>
-      </w:r>
-      <w:r>
-        <w:t>avec taux de 27% sur le Sanglier</w:t>
+        <w:t>Panoplie Moskito</w:t>
+      </w:r>
+      <w:r>
+        <w:t xml:space="preserve"> sur avec taux de 27% sur le Moskito</w:t>
       </w:r>
     </w:p>
     <w:p>
@@ -2635,7 +2638,10 @@
         </w:numPr>
       </w:pPr>
       <w:r>
-        <w:t>Panoplie du Tofu avec taux de 27% sur le Tofu</w:t>
+        <w:t xml:space="preserve">Panoplie du Sanglier </w:t>
+      </w:r>
+      <w:r>
+        <w:t>avec taux de 27% sur le Sanglier</w:t>
       </w:r>
     </w:p>
     <w:p>
@@ -2647,26 +2653,7 @@
         </w:numPr>
       </w:pPr>
       <w:r>
-        <w:t xml:space="preserve">Panoplie du </w:t>
-      </w:r>
-      <w:proofErr w:type="spellStart"/>
-      <w:r>
-        <w:t>Bouftou</w:t>
-      </w:r>
-      <w:proofErr w:type="spellEnd"/>
-      <w:r>
-        <w:t xml:space="preserve"> Royal </w:t>
-      </w:r>
-      <w:r>
-        <w:t xml:space="preserve">avec taux de 27% sur le </w:t>
-      </w:r>
-      <w:proofErr w:type="spellStart"/>
-      <w:r>
-        <w:t>Bouftou</w:t>
-      </w:r>
-      <w:proofErr w:type="spellEnd"/>
-      <w:r>
-        <w:t xml:space="preserve"> Royal</w:t>
+        <w:t>Panoplie du Tofu avec taux de 27% sur le Tofu</w:t>
       </w:r>
     </w:p>
     <w:p>
@@ -2682,17 +2669,23 @@
       </w:r>
       <w:proofErr w:type="spellStart"/>
       <w:r>
-        <w:t>Prespic</w:t>
+        <w:t>Bouftou</w:t>
       </w:r>
       <w:proofErr w:type="spellEnd"/>
       <w:r>
-        <w:t xml:space="preserve"> avec taux de 27% sur le </w:t>
+        <w:t xml:space="preserve"> Royal </w:t>
+      </w:r>
+      <w:r>
+        <w:t xml:space="preserve">avec taux de 27% sur le </w:t>
       </w:r>
       <w:proofErr w:type="spellStart"/>
       <w:r>
-        <w:t>Prespic</w:t>
+        <w:t>Bouftou</w:t>
       </w:r>
       <w:proofErr w:type="spellEnd"/>
+      <w:r>
+        <w:t xml:space="preserve"> Royal</w:t>
+      </w:r>
     </w:p>
     <w:p>
       <w:pPr>
@@ -2703,16 +2696,21 @@
         </w:numPr>
       </w:pPr>
       <w:r>
-        <w:t xml:space="preserve">Panoplie </w:t>
+        <w:t xml:space="preserve">Panoplie du </w:t>
       </w:r>
       <w:proofErr w:type="spellStart"/>
       <w:r>
-        <w:t>Larvesque</w:t>
+        <w:t>Prespic</w:t>
       </w:r>
       <w:proofErr w:type="spellEnd"/>
       <w:r>
-        <w:t xml:space="preserve"> avec taux de 27% sur la Larve verte</w:t>
-      </w:r>
+        <w:t xml:space="preserve"> avec taux de 27% sur le </w:t>
+      </w:r>
+      <w:proofErr w:type="spellStart"/>
+      <w:r>
+        <w:t>Prespic</w:t>
+      </w:r>
+      <w:proofErr w:type="spellEnd"/>
     </w:p>
     <w:p>
       <w:pPr>
@@ -2722,19 +2720,17 @@
           <w:numId w:val="46"/>
         </w:numPr>
       </w:pPr>
+      <w:r>
+        <w:t xml:space="preserve">Panoplie </w:t>
+      </w:r>
       <w:proofErr w:type="spellStart"/>
       <w:r>
-        <w:t>Microplie</w:t>
+        <w:t>Larvesque</w:t>
       </w:r>
       <w:proofErr w:type="spellEnd"/>
       <w:r>
-        <w:t xml:space="preserve"> avec taux de 27% sur le </w:t>
-      </w:r>
-      <w:proofErr w:type="spellStart"/>
-      <w:r>
-        <w:t>Kankreblath</w:t>
-      </w:r>
-      <w:proofErr w:type="spellEnd"/>
+        <w:t xml:space="preserve"> avec taux de 27% sur la Larve verte</w:t>
+      </w:r>
     </w:p>
     <w:p>
       <w:pPr>
@@ -2744,17 +2740,19 @@
           <w:numId w:val="46"/>
         </w:numPr>
       </w:pPr>
-      <w:r>
-        <w:t xml:space="preserve">Panoplie Kwak avec taux de 27% sur les </w:t>
-      </w:r>
       <w:proofErr w:type="spellStart"/>
       <w:r>
-        <w:t>kwak</w:t>
+        <w:t>Microplie</w:t>
       </w:r>
       <w:proofErr w:type="spellEnd"/>
       <w:r>
-        <w:t xml:space="preserve"> élémentaires</w:t>
-      </w:r>
+        <w:t xml:space="preserve"> avec taux de 27% sur le </w:t>
+      </w:r>
+      <w:proofErr w:type="spellStart"/>
+      <w:r>
+        <w:t>Kankreblath</w:t>
+      </w:r>
+      <w:proofErr w:type="spellEnd"/>
     </w:p>
     <w:p>
       <w:pPr>
@@ -2765,19 +2763,11 @@
         </w:numPr>
       </w:pPr>
       <w:r>
-        <w:t xml:space="preserve">Panoplie </w:t>
+        <w:t xml:space="preserve">Panoplie Kwak avec taux de 27% sur les </w:t>
       </w:r>
       <w:proofErr w:type="spellStart"/>
       <w:r>
-        <w:t>Scarafeuille</w:t>
-      </w:r>
-      <w:proofErr w:type="spellEnd"/>
-      <w:r>
-        <w:t xml:space="preserve"> avec taux de 27% sur les </w:t>
-      </w:r>
-      <w:proofErr w:type="spellStart"/>
-      <w:r>
-        <w:t>Scarafeuilles</w:t>
+        <w:t>kwak</w:t>
       </w:r>
       <w:proofErr w:type="spellEnd"/>
       <w:r>
@@ -2793,11 +2783,19 @@
         </w:numPr>
       </w:pPr>
       <w:r>
-        <w:t xml:space="preserve">Panoplie Blop avec taux de 27% sur les </w:t>
+        <w:t xml:space="preserve">Panoplie </w:t>
       </w:r>
       <w:proofErr w:type="spellStart"/>
       <w:r>
-        <w:t>Blop</w:t>
+        <w:t>Scarafeuille</w:t>
+      </w:r>
+      <w:proofErr w:type="spellEnd"/>
+      <w:r>
+        <w:t xml:space="preserve"> avec taux de 27% sur les </w:t>
+      </w:r>
+      <w:proofErr w:type="spellStart"/>
+      <w:r>
+        <w:t>Scarafeuilles</w:t>
       </w:r>
       <w:proofErr w:type="spellEnd"/>
       <w:r>
@@ -2812,28 +2810,16 @@
           <w:numId w:val="46"/>
         </w:numPr>
       </w:pPr>
+      <w:r>
+        <w:t xml:space="preserve">Panoplie Blop avec taux de 27% sur les </w:t>
+      </w:r>
       <w:proofErr w:type="spellStart"/>
       <w:r>
-        <w:t>Gelano</w:t>
+        <w:t>Blop</w:t>
       </w:r>
       <w:proofErr w:type="spellEnd"/>
       <w:r>
-        <w:t xml:space="preserve"> </w:t>
-      </w:r>
-      <w:r>
-        <w:t xml:space="preserve">avec taux de </w:t>
-      </w:r>
-      <w:r>
-        <w:t>6</w:t>
-      </w:r>
-      <w:r>
-        <w:t xml:space="preserve">% sur les </w:t>
-      </w:r>
-      <w:r>
-        <w:t>G</w:t>
-      </w:r>
-      <w:r>
-        <w:t>elées royales</w:t>
+        <w:t xml:space="preserve"> élémentaires</w:t>
       </w:r>
     </w:p>
     <w:p>
@@ -2844,27 +2830,28 @@
           <w:numId w:val="46"/>
         </w:numPr>
       </w:pPr>
-      <w:r>
-        <w:t xml:space="preserve">Panoplie du Chef </w:t>
-      </w:r>
       <w:proofErr w:type="spellStart"/>
       <w:r>
-        <w:t>Bwork</w:t>
+        <w:t>Gelano</w:t>
       </w:r>
       <w:proofErr w:type="spellEnd"/>
       <w:r>
         <w:t xml:space="preserve"> </w:t>
       </w:r>
       <w:r>
-        <w:t xml:space="preserve">avec taux de 3% sur </w:t>
-      </w:r>
-      <w:proofErr w:type="spellStart"/>
-      <w:r>
-        <w:t>Qil</w:t>
-      </w:r>
-      <w:proofErr w:type="spellEnd"/>
-      <w:r>
-        <w:t xml:space="preserve"> Bil</w:t>
+        <w:t xml:space="preserve">avec taux de </w:t>
+      </w:r>
+      <w:r>
+        <w:t>6</w:t>
+      </w:r>
+      <w:r>
+        <w:t xml:space="preserve">% sur les </w:t>
+      </w:r>
+      <w:r>
+        <w:t>G</w:t>
+      </w:r>
+      <w:r>
+        <w:t>elées royales</w:t>
       </w:r>
     </w:p>
     <w:p>
@@ -2876,6 +2863,37 @@
         </w:numPr>
       </w:pPr>
       <w:r>
+        <w:t xml:space="preserve">Panoplie du Chef </w:t>
+      </w:r>
+      <w:proofErr w:type="spellStart"/>
+      <w:r>
+        <w:t>Bwork</w:t>
+      </w:r>
+      <w:proofErr w:type="spellEnd"/>
+      <w:r>
+        <w:t xml:space="preserve"> </w:t>
+      </w:r>
+      <w:r>
+        <w:t xml:space="preserve">avec taux de 3% sur </w:t>
+      </w:r>
+      <w:proofErr w:type="spellStart"/>
+      <w:r>
+        <w:t>Qil</w:t>
+      </w:r>
+      <w:proofErr w:type="spellEnd"/>
+      <w:r>
+        <w:t xml:space="preserve"> Bil</w:t>
+      </w:r>
+    </w:p>
+    <w:p>
+      <w:pPr>
+        <w:pStyle w:val="Paragraphedeliste"/>
+        <w:numPr>
+          <w:ilvl w:val="0"/>
+          <w:numId w:val="46"/>
+        </w:numPr>
+      </w:pPr>
+      <w:r>
         <w:t xml:space="preserve">Mandrin – Styx – </w:t>
       </w:r>
       <w:proofErr w:type="spellStart"/>
@@ -3055,6 +3073,7 @@
     </w:p>
     <w:p>
       <w:r>
+        <w:lastRenderedPageBreak/>
         <w:tab/>
         <w:t xml:space="preserve">Exception sur les items de </w:t>
       </w:r>
@@ -3077,7 +3096,6 @@
     </w:p>
     <w:p>
       <w:r>
-        <w:lastRenderedPageBreak/>
         <w:t>Les runes de niveau supérieur sont obtenables par fusion au concasseur</w:t>
       </w:r>
       <w:r>
@@ -7576,6 +7594,7 @@
           </w:tcPr>
           <w:p>
             <w:r>
+              <w:lastRenderedPageBreak/>
               <w:t>Sagesse</w:t>
             </w:r>
           </w:p>
@@ -7605,7 +7624,6 @@
           </w:tcPr>
           <w:p>
             <w:r>
-              <w:lastRenderedPageBreak/>
               <w:t>Force</w:t>
             </w:r>
           </w:p>
@@ -8713,6 +8731,7 @@
     </w:p>
     <w:p>
       <w:r>
+        <w:lastRenderedPageBreak/>
         <w:t>Il faut créer plusieurs personnages sur votre compte.</w:t>
       </w:r>
     </w:p>
@@ -9185,6 +9204,7 @@
         <w:rPr>
           <w:lang w:val="fr-FR"/>
         </w:rPr>
+        <w:lastRenderedPageBreak/>
         <w:t xml:space="preserve">Les </w:t>
       </w:r>
       <w:proofErr w:type="spellStart"/>
@@ -9403,7 +9423,6 @@
                 <w:b/>
                 <w:bCs/>
               </w:rPr>
-              <w:lastRenderedPageBreak/>
               <w:t>Dofus</w:t>
             </w:r>
             <w:proofErr w:type="spellEnd"/>
@@ -11103,6 +11122,7 @@
               <w:jc w:val="center"/>
             </w:pPr>
             <w:r>
+              <w:lastRenderedPageBreak/>
               <w:t>20 do air</w:t>
             </w:r>
           </w:p>
@@ -11118,6 +11138,7 @@
             </w:pPr>
             <w:proofErr w:type="spellStart"/>
             <w:r>
+              <w:lastRenderedPageBreak/>
               <w:t>Harebourg</w:t>
             </w:r>
             <w:proofErr w:type="spellEnd"/>
@@ -11263,7 +11284,6 @@
                 <w:b/>
                 <w:bCs/>
               </w:rPr>
-              <w:lastRenderedPageBreak/>
               <w:t>Dofus</w:t>
             </w:r>
             <w:proofErr w:type="spellEnd"/>
@@ -15354,6 +15374,7 @@
                 <w:color w:val="000000"/>
                 <w:lang w:eastAsia="fr-FR"/>
               </w:rPr>
+              <w:lastRenderedPageBreak/>
               <w:t>Petit Chienchien Noir</w:t>
             </w:r>
           </w:p>
@@ -15812,7 +15833,6 @@
                 <w:color w:val="000000"/>
                 <w:lang w:eastAsia="fr-FR"/>
               </w:rPr>
-              <w:lastRenderedPageBreak/>
               <w:t>Bébé Pandawa</w:t>
             </w:r>
           </w:p>
@@ -21551,7 +21571,6 @@
                 <w:color w:val="000000"/>
                 <w:lang w:eastAsia="fr-FR"/>
               </w:rPr>
-              <w:lastRenderedPageBreak/>
               <w:t>Ross</w:t>
             </w:r>
           </w:p>
@@ -26701,6 +26720,7 @@
                 <w:color w:val="000000"/>
                 <w:lang w:eastAsia="fr-FR"/>
               </w:rPr>
+              <w:lastRenderedPageBreak/>
               <w:t>Volkorne</w:t>
             </w:r>
             <w:proofErr w:type="spellEnd"/>
@@ -27184,7 +27204,6 @@
                 <w:color w:val="000000"/>
                 <w:lang w:eastAsia="fr-FR"/>
               </w:rPr>
-              <w:lastRenderedPageBreak/>
               <w:t>Chauffe-souris Délavée</w:t>
             </w:r>
           </w:p>
@@ -30469,6 +30488,7 @@
         <w:pStyle w:val="Titre3"/>
       </w:pPr>
       <w:r>
+        <w:lastRenderedPageBreak/>
         <w:t>Sram</w:t>
       </w:r>
     </w:p>
@@ -30517,7 +30537,6 @@
       </w:pPr>
       <w:proofErr w:type="spellStart"/>
       <w:r>
-        <w:lastRenderedPageBreak/>
         <w:t>Ecaflip</w:t>
       </w:r>
       <w:proofErr w:type="spellEnd"/>
@@ -30896,6 +30915,7 @@
         <w:rPr>
           <w:lang w:val="fr-FR"/>
         </w:rPr>
+        <w:lastRenderedPageBreak/>
         <w:t>Item PA / PM de niveau &gt; 190</w:t>
       </w:r>
     </w:p>
@@ -31778,6 +31798,7 @@
         <w:pStyle w:val="Titre3"/>
       </w:pPr>
       <w:r>
+        <w:lastRenderedPageBreak/>
         <w:t>Boss</w:t>
       </w:r>
     </w:p>
@@ -31952,7 +31973,6 @@
                 <w:b/>
                 <w:bCs/>
               </w:rPr>
-              <w:lastRenderedPageBreak/>
               <w:t>Boss</w:t>
             </w:r>
           </w:p>
@@ -33246,6 +33266,7 @@
           </w:p>
           <w:p>
             <w:r>
+              <w:lastRenderedPageBreak/>
               <w:t>Invocation de la pougnette qui one shot tous les personnages à plus de 7 PO d’elle au début de son 5</w:t>
             </w:r>
             <w:r>
@@ -33280,6 +33301,7 @@
                 <w:b/>
                 <w:bCs/>
               </w:rPr>
+              <w:lastRenderedPageBreak/>
               <w:t>XLII</w:t>
             </w:r>
           </w:p>
@@ -33440,7 +33462,6 @@
                 <w:b/>
                 <w:bCs/>
               </w:rPr>
-              <w:lastRenderedPageBreak/>
               <w:t>Fuji Givrefoux</w:t>
             </w:r>
           </w:p>
@@ -34464,6 +34485,7 @@
           </w:p>
           <w:p>
             <w:r>
+              <w:lastRenderedPageBreak/>
               <w:t>Débuter son tour sur la glyphe OS le personnage</w:t>
             </w:r>
           </w:p>
@@ -34493,6 +34515,7 @@
                 <w:b/>
                 <w:bCs/>
               </w:rPr>
+              <w:lastRenderedPageBreak/>
               <w:t>Roi Nidas</w:t>
             </w:r>
           </w:p>
@@ -34607,7 +34630,6 @@
               </w:numPr>
             </w:pPr>
             <w:r>
-              <w:lastRenderedPageBreak/>
               <w:t>Dés en croix 1 autour du boss (x4)</w:t>
             </w:r>
           </w:p>
@@ -34821,7 +34843,6 @@
                 <w:b/>
                 <w:bCs/>
               </w:rPr>
-              <w:lastRenderedPageBreak/>
               <w:t>Vortex</w:t>
             </w:r>
           </w:p>
@@ -35369,6 +35390,7 @@
         <w:pStyle w:val="Titre3"/>
       </w:pPr>
       <w:r>
+        <w:lastRenderedPageBreak/>
         <w:t>Avis de recherche</w:t>
       </w:r>
     </w:p>
@@ -35569,7 +35591,6 @@
                 <w:b/>
                 <w:bCs/>
               </w:rPr>
-              <w:lastRenderedPageBreak/>
               <w:t>Anatak</w:t>
             </w:r>
             <w:proofErr w:type="spellEnd"/>
@@ -36686,6 +36707,7 @@
                 <w:b/>
                 <w:bCs/>
               </w:rPr>
+              <w:lastRenderedPageBreak/>
               <w:t xml:space="preserve">Ka </w:t>
             </w:r>
             <w:proofErr w:type="spellStart"/>
@@ -37059,7 +37081,6 @@
                 <w:b/>
                 <w:bCs/>
               </w:rPr>
-              <w:lastRenderedPageBreak/>
               <w:t>Morblok</w:t>
             </w:r>
             <w:proofErr w:type="spellEnd"/>

</xml_diff>

<commit_message>
Update wiki PDF/docx from the master Wiki Serveur Askawawa document
</commit_message>
<xml_diff>
--- a/docs/wiki-askawawa.docx
+++ b/docs/wiki-askawawa.docx
@@ -1,6 +1,6 @@
 
 <file path=word/document.xml><?xml version="1.0" encoding="utf-8"?>
-<w:document xmlns:wpc="http://schemas.microsoft.com/office/word/2010/wordprocessingCanvas" xmlns:cx="http://schemas.microsoft.com/office/drawing/2014/chartex" xmlns:cx1="http://schemas.microsoft.com/office/drawing/2015/9/8/chartex" xmlns:cx2="http://schemas.microsoft.com/office/drawing/2015/10/21/chartex" xmlns:cx3="http://schemas.microsoft.com/office/drawing/2016/5/9/chartex" xmlns:cx4="http://schemas.microsoft.com/office/drawing/2016/5/10/chartex" xmlns:cx5="http://schemas.microsoft.com/office/drawing/2016/5/11/chartex" xmlns:cx6="http://schemas.microsoft.com/office/drawing/2016/5/12/chartex" xmlns:cx7="http://schemas.microsoft.com/office/drawing/2016/5/13/chartex" xmlns:cx8="http://schemas.microsoft.com/office/drawing/2016/5/14/chartex" xmlns:mc="http://schemas.openxmlformats.org/markup-compatibility/2006" xmlns:aink="http://schemas.microsoft.com/office/drawing/2016/ink" xmlns:am3d="http://schemas.microsoft.com/office/drawing/2017/model3d" xmlns:o="urn:schemas-microsoft-com:office:office" xmlns:oel="http://schemas.microsoft.com/office/2019/extlst" xmlns:r="http://schemas.openxmlformats.org/officeDocument/2006/relationships" xmlns:m="http://schemas.openxmlformats.org/officeDocument/2006/math" xmlns:v="urn:schemas-microsoft-com:vml" xmlns:wp14="http://schemas.microsoft.com/office/word/2010/wordprocessingDrawing" xmlns:wp="http://schemas.openxmlformats.org/drawingml/2006/wordprocessingDrawing" xmlns:w10="urn:schemas-microsoft-com:office:word" xmlns:w="http://schemas.openxmlformats.org/wordprocessingml/2006/main" xmlns:w14="http://schemas.microsoft.com/office/word/2010/wordml" xmlns:w15="http://schemas.microsoft.com/office/word/2012/wordml" xmlns:w16cex="http://schemas.microsoft.com/office/word/2018/wordml/cex" xmlns:w16cid="http://schemas.microsoft.com/office/word/2016/wordml/cid" xmlns:w16="http://schemas.microsoft.com/office/word/2018/wordml" xmlns:w16du="http://schemas.microsoft.com/office/word/2023/wordml/word16du" xmlns:w16sdtdh="http://schemas.microsoft.com/office/word/2020/wordml/sdtdatahash" xmlns:w16sdtfl="http://schemas.microsoft.com/office/word/2024/wordml/sdtformatlock" xmlns:w16se="http://schemas.microsoft.com/office/word/2015/wordml/symex" xmlns:wpg="http://schemas.microsoft.com/office/word/2010/wordprocessingGroup" xmlns:wpi="http://schemas.microsoft.com/office/word/2010/wordprocessingInk" xmlns:wne="http://schemas.microsoft.com/office/word/2006/wordml" xmlns:wps="http://schemas.microsoft.com/office/word/2010/wordprocessingShape" mc:Ignorable="w14 w15 w16se w16cid w16 w16cex w16sdtdh w16sdtfl w16du wp14">
+<w:document xmlns:wpc="http://schemas.microsoft.com/office/word/2010/wordprocessingCanvas" xmlns:cx="http://schemas.microsoft.com/office/drawing/2014/chartex" xmlns:cx1="http://schemas.microsoft.com/office/drawing/2015/9/8/chartex" xmlns:cx2="http://schemas.microsoft.com/office/drawing/2015/10/21/chartex" xmlns:cx3="http://schemas.microsoft.com/office/drawing/2016/5/9/chartex" xmlns:cx4="http://schemas.microsoft.com/office/drawing/2016/5/10/chartex" xmlns:cx5="http://schemas.microsoft.com/office/drawing/2016/5/11/chartex" xmlns:cx6="http://schemas.microsoft.com/office/drawing/2016/5/12/chartex" xmlns:cx7="http://schemas.microsoft.com/office/drawing/2016/5/13/chartex" xmlns:cx8="http://schemas.microsoft.com/office/drawing/2016/5/14/chartex" xmlns:mc="http://schemas.openxmlformats.org/markup-compatibility/2006" xmlns:aink="http://schemas.microsoft.com/office/drawing/2016/ink" xmlns:am3d="http://schemas.microsoft.com/office/drawing/2017/model3d" xmlns:o="urn:schemas-microsoft-com:office:office" xmlns:oel="http://schemas.microsoft.com/office/2019/extlst" xmlns:r="http://schemas.openxmlformats.org/officeDocument/2006/relationships" xmlns:m="http://schemas.openxmlformats.org/officeDocument/2006/math" xmlns:v="urn:schemas-microsoft-com:vml" xmlns:wp14="http://schemas.microsoft.com/office/word/2010/wordprocessingDrawing" xmlns:wp="http://schemas.openxmlformats.org/drawingml/2006/wordprocessingDrawing" xmlns:w10="urn:schemas-microsoft-com:office:word" xmlns:w="http://schemas.openxmlformats.org/wordprocessingml/2006/main" xmlns:w14="http://schemas.microsoft.com/office/word/2010/wordml" xmlns:w15="http://schemas.microsoft.com/office/word/2012/wordml" xmlns:w16cei="http://schemas.microsoft.com/office/word/2026/wordml/cei" xmlns:w16cex="http://schemas.microsoft.com/office/word/2018/wordml/cex" xmlns:w16cid="http://schemas.microsoft.com/office/word/2016/wordml/cid" xmlns:w16="http://schemas.microsoft.com/office/word/2018/wordml" xmlns:w16du="http://schemas.microsoft.com/office/word/2023/wordml/word16du" xmlns:w16sdtdh="http://schemas.microsoft.com/office/word/2020/wordml/sdtdatahash" xmlns:w16sdtfl="http://schemas.microsoft.com/office/word/2024/wordml/sdtformatlock" xmlns:w16se="http://schemas.microsoft.com/office/word/2015/wordml/symex" xmlns:wpg="http://schemas.microsoft.com/office/word/2010/wordprocessingGroup" xmlns:wpi="http://schemas.microsoft.com/office/word/2010/wordprocessingInk" xmlns:wne="http://schemas.microsoft.com/office/word/2006/wordml" xmlns:wps="http://schemas.microsoft.com/office/word/2010/wordprocessingShape" mc:Ignorable="w14 w15 w16se w16cid w16 w16cex w16sdtdh w16sdtfl w16du wp14">
   <w:body>
     <w:p>
       <w:pPr>
@@ -2197,7 +2197,12 @@
     <w:p>
       <w:r>
         <w:tab/>
-        <w:t xml:space="preserve">1.5 entre le </w:t>
+      </w:r>
+      <w:r>
+        <w:t>2</w:t>
+      </w:r>
+      <w:r>
+        <w:t xml:space="preserve"> entre le </w:t>
       </w:r>
       <w:proofErr w:type="spellStart"/>
       <w:r>
@@ -2205,13 +2210,22 @@
       </w:r>
       <w:proofErr w:type="spellEnd"/>
       <w:r>
-        <w:t xml:space="preserve"> 1 et 79</w:t>
+        <w:t xml:space="preserve"> 1 et </w:t>
+      </w:r>
+      <w:r>
+        <w:t>40</w:t>
       </w:r>
     </w:p>
     <w:p>
       <w:r>
         <w:tab/>
-        <w:t xml:space="preserve">2 entre le </w:t>
+        <w:t>2</w:t>
+      </w:r>
+      <w:r>
+        <w:t>.5</w:t>
+      </w:r>
+      <w:r>
+        <w:t xml:space="preserve"> entre le </w:t>
       </w:r>
       <w:proofErr w:type="spellStart"/>
       <w:r>
@@ -2219,13 +2233,27 @@
       </w:r>
       <w:proofErr w:type="spellEnd"/>
       <w:r>
-        <w:t xml:space="preserve"> 80 et 129</w:t>
+        <w:t xml:space="preserve"> </w:t>
+      </w:r>
+      <w:r>
+        <w:t>41</w:t>
+      </w:r>
+      <w:r>
+        <w:t xml:space="preserve"> et </w:t>
+      </w:r>
+      <w:r>
+        <w:t>80</w:t>
       </w:r>
     </w:p>
     <w:p>
       <w:r>
         <w:tab/>
-        <w:t xml:space="preserve">2.5 entre le </w:t>
+      </w:r>
+      <w:r>
+        <w:t>3</w:t>
+      </w:r>
+      <w:r>
+        <w:t xml:space="preserve"> entre le </w:t>
       </w:r>
       <w:proofErr w:type="spellStart"/>
       <w:r>
@@ -2233,13 +2261,27 @@
       </w:r>
       <w:proofErr w:type="spellEnd"/>
       <w:r>
-        <w:t xml:space="preserve"> 130 et 169</w:t>
+        <w:t xml:space="preserve"> </w:t>
+      </w:r>
+      <w:r>
+        <w:t>81</w:t>
+      </w:r>
+      <w:r>
+        <w:t xml:space="preserve"> et </w:t>
+      </w:r>
+      <w:r>
+        <w:t>130</w:t>
       </w:r>
     </w:p>
     <w:p>
       <w:r>
         <w:tab/>
-        <w:t xml:space="preserve">3 à partir du </w:t>
+      </w:r>
+      <w:r>
+        <w:t>4</w:t>
+      </w:r>
+      <w:r>
+        <w:t xml:space="preserve"> à partir du </w:t>
       </w:r>
       <w:proofErr w:type="spellStart"/>
       <w:r>
@@ -2247,7 +2289,10 @@
       </w:r>
       <w:proofErr w:type="spellEnd"/>
       <w:r>
-        <w:t xml:space="preserve"> 170</w:t>
+        <w:t xml:space="preserve"> </w:t>
+      </w:r>
+      <w:r>
+        <w:t>131</w:t>
       </w:r>
     </w:p>
     <w:p>
@@ -2426,8 +2471,13 @@
       </w:r>
     </w:p>
     <w:p>
-      <w:r>
-        <w:t xml:space="preserve">Certain équipements sont obtenables en drop en début d’aventure : </w:t>
+      <w:proofErr w:type="gramStart"/>
+      <w:r>
+        <w:t>Certain équipements</w:t>
+      </w:r>
+      <w:proofErr w:type="gramEnd"/>
+      <w:r>
+        <w:t xml:space="preserve"> sont obtenables en drop en début d’aventure : </w:t>
       </w:r>
     </w:p>
     <w:p>
@@ -7395,7 +7445,15 @@
         <w:t>Chaque ligne est indépendante en probabilité des autres</w:t>
       </w:r>
       <w:r>
-        <w:t>, il n’y a pas de poids globale de l’objet.</w:t>
+        <w:t xml:space="preserve">, il n’y a pas de </w:t>
+      </w:r>
+      <w:proofErr w:type="gramStart"/>
+      <w:r>
+        <w:t>poids globale</w:t>
+      </w:r>
+      <w:proofErr w:type="gramEnd"/>
+      <w:r>
+        <w:t xml:space="preserve"> de l’objet.</w:t>
       </w:r>
     </w:p>
     <w:p>
@@ -8774,6 +8832,7 @@
       </w:r>
     </w:p>
     <w:p>
+      <w:proofErr w:type="gramStart"/>
       <w:r>
         <w:t>.</w:t>
       </w:r>
@@ -8782,6 +8841,7 @@
         <w:t>hero</w:t>
       </w:r>
       <w:proofErr w:type="spellEnd"/>
+      <w:proofErr w:type="gramEnd"/>
       <w:r>
         <w:t xml:space="preserve"> </w:t>
       </w:r>
@@ -8791,13 +8851,18 @@
       </w:r>
       <w:proofErr w:type="spellEnd"/>
       <w:r>
-        <w:t xml:space="preserve"> (exemple : .</w:t>
+        <w:t xml:space="preserve"> (exemple </w:t>
+      </w:r>
+      <w:proofErr w:type="gramStart"/>
+      <w:r>
+        <w:t>: .</w:t>
       </w:r>
       <w:proofErr w:type="spellStart"/>
       <w:r>
         <w:t>hero</w:t>
       </w:r>
       <w:proofErr w:type="spellEnd"/>
+      <w:proofErr w:type="gramEnd"/>
       <w:r>
         <w:t xml:space="preserve"> </w:t>
       </w:r>
@@ -8819,6 +8884,7 @@
       </w:r>
     </w:p>
     <w:p>
+      <w:proofErr w:type="gramStart"/>
       <w:r>
         <w:t>.</w:t>
       </w:r>
@@ -8827,6 +8893,7 @@
         <w:t>herorelease</w:t>
       </w:r>
       <w:proofErr w:type="spellEnd"/>
+      <w:proofErr w:type="gramEnd"/>
       <w:r>
         <w:t xml:space="preserve"> </w:t>
       </w:r>
@@ -8839,6 +8906,7 @@
         <w:t xml:space="preserve"> : déconnecte le héro </w:t>
       </w:r>
     </w:p>
+    <w:p/>
     <w:p>
       <w:r>
         <w:t xml:space="preserve">Une fois les héros connectés : </w:t>
@@ -8853,13 +8921,18 @@
         </w:numPr>
       </w:pPr>
       <w:r>
-        <w:t>Pour changer de héro hors combat : refaire la commande .</w:t>
+        <w:t xml:space="preserve">Pour changer de héro hors combat : refaire la </w:t>
+      </w:r>
+      <w:proofErr w:type="gramStart"/>
+      <w:r>
+        <w:t>commande .</w:t>
       </w:r>
       <w:proofErr w:type="spellStart"/>
       <w:r>
         <w:t>hero</w:t>
       </w:r>
       <w:proofErr w:type="spellEnd"/>
+      <w:proofErr w:type="gramEnd"/>
       <w:r>
         <w:t xml:space="preserve"> pour le personnage souhaité</w:t>
       </w:r>
@@ -8911,7 +8984,11 @@
     </w:p>
     <w:p>
       <w:r>
-        <w:t xml:space="preserve">Il suffit de faire la commande </w:t>
+        <w:t xml:space="preserve">Il suffit de faire la </w:t>
+      </w:r>
+      <w:proofErr w:type="gramStart"/>
+      <w:r>
+        <w:t xml:space="preserve">commande </w:t>
       </w:r>
       <w:r>
         <w:t>.</w:t>
@@ -8921,6 +8998,7 @@
         <w:t>hero</w:t>
       </w:r>
       <w:proofErr w:type="spellEnd"/>
+      <w:proofErr w:type="gramEnd"/>
       <w:r>
         <w:t xml:space="preserve"> </w:t>
       </w:r>
@@ -9001,6 +9079,7 @@
         <w:t xml:space="preserve"> héro.</w:t>
       </w:r>
     </w:p>
+    <w:p/>
     <w:p>
       <w:r>
         <w:t>Il faut envoyer 1 invitation, accepter, 2</w:t>
@@ -9037,13 +9116,18 @@
     </w:p>
     <w:p>
       <w:r>
-        <w:t>Il suffit de faire la commande .</w:t>
+        <w:t xml:space="preserve">Il suffit de faire la </w:t>
+      </w:r>
+      <w:proofErr w:type="gramStart"/>
+      <w:r>
+        <w:t>commande .</w:t>
       </w:r>
       <w:proofErr w:type="spellStart"/>
       <w:r>
         <w:t>ipdrop</w:t>
       </w:r>
       <w:proofErr w:type="spellEnd"/>
+      <w:proofErr w:type="gramEnd"/>
       <w:r>
         <w:t xml:space="preserve"> sur le personnage principal</w:t>
       </w:r>
@@ -9119,2525 +9203,7 @@
         <w:t>Chaque avis de recherche est porteur d’une étoile qui ne peut être obtenue qu’une unique fois par personnage.</w:t>
       </w:r>
     </w:p>
-    <w:tbl>
-      <w:tblPr>
-        <w:tblStyle w:val="Grilledutableau"/>
-        <w:tblW w:w="0" w:type="auto"/>
-        <w:tblLook w:val="04A0" w:firstRow="1" w:lastRow="0" w:firstColumn="1" w:lastColumn="0" w:noHBand="0" w:noVBand="1"/>
-      </w:tblPr>
-      <w:tblGrid>
-        <w:gridCol w:w="2492"/>
-        <w:gridCol w:w="3884"/>
-      </w:tblGrid>
-      <w:tr>
-        <w:tc>
-          <w:tcPr>
-            <w:tcW w:w="2492" w:type="dxa"/>
-            <w:shd w:val="clear" w:color="auto" w:fill="BFBFBF" w:themeFill="background1" w:themeFillShade="BF"/>
-          </w:tcPr>
-          <w:p>
-            <w:pPr>
-              <w:jc w:val="center"/>
-              <w:rPr>
-                <w:b/>
-                <w:bCs/>
-              </w:rPr>
-            </w:pPr>
-            <w:r>
-              <w:rPr>
-                <w:b/>
-                <w:bCs/>
-              </w:rPr>
-              <w:t>Recherché</w:t>
-            </w:r>
-          </w:p>
-        </w:tc>
-        <w:tc>
-          <w:tcPr>
-            <w:tcW w:w="3884" w:type="dxa"/>
-            <w:shd w:val="clear" w:color="auto" w:fill="BFBFBF" w:themeFill="background1" w:themeFillShade="BF"/>
-          </w:tcPr>
-          <w:p>
-            <w:pPr>
-              <w:jc w:val="center"/>
-              <w:rPr>
-                <w:b/>
-                <w:bCs/>
-              </w:rPr>
-            </w:pPr>
-            <w:r>
-              <w:rPr>
-                <w:b/>
-                <w:bCs/>
-              </w:rPr>
-              <w:t>Monnaie</w:t>
-            </w:r>
-          </w:p>
-        </w:tc>
-      </w:tr>
-      <w:tr>
-        <w:tc>
-          <w:tcPr>
-            <w:tcW w:w="2492" w:type="dxa"/>
-            <w:shd w:val="clear" w:color="auto" w:fill="DEEAF6" w:themeFill="accent5" w:themeFillTint="33"/>
-          </w:tcPr>
-          <w:p>
-            <w:pPr>
-              <w:jc w:val="center"/>
-            </w:pPr>
-            <w:proofErr w:type="spellStart"/>
-            <w:r>
-              <w:t>Fouduglen</w:t>
-            </w:r>
-            <w:proofErr w:type="spellEnd"/>
-            <w:r>
-              <w:t xml:space="preserve"> l’écureuil</w:t>
-            </w:r>
-          </w:p>
-        </w:tc>
-        <w:tc>
-          <w:tcPr>
-            <w:tcW w:w="3884" w:type="dxa"/>
-            <w:vMerge w:val="restart"/>
-            <w:vAlign w:val="center"/>
-          </w:tcPr>
-          <w:p>
-            <w:pPr>
-              <w:jc w:val="center"/>
-            </w:pPr>
-            <w:r>
-              <w:t xml:space="preserve">Etoile </w:t>
-            </w:r>
-            <w:proofErr w:type="spellStart"/>
-            <w:r>
-              <w:t>level</w:t>
-            </w:r>
-            <w:proofErr w:type="spellEnd"/>
-            <w:r>
-              <w:t xml:space="preserve"> 1</w:t>
-            </w:r>
-          </w:p>
-        </w:tc>
-      </w:tr>
-      <w:tr>
-        <w:tc>
-          <w:tcPr>
-            <w:tcW w:w="2492" w:type="dxa"/>
-            <w:shd w:val="clear" w:color="auto" w:fill="DEEAF6" w:themeFill="accent5" w:themeFillTint="33"/>
-          </w:tcPr>
-          <w:p>
-            <w:pPr>
-              <w:jc w:val="center"/>
-            </w:pPr>
-            <w:proofErr w:type="spellStart"/>
-            <w:r>
-              <w:t>Frakacia</w:t>
-            </w:r>
-            <w:proofErr w:type="spellEnd"/>
-            <w:r>
-              <w:t xml:space="preserve"> </w:t>
-            </w:r>
-            <w:proofErr w:type="spellStart"/>
-            <w:r>
-              <w:t>Leukocytine</w:t>
-            </w:r>
-            <w:proofErr w:type="spellEnd"/>
-          </w:p>
-        </w:tc>
-        <w:tc>
-          <w:tcPr>
-            <w:tcW w:w="3884" w:type="dxa"/>
-            <w:vMerge/>
-            <w:vAlign w:val="center"/>
-          </w:tcPr>
-          <w:p>
-            <w:pPr>
-              <w:jc w:val="center"/>
-            </w:pPr>
-          </w:p>
-        </w:tc>
-      </w:tr>
-      <w:tr>
-        <w:tc>
-          <w:tcPr>
-            <w:tcW w:w="2492" w:type="dxa"/>
-            <w:shd w:val="clear" w:color="auto" w:fill="DEEAF6" w:themeFill="accent5" w:themeFillTint="33"/>
-          </w:tcPr>
-          <w:p>
-            <w:pPr>
-              <w:jc w:val="center"/>
-            </w:pPr>
-            <w:r>
-              <w:t>Ambi Guman</w:t>
-            </w:r>
-          </w:p>
-        </w:tc>
-        <w:tc>
-          <w:tcPr>
-            <w:tcW w:w="3884" w:type="dxa"/>
-            <w:vMerge/>
-            <w:vAlign w:val="center"/>
-          </w:tcPr>
-          <w:p>
-            <w:pPr>
-              <w:jc w:val="center"/>
-            </w:pPr>
-          </w:p>
-        </w:tc>
-      </w:tr>
-      <w:tr>
-        <w:tc>
-          <w:tcPr>
-            <w:tcW w:w="2492" w:type="dxa"/>
-            <w:shd w:val="clear" w:color="auto" w:fill="DEEAF6" w:themeFill="accent5" w:themeFillTint="33"/>
-          </w:tcPr>
-          <w:p>
-            <w:pPr>
-              <w:jc w:val="center"/>
-            </w:pPr>
-            <w:r>
-              <w:t>Sam Sagaz</w:t>
-            </w:r>
-          </w:p>
-        </w:tc>
-        <w:tc>
-          <w:tcPr>
-            <w:tcW w:w="3884" w:type="dxa"/>
-            <w:vMerge/>
-            <w:vAlign w:val="center"/>
-          </w:tcPr>
-          <w:p>
-            <w:pPr>
-              <w:jc w:val="center"/>
-            </w:pPr>
-          </w:p>
-        </w:tc>
-      </w:tr>
-      <w:tr>
-        <w:tc>
-          <w:tcPr>
-            <w:tcW w:w="2492" w:type="dxa"/>
-            <w:shd w:val="clear" w:color="auto" w:fill="DEEAF6" w:themeFill="accent5" w:themeFillTint="33"/>
-          </w:tcPr>
-          <w:p>
-            <w:pPr>
-              <w:jc w:val="center"/>
-            </w:pPr>
-            <w:r>
-              <w:t>Maitre Boulet</w:t>
-            </w:r>
-          </w:p>
-        </w:tc>
-        <w:tc>
-          <w:tcPr>
-            <w:tcW w:w="3884" w:type="dxa"/>
-            <w:vMerge/>
-            <w:vAlign w:val="center"/>
-          </w:tcPr>
-          <w:p>
-            <w:pPr>
-              <w:jc w:val="center"/>
-            </w:pPr>
-          </w:p>
-        </w:tc>
-      </w:tr>
-      <w:tr>
-        <w:tc>
-          <w:tcPr>
-            <w:tcW w:w="2492" w:type="dxa"/>
-            <w:shd w:val="clear" w:color="auto" w:fill="DEEAF6" w:themeFill="accent5" w:themeFillTint="33"/>
-          </w:tcPr>
-          <w:p>
-            <w:pPr>
-              <w:jc w:val="center"/>
-            </w:pPr>
-            <w:proofErr w:type="spellStart"/>
-            <w:r>
-              <w:t>Roub’Ignolles</w:t>
-            </w:r>
-            <w:proofErr w:type="spellEnd"/>
-          </w:p>
-        </w:tc>
-        <w:tc>
-          <w:tcPr>
-            <w:tcW w:w="3884" w:type="dxa"/>
-            <w:vMerge/>
-            <w:vAlign w:val="center"/>
-          </w:tcPr>
-          <w:p>
-            <w:pPr>
-              <w:jc w:val="center"/>
-            </w:pPr>
-          </w:p>
-        </w:tc>
-      </w:tr>
-      <w:tr>
-        <w:tc>
-          <w:tcPr>
-            <w:tcW w:w="2492" w:type="dxa"/>
-            <w:shd w:val="clear" w:color="auto" w:fill="FBE4D5" w:themeFill="accent2" w:themeFillTint="33"/>
-          </w:tcPr>
-          <w:p>
-            <w:pPr>
-              <w:jc w:val="center"/>
-            </w:pPr>
-            <w:proofErr w:type="spellStart"/>
-            <w:r>
-              <w:t>Bouss</w:t>
-            </w:r>
-            <w:proofErr w:type="spellEnd"/>
-            <w:r>
-              <w:t xml:space="preserve"> Baybe</w:t>
-            </w:r>
-          </w:p>
-        </w:tc>
-        <w:tc>
-          <w:tcPr>
-            <w:tcW w:w="3884" w:type="dxa"/>
-            <w:vMerge w:val="restart"/>
-            <w:vAlign w:val="center"/>
-          </w:tcPr>
-          <w:p>
-            <w:pPr>
-              <w:jc w:val="center"/>
-            </w:pPr>
-            <w:r>
-              <w:t xml:space="preserve">Etoile </w:t>
-            </w:r>
-            <w:proofErr w:type="spellStart"/>
-            <w:r>
-              <w:t>level</w:t>
-            </w:r>
-            <w:proofErr w:type="spellEnd"/>
-            <w:r>
-              <w:t xml:space="preserve"> 2</w:t>
-            </w:r>
-          </w:p>
-        </w:tc>
-      </w:tr>
-      <w:tr>
-        <w:tc>
-          <w:tcPr>
-            <w:tcW w:w="2492" w:type="dxa"/>
-            <w:shd w:val="clear" w:color="auto" w:fill="FBE4D5" w:themeFill="accent2" w:themeFillTint="33"/>
-          </w:tcPr>
-          <w:p>
-            <w:pPr>
-              <w:jc w:val="center"/>
-            </w:pPr>
-            <w:proofErr w:type="spellStart"/>
-            <w:r>
-              <w:t>Ogivol</w:t>
-            </w:r>
-            <w:proofErr w:type="spellEnd"/>
-            <w:r>
-              <w:t xml:space="preserve"> Scalarcin</w:t>
-            </w:r>
-          </w:p>
-        </w:tc>
-        <w:tc>
-          <w:tcPr>
-            <w:tcW w:w="3884" w:type="dxa"/>
-            <w:vMerge/>
-            <w:vAlign w:val="center"/>
-          </w:tcPr>
-          <w:p>
-            <w:pPr>
-              <w:jc w:val="center"/>
-            </w:pPr>
-          </w:p>
-        </w:tc>
-      </w:tr>
-      <w:tr>
-        <w:tc>
-          <w:tcPr>
-            <w:tcW w:w="2492" w:type="dxa"/>
-            <w:shd w:val="clear" w:color="auto" w:fill="FBE4D5" w:themeFill="accent2" w:themeFillTint="33"/>
-          </w:tcPr>
-          <w:p>
-            <w:pPr>
-              <w:jc w:val="center"/>
-            </w:pPr>
-            <w:r>
-              <w:t xml:space="preserve">Brumen </w:t>
-            </w:r>
-            <w:proofErr w:type="spellStart"/>
-            <w:r>
-              <w:t>Tinctorias</w:t>
-            </w:r>
-            <w:proofErr w:type="spellEnd"/>
-          </w:p>
-        </w:tc>
-        <w:tc>
-          <w:tcPr>
-            <w:tcW w:w="3884" w:type="dxa"/>
-            <w:vMerge/>
-            <w:vAlign w:val="center"/>
-          </w:tcPr>
-          <w:p>
-            <w:pPr>
-              <w:jc w:val="center"/>
-            </w:pPr>
-          </w:p>
-        </w:tc>
-      </w:tr>
-      <w:tr>
-        <w:tc>
-          <w:tcPr>
-            <w:tcW w:w="2492" w:type="dxa"/>
-            <w:shd w:val="clear" w:color="auto" w:fill="FBE4D5" w:themeFill="accent2" w:themeFillTint="33"/>
-          </w:tcPr>
-          <w:p>
-            <w:pPr>
-              <w:jc w:val="center"/>
-            </w:pPr>
-            <w:proofErr w:type="spellStart"/>
-            <w:r>
-              <w:t>Gadoo</w:t>
-            </w:r>
-            <w:proofErr w:type="spellEnd"/>
-          </w:p>
-        </w:tc>
-        <w:tc>
-          <w:tcPr>
-            <w:tcW w:w="3884" w:type="dxa"/>
-            <w:vMerge/>
-            <w:vAlign w:val="center"/>
-          </w:tcPr>
-          <w:p>
-            <w:pPr>
-              <w:jc w:val="center"/>
-            </w:pPr>
-          </w:p>
-        </w:tc>
-      </w:tr>
-      <w:tr>
-        <w:tc>
-          <w:tcPr>
-            <w:tcW w:w="2492" w:type="dxa"/>
-            <w:shd w:val="clear" w:color="auto" w:fill="FBE4D5" w:themeFill="accent2" w:themeFillTint="33"/>
-          </w:tcPr>
-          <w:p>
-            <w:pPr>
-              <w:jc w:val="center"/>
-            </w:pPr>
-            <w:r>
-              <w:t xml:space="preserve">Nono le </w:t>
-            </w:r>
-            <w:proofErr w:type="spellStart"/>
-            <w:r>
-              <w:t>Wobot</w:t>
-            </w:r>
-            <w:proofErr w:type="spellEnd"/>
-          </w:p>
-        </w:tc>
-        <w:tc>
-          <w:tcPr>
-            <w:tcW w:w="3884" w:type="dxa"/>
-            <w:vMerge/>
-            <w:vAlign w:val="center"/>
-          </w:tcPr>
-          <w:p>
-            <w:pPr>
-              <w:jc w:val="center"/>
-            </w:pPr>
-          </w:p>
-        </w:tc>
-      </w:tr>
-      <w:tr>
-        <w:tc>
-          <w:tcPr>
-            <w:tcW w:w="2492" w:type="dxa"/>
-            <w:shd w:val="clear" w:color="auto" w:fill="FBE4D5" w:themeFill="accent2" w:themeFillTint="33"/>
-          </w:tcPr>
-          <w:p>
-            <w:pPr>
-              <w:jc w:val="center"/>
-            </w:pPr>
-            <w:proofErr w:type="spellStart"/>
-            <w:r>
-              <w:t>Marzwel</w:t>
-            </w:r>
-            <w:proofErr w:type="spellEnd"/>
-            <w:r>
-              <w:t xml:space="preserve"> le Gobelin</w:t>
-            </w:r>
-          </w:p>
-        </w:tc>
-        <w:tc>
-          <w:tcPr>
-            <w:tcW w:w="3884" w:type="dxa"/>
-            <w:vMerge/>
-            <w:vAlign w:val="center"/>
-          </w:tcPr>
-          <w:p>
-            <w:pPr>
-              <w:jc w:val="center"/>
-            </w:pPr>
-          </w:p>
-        </w:tc>
-      </w:tr>
-      <w:tr>
-        <w:tc>
-          <w:tcPr>
-            <w:tcW w:w="2492" w:type="dxa"/>
-            <w:shd w:val="clear" w:color="auto" w:fill="E2EFD9" w:themeFill="accent6" w:themeFillTint="33"/>
-          </w:tcPr>
-          <w:p>
-            <w:pPr>
-              <w:jc w:val="center"/>
-            </w:pPr>
-            <w:r>
-              <w:t>Armada l’invincible</w:t>
-            </w:r>
-          </w:p>
-        </w:tc>
-        <w:tc>
-          <w:tcPr>
-            <w:tcW w:w="3884" w:type="dxa"/>
-            <w:vMerge w:val="restart"/>
-            <w:vAlign w:val="center"/>
-          </w:tcPr>
-          <w:p>
-            <w:pPr>
-              <w:jc w:val="center"/>
-            </w:pPr>
-            <w:r>
-              <w:t xml:space="preserve">Etoile </w:t>
-            </w:r>
-            <w:proofErr w:type="spellStart"/>
-            <w:r>
-              <w:t>level</w:t>
-            </w:r>
-            <w:proofErr w:type="spellEnd"/>
-            <w:r>
-              <w:t xml:space="preserve"> 3</w:t>
-            </w:r>
-          </w:p>
-        </w:tc>
-      </w:tr>
-      <w:tr>
-        <w:tc>
-          <w:tcPr>
-            <w:tcW w:w="2492" w:type="dxa"/>
-            <w:shd w:val="clear" w:color="auto" w:fill="E2EFD9" w:themeFill="accent6" w:themeFillTint="33"/>
-          </w:tcPr>
-          <w:p>
-            <w:pPr>
-              <w:jc w:val="center"/>
-            </w:pPr>
-            <w:proofErr w:type="spellStart"/>
-            <w:r>
-              <w:t>Aermyne</w:t>
-            </w:r>
-            <w:proofErr w:type="spellEnd"/>
-            <w:r>
-              <w:t xml:space="preserve"> 'Braco' </w:t>
-            </w:r>
-            <w:proofErr w:type="spellStart"/>
-            <w:r>
-              <w:t>Scalptaras</w:t>
-            </w:r>
-            <w:proofErr w:type="spellEnd"/>
-          </w:p>
-        </w:tc>
-        <w:tc>
-          <w:tcPr>
-            <w:tcW w:w="3884" w:type="dxa"/>
-            <w:vMerge/>
-            <w:vAlign w:val="center"/>
-          </w:tcPr>
-          <w:p>
-            <w:pPr>
-              <w:jc w:val="center"/>
-            </w:pPr>
-          </w:p>
-        </w:tc>
-      </w:tr>
-      <w:tr>
-        <w:tc>
-          <w:tcPr>
-            <w:tcW w:w="2492" w:type="dxa"/>
-            <w:shd w:val="clear" w:color="auto" w:fill="E2EFD9" w:themeFill="accent6" w:themeFillTint="33"/>
-          </w:tcPr>
-          <w:p>
-            <w:pPr>
-              <w:jc w:val="center"/>
-            </w:pPr>
-            <w:proofErr w:type="spellStart"/>
-            <w:r>
-              <w:t>Qil</w:t>
-            </w:r>
-            <w:proofErr w:type="spellEnd"/>
-            <w:r>
-              <w:t xml:space="preserve"> Bil</w:t>
-            </w:r>
-          </w:p>
-        </w:tc>
-        <w:tc>
-          <w:tcPr>
-            <w:tcW w:w="3884" w:type="dxa"/>
-            <w:vMerge/>
-            <w:vAlign w:val="center"/>
-          </w:tcPr>
-          <w:p>
-            <w:pPr>
-              <w:jc w:val="center"/>
-            </w:pPr>
-          </w:p>
-        </w:tc>
-      </w:tr>
-      <w:tr>
-        <w:tc>
-          <w:tcPr>
-            <w:tcW w:w="2492" w:type="dxa"/>
-            <w:shd w:val="clear" w:color="auto" w:fill="E2EFD9" w:themeFill="accent6" w:themeFillTint="33"/>
-          </w:tcPr>
-          <w:p>
-            <w:pPr>
-              <w:jc w:val="center"/>
-            </w:pPr>
-            <w:proofErr w:type="spellStart"/>
-            <w:r>
-              <w:t>Dragodingo</w:t>
-            </w:r>
-            <w:proofErr w:type="spellEnd"/>
-          </w:p>
-        </w:tc>
-        <w:tc>
-          <w:tcPr>
-            <w:tcW w:w="3884" w:type="dxa"/>
-            <w:vMerge/>
-            <w:vAlign w:val="center"/>
-          </w:tcPr>
-          <w:p>
-            <w:pPr>
-              <w:jc w:val="center"/>
-            </w:pPr>
-          </w:p>
-        </w:tc>
-      </w:tr>
-      <w:tr>
-        <w:tc>
-          <w:tcPr>
-            <w:tcW w:w="2492" w:type="dxa"/>
-            <w:shd w:val="clear" w:color="auto" w:fill="E2EFD9" w:themeFill="accent6" w:themeFillTint="33"/>
-          </w:tcPr>
-          <w:p>
-            <w:pPr>
-              <w:jc w:val="center"/>
-            </w:pPr>
-            <w:r>
-              <w:t>Musha l’Oni</w:t>
-            </w:r>
-          </w:p>
-        </w:tc>
-        <w:tc>
-          <w:tcPr>
-            <w:tcW w:w="3884" w:type="dxa"/>
-            <w:vMerge/>
-            <w:vAlign w:val="center"/>
-          </w:tcPr>
-          <w:p>
-            <w:pPr>
-              <w:jc w:val="center"/>
-            </w:pPr>
-          </w:p>
-        </w:tc>
-      </w:tr>
-      <w:tr>
-        <w:tc>
-          <w:tcPr>
-            <w:tcW w:w="2492" w:type="dxa"/>
-            <w:shd w:val="clear" w:color="auto" w:fill="E2EFD9" w:themeFill="accent6" w:themeFillTint="33"/>
-          </w:tcPr>
-          <w:p>
-            <w:pPr>
-              <w:jc w:val="center"/>
-            </w:pPr>
-            <w:r>
-              <w:t>Tournade</w:t>
-            </w:r>
-          </w:p>
-        </w:tc>
-        <w:tc>
-          <w:tcPr>
-            <w:tcW w:w="3884" w:type="dxa"/>
-            <w:vMerge/>
-            <w:vAlign w:val="center"/>
-          </w:tcPr>
-          <w:p>
-            <w:pPr>
-              <w:jc w:val="center"/>
-            </w:pPr>
-          </w:p>
-        </w:tc>
-      </w:tr>
-      <w:tr>
-        <w:tc>
-          <w:tcPr>
-            <w:tcW w:w="2492" w:type="dxa"/>
-            <w:shd w:val="clear" w:color="auto" w:fill="E2EFD9" w:themeFill="accent6" w:themeFillTint="33"/>
-          </w:tcPr>
-          <w:p>
-            <w:pPr>
-              <w:jc w:val="center"/>
-            </w:pPr>
-            <w:r>
-              <w:t>Tyranne la terrible</w:t>
-            </w:r>
-          </w:p>
-        </w:tc>
-        <w:tc>
-          <w:tcPr>
-            <w:tcW w:w="3884" w:type="dxa"/>
-            <w:vMerge/>
-            <w:vAlign w:val="center"/>
-          </w:tcPr>
-          <w:p>
-            <w:pPr>
-              <w:jc w:val="center"/>
-            </w:pPr>
-          </w:p>
-        </w:tc>
-      </w:tr>
-      <w:tr>
-        <w:tc>
-          <w:tcPr>
-            <w:tcW w:w="2492" w:type="dxa"/>
-            <w:shd w:val="clear" w:color="auto" w:fill="E2EFD9" w:themeFill="accent6" w:themeFillTint="33"/>
-          </w:tcPr>
-          <w:p>
-            <w:pPr>
-              <w:jc w:val="center"/>
-            </w:pPr>
-            <w:proofErr w:type="spellStart"/>
-            <w:r>
-              <w:t>Degolas</w:t>
-            </w:r>
-            <w:proofErr w:type="spellEnd"/>
-          </w:p>
-        </w:tc>
-        <w:tc>
-          <w:tcPr>
-            <w:tcW w:w="3884" w:type="dxa"/>
-            <w:vMerge/>
-            <w:vAlign w:val="center"/>
-          </w:tcPr>
-          <w:p>
-            <w:pPr>
-              <w:jc w:val="center"/>
-            </w:pPr>
-          </w:p>
-        </w:tc>
-      </w:tr>
-      <w:tr>
-        <w:tc>
-          <w:tcPr>
-            <w:tcW w:w="2492" w:type="dxa"/>
-            <w:shd w:val="clear" w:color="auto" w:fill="E2EFD9" w:themeFill="accent6" w:themeFillTint="33"/>
-          </w:tcPr>
-          <w:p>
-            <w:pPr>
-              <w:jc w:val="center"/>
-            </w:pPr>
-            <w:r>
-              <w:t xml:space="preserve">Rok </w:t>
-            </w:r>
-            <w:proofErr w:type="spellStart"/>
-            <w:r>
-              <w:t>gnorok</w:t>
-            </w:r>
-            <w:proofErr w:type="spellEnd"/>
-          </w:p>
-        </w:tc>
-        <w:tc>
-          <w:tcPr>
-            <w:tcW w:w="3884" w:type="dxa"/>
-            <w:vMerge/>
-            <w:vAlign w:val="center"/>
-          </w:tcPr>
-          <w:p>
-            <w:pPr>
-              <w:jc w:val="center"/>
-            </w:pPr>
-          </w:p>
-        </w:tc>
-      </w:tr>
-      <w:tr>
-        <w:tc>
-          <w:tcPr>
-            <w:tcW w:w="2492" w:type="dxa"/>
-            <w:shd w:val="clear" w:color="auto" w:fill="E2EFD9" w:themeFill="accent6" w:themeFillTint="33"/>
-          </w:tcPr>
-          <w:p>
-            <w:pPr>
-              <w:jc w:val="center"/>
-            </w:pPr>
-            <w:proofErr w:type="spellStart"/>
-            <w:r>
-              <w:t>Simbadas</w:t>
-            </w:r>
-            <w:proofErr w:type="spellEnd"/>
-          </w:p>
-        </w:tc>
-        <w:tc>
-          <w:tcPr>
-            <w:tcW w:w="3884" w:type="dxa"/>
-            <w:vMerge/>
-            <w:vAlign w:val="center"/>
-          </w:tcPr>
-          <w:p>
-            <w:pPr>
-              <w:jc w:val="center"/>
-            </w:pPr>
-          </w:p>
-        </w:tc>
-      </w:tr>
-      <w:tr>
-        <w:tc>
-          <w:tcPr>
-            <w:tcW w:w="2492" w:type="dxa"/>
-            <w:shd w:val="clear" w:color="auto" w:fill="E2EFD9" w:themeFill="accent6" w:themeFillTint="33"/>
-          </w:tcPr>
-          <w:p>
-            <w:pPr>
-              <w:jc w:val="center"/>
-            </w:pPr>
-            <w:r>
-              <w:t>Carlita de L’</w:t>
-            </w:r>
-            <w:proofErr w:type="spellStart"/>
-            <w:r>
-              <w:t>aguerfelde</w:t>
-            </w:r>
-            <w:proofErr w:type="spellEnd"/>
-          </w:p>
-        </w:tc>
-        <w:tc>
-          <w:tcPr>
-            <w:tcW w:w="3884" w:type="dxa"/>
-            <w:vMerge/>
-            <w:vAlign w:val="center"/>
-          </w:tcPr>
-          <w:p>
-            <w:pPr>
-              <w:jc w:val="center"/>
-            </w:pPr>
-          </w:p>
-        </w:tc>
-      </w:tr>
-      <w:tr>
-        <w:tc>
-          <w:tcPr>
-            <w:tcW w:w="2492" w:type="dxa"/>
-            <w:shd w:val="clear" w:color="auto" w:fill="E2EFD9" w:themeFill="accent6" w:themeFillTint="33"/>
-          </w:tcPr>
-          <w:p>
-            <w:pPr>
-              <w:jc w:val="center"/>
-            </w:pPr>
-            <w:r>
-              <w:t>Maxi-malle</w:t>
-            </w:r>
-          </w:p>
-        </w:tc>
-        <w:tc>
-          <w:tcPr>
-            <w:tcW w:w="3884" w:type="dxa"/>
-            <w:vMerge/>
-            <w:vAlign w:val="center"/>
-          </w:tcPr>
-          <w:p>
-            <w:pPr>
-              <w:jc w:val="center"/>
-            </w:pPr>
-          </w:p>
-        </w:tc>
-      </w:tr>
-      <w:tr>
-        <w:tc>
-          <w:tcPr>
-            <w:tcW w:w="2492" w:type="dxa"/>
-            <w:shd w:val="clear" w:color="auto" w:fill="E2EFD9" w:themeFill="accent6" w:themeFillTint="33"/>
-          </w:tcPr>
-          <w:p>
-            <w:pPr>
-              <w:jc w:val="center"/>
-            </w:pPr>
-            <w:proofErr w:type="spellStart"/>
-            <w:r>
-              <w:lastRenderedPageBreak/>
-              <w:t>Naganita</w:t>
-            </w:r>
-            <w:proofErr w:type="spellEnd"/>
-          </w:p>
-        </w:tc>
-        <w:tc>
-          <w:tcPr>
-            <w:tcW w:w="3884" w:type="dxa"/>
-            <w:vMerge/>
-            <w:vAlign w:val="center"/>
-          </w:tcPr>
-          <w:p>
-            <w:pPr>
-              <w:jc w:val="center"/>
-            </w:pPr>
-          </w:p>
-        </w:tc>
-      </w:tr>
-      <w:tr>
-        <w:tc>
-          <w:tcPr>
-            <w:tcW w:w="2492" w:type="dxa"/>
-            <w:shd w:val="clear" w:color="auto" w:fill="E2EFD9" w:themeFill="accent6" w:themeFillTint="33"/>
-          </w:tcPr>
-          <w:p>
-            <w:pPr>
-              <w:jc w:val="center"/>
-            </w:pPr>
-            <w:r>
-              <w:t>Prince marchand</w:t>
-            </w:r>
-          </w:p>
-        </w:tc>
-        <w:tc>
-          <w:tcPr>
-            <w:tcW w:w="3884" w:type="dxa"/>
-            <w:vMerge/>
-            <w:vAlign w:val="center"/>
-          </w:tcPr>
-          <w:p>
-            <w:pPr>
-              <w:jc w:val="center"/>
-            </w:pPr>
-          </w:p>
-        </w:tc>
-      </w:tr>
-      <w:tr>
-        <w:tc>
-          <w:tcPr>
-            <w:tcW w:w="2492" w:type="dxa"/>
-            <w:shd w:val="clear" w:color="auto" w:fill="E2EFD9" w:themeFill="accent6" w:themeFillTint="33"/>
-          </w:tcPr>
-          <w:p>
-            <w:pPr>
-              <w:jc w:val="center"/>
-            </w:pPr>
-            <w:proofErr w:type="spellStart"/>
-            <w:r>
-              <w:t>Trukipik</w:t>
-            </w:r>
-            <w:proofErr w:type="spellEnd"/>
-          </w:p>
-        </w:tc>
-        <w:tc>
-          <w:tcPr>
-            <w:tcW w:w="3884" w:type="dxa"/>
-            <w:vMerge/>
-            <w:vAlign w:val="center"/>
-          </w:tcPr>
-          <w:p>
-            <w:pPr>
-              <w:jc w:val="center"/>
-            </w:pPr>
-          </w:p>
-        </w:tc>
-      </w:tr>
-      <w:tr>
-        <w:tc>
-          <w:tcPr>
-            <w:tcW w:w="2492" w:type="dxa"/>
-            <w:shd w:val="clear" w:color="auto" w:fill="E2EFD9" w:themeFill="accent6" w:themeFillTint="33"/>
-          </w:tcPr>
-          <w:p>
-            <w:pPr>
-              <w:jc w:val="center"/>
-            </w:pPr>
-            <w:r>
-              <w:t>Gobrechaum</w:t>
-            </w:r>
-          </w:p>
-        </w:tc>
-        <w:tc>
-          <w:tcPr>
-            <w:tcW w:w="3884" w:type="dxa"/>
-            <w:vMerge/>
-            <w:vAlign w:val="center"/>
-          </w:tcPr>
-          <w:p>
-            <w:pPr>
-              <w:jc w:val="center"/>
-            </w:pPr>
-          </w:p>
-        </w:tc>
-      </w:tr>
-      <w:tr>
-        <w:tc>
-          <w:tcPr>
-            <w:tcW w:w="2492" w:type="dxa"/>
-            <w:shd w:val="clear" w:color="auto" w:fill="E2EFD9" w:themeFill="accent6" w:themeFillTint="33"/>
-          </w:tcPr>
-          <w:p>
-            <w:pPr>
-              <w:jc w:val="center"/>
-            </w:pPr>
-            <w:proofErr w:type="spellStart"/>
-            <w:r>
-              <w:t>Vashkiwi</w:t>
-            </w:r>
-            <w:proofErr w:type="spellEnd"/>
-          </w:p>
-        </w:tc>
-        <w:tc>
-          <w:tcPr>
-            <w:tcW w:w="3884" w:type="dxa"/>
-            <w:vMerge/>
-            <w:vAlign w:val="center"/>
-          </w:tcPr>
-          <w:p>
-            <w:pPr>
-              <w:jc w:val="center"/>
-            </w:pPr>
-          </w:p>
-        </w:tc>
-      </w:tr>
-      <w:tr>
-        <w:tc>
-          <w:tcPr>
-            <w:tcW w:w="2492" w:type="dxa"/>
-            <w:shd w:val="clear" w:color="auto" w:fill="E2EFD9" w:themeFill="accent6" w:themeFillTint="33"/>
-          </w:tcPr>
-          <w:p>
-            <w:pPr>
-              <w:jc w:val="center"/>
-            </w:pPr>
-            <w:proofErr w:type="spellStart"/>
-            <w:r>
-              <w:t>Nenufor</w:t>
-            </w:r>
-            <w:proofErr w:type="spellEnd"/>
-            <w:r>
-              <w:t xml:space="preserve"> Tilotus</w:t>
-            </w:r>
-          </w:p>
-        </w:tc>
-        <w:tc>
-          <w:tcPr>
-            <w:tcW w:w="3884" w:type="dxa"/>
-            <w:vMerge/>
-            <w:vAlign w:val="center"/>
-          </w:tcPr>
-          <w:p>
-            <w:pPr>
-              <w:jc w:val="center"/>
-            </w:pPr>
-          </w:p>
-        </w:tc>
-      </w:tr>
-      <w:tr>
-        <w:tc>
-          <w:tcPr>
-            <w:tcW w:w="2492" w:type="dxa"/>
-            <w:shd w:val="clear" w:color="auto" w:fill="FFF2CC" w:themeFill="accent4" w:themeFillTint="33"/>
-          </w:tcPr>
-          <w:p>
-            <w:pPr>
-              <w:jc w:val="center"/>
-            </w:pPr>
-            <w:proofErr w:type="spellStart"/>
-            <w:r>
-              <w:t>Bouflouth</w:t>
-            </w:r>
-            <w:proofErr w:type="spellEnd"/>
-          </w:p>
-        </w:tc>
-        <w:tc>
-          <w:tcPr>
-            <w:tcW w:w="3884" w:type="dxa"/>
-            <w:vMerge w:val="restart"/>
-            <w:vAlign w:val="center"/>
-          </w:tcPr>
-          <w:p>
-            <w:pPr>
-              <w:jc w:val="center"/>
-            </w:pPr>
-            <w:r>
-              <w:t xml:space="preserve">Etoile </w:t>
-            </w:r>
-            <w:proofErr w:type="spellStart"/>
-            <w:r>
-              <w:t>level</w:t>
-            </w:r>
-            <w:proofErr w:type="spellEnd"/>
-            <w:r>
-              <w:t xml:space="preserve"> 4</w:t>
-            </w:r>
-          </w:p>
-        </w:tc>
-      </w:tr>
-      <w:tr>
-        <w:tc>
-          <w:tcPr>
-            <w:tcW w:w="2492" w:type="dxa"/>
-            <w:shd w:val="clear" w:color="auto" w:fill="FFF2CC" w:themeFill="accent4" w:themeFillTint="33"/>
-          </w:tcPr>
-          <w:p>
-            <w:pPr>
-              <w:jc w:val="center"/>
-            </w:pPr>
-            <w:proofErr w:type="spellStart"/>
-            <w:r>
-              <w:t>Morblok</w:t>
-            </w:r>
-            <w:proofErr w:type="spellEnd"/>
-          </w:p>
-        </w:tc>
-        <w:tc>
-          <w:tcPr>
-            <w:tcW w:w="3884" w:type="dxa"/>
-            <w:vMerge/>
-            <w:vAlign w:val="center"/>
-          </w:tcPr>
-          <w:p>
-            <w:pPr>
-              <w:jc w:val="center"/>
-            </w:pPr>
-          </w:p>
-        </w:tc>
-      </w:tr>
-      <w:tr>
-        <w:tc>
-          <w:tcPr>
-            <w:tcW w:w="2492" w:type="dxa"/>
-            <w:shd w:val="clear" w:color="auto" w:fill="FFF2CC" w:themeFill="accent4" w:themeFillTint="33"/>
-          </w:tcPr>
-          <w:p>
-            <w:pPr>
-              <w:jc w:val="center"/>
-            </w:pPr>
-            <w:proofErr w:type="spellStart"/>
-            <w:r>
-              <w:t>Jérart</w:t>
-            </w:r>
-            <w:proofErr w:type="spellEnd"/>
-            <w:r>
-              <w:t xml:space="preserve"> Dupaindur</w:t>
-            </w:r>
-          </w:p>
-        </w:tc>
-        <w:tc>
-          <w:tcPr>
-            <w:tcW w:w="3884" w:type="dxa"/>
-            <w:vMerge/>
-            <w:vAlign w:val="center"/>
-          </w:tcPr>
-          <w:p>
-            <w:pPr>
-              <w:jc w:val="center"/>
-            </w:pPr>
-          </w:p>
-        </w:tc>
-      </w:tr>
-      <w:tr>
-        <w:tc>
-          <w:tcPr>
-            <w:tcW w:w="2492" w:type="dxa"/>
-            <w:shd w:val="clear" w:color="auto" w:fill="FFF2CC" w:themeFill="accent4" w:themeFillTint="33"/>
-          </w:tcPr>
-          <w:p>
-            <w:pPr>
-              <w:jc w:val="center"/>
-            </w:pPr>
-            <w:r>
-              <w:t>Monsieur Pingouin</w:t>
-            </w:r>
-          </w:p>
-        </w:tc>
-        <w:tc>
-          <w:tcPr>
-            <w:tcW w:w="3884" w:type="dxa"/>
-            <w:vMerge/>
-            <w:vAlign w:val="center"/>
-          </w:tcPr>
-          <w:p>
-            <w:pPr>
-              <w:jc w:val="center"/>
-            </w:pPr>
-          </w:p>
-        </w:tc>
-      </w:tr>
-      <w:tr>
-        <w:tc>
-          <w:tcPr>
-            <w:tcW w:w="2492" w:type="dxa"/>
-            <w:shd w:val="clear" w:color="auto" w:fill="FFF2CC" w:themeFill="accent4" w:themeFillTint="33"/>
-          </w:tcPr>
-          <w:p>
-            <w:pPr>
-              <w:jc w:val="center"/>
-            </w:pPr>
-            <w:proofErr w:type="spellStart"/>
-            <w:r>
-              <w:t>Padgref</w:t>
-            </w:r>
-            <w:proofErr w:type="spellEnd"/>
-            <w:r>
-              <w:t xml:space="preserve"> Demoël</w:t>
-            </w:r>
-          </w:p>
-        </w:tc>
-        <w:tc>
-          <w:tcPr>
-            <w:tcW w:w="3884" w:type="dxa"/>
-            <w:vMerge/>
-            <w:vAlign w:val="center"/>
-          </w:tcPr>
-          <w:p>
-            <w:pPr>
-              <w:jc w:val="center"/>
-            </w:pPr>
-          </w:p>
-        </w:tc>
-      </w:tr>
-      <w:tr>
-        <w:tc>
-          <w:tcPr>
-            <w:tcW w:w="2492" w:type="dxa"/>
-            <w:shd w:val="clear" w:color="auto" w:fill="FFF2CC" w:themeFill="accent4" w:themeFillTint="33"/>
-          </w:tcPr>
-          <w:p>
-            <w:pPr>
-              <w:jc w:val="center"/>
-            </w:pPr>
-            <w:r>
-              <w:t xml:space="preserve">Roi </w:t>
-            </w:r>
-            <w:proofErr w:type="spellStart"/>
-            <w:r>
-              <w:t>Camole</w:t>
-            </w:r>
-            <w:proofErr w:type="spellEnd"/>
-          </w:p>
-        </w:tc>
-        <w:tc>
-          <w:tcPr>
-            <w:tcW w:w="3884" w:type="dxa"/>
-            <w:vMerge/>
-            <w:vAlign w:val="center"/>
-          </w:tcPr>
-          <w:p>
-            <w:pPr>
-              <w:jc w:val="center"/>
-            </w:pPr>
-          </w:p>
-        </w:tc>
-      </w:tr>
-      <w:tr>
-        <w:tc>
-          <w:tcPr>
-            <w:tcW w:w="2492" w:type="dxa"/>
-            <w:shd w:val="clear" w:color="auto" w:fill="FFF2CC" w:themeFill="accent4" w:themeFillTint="33"/>
-          </w:tcPr>
-          <w:p>
-            <w:pPr>
-              <w:jc w:val="center"/>
-            </w:pPr>
-            <w:r>
-              <w:t>Amy l’empoisonneuse</w:t>
-            </w:r>
-          </w:p>
-        </w:tc>
-        <w:tc>
-          <w:tcPr>
-            <w:tcW w:w="3884" w:type="dxa"/>
-            <w:vMerge/>
-            <w:vAlign w:val="center"/>
-          </w:tcPr>
-          <w:p>
-            <w:pPr>
-              <w:jc w:val="center"/>
-            </w:pPr>
-          </w:p>
-        </w:tc>
-      </w:tr>
-      <w:tr>
-        <w:tc>
-          <w:tcPr>
-            <w:tcW w:w="2492" w:type="dxa"/>
-            <w:shd w:val="clear" w:color="auto" w:fill="FFF2CC" w:themeFill="accent4" w:themeFillTint="33"/>
-          </w:tcPr>
-          <w:p>
-            <w:pPr>
-              <w:jc w:val="center"/>
-            </w:pPr>
-            <w:r>
-              <w:t>Ali Grothor</w:t>
-            </w:r>
-          </w:p>
-        </w:tc>
-        <w:tc>
-          <w:tcPr>
-            <w:tcW w:w="3884" w:type="dxa"/>
-            <w:vMerge/>
-            <w:vAlign w:val="center"/>
-          </w:tcPr>
-          <w:p>
-            <w:pPr>
-              <w:jc w:val="center"/>
-            </w:pPr>
-          </w:p>
-        </w:tc>
-      </w:tr>
-      <w:tr>
-        <w:tc>
-          <w:tcPr>
-            <w:tcW w:w="2492" w:type="dxa"/>
-            <w:shd w:val="clear" w:color="auto" w:fill="FFF2CC" w:themeFill="accent4" w:themeFillTint="33"/>
-          </w:tcPr>
-          <w:p>
-            <w:pPr>
-              <w:jc w:val="center"/>
-            </w:pPr>
-            <w:r>
-              <w:t>Darma</w:t>
-            </w:r>
-          </w:p>
-        </w:tc>
-        <w:tc>
-          <w:tcPr>
-            <w:tcW w:w="3884" w:type="dxa"/>
-            <w:vMerge/>
-            <w:vAlign w:val="center"/>
-          </w:tcPr>
-          <w:p>
-            <w:pPr>
-              <w:jc w:val="center"/>
-            </w:pPr>
-          </w:p>
-        </w:tc>
-      </w:tr>
-      <w:tr>
-        <w:tc>
-          <w:tcPr>
-            <w:tcW w:w="2492" w:type="dxa"/>
-            <w:shd w:val="clear" w:color="auto" w:fill="FFF2CC" w:themeFill="accent4" w:themeFillTint="33"/>
-          </w:tcPr>
-          <w:p>
-            <w:pPr>
-              <w:jc w:val="center"/>
-            </w:pPr>
-            <w:proofErr w:type="spellStart"/>
-            <w:r>
-              <w:t>Fojumo</w:t>
-            </w:r>
-            <w:proofErr w:type="spellEnd"/>
-          </w:p>
-        </w:tc>
-        <w:tc>
-          <w:tcPr>
-            <w:tcW w:w="3884" w:type="dxa"/>
-            <w:vMerge/>
-            <w:vAlign w:val="center"/>
-          </w:tcPr>
-          <w:p>
-            <w:pPr>
-              <w:jc w:val="center"/>
-            </w:pPr>
-          </w:p>
-        </w:tc>
-      </w:tr>
-      <w:tr>
-        <w:tc>
-          <w:tcPr>
-            <w:tcW w:w="2492" w:type="dxa"/>
-            <w:shd w:val="clear" w:color="auto" w:fill="FFF2CC" w:themeFill="accent4" w:themeFillTint="33"/>
-          </w:tcPr>
-          <w:p>
-            <w:pPr>
-              <w:jc w:val="center"/>
-            </w:pPr>
-            <w:proofErr w:type="spellStart"/>
-            <w:r>
-              <w:t>Katigrou</w:t>
-            </w:r>
-            <w:proofErr w:type="spellEnd"/>
-          </w:p>
-        </w:tc>
-        <w:tc>
-          <w:tcPr>
-            <w:tcW w:w="3884" w:type="dxa"/>
-            <w:vMerge/>
-            <w:vAlign w:val="center"/>
-          </w:tcPr>
-          <w:p>
-            <w:pPr>
-              <w:jc w:val="center"/>
-            </w:pPr>
-          </w:p>
-        </w:tc>
-      </w:tr>
-      <w:tr>
-        <w:tc>
-          <w:tcPr>
-            <w:tcW w:w="2492" w:type="dxa"/>
-            <w:shd w:val="clear" w:color="auto" w:fill="FFF2CC" w:themeFill="accent4" w:themeFillTint="33"/>
-          </w:tcPr>
-          <w:p>
-            <w:pPr>
-              <w:jc w:val="center"/>
-            </w:pPr>
-            <w:proofErr w:type="spellStart"/>
-            <w:r>
-              <w:t>Pantèroz</w:t>
-            </w:r>
-            <w:proofErr w:type="spellEnd"/>
-          </w:p>
-        </w:tc>
-        <w:tc>
-          <w:tcPr>
-            <w:tcW w:w="3884" w:type="dxa"/>
-            <w:vMerge/>
-            <w:vAlign w:val="center"/>
-          </w:tcPr>
-          <w:p>
-            <w:pPr>
-              <w:jc w:val="center"/>
-            </w:pPr>
-          </w:p>
-        </w:tc>
-      </w:tr>
-      <w:tr>
-        <w:tc>
-          <w:tcPr>
-            <w:tcW w:w="2492" w:type="dxa"/>
-            <w:shd w:val="clear" w:color="auto" w:fill="FFF2CC" w:themeFill="accent4" w:themeFillTint="33"/>
-          </w:tcPr>
-          <w:p>
-            <w:pPr>
-              <w:jc w:val="center"/>
-            </w:pPr>
-            <w:proofErr w:type="spellStart"/>
-            <w:r>
-              <w:t>Aigripoil</w:t>
-            </w:r>
-            <w:proofErr w:type="spellEnd"/>
-          </w:p>
-        </w:tc>
-        <w:tc>
-          <w:tcPr>
-            <w:tcW w:w="3884" w:type="dxa"/>
-            <w:vMerge/>
-            <w:vAlign w:val="center"/>
-          </w:tcPr>
-          <w:p>
-            <w:pPr>
-              <w:jc w:val="center"/>
-            </w:pPr>
-          </w:p>
-        </w:tc>
-      </w:tr>
-      <w:tr>
-        <w:tc>
-          <w:tcPr>
-            <w:tcW w:w="2492" w:type="dxa"/>
-            <w:shd w:val="clear" w:color="auto" w:fill="FFF2CC" w:themeFill="accent4" w:themeFillTint="33"/>
-          </w:tcPr>
-          <w:p>
-            <w:pPr>
-              <w:jc w:val="center"/>
-            </w:pPr>
-            <w:proofErr w:type="spellStart"/>
-            <w:r>
-              <w:t>Mogligli</w:t>
-            </w:r>
-            <w:proofErr w:type="spellEnd"/>
-          </w:p>
-        </w:tc>
-        <w:tc>
-          <w:tcPr>
-            <w:tcW w:w="3884" w:type="dxa"/>
-            <w:vMerge/>
-            <w:vAlign w:val="center"/>
-          </w:tcPr>
-          <w:p>
-            <w:pPr>
-              <w:jc w:val="center"/>
-            </w:pPr>
-          </w:p>
-        </w:tc>
-      </w:tr>
-      <w:tr>
-        <w:tc>
-          <w:tcPr>
-            <w:tcW w:w="2492" w:type="dxa"/>
-            <w:shd w:val="clear" w:color="auto" w:fill="FFF2CC" w:themeFill="accent4" w:themeFillTint="33"/>
-          </w:tcPr>
-          <w:p>
-            <w:pPr>
-              <w:jc w:val="center"/>
-            </w:pPr>
-            <w:proofErr w:type="spellStart"/>
-            <w:r>
-              <w:t>Fantômayte</w:t>
-            </w:r>
-            <w:proofErr w:type="spellEnd"/>
-          </w:p>
-        </w:tc>
-        <w:tc>
-          <w:tcPr>
-            <w:tcW w:w="3884" w:type="dxa"/>
-            <w:vMerge/>
-            <w:vAlign w:val="center"/>
-          </w:tcPr>
-          <w:p>
-            <w:pPr>
-              <w:jc w:val="center"/>
-            </w:pPr>
-          </w:p>
-        </w:tc>
-      </w:tr>
-      <w:tr>
-        <w:tc>
-          <w:tcPr>
-            <w:tcW w:w="2492" w:type="dxa"/>
-            <w:shd w:val="clear" w:color="auto" w:fill="FFF2CC" w:themeFill="accent4" w:themeFillTint="33"/>
-          </w:tcPr>
-          <w:p>
-            <w:pPr>
-              <w:jc w:val="center"/>
-            </w:pPr>
-            <w:proofErr w:type="spellStart"/>
-            <w:r>
-              <w:t>Zatoïshwan</w:t>
-            </w:r>
-            <w:proofErr w:type="spellEnd"/>
-          </w:p>
-        </w:tc>
-        <w:tc>
-          <w:tcPr>
-            <w:tcW w:w="3884" w:type="dxa"/>
-            <w:vMerge/>
-            <w:vAlign w:val="center"/>
-          </w:tcPr>
-          <w:p>
-            <w:pPr>
-              <w:jc w:val="center"/>
-            </w:pPr>
-          </w:p>
-        </w:tc>
-      </w:tr>
-      <w:tr>
-        <w:tc>
-          <w:tcPr>
-            <w:tcW w:w="2492" w:type="dxa"/>
-            <w:shd w:val="clear" w:color="auto" w:fill="FFF2CC" w:themeFill="accent4" w:themeFillTint="33"/>
-          </w:tcPr>
-          <w:p>
-            <w:pPr>
-              <w:jc w:val="center"/>
-            </w:pPr>
-            <w:proofErr w:type="spellStart"/>
-            <w:r>
-              <w:t>Anatak</w:t>
-            </w:r>
-            <w:proofErr w:type="spellEnd"/>
-            <w:r>
-              <w:t xml:space="preserve"> </w:t>
-            </w:r>
-            <w:proofErr w:type="spellStart"/>
-            <w:r>
-              <w:t>Diskedor</w:t>
-            </w:r>
-            <w:proofErr w:type="spellEnd"/>
-          </w:p>
-        </w:tc>
-        <w:tc>
-          <w:tcPr>
-            <w:tcW w:w="3884" w:type="dxa"/>
-            <w:vMerge/>
-            <w:vAlign w:val="center"/>
-          </w:tcPr>
-          <w:p>
-            <w:pPr>
-              <w:jc w:val="center"/>
-            </w:pPr>
-          </w:p>
-        </w:tc>
-      </w:tr>
-      <w:tr>
-        <w:tc>
-          <w:tcPr>
-            <w:tcW w:w="2492" w:type="dxa"/>
-            <w:shd w:val="clear" w:color="auto" w:fill="FFF2CC" w:themeFill="accent4" w:themeFillTint="33"/>
-          </w:tcPr>
-          <w:p>
-            <w:pPr>
-              <w:jc w:val="center"/>
-            </w:pPr>
-            <w:proofErr w:type="spellStart"/>
-            <w:r>
-              <w:t>Glandaf</w:t>
-            </w:r>
-            <w:proofErr w:type="spellEnd"/>
-            <w:r>
-              <w:t xml:space="preserve"> l’Aigri</w:t>
-            </w:r>
-          </w:p>
-        </w:tc>
-        <w:tc>
-          <w:tcPr>
-            <w:tcW w:w="3884" w:type="dxa"/>
-            <w:vMerge/>
-            <w:vAlign w:val="center"/>
-          </w:tcPr>
-          <w:p>
-            <w:pPr>
-              <w:jc w:val="center"/>
-            </w:pPr>
-          </w:p>
-        </w:tc>
-      </w:tr>
-      <w:tr>
-        <w:tc>
-          <w:tcPr>
-            <w:tcW w:w="2492" w:type="dxa"/>
-            <w:shd w:val="clear" w:color="auto" w:fill="FFF2CC" w:themeFill="accent4" w:themeFillTint="33"/>
-          </w:tcPr>
-          <w:p>
-            <w:pPr>
-              <w:jc w:val="center"/>
-            </w:pPr>
-            <w:proofErr w:type="spellStart"/>
-            <w:r>
-              <w:t>Crasper</w:t>
-            </w:r>
-            <w:proofErr w:type="spellEnd"/>
-          </w:p>
-        </w:tc>
-        <w:tc>
-          <w:tcPr>
-            <w:tcW w:w="3884" w:type="dxa"/>
-            <w:vMerge/>
-            <w:vAlign w:val="center"/>
-          </w:tcPr>
-          <w:p>
-            <w:pPr>
-              <w:jc w:val="center"/>
-            </w:pPr>
-          </w:p>
-        </w:tc>
-      </w:tr>
-      <w:tr>
-        <w:tc>
-          <w:tcPr>
-            <w:tcW w:w="2492" w:type="dxa"/>
-            <w:shd w:val="clear" w:color="auto" w:fill="FFF2CC" w:themeFill="accent4" w:themeFillTint="33"/>
-          </w:tcPr>
-          <w:p>
-            <w:pPr>
-              <w:jc w:val="center"/>
-            </w:pPr>
-            <w:proofErr w:type="spellStart"/>
-            <w:r>
-              <w:t>Vengeuse</w:t>
-            </w:r>
-            <w:proofErr w:type="spellEnd"/>
-            <w:r>
-              <w:t xml:space="preserve"> masquée</w:t>
-            </w:r>
-          </w:p>
-        </w:tc>
-        <w:tc>
-          <w:tcPr>
-            <w:tcW w:w="3884" w:type="dxa"/>
-            <w:vMerge/>
-            <w:vAlign w:val="center"/>
-          </w:tcPr>
-          <w:p>
-            <w:pPr>
-              <w:jc w:val="center"/>
-            </w:pPr>
-          </w:p>
-        </w:tc>
-      </w:tr>
-      <w:tr>
-        <w:tc>
-          <w:tcPr>
-            <w:tcW w:w="2492" w:type="dxa"/>
-            <w:shd w:val="clear" w:color="auto" w:fill="FFF2CC" w:themeFill="accent4" w:themeFillTint="33"/>
-          </w:tcPr>
-          <w:p>
-            <w:pPr>
-              <w:jc w:val="center"/>
-            </w:pPr>
-            <w:r>
-              <w:t>Hin</w:t>
-            </w:r>
-          </w:p>
-        </w:tc>
-        <w:tc>
-          <w:tcPr>
-            <w:tcW w:w="3884" w:type="dxa"/>
-            <w:vMerge/>
-            <w:vAlign w:val="center"/>
-          </w:tcPr>
-          <w:p>
-            <w:pPr>
-              <w:jc w:val="center"/>
-            </w:pPr>
-          </w:p>
-        </w:tc>
-      </w:tr>
-      <w:tr>
-        <w:tc>
-          <w:tcPr>
-            <w:tcW w:w="2492" w:type="dxa"/>
-            <w:shd w:val="clear" w:color="auto" w:fill="FFF2CC" w:themeFill="accent4" w:themeFillTint="33"/>
-          </w:tcPr>
-          <w:p>
-            <w:pPr>
-              <w:jc w:val="center"/>
-            </w:pPr>
-            <w:proofErr w:type="spellStart"/>
-            <w:r>
-              <w:t>Ka’Youloud</w:t>
-            </w:r>
-            <w:proofErr w:type="spellEnd"/>
-          </w:p>
-        </w:tc>
-        <w:tc>
-          <w:tcPr>
-            <w:tcW w:w="3884" w:type="dxa"/>
-            <w:vMerge/>
-            <w:vAlign w:val="center"/>
-          </w:tcPr>
-          <w:p>
-            <w:pPr>
-              <w:jc w:val="center"/>
-            </w:pPr>
-          </w:p>
-        </w:tc>
-      </w:tr>
-      <w:tr>
-        <w:tc>
-          <w:tcPr>
-            <w:tcW w:w="2492" w:type="dxa"/>
-            <w:shd w:val="clear" w:color="auto" w:fill="C9A6E4"/>
-          </w:tcPr>
-          <w:p>
-            <w:pPr>
-              <w:jc w:val="center"/>
-            </w:pPr>
-            <w:proofErr w:type="spellStart"/>
-            <w:r>
-              <w:t>YeCh’Ti</w:t>
-            </w:r>
-            <w:proofErr w:type="spellEnd"/>
-          </w:p>
-        </w:tc>
-        <w:tc>
-          <w:tcPr>
-            <w:tcW w:w="3884" w:type="dxa"/>
-            <w:vMerge w:val="restart"/>
-            <w:vAlign w:val="center"/>
-          </w:tcPr>
-          <w:p>
-            <w:pPr>
-              <w:jc w:val="center"/>
-            </w:pPr>
-            <w:r>
-              <w:t xml:space="preserve">Etoile </w:t>
-            </w:r>
-            <w:proofErr w:type="spellStart"/>
-            <w:r>
-              <w:t>level</w:t>
-            </w:r>
-            <w:proofErr w:type="spellEnd"/>
-            <w:r>
-              <w:t xml:space="preserve"> 5</w:t>
-            </w:r>
-          </w:p>
-        </w:tc>
-      </w:tr>
-      <w:tr>
-        <w:tc>
-          <w:tcPr>
-            <w:tcW w:w="2492" w:type="dxa"/>
-            <w:shd w:val="clear" w:color="auto" w:fill="C9A6E4"/>
-          </w:tcPr>
-          <w:p>
-            <w:pPr>
-              <w:jc w:val="center"/>
-            </w:pPr>
-            <w:r>
-              <w:t>Carter le Pillard</w:t>
-            </w:r>
-          </w:p>
-        </w:tc>
-        <w:tc>
-          <w:tcPr>
-            <w:tcW w:w="3884" w:type="dxa"/>
-            <w:vMerge/>
-            <w:vAlign w:val="center"/>
-          </w:tcPr>
-          <w:p>
-            <w:pPr>
-              <w:jc w:val="center"/>
-            </w:pPr>
-          </w:p>
-        </w:tc>
-      </w:tr>
-      <w:tr>
-        <w:tc>
-          <w:tcPr>
-            <w:tcW w:w="2492" w:type="dxa"/>
-            <w:shd w:val="clear" w:color="auto" w:fill="C9A6E4"/>
-          </w:tcPr>
-          <w:p>
-            <w:pPr>
-              <w:jc w:val="center"/>
-            </w:pPr>
-            <w:proofErr w:type="spellStart"/>
-            <w:r>
-              <w:t>Dremoan</w:t>
-            </w:r>
-            <w:proofErr w:type="spellEnd"/>
-          </w:p>
-        </w:tc>
-        <w:tc>
-          <w:tcPr>
-            <w:tcW w:w="3884" w:type="dxa"/>
-            <w:vMerge/>
-            <w:vAlign w:val="center"/>
-          </w:tcPr>
-          <w:p>
-            <w:pPr>
-              <w:jc w:val="center"/>
-            </w:pPr>
-          </w:p>
-        </w:tc>
-      </w:tr>
-      <w:tr>
-        <w:tc>
-          <w:tcPr>
-            <w:tcW w:w="2492" w:type="dxa"/>
-            <w:shd w:val="clear" w:color="auto" w:fill="C9A6E4"/>
-          </w:tcPr>
-          <w:p>
-            <w:pPr>
-              <w:jc w:val="center"/>
-            </w:pPr>
-            <w:r>
-              <w:t>Guerrier du K.O</w:t>
-            </w:r>
-          </w:p>
-        </w:tc>
-        <w:tc>
-          <w:tcPr>
-            <w:tcW w:w="3884" w:type="dxa"/>
-            <w:vMerge/>
-            <w:vAlign w:val="center"/>
-          </w:tcPr>
-          <w:p>
-            <w:pPr>
-              <w:jc w:val="center"/>
-            </w:pPr>
-          </w:p>
-        </w:tc>
-      </w:tr>
-      <w:tr>
-        <w:tc>
-          <w:tcPr>
-            <w:tcW w:w="2492" w:type="dxa"/>
-            <w:shd w:val="clear" w:color="auto" w:fill="C9A6E4"/>
-          </w:tcPr>
-          <w:p>
-            <w:pPr>
-              <w:jc w:val="center"/>
-            </w:pPr>
-            <w:proofErr w:type="spellStart"/>
-            <w:r>
-              <w:t>Mouchâme</w:t>
-            </w:r>
-            <w:proofErr w:type="spellEnd"/>
-          </w:p>
-        </w:tc>
-        <w:tc>
-          <w:tcPr>
-            <w:tcW w:w="3884" w:type="dxa"/>
-            <w:vMerge/>
-            <w:vAlign w:val="center"/>
-          </w:tcPr>
-          <w:p>
-            <w:pPr>
-              <w:jc w:val="center"/>
-            </w:pPr>
-          </w:p>
-        </w:tc>
-      </w:tr>
-      <w:tr>
-        <w:tc>
-          <w:tcPr>
-            <w:tcW w:w="2492" w:type="dxa"/>
-            <w:shd w:val="clear" w:color="auto" w:fill="C9A6E4"/>
-          </w:tcPr>
-          <w:p>
-            <w:pPr>
-              <w:jc w:val="center"/>
-            </w:pPr>
-            <w:r>
-              <w:t>Shushu Debruk</w:t>
-            </w:r>
-          </w:p>
-        </w:tc>
-        <w:tc>
-          <w:tcPr>
-            <w:tcW w:w="3884" w:type="dxa"/>
-            <w:vMerge/>
-            <w:vAlign w:val="center"/>
-          </w:tcPr>
-          <w:p>
-            <w:pPr>
-              <w:jc w:val="center"/>
-            </w:pPr>
-          </w:p>
-        </w:tc>
-      </w:tr>
-      <w:tr>
-        <w:tc>
-          <w:tcPr>
-            <w:tcW w:w="2492" w:type="dxa"/>
-            <w:shd w:val="clear" w:color="auto" w:fill="C9A6E4"/>
-          </w:tcPr>
-          <w:p>
-            <w:pPr>
-              <w:jc w:val="center"/>
-            </w:pPr>
-            <w:r>
-              <w:t>Docteur Eggob</w:t>
-            </w:r>
-          </w:p>
-        </w:tc>
-        <w:tc>
-          <w:tcPr>
-            <w:tcW w:w="3884" w:type="dxa"/>
-            <w:vMerge/>
-            <w:vAlign w:val="center"/>
-          </w:tcPr>
-          <w:p>
-            <w:pPr>
-              <w:jc w:val="center"/>
-            </w:pPr>
-          </w:p>
-        </w:tc>
-      </w:tr>
-      <w:tr>
-        <w:tc>
-          <w:tcPr>
-            <w:tcW w:w="2492" w:type="dxa"/>
-            <w:shd w:val="clear" w:color="auto" w:fill="C9A6E4"/>
-          </w:tcPr>
-          <w:p>
-            <w:pPr>
-              <w:jc w:val="center"/>
-            </w:pPr>
-            <w:proofErr w:type="spellStart"/>
-            <w:r>
-              <w:t>Flasho</w:t>
-            </w:r>
-            <w:proofErr w:type="spellEnd"/>
-          </w:p>
-        </w:tc>
-        <w:tc>
-          <w:tcPr>
-            <w:tcW w:w="3884" w:type="dxa"/>
-            <w:vMerge/>
-            <w:vAlign w:val="center"/>
-          </w:tcPr>
-          <w:p>
-            <w:pPr>
-              <w:jc w:val="center"/>
-            </w:pPr>
-          </w:p>
-        </w:tc>
-      </w:tr>
-      <w:tr>
-        <w:tc>
-          <w:tcPr>
-            <w:tcW w:w="2492" w:type="dxa"/>
-            <w:shd w:val="clear" w:color="auto" w:fill="C9A6E4"/>
-          </w:tcPr>
-          <w:p>
-            <w:pPr>
-              <w:jc w:val="center"/>
-            </w:pPr>
-            <w:proofErr w:type="spellStart"/>
-            <w:r>
-              <w:t>Predagob</w:t>
-            </w:r>
-            <w:proofErr w:type="spellEnd"/>
-          </w:p>
-        </w:tc>
-        <w:tc>
-          <w:tcPr>
-            <w:tcW w:w="3884" w:type="dxa"/>
-            <w:vMerge/>
-            <w:vAlign w:val="center"/>
-          </w:tcPr>
-          <w:p>
-            <w:pPr>
-              <w:jc w:val="center"/>
-            </w:pPr>
-          </w:p>
-        </w:tc>
-      </w:tr>
-      <w:tr>
-        <w:tc>
-          <w:tcPr>
-            <w:tcW w:w="2492" w:type="dxa"/>
-            <w:shd w:val="clear" w:color="auto" w:fill="C9A6E4"/>
-          </w:tcPr>
-          <w:p>
-            <w:pPr>
-              <w:jc w:val="center"/>
-            </w:pPr>
-            <w:r>
-              <w:t>Sans visage</w:t>
-            </w:r>
-          </w:p>
-        </w:tc>
-        <w:tc>
-          <w:tcPr>
-            <w:tcW w:w="3884" w:type="dxa"/>
-            <w:vMerge/>
-            <w:vAlign w:val="center"/>
-          </w:tcPr>
-          <w:p>
-            <w:pPr>
-              <w:jc w:val="center"/>
-            </w:pPr>
-          </w:p>
-        </w:tc>
-      </w:tr>
-      <w:tr>
-        <w:tc>
-          <w:tcPr>
-            <w:tcW w:w="2492" w:type="dxa"/>
-            <w:shd w:val="clear" w:color="auto" w:fill="C9A6E4"/>
-          </w:tcPr>
-          <w:p>
-            <w:pPr>
-              <w:jc w:val="center"/>
-            </w:pPr>
-            <w:r>
-              <w:t xml:space="preserve">Viti </w:t>
-            </w:r>
-            <w:proofErr w:type="spellStart"/>
-            <w:r>
-              <w:t>Glourson</w:t>
-            </w:r>
-            <w:proofErr w:type="spellEnd"/>
-          </w:p>
-        </w:tc>
-        <w:tc>
-          <w:tcPr>
-            <w:tcW w:w="3884" w:type="dxa"/>
-            <w:vMerge/>
-            <w:vAlign w:val="center"/>
-          </w:tcPr>
-          <w:p>
-            <w:pPr>
-              <w:jc w:val="center"/>
-            </w:pPr>
-          </w:p>
-        </w:tc>
-      </w:tr>
-      <w:tr>
-        <w:tc>
-          <w:tcPr>
-            <w:tcW w:w="2492" w:type="dxa"/>
-            <w:shd w:val="clear" w:color="auto" w:fill="C9A6E4"/>
-          </w:tcPr>
-          <w:p>
-            <w:pPr>
-              <w:jc w:val="center"/>
-            </w:pPr>
-            <w:proofErr w:type="spellStart"/>
-            <w:r>
-              <w:t>Hyperscampe</w:t>
-            </w:r>
-            <w:proofErr w:type="spellEnd"/>
-          </w:p>
-        </w:tc>
-        <w:tc>
-          <w:tcPr>
-            <w:tcW w:w="3884" w:type="dxa"/>
-            <w:vMerge/>
-            <w:vAlign w:val="center"/>
-          </w:tcPr>
-          <w:p>
-            <w:pPr>
-              <w:jc w:val="center"/>
-            </w:pPr>
-          </w:p>
-        </w:tc>
-      </w:tr>
-      <w:tr>
-        <w:tc>
-          <w:tcPr>
-            <w:tcW w:w="2492" w:type="dxa"/>
-            <w:shd w:val="clear" w:color="auto" w:fill="FFA7A7"/>
-          </w:tcPr>
-          <w:p>
-            <w:pPr>
-              <w:jc w:val="center"/>
-            </w:pPr>
-            <w:r>
-              <w:t xml:space="preserve">Le Fantôme </w:t>
-            </w:r>
-            <w:proofErr w:type="spellStart"/>
-            <w:r>
-              <w:t>Braïdeur</w:t>
-            </w:r>
-            <w:proofErr w:type="spellEnd"/>
-          </w:p>
-        </w:tc>
-        <w:tc>
-          <w:tcPr>
-            <w:tcW w:w="3884" w:type="dxa"/>
-            <w:vMerge w:val="restart"/>
-            <w:vAlign w:val="center"/>
-          </w:tcPr>
-          <w:p>
-            <w:pPr>
-              <w:jc w:val="center"/>
-            </w:pPr>
-            <w:r>
-              <w:t xml:space="preserve">Etoile </w:t>
-            </w:r>
-            <w:proofErr w:type="spellStart"/>
-            <w:r>
-              <w:t>level</w:t>
-            </w:r>
-            <w:proofErr w:type="spellEnd"/>
-            <w:r>
-              <w:t xml:space="preserve"> 6</w:t>
-            </w:r>
-          </w:p>
-        </w:tc>
-      </w:tr>
-      <w:tr>
-        <w:tc>
-          <w:tcPr>
-            <w:tcW w:w="2492" w:type="dxa"/>
-            <w:shd w:val="clear" w:color="auto" w:fill="FFA7A7"/>
-          </w:tcPr>
-          <w:p>
-            <w:pPr>
-              <w:jc w:val="center"/>
-            </w:pPr>
-            <w:r>
-              <w:t xml:space="preserve">Grand </w:t>
-            </w:r>
-            <w:proofErr w:type="spellStart"/>
-            <w:r>
-              <w:t>Kongoku</w:t>
-            </w:r>
-            <w:proofErr w:type="spellEnd"/>
-          </w:p>
-        </w:tc>
-        <w:tc>
-          <w:tcPr>
-            <w:tcW w:w="3884" w:type="dxa"/>
-            <w:vMerge/>
-          </w:tcPr>
-          <w:p>
-            <w:pPr>
-              <w:jc w:val="center"/>
-            </w:pPr>
-          </w:p>
-        </w:tc>
-      </w:tr>
-      <w:tr>
-        <w:tc>
-          <w:tcPr>
-            <w:tcW w:w="2492" w:type="dxa"/>
-            <w:shd w:val="clear" w:color="auto" w:fill="FFA7A7"/>
-          </w:tcPr>
-          <w:p>
-            <w:pPr>
-              <w:jc w:val="center"/>
-            </w:pPr>
-            <w:proofErr w:type="spellStart"/>
-            <w:r>
-              <w:t>Glourdorak</w:t>
-            </w:r>
-            <w:proofErr w:type="spellEnd"/>
-          </w:p>
-        </w:tc>
-        <w:tc>
-          <w:tcPr>
-            <w:tcW w:w="3884" w:type="dxa"/>
-            <w:vMerge/>
-          </w:tcPr>
-          <w:p>
-            <w:pPr>
-              <w:jc w:val="center"/>
-            </w:pPr>
-          </w:p>
-        </w:tc>
-      </w:tr>
-      <w:tr>
-        <w:tc>
-          <w:tcPr>
-            <w:tcW w:w="2492" w:type="dxa"/>
-            <w:shd w:val="clear" w:color="auto" w:fill="FFA7A7"/>
-          </w:tcPr>
-          <w:p>
-            <w:pPr>
-              <w:jc w:val="center"/>
-            </w:pPr>
-            <w:r>
-              <w:t>Chevalier de glace</w:t>
-            </w:r>
-          </w:p>
-        </w:tc>
-        <w:tc>
-          <w:tcPr>
-            <w:tcW w:w="3884" w:type="dxa"/>
-            <w:vMerge/>
-          </w:tcPr>
-          <w:p>
-            <w:pPr>
-              <w:jc w:val="center"/>
-            </w:pPr>
-          </w:p>
-        </w:tc>
-      </w:tr>
-      <w:tr>
-        <w:tc>
-          <w:tcPr>
-            <w:tcW w:w="2492" w:type="dxa"/>
-            <w:shd w:val="clear" w:color="auto" w:fill="FFA7A7"/>
-          </w:tcPr>
-          <w:p>
-            <w:pPr>
-              <w:jc w:val="center"/>
-            </w:pPr>
-            <w:proofErr w:type="spellStart"/>
-            <w:r>
-              <w:t>Mekamouth</w:t>
-            </w:r>
-            <w:proofErr w:type="spellEnd"/>
-          </w:p>
-        </w:tc>
-        <w:tc>
-          <w:tcPr>
-            <w:tcW w:w="3884" w:type="dxa"/>
-            <w:vMerge/>
-          </w:tcPr>
-          <w:p>
-            <w:pPr>
-              <w:jc w:val="center"/>
-            </w:pPr>
-          </w:p>
-        </w:tc>
-      </w:tr>
-      <w:tr>
-        <w:tc>
-          <w:tcPr>
-            <w:tcW w:w="2492" w:type="dxa"/>
-            <w:shd w:val="clear" w:color="auto" w:fill="FFA7A7"/>
-          </w:tcPr>
-          <w:p>
-            <w:pPr>
-              <w:jc w:val="center"/>
-            </w:pPr>
-            <w:proofErr w:type="spellStart"/>
-            <w:r>
-              <w:t>Psikopompe</w:t>
-            </w:r>
-            <w:proofErr w:type="spellEnd"/>
-          </w:p>
-        </w:tc>
-        <w:tc>
-          <w:tcPr>
-            <w:tcW w:w="3884" w:type="dxa"/>
-            <w:vMerge/>
-          </w:tcPr>
-          <w:p>
-            <w:pPr>
-              <w:jc w:val="center"/>
-            </w:pPr>
-          </w:p>
-        </w:tc>
-      </w:tr>
-      <w:tr>
-        <w:tc>
-          <w:tcPr>
-            <w:tcW w:w="2492" w:type="dxa"/>
-            <w:shd w:val="clear" w:color="auto" w:fill="FFA7A7"/>
-          </w:tcPr>
-          <w:p>
-            <w:pPr>
-              <w:jc w:val="center"/>
-            </w:pPr>
-            <w:proofErr w:type="spellStart"/>
-            <w:r>
-              <w:t>Culbutoeuf</w:t>
-            </w:r>
-            <w:proofErr w:type="spellEnd"/>
-          </w:p>
-        </w:tc>
-        <w:tc>
-          <w:tcPr>
-            <w:tcW w:w="3884" w:type="dxa"/>
-            <w:vMerge/>
-          </w:tcPr>
-          <w:p>
-            <w:pPr>
-              <w:jc w:val="center"/>
-            </w:pPr>
-          </w:p>
-        </w:tc>
-      </w:tr>
-      <w:tr>
-        <w:tc>
-          <w:tcPr>
-            <w:tcW w:w="2492" w:type="dxa"/>
-            <w:shd w:val="clear" w:color="auto" w:fill="FFA7A7"/>
-          </w:tcPr>
-          <w:p>
-            <w:pPr>
-              <w:jc w:val="center"/>
-            </w:pPr>
-            <w:proofErr w:type="spellStart"/>
-            <w:r>
-              <w:t>Sicogne</w:t>
-            </w:r>
-            <w:proofErr w:type="spellEnd"/>
-          </w:p>
-        </w:tc>
-        <w:tc>
-          <w:tcPr>
-            <w:tcW w:w="3884" w:type="dxa"/>
-            <w:vMerge/>
-          </w:tcPr>
-          <w:p>
-            <w:pPr>
-              <w:jc w:val="center"/>
-            </w:pPr>
-          </w:p>
-        </w:tc>
-      </w:tr>
-      <w:tr>
-        <w:tc>
-          <w:tcPr>
-            <w:tcW w:w="2492" w:type="dxa"/>
-            <w:shd w:val="clear" w:color="auto" w:fill="FFA7A7"/>
-          </w:tcPr>
-          <w:p>
-            <w:pPr>
-              <w:jc w:val="center"/>
-            </w:pPr>
-            <w:proofErr w:type="spellStart"/>
-            <w:r>
-              <w:t>Gein</w:t>
-            </w:r>
-            <w:proofErr w:type="spellEnd"/>
-          </w:p>
-        </w:tc>
-        <w:tc>
-          <w:tcPr>
-            <w:tcW w:w="3884" w:type="dxa"/>
-            <w:vMerge/>
-          </w:tcPr>
-          <w:p>
-            <w:pPr>
-              <w:jc w:val="center"/>
-            </w:pPr>
-          </w:p>
-        </w:tc>
-      </w:tr>
-      <w:tr>
-        <w:tc>
-          <w:tcPr>
-            <w:tcW w:w="2492" w:type="dxa"/>
-            <w:shd w:val="clear" w:color="auto" w:fill="FFA7A7"/>
-          </w:tcPr>
-          <w:p>
-            <w:pPr>
-              <w:jc w:val="center"/>
-            </w:pPr>
-            <w:proofErr w:type="spellStart"/>
-            <w:r>
-              <w:t>Voldelor</w:t>
-            </w:r>
-            <w:proofErr w:type="spellEnd"/>
-          </w:p>
-        </w:tc>
-        <w:tc>
-          <w:tcPr>
-            <w:tcW w:w="3884" w:type="dxa"/>
-            <w:vMerge/>
-          </w:tcPr>
-          <w:p>
-            <w:pPr>
-              <w:jc w:val="center"/>
-            </w:pPr>
-          </w:p>
-        </w:tc>
-      </w:tr>
-      <w:tr>
-        <w:tc>
-          <w:tcPr>
-            <w:tcW w:w="2492" w:type="dxa"/>
-            <w:shd w:val="clear" w:color="auto" w:fill="FFA7A7"/>
-          </w:tcPr>
-          <w:p>
-            <w:pPr>
-              <w:jc w:val="center"/>
-            </w:pPr>
-            <w:proofErr w:type="spellStart"/>
-            <w:r>
-              <w:t>Atcham</w:t>
-            </w:r>
-            <w:proofErr w:type="spellEnd"/>
-          </w:p>
-        </w:tc>
-        <w:tc>
-          <w:tcPr>
-            <w:tcW w:w="3884" w:type="dxa"/>
-            <w:vMerge/>
-          </w:tcPr>
-          <w:p>
-            <w:pPr>
-              <w:jc w:val="center"/>
-            </w:pPr>
-          </w:p>
-        </w:tc>
-      </w:tr>
-      <w:tr>
-        <w:tc>
-          <w:tcPr>
-            <w:tcW w:w="2492" w:type="dxa"/>
-            <w:shd w:val="clear" w:color="auto" w:fill="FFA7A7"/>
-          </w:tcPr>
-          <w:p>
-            <w:pPr>
-              <w:jc w:val="center"/>
-            </w:pPr>
-            <w:proofErr w:type="spellStart"/>
-            <w:r>
-              <w:t>Khepricorne</w:t>
-            </w:r>
-            <w:proofErr w:type="spellEnd"/>
-          </w:p>
-        </w:tc>
-        <w:tc>
-          <w:tcPr>
-            <w:tcW w:w="3884" w:type="dxa"/>
-            <w:vMerge/>
-          </w:tcPr>
-          <w:p>
-            <w:pPr>
-              <w:jc w:val="center"/>
-            </w:pPr>
-          </w:p>
-        </w:tc>
-      </w:tr>
-      <w:tr>
-        <w:tc>
-          <w:tcPr>
-            <w:tcW w:w="2492" w:type="dxa"/>
-            <w:shd w:val="clear" w:color="auto" w:fill="FFA7A7"/>
-          </w:tcPr>
-          <w:p>
-            <w:pPr>
-              <w:jc w:val="center"/>
-            </w:pPr>
-            <w:proofErr w:type="spellStart"/>
-            <w:r>
-              <w:t>Takomako</w:t>
-            </w:r>
-            <w:proofErr w:type="spellEnd"/>
-          </w:p>
-        </w:tc>
-        <w:tc>
-          <w:tcPr>
-            <w:tcW w:w="3884" w:type="dxa"/>
-            <w:vMerge/>
-          </w:tcPr>
-          <w:p>
-            <w:pPr>
-              <w:jc w:val="center"/>
-            </w:pPr>
-          </w:p>
-        </w:tc>
-      </w:tr>
-      <w:tr>
-        <w:tc>
-          <w:tcPr>
-            <w:tcW w:w="2492" w:type="dxa"/>
-            <w:shd w:val="clear" w:color="auto" w:fill="FFA7A7"/>
-          </w:tcPr>
-          <w:p>
-            <w:pPr>
-              <w:jc w:val="center"/>
-            </w:pPr>
-            <w:proofErr w:type="spellStart"/>
-            <w:r>
-              <w:t>Buldalazred</w:t>
-            </w:r>
-            <w:proofErr w:type="spellEnd"/>
-          </w:p>
-        </w:tc>
-        <w:tc>
-          <w:tcPr>
-            <w:tcW w:w="3884" w:type="dxa"/>
-            <w:vMerge/>
-          </w:tcPr>
-          <w:p>
-            <w:pPr>
-              <w:jc w:val="center"/>
-            </w:pPr>
-          </w:p>
-        </w:tc>
-      </w:tr>
-      <w:tr>
-        <w:tc>
-          <w:tcPr>
-            <w:tcW w:w="2492" w:type="dxa"/>
-            <w:shd w:val="clear" w:color="auto" w:fill="FFA7A7"/>
-          </w:tcPr>
-          <w:p>
-            <w:pPr>
-              <w:jc w:val="center"/>
-            </w:pPr>
-            <w:r>
-              <w:t xml:space="preserve">Homard </w:t>
-            </w:r>
-            <w:proofErr w:type="spellStart"/>
-            <w:r>
-              <w:t>Medali</w:t>
-            </w:r>
-            <w:proofErr w:type="spellEnd"/>
-          </w:p>
-        </w:tc>
-        <w:tc>
-          <w:tcPr>
-            <w:tcW w:w="3884" w:type="dxa"/>
-            <w:vMerge/>
-          </w:tcPr>
-          <w:p>
-            <w:pPr>
-              <w:jc w:val="center"/>
-            </w:pPr>
-          </w:p>
-        </w:tc>
-      </w:tr>
-    </w:tbl>
+    <w:p/>
     <w:p>
       <w:pPr>
         <w:pStyle w:val="Titre3"/>
@@ -11688,6 +9254,21 @@
         <w:t>100 pour la sagesse</w:t>
       </w:r>
     </w:p>
+    <w:p/>
+    <w:p/>
+    <w:p/>
+    <w:p/>
+    <w:p/>
+    <w:p/>
+    <w:p/>
+    <w:p/>
+    <w:p/>
+    <w:p/>
+    <w:p/>
+    <w:p/>
+    <w:p/>
+    <w:p/>
+    <w:p/>
     <w:p>
       <w:pPr>
         <w:pStyle w:val="Titre2"/>
@@ -12467,7 +10048,15 @@
               <w:jc w:val="center"/>
             </w:pPr>
             <w:r>
-              <w:t>25 esquive PM</w:t>
+              <w:t xml:space="preserve">25 </w:t>
+            </w:r>
+            <w:proofErr w:type="gramStart"/>
+            <w:r>
+              <w:t>esquive</w:t>
+            </w:r>
+            <w:proofErr w:type="gramEnd"/>
+            <w:r>
+              <w:t xml:space="preserve"> PM</w:t>
             </w:r>
           </w:p>
         </w:tc>
@@ -12697,8 +10286,13 @@
               <w:jc w:val="center"/>
             </w:pPr>
             <w:r>
-              <w:t>200 vitalité</w:t>
-            </w:r>
+              <w:t xml:space="preserve">200 </w:t>
+            </w:r>
+            <w:proofErr w:type="gramStart"/>
+            <w:r>
+              <w:t>vitalité</w:t>
+            </w:r>
+            <w:proofErr w:type="gramEnd"/>
           </w:p>
           <w:p>
             <w:pPr>
@@ -12972,8 +10566,13 @@
               <w:jc w:val="center"/>
             </w:pPr>
             <w:r>
-              <w:t>40 fuite</w:t>
-            </w:r>
+              <w:t xml:space="preserve">40 </w:t>
+            </w:r>
+            <w:proofErr w:type="gramStart"/>
+            <w:r>
+              <w:t>fuite</w:t>
+            </w:r>
+            <w:proofErr w:type="gramEnd"/>
           </w:p>
           <w:p>
             <w:pPr>
@@ -13061,33 +10660,50 @@
             <w:r>
               <w:t xml:space="preserve">70 </w:t>
             </w:r>
+            <w:proofErr w:type="gramStart"/>
             <w:r>
               <w:t>force</w:t>
             </w:r>
-          </w:p>
-          <w:p>
-            <w:pPr>
-              <w:jc w:val="center"/>
-            </w:pPr>
-            <w:r>
-              <w:t>70 chance</w:t>
-            </w:r>
-          </w:p>
-          <w:p>
-            <w:pPr>
-              <w:jc w:val="center"/>
-            </w:pPr>
-            <w:r>
-              <w:t>70 agilité</w:t>
-            </w:r>
-          </w:p>
-          <w:p>
-            <w:pPr>
-              <w:jc w:val="center"/>
-            </w:pPr>
-            <w:r>
-              <w:t>70 intelligence</w:t>
-            </w:r>
+            <w:proofErr w:type="gramEnd"/>
+          </w:p>
+          <w:p>
+            <w:pPr>
+              <w:jc w:val="center"/>
+            </w:pPr>
+            <w:r>
+              <w:t xml:space="preserve">70 </w:t>
+            </w:r>
+            <w:proofErr w:type="gramStart"/>
+            <w:r>
+              <w:t>chance</w:t>
+            </w:r>
+            <w:proofErr w:type="gramEnd"/>
+          </w:p>
+          <w:p>
+            <w:pPr>
+              <w:jc w:val="center"/>
+            </w:pPr>
+            <w:r>
+              <w:t xml:space="preserve">70 </w:t>
+            </w:r>
+            <w:proofErr w:type="gramStart"/>
+            <w:r>
+              <w:t>agilité</w:t>
+            </w:r>
+            <w:proofErr w:type="gramEnd"/>
+          </w:p>
+          <w:p>
+            <w:pPr>
+              <w:jc w:val="center"/>
+            </w:pPr>
+            <w:r>
+              <w:t xml:space="preserve">70 </w:t>
+            </w:r>
+            <w:proofErr w:type="gramStart"/>
+            <w:r>
+              <w:t>intelligence</w:t>
+            </w:r>
+            <w:proofErr w:type="gramEnd"/>
           </w:p>
         </w:tc>
         <w:tc>
@@ -13474,7 +11090,15 @@
               <w:jc w:val="center"/>
             </w:pPr>
             <w:r>
-              <w:t>+ 1 PM si aucun ennemis au corps à corps en début de tour</w:t>
+              <w:t xml:space="preserve">+ 1 PM si </w:t>
+            </w:r>
+            <w:proofErr w:type="gramStart"/>
+            <w:r>
+              <w:t>aucun ennemis</w:t>
+            </w:r>
+            <w:proofErr w:type="gramEnd"/>
+            <w:r>
+              <w:t xml:space="preserve"> au corps à corps en début de tour</w:t>
             </w:r>
           </w:p>
           <w:p>
@@ -14284,8 +11908,18 @@
                 <w:color w:val="000000"/>
                 <w:lang w:eastAsia="fr-FR"/>
               </w:rPr>
-              <w:t>20 sagesse</w:t>
-            </w:r>
+              <w:t xml:space="preserve">20 </w:t>
+            </w:r>
+            <w:proofErr w:type="gramStart"/>
+            <w:r>
+              <w:rPr>
+                <w:rFonts w:ascii="Aptos Narrow" w:eastAsia="Times New Roman" w:hAnsi="Aptos Narrow" w:cs="Times New Roman"/>
+                <w:color w:val="000000"/>
+                <w:lang w:eastAsia="fr-FR"/>
+              </w:rPr>
+              <w:t>sagesse</w:t>
+            </w:r>
+            <w:proofErr w:type="gramEnd"/>
           </w:p>
         </w:tc>
         <w:tc>
@@ -15081,7 +12715,25 @@
                 <w:color w:val="000000"/>
                 <w:lang w:eastAsia="fr-FR"/>
               </w:rPr>
-              <w:t>80 Vitalité et 10 retrait PM</w:t>
+              <w:t xml:space="preserve">80 Vitalité et 10 </w:t>
+            </w:r>
+            <w:proofErr w:type="gramStart"/>
+            <w:r>
+              <w:rPr>
+                <w:rFonts w:ascii="Aptos Narrow" w:eastAsia="Times New Roman" w:hAnsi="Aptos Narrow" w:cs="Times New Roman"/>
+                <w:color w:val="000000"/>
+                <w:lang w:eastAsia="fr-FR"/>
+              </w:rPr>
+              <w:t>retrait</w:t>
+            </w:r>
+            <w:proofErr w:type="gramEnd"/>
+            <w:r>
+              <w:rPr>
+                <w:rFonts w:ascii="Aptos Narrow" w:eastAsia="Times New Roman" w:hAnsi="Aptos Narrow" w:cs="Times New Roman"/>
+                <w:color w:val="000000"/>
+                <w:lang w:eastAsia="fr-FR"/>
+              </w:rPr>
+              <w:t xml:space="preserve"> PM</w:t>
             </w:r>
           </w:p>
         </w:tc>
@@ -15182,7 +12834,25 @@
                 <w:color w:val="000000"/>
                 <w:lang w:eastAsia="fr-FR"/>
               </w:rPr>
-              <w:t>80 Vitalité et 10 retrait PA</w:t>
+              <w:t xml:space="preserve">80 Vitalité et 10 </w:t>
+            </w:r>
+            <w:proofErr w:type="gramStart"/>
+            <w:r>
+              <w:rPr>
+                <w:rFonts w:ascii="Aptos Narrow" w:eastAsia="Times New Roman" w:hAnsi="Aptos Narrow" w:cs="Times New Roman"/>
+                <w:color w:val="000000"/>
+                <w:lang w:eastAsia="fr-FR"/>
+              </w:rPr>
+              <w:t>retrait</w:t>
+            </w:r>
+            <w:proofErr w:type="gramEnd"/>
+            <w:r>
+              <w:rPr>
+                <w:rFonts w:ascii="Aptos Narrow" w:eastAsia="Times New Roman" w:hAnsi="Aptos Narrow" w:cs="Times New Roman"/>
+                <w:color w:val="000000"/>
+                <w:lang w:eastAsia="fr-FR"/>
+              </w:rPr>
+              <w:t xml:space="preserve"> PA</w:t>
             </w:r>
           </w:p>
         </w:tc>
@@ -15926,8 +13596,18 @@
                 <w:color w:val="000000"/>
                 <w:lang w:eastAsia="fr-FR"/>
               </w:rPr>
-              <w:t>80 Vitalité et 20 fuite</w:t>
-            </w:r>
+              <w:t xml:space="preserve">80 Vitalité et 20 </w:t>
+            </w:r>
+            <w:proofErr w:type="gramStart"/>
+            <w:r>
+              <w:rPr>
+                <w:rFonts w:ascii="Aptos Narrow" w:eastAsia="Times New Roman" w:hAnsi="Aptos Narrow" w:cs="Times New Roman"/>
+                <w:color w:val="000000"/>
+                <w:lang w:eastAsia="fr-FR"/>
+              </w:rPr>
+              <w:t>fuite</w:t>
+            </w:r>
+            <w:proofErr w:type="gramEnd"/>
           </w:p>
         </w:tc>
         <w:tc>
@@ -16039,8 +13719,18 @@
                 <w:color w:val="000000"/>
                 <w:lang w:eastAsia="fr-FR"/>
               </w:rPr>
-              <w:t>80 Vitalité et 20 tacle</w:t>
-            </w:r>
+              <w:t xml:space="preserve">80 Vitalité et 20 </w:t>
+            </w:r>
+            <w:proofErr w:type="gramStart"/>
+            <w:r>
+              <w:rPr>
+                <w:rFonts w:ascii="Aptos Narrow" w:eastAsia="Times New Roman" w:hAnsi="Aptos Narrow" w:cs="Times New Roman"/>
+                <w:color w:val="000000"/>
+                <w:lang w:eastAsia="fr-FR"/>
+              </w:rPr>
+              <w:t>tacle</w:t>
+            </w:r>
+            <w:proofErr w:type="gramEnd"/>
           </w:p>
         </w:tc>
         <w:tc>
@@ -17075,7 +14765,25 @@
                 <w:color w:val="000000"/>
                 <w:lang w:eastAsia="fr-FR"/>
               </w:rPr>
-              <w:t>1 PM et 5 dommage de chaque élément</w:t>
+              <w:t xml:space="preserve">1 PM et 5 </w:t>
+            </w:r>
+            <w:proofErr w:type="gramStart"/>
+            <w:r>
+              <w:rPr>
+                <w:rFonts w:ascii="Aptos Narrow" w:eastAsia="Times New Roman" w:hAnsi="Aptos Narrow" w:cs="Times New Roman"/>
+                <w:color w:val="000000"/>
+                <w:lang w:eastAsia="fr-FR"/>
+              </w:rPr>
+              <w:t>dommage</w:t>
+            </w:r>
+            <w:proofErr w:type="gramEnd"/>
+            <w:r>
+              <w:rPr>
+                <w:rFonts w:ascii="Aptos Narrow" w:eastAsia="Times New Roman" w:hAnsi="Aptos Narrow" w:cs="Times New Roman"/>
+                <w:color w:val="000000"/>
+                <w:lang w:eastAsia="fr-FR"/>
+              </w:rPr>
+              <w:t xml:space="preserve"> de chaque élément</w:t>
             </w:r>
           </w:p>
         </w:tc>
@@ -17373,8 +15081,18 @@
                 <w:color w:val="000000"/>
                 <w:lang w:eastAsia="fr-FR"/>
               </w:rPr>
-              <w:t>15 soin</w:t>
-            </w:r>
+              <w:t xml:space="preserve">15 </w:t>
+            </w:r>
+            <w:proofErr w:type="gramStart"/>
+            <w:r>
+              <w:rPr>
+                <w:rFonts w:ascii="Aptos Narrow" w:eastAsia="Times New Roman" w:hAnsi="Aptos Narrow" w:cs="Times New Roman"/>
+                <w:color w:val="000000"/>
+                <w:lang w:eastAsia="fr-FR"/>
+              </w:rPr>
+              <w:t>soin</w:t>
+            </w:r>
+            <w:proofErr w:type="gramEnd"/>
           </w:p>
         </w:tc>
         <w:tc>
@@ -18360,7 +16078,25 @@
                 <w:color w:val="000000"/>
                 <w:lang w:eastAsia="fr-FR"/>
               </w:rPr>
-              <w:t xml:space="preserve">150 Vitalité et 8 dommage de chaque élément </w:t>
+              <w:t xml:space="preserve">150 Vitalité et 8 </w:t>
+            </w:r>
+            <w:proofErr w:type="gramStart"/>
+            <w:r>
+              <w:rPr>
+                <w:rFonts w:ascii="Aptos Narrow" w:eastAsia="Times New Roman" w:hAnsi="Aptos Narrow" w:cs="Times New Roman"/>
+                <w:color w:val="000000"/>
+                <w:lang w:eastAsia="fr-FR"/>
+              </w:rPr>
+              <w:t>dommage</w:t>
+            </w:r>
+            <w:proofErr w:type="gramEnd"/>
+            <w:r>
+              <w:rPr>
+                <w:rFonts w:ascii="Aptos Narrow" w:eastAsia="Times New Roman" w:hAnsi="Aptos Narrow" w:cs="Times New Roman"/>
+                <w:color w:val="000000"/>
+                <w:lang w:eastAsia="fr-FR"/>
+              </w:rPr>
+              <w:t xml:space="preserve"> de chaque élément </w:t>
             </w:r>
           </w:p>
         </w:tc>
@@ -18481,8 +16217,36 @@
                 <w:color w:val="000000"/>
                 <w:lang w:eastAsia="fr-FR"/>
               </w:rPr>
-              <w:t>150 Vitalité et 20 fuite et 20 tacle</w:t>
-            </w:r>
+              <w:t xml:space="preserve">150 Vitalité et 20 </w:t>
+            </w:r>
+            <w:proofErr w:type="gramStart"/>
+            <w:r>
+              <w:rPr>
+                <w:rFonts w:ascii="Aptos Narrow" w:eastAsia="Times New Roman" w:hAnsi="Aptos Narrow" w:cs="Times New Roman"/>
+                <w:color w:val="000000"/>
+                <w:lang w:eastAsia="fr-FR"/>
+              </w:rPr>
+              <w:t>fuite</w:t>
+            </w:r>
+            <w:proofErr w:type="gramEnd"/>
+            <w:r>
+              <w:rPr>
+                <w:rFonts w:ascii="Aptos Narrow" w:eastAsia="Times New Roman" w:hAnsi="Aptos Narrow" w:cs="Times New Roman"/>
+                <w:color w:val="000000"/>
+                <w:lang w:eastAsia="fr-FR"/>
+              </w:rPr>
+              <w:t xml:space="preserve"> et 20 </w:t>
+            </w:r>
+            <w:proofErr w:type="gramStart"/>
+            <w:r>
+              <w:rPr>
+                <w:rFonts w:ascii="Aptos Narrow" w:eastAsia="Times New Roman" w:hAnsi="Aptos Narrow" w:cs="Times New Roman"/>
+                <w:color w:val="000000"/>
+                <w:lang w:eastAsia="fr-FR"/>
+              </w:rPr>
+              <w:t>tacle</w:t>
+            </w:r>
+            <w:proofErr w:type="gramEnd"/>
           </w:p>
         </w:tc>
         <w:tc>
@@ -19369,8 +17133,18 @@
                 <w:color w:val="000000"/>
                 <w:lang w:eastAsia="fr-FR"/>
               </w:rPr>
-              <w:t>75 sagesse</w:t>
-            </w:r>
+              <w:t xml:space="preserve">75 </w:t>
+            </w:r>
+            <w:proofErr w:type="gramStart"/>
+            <w:r>
+              <w:rPr>
+                <w:rFonts w:ascii="Aptos Narrow" w:eastAsia="Times New Roman" w:hAnsi="Aptos Narrow" w:cs="Times New Roman"/>
+                <w:color w:val="000000"/>
+                <w:lang w:eastAsia="fr-FR"/>
+              </w:rPr>
+              <w:t>sagesse</w:t>
+            </w:r>
+            <w:proofErr w:type="gramEnd"/>
           </w:p>
         </w:tc>
         <w:tc>
@@ -21446,8 +19220,18 @@
                 <w:color w:val="000000"/>
                 <w:lang w:eastAsia="fr-FR"/>
               </w:rPr>
-              <w:t>100 sagesse</w:t>
-            </w:r>
+              <w:t xml:space="preserve">100 </w:t>
+            </w:r>
+            <w:proofErr w:type="gramStart"/>
+            <w:r>
+              <w:rPr>
+                <w:rFonts w:ascii="Aptos Narrow" w:eastAsia="Times New Roman" w:hAnsi="Aptos Narrow" w:cs="Times New Roman"/>
+                <w:color w:val="000000"/>
+                <w:lang w:eastAsia="fr-FR"/>
+              </w:rPr>
+              <w:t>sagesse</w:t>
+            </w:r>
+            <w:proofErr w:type="gramEnd"/>
           </w:p>
         </w:tc>
         <w:tc>
@@ -24669,7 +22453,25 @@
                 <w:color w:val="000000"/>
                 <w:lang w:eastAsia="fr-FR"/>
               </w:rPr>
-              <w:t>70 puissance et 100 Rés. Critique</w:t>
+              <w:t xml:space="preserve">70 </w:t>
+            </w:r>
+            <w:proofErr w:type="gramStart"/>
+            <w:r>
+              <w:rPr>
+                <w:rFonts w:ascii="Aptos Narrow" w:eastAsia="Times New Roman" w:hAnsi="Aptos Narrow" w:cs="Times New Roman"/>
+                <w:color w:val="000000"/>
+                <w:lang w:eastAsia="fr-FR"/>
+              </w:rPr>
+              <w:t>puissance</w:t>
+            </w:r>
+            <w:proofErr w:type="gramEnd"/>
+            <w:r>
+              <w:rPr>
+                <w:rFonts w:ascii="Aptos Narrow" w:eastAsia="Times New Roman" w:hAnsi="Aptos Narrow" w:cs="Times New Roman"/>
+                <w:color w:val="000000"/>
+                <w:lang w:eastAsia="fr-FR"/>
+              </w:rPr>
+              <w:t xml:space="preserve"> et 100 Rés. Critique</w:t>
             </w:r>
           </w:p>
         </w:tc>
@@ -24772,7 +22574,25 @@
                 <w:color w:val="000000"/>
                 <w:lang w:eastAsia="fr-FR"/>
               </w:rPr>
-              <w:t>70 puissance et 40 Tacle</w:t>
+              <w:t xml:space="preserve">70 </w:t>
+            </w:r>
+            <w:proofErr w:type="gramStart"/>
+            <w:r>
+              <w:rPr>
+                <w:rFonts w:ascii="Aptos Narrow" w:eastAsia="Times New Roman" w:hAnsi="Aptos Narrow" w:cs="Times New Roman"/>
+                <w:color w:val="000000"/>
+                <w:lang w:eastAsia="fr-FR"/>
+              </w:rPr>
+              <w:t>puissance</w:t>
+            </w:r>
+            <w:proofErr w:type="gramEnd"/>
+            <w:r>
+              <w:rPr>
+                <w:rFonts w:ascii="Aptos Narrow" w:eastAsia="Times New Roman" w:hAnsi="Aptos Narrow" w:cs="Times New Roman"/>
+                <w:color w:val="000000"/>
+                <w:lang w:eastAsia="fr-FR"/>
+              </w:rPr>
+              <w:t xml:space="preserve"> et 40 Tacle</w:t>
             </w:r>
           </w:p>
         </w:tc>
@@ -24883,7 +22703,25 @@
                 <w:color w:val="000000"/>
                 <w:lang w:eastAsia="fr-FR"/>
               </w:rPr>
-              <w:t>70 puissance et 40 Fuite</w:t>
+              <w:t xml:space="preserve">70 </w:t>
+            </w:r>
+            <w:proofErr w:type="gramStart"/>
+            <w:r>
+              <w:rPr>
+                <w:rFonts w:ascii="Aptos Narrow" w:eastAsia="Times New Roman" w:hAnsi="Aptos Narrow" w:cs="Times New Roman"/>
+                <w:color w:val="000000"/>
+                <w:lang w:eastAsia="fr-FR"/>
+              </w:rPr>
+              <w:t>puissance</w:t>
+            </w:r>
+            <w:proofErr w:type="gramEnd"/>
+            <w:r>
+              <w:rPr>
+                <w:rFonts w:ascii="Aptos Narrow" w:eastAsia="Times New Roman" w:hAnsi="Aptos Narrow" w:cs="Times New Roman"/>
+                <w:color w:val="000000"/>
+                <w:lang w:eastAsia="fr-FR"/>
+              </w:rPr>
+              <w:t xml:space="preserve"> et 40 Fuite</w:t>
             </w:r>
           </w:p>
         </w:tc>
@@ -26065,8 +23903,18 @@
                 <w:color w:val="000000"/>
                 <w:lang w:eastAsia="fr-FR"/>
               </w:rPr>
-              <w:t>150 sagesse</w:t>
-            </w:r>
+              <w:t xml:space="preserve">150 </w:t>
+            </w:r>
+            <w:proofErr w:type="gramStart"/>
+            <w:r>
+              <w:rPr>
+                <w:rFonts w:ascii="Aptos Narrow" w:eastAsia="Times New Roman" w:hAnsi="Aptos Narrow" w:cs="Times New Roman"/>
+                <w:color w:val="000000"/>
+                <w:lang w:eastAsia="fr-FR"/>
+              </w:rPr>
+              <w:t>sagesse</w:t>
+            </w:r>
+            <w:proofErr w:type="gramEnd"/>
           </w:p>
         </w:tc>
         <w:tc>
@@ -32780,61 +30628,11 @@
           <w:lang w:val="it-IT"/>
         </w:rPr>
       </w:pPr>
-      <w:proofErr w:type="spellStart"/>
       <w:r>
         <w:rPr>
           <w:lang w:val="it-IT"/>
         </w:rPr>
-        <w:t>Montures</w:t>
-      </w:r>
-      <w:proofErr w:type="spellEnd"/>
-      <w:r>
-        <w:rPr>
-          <w:lang w:val="it-IT"/>
-        </w:rPr>
-        <w:t xml:space="preserve"> (</w:t>
-      </w:r>
-      <w:proofErr w:type="spellStart"/>
-      <w:r>
-        <w:rPr>
-          <w:lang w:val="it-IT"/>
-        </w:rPr>
-        <w:t>Dragodinde</w:t>
-      </w:r>
-      <w:proofErr w:type="spellEnd"/>
-      <w:r>
-        <w:rPr>
-          <w:lang w:val="it-IT"/>
-        </w:rPr>
-        <w:t xml:space="preserve"> / </w:t>
-      </w:r>
-      <w:proofErr w:type="spellStart"/>
-      <w:r>
-        <w:rPr>
-          <w:lang w:val="it-IT"/>
-        </w:rPr>
-        <w:t>Muldo</w:t>
-      </w:r>
-      <w:proofErr w:type="spellEnd"/>
-      <w:r>
-        <w:rPr>
-          <w:lang w:val="it-IT"/>
-        </w:rPr>
-        <w:t xml:space="preserve"> / </w:t>
-      </w:r>
-      <w:proofErr w:type="spellStart"/>
-      <w:r>
-        <w:rPr>
-          <w:lang w:val="it-IT"/>
-        </w:rPr>
-        <w:t>Volkorne</w:t>
-      </w:r>
-      <w:proofErr w:type="spellEnd"/>
-      <w:r>
-        <w:rPr>
-          <w:lang w:val="it-IT"/>
-        </w:rPr>
-        <w:t>)</w:t>
+        <w:t>Montures (Dragodinde / Muldo / Volkorne)</w:t>
       </w:r>
     </w:p>
     <w:p>
@@ -32982,7 +30780,15 @@
     </w:p>
     <w:p>
       <w:r>
-        <w:t>Changement des variantes de manière à ce qu’on puisse avoir les 3 invocations de chaque type en même temps pour un élément.</w:t>
+        <w:t xml:space="preserve">Changement des variantes </w:t>
+      </w:r>
+      <w:proofErr w:type="gramStart"/>
+      <w:r>
+        <w:t>de manière à ce</w:t>
+      </w:r>
+      <w:proofErr w:type="gramEnd"/>
+      <w:r>
+        <w:t xml:space="preserve"> qu’on puisse avoir les 3 invocations de chaque type en même temps pour un élément.</w:t>
       </w:r>
     </w:p>
     <w:p/>
@@ -33046,63 +30852,17 @@
     </w:p>
     <w:p>
       <w:r>
-        <w:t xml:space="preserve">Face ou Pile </w:t>
-      </w:r>
-      <w:r>
-        <w:t xml:space="preserve">passe à 4 PA et </w:t>
-      </w:r>
-      <w:r>
-        <w:t>met 15% érosion</w:t>
-      </w:r>
-      <w:r>
-        <w:t xml:space="preserve"> et inflige des dégâts en coup critique (au lieu du vol de force)</w:t>
-      </w:r>
-      <w:r>
-        <w:t>. Passe en PO non modifiable</w:t>
+        <w:t>Face ou Pile met 15% érosion</w:t>
       </w:r>
     </w:p>
     <w:p>
       <w:r>
-        <w:t xml:space="preserve">Bluff devient un sort uniquement Eau </w:t>
+        <w:t>Réflexe met 15% érosion</w:t>
       </w:r>
     </w:p>
     <w:p>
       <w:r>
-        <w:t>Toupet devient un sort uniquement Air + repousse + retire des résistance poussée</w:t>
-      </w:r>
-    </w:p>
-    <w:p>
-      <w:r>
-        <w:t>Réflexe met 15% érosion</w:t>
-      </w:r>
-    </w:p>
-    <w:p>
-      <w:r>
         <w:t>Coussinet met 10% érosion</w:t>
-      </w:r>
-    </w:p>
-    <w:p>
-      <w:r>
-        <w:t>Griffe joueuse devient un sort uniquement Terre</w:t>
-      </w:r>
-    </w:p>
-    <w:p>
-      <w:r>
-        <w:t xml:space="preserve">Mésaventure devient un sort uniquement </w:t>
-      </w:r>
-      <w:r>
-        <w:t>Terre</w:t>
-      </w:r>
-      <w:r>
-        <w:t xml:space="preserve"> </w:t>
-      </w:r>
-    </w:p>
-    <w:p>
-      <w:r>
-        <w:t xml:space="preserve">Trèfle : </w:t>
-      </w:r>
-      <w:r>
-        <w:t>Applique un bonus aléatoire entre Coup critique, portée, dommages, dommages de poussée, dommages critiques, tacle et fuite pour 1 tour. Si relancé dans le tour, supprime le 1er effet.</w:t>
       </w:r>
     </w:p>
     <w:p/>
@@ -33127,11 +30887,6 @@
     <w:p>
       <w:r>
         <w:t>Fracture met 15% érosion</w:t>
-      </w:r>
-    </w:p>
-    <w:p>
-      <w:r>
-        <w:t>Epée destructrice met 10% érosion</w:t>
       </w:r>
     </w:p>
     <w:p/>
@@ -33224,8 +30979,13 @@
       </w:r>
     </w:p>
     <w:p>
-      <w:r>
-        <w:t>Les masque n’ont plus de coût en PA</w:t>
+      <w:proofErr w:type="gramStart"/>
+      <w:r>
+        <w:t>Les masque</w:t>
+      </w:r>
+      <w:proofErr w:type="gramEnd"/>
+      <w:r>
+        <w:t xml:space="preserve"> n’ont plus de coût en PA</w:t>
       </w:r>
     </w:p>
     <w:p>
@@ -33249,8 +31009,13 @@
     </w:p>
     <w:p>
       <w:r>
-        <w:t>Les tourelles sont également contrôlable</w:t>
-      </w:r>
+        <w:t xml:space="preserve">Les tourelles sont également </w:t>
+      </w:r>
+      <w:proofErr w:type="gramStart"/>
+      <w:r>
+        <w:t>contrôlable</w:t>
+      </w:r>
+      <w:proofErr w:type="gramEnd"/>
     </w:p>
     <w:p>
       <w:r>
@@ -33262,7 +31027,23 @@
       </w:r>
       <w:proofErr w:type="spellEnd"/>
       <w:r>
-        <w:t xml:space="preserve"> de la tourelle de manière à ce qu’elles n’en ait que 1 avec dommage sur le meilleur élément.</w:t>
+        <w:t xml:space="preserve"> de la tourelle </w:t>
+      </w:r>
+      <w:proofErr w:type="gramStart"/>
+      <w:r>
+        <w:t>de manière à ce</w:t>
+      </w:r>
+      <w:proofErr w:type="gramEnd"/>
+      <w:r>
+        <w:t xml:space="preserve"> </w:t>
+      </w:r>
+      <w:proofErr w:type="gramStart"/>
+      <w:r>
+        <w:t>qu’elles n’en ait</w:t>
+      </w:r>
+      <w:proofErr w:type="gramEnd"/>
+      <w:r>
+        <w:t xml:space="preserve"> que 1 avec dommage sur le meilleur élément.</w:t>
       </w:r>
     </w:p>
     <w:p>
@@ -33335,8 +31116,13 @@
       </w:r>
     </w:p>
     <w:p>
-      <w:r>
-        <w:t>Ouragan: le sort passe à portée modifiable</w:t>
+      <w:proofErr w:type="gramStart"/>
+      <w:r>
+        <w:t>Ouragan:</w:t>
+      </w:r>
+      <w:proofErr w:type="gramEnd"/>
+      <w:r>
+        <w:t xml:space="preserve"> le sort passe à portée modifiable</w:t>
       </w:r>
     </w:p>
     <w:p>
@@ -33351,7 +31137,6 @@
     </w:p>
     <w:p>
       <w:r>
-        <w:lastRenderedPageBreak/>
         <w:t>Lame tellurique : le sort passe à portée modifiable</w:t>
       </w:r>
     </w:p>
@@ -33361,40 +31146,24 @@
           <w:lang w:val="it-IT"/>
         </w:rPr>
       </w:pPr>
-      <w:proofErr w:type="spellStart"/>
       <w:r>
         <w:rPr>
           <w:lang w:val="it-IT"/>
         </w:rPr>
-        <w:t>Eclats</w:t>
-      </w:r>
-      <w:proofErr w:type="spellEnd"/>
-      <w:r>
+        <w:t>Eclats glacés : PO 1-7</w:t>
+      </w:r>
+    </w:p>
+    <w:p>
+      <w:pPr>
         <w:rPr>
           <w:lang w:val="it-IT"/>
         </w:rPr>
-        <w:t xml:space="preserve"> glacés : PO 1-7</w:t>
-      </w:r>
-    </w:p>
-    <w:p>
-      <w:pPr>
+      </w:pPr>
+      <w:r>
         <w:rPr>
           <w:lang w:val="it-IT"/>
         </w:rPr>
-      </w:pPr>
-      <w:proofErr w:type="spellStart"/>
-      <w:r>
-        <w:rPr>
-          <w:lang w:val="it-IT"/>
-        </w:rPr>
-        <w:t>Stalactite</w:t>
-      </w:r>
-      <w:proofErr w:type="spellEnd"/>
-      <w:r>
-        <w:rPr>
-          <w:lang w:val="it-IT"/>
-        </w:rPr>
-        <w:t xml:space="preserve">  : PO 1-5</w:t>
+        <w:t>Stalactite  : PO 1-5</w:t>
       </w:r>
     </w:p>
     <w:p>
@@ -33470,6 +31239,7 @@
         <w:rPr>
           <w:lang w:val="fr-FR"/>
         </w:rPr>
+        <w:lastRenderedPageBreak/>
         <w:t>Item PA / PM de niveau &gt; 190</w:t>
       </w:r>
     </w:p>
@@ -33516,12 +31286,14 @@
           <w:lang w:val="fr-FR"/>
         </w:rPr>
       </w:pPr>
+      <w:proofErr w:type="gramStart"/>
       <w:r>
         <w:rPr>
           <w:lang w:val="fr-FR"/>
         </w:rPr>
         <w:t>Sort communs</w:t>
       </w:r>
+      <w:proofErr w:type="gramEnd"/>
     </w:p>
     <w:p>
       <w:r>
@@ -33553,7 +31325,15 @@
       </w:r>
       <w:proofErr w:type="spellEnd"/>
       <w:r>
-        <w:t>. Il permet d’accéder à la première salle de chacun des donjon.</w:t>
+        <w:t xml:space="preserve">. Il permet d’accéder à la première salle de chacun </w:t>
+      </w:r>
+      <w:proofErr w:type="gramStart"/>
+      <w:r>
+        <w:t>des donjon</w:t>
+      </w:r>
+      <w:proofErr w:type="gramEnd"/>
+      <w:r>
+        <w:t>.</w:t>
       </w:r>
     </w:p>
     <w:p>
@@ -33626,11 +31406,16 @@
       <w:r>
         <w:t xml:space="preserve">Le </w:t>
       </w:r>
+      <w:proofErr w:type="gramStart"/>
       <w:r>
         <w:t xml:space="preserve">niveau </w:t>
       </w:r>
       <w:r>
-        <w:t xml:space="preserve"> des boucliers </w:t>
+        <w:t xml:space="preserve"> des</w:t>
+      </w:r>
+      <w:proofErr w:type="gramEnd"/>
+      <w:r>
+        <w:t xml:space="preserve"> boucliers </w:t>
       </w:r>
       <w:proofErr w:type="spellStart"/>
       <w:r>
@@ -33854,7 +31639,15 @@
           </w:tcPr>
           <w:p>
             <w:r>
-              <w:t xml:space="preserve">Les monstres gagne des effets supplémentaires sur leur sort si </w:t>
+              <w:t xml:space="preserve">Les monstres </w:t>
+            </w:r>
+            <w:proofErr w:type="gramStart"/>
+            <w:r>
+              <w:t>gagne</w:t>
+            </w:r>
+            <w:proofErr w:type="gramEnd"/>
+            <w:r>
+              <w:t xml:space="preserve"> des effets supplémentaires sur leur sort si </w:t>
             </w:r>
             <w:proofErr w:type="spellStart"/>
             <w:r>
@@ -34095,7 +31888,6 @@
                 <w:b/>
                 <w:bCs/>
               </w:rPr>
-              <w:lastRenderedPageBreak/>
               <w:t>Maudits</w:t>
             </w:r>
           </w:p>
@@ -34264,7 +32056,15 @@
           </w:tcPr>
           <w:p>
             <w:r>
-              <w:t xml:space="preserve">A chaque fois qu’un monstre n’a pas infligé de </w:t>
+              <w:t xml:space="preserve">A chaque fois qu’un monstre n’a pas </w:t>
+            </w:r>
+            <w:proofErr w:type="gramStart"/>
+            <w:r>
+              <w:t>infligé</w:t>
+            </w:r>
+            <w:proofErr w:type="gramEnd"/>
+            <w:r>
+              <w:t xml:space="preserve"> de </w:t>
             </w:r>
             <w:proofErr w:type="spellStart"/>
             <w:r>
@@ -34345,6 +32145,7 @@
         <w:pStyle w:val="Titre3"/>
       </w:pPr>
       <w:r>
+        <w:lastRenderedPageBreak/>
         <w:t>Boss</w:t>
       </w:r>
     </w:p>
@@ -34473,12 +32274,17 @@
         <w:t xml:space="preserve"> : Fabrique de </w:t>
       </w:r>
       <w:proofErr w:type="spellStart"/>
+      <w:proofErr w:type="gramStart"/>
       <w:r>
         <w:t>Malléfisk</w:t>
       </w:r>
       <w:proofErr w:type="spellEnd"/>
       <w:r>
-        <w:t xml:space="preserve">  - Galerie du </w:t>
+        <w:t xml:space="preserve">  -</w:t>
+      </w:r>
+      <w:proofErr w:type="gramEnd"/>
+      <w:r>
+        <w:t xml:space="preserve"> Galerie du </w:t>
       </w:r>
       <w:proofErr w:type="spellStart"/>
       <w:r>
@@ -34687,7 +32493,15 @@
             </w:r>
             <w:proofErr w:type="spellEnd"/>
             <w:r>
-              <w:t xml:space="preserve"> invoque lors de ses attaque une tamponneur. En cas de dommages de poussée indirects subis par le tamponneur, celui-ci repousse les entités à son corps à corps.</w:t>
+              <w:t xml:space="preserve"> invoque lors de </w:t>
+            </w:r>
+            <w:proofErr w:type="gramStart"/>
+            <w:r>
+              <w:t>ses attaque</w:t>
+            </w:r>
+            <w:proofErr w:type="gramEnd"/>
+            <w:r>
+              <w:t xml:space="preserve"> une tamponneur. En cas de dommages de poussée indirects subis par le tamponneur, celui-ci repousse les entités à son corps à corps.</w:t>
             </w:r>
           </w:p>
         </w:tc>
@@ -34735,7 +32549,15 @@
               <w:t xml:space="preserve"> se boost de 50% de résistance et </w:t>
             </w:r>
             <w:r>
-              <w:t>200 puissance pour 2 tours</w:t>
+              <w:t xml:space="preserve">200 </w:t>
+            </w:r>
+            <w:proofErr w:type="gramStart"/>
+            <w:r>
+              <w:t>puissance</w:t>
+            </w:r>
+            <w:proofErr w:type="gramEnd"/>
+            <w:r>
+              <w:t xml:space="preserve"> pour 2 tours</w:t>
             </w:r>
             <w:r>
               <w:t xml:space="preserve"> en cas de dommage à distance subis</w:t>
@@ -34855,8 +32677,13 @@
             </w:r>
             <w:proofErr w:type="spellEnd"/>
             <w:r>
-              <w:t xml:space="preserve"> atteint, chaque attaque subie lui confère 500 bouclier</w:t>
-            </w:r>
+              <w:t xml:space="preserve"> atteint, chaque attaque subie lui confère 500 </w:t>
+            </w:r>
+            <w:proofErr w:type="gramStart"/>
+            <w:r>
+              <w:t>bouclier</w:t>
+            </w:r>
+            <w:proofErr w:type="gramEnd"/>
           </w:p>
         </w:tc>
       </w:tr>
@@ -34890,7 +32717,15 @@
           </w:tcPr>
           <w:p>
             <w:r>
-              <w:t>Moon invoque 4 totems élémentaires. Chaque ligne de dommage dans l’élément correspondant au totem fait perdre des résistance à Moon</w:t>
+              <w:t xml:space="preserve">Moon invoque 4 totems élémentaires. Chaque ligne de dommage dans l’élément correspondant au totem fait perdre </w:t>
+            </w:r>
+            <w:proofErr w:type="gramStart"/>
+            <w:r>
+              <w:t>des résistance</w:t>
+            </w:r>
+            <w:proofErr w:type="gramEnd"/>
+            <w:r>
+              <w:t xml:space="preserve"> à Moon</w:t>
             </w:r>
           </w:p>
         </w:tc>
@@ -34925,7 +32760,15 @@
           </w:tcPr>
           <w:p>
             <w:r>
-              <w:t>Le Maitre des pantin perd progressivement des résistances sur les premiers tous de jeu</w:t>
+              <w:t xml:space="preserve">Le Maitre </w:t>
+            </w:r>
+            <w:proofErr w:type="gramStart"/>
+            <w:r>
+              <w:t>des pantin</w:t>
+            </w:r>
+            <w:proofErr w:type="gramEnd"/>
+            <w:r>
+              <w:t xml:space="preserve"> perd progressivement des résistances sur les premiers tous de jeu</w:t>
             </w:r>
           </w:p>
         </w:tc>
@@ -35466,7 +33309,15 @@
             </w:r>
             <w:proofErr w:type="spellEnd"/>
             <w:r>
-              <w:t xml:space="preserve"> royal gagne 1000 vitalité et 1 PM par monstre qui meurt</w:t>
+              <w:t xml:space="preserve"> royal gagne 1000 </w:t>
+            </w:r>
+            <w:proofErr w:type="gramStart"/>
+            <w:r>
+              <w:t>vitalité</w:t>
+            </w:r>
+            <w:proofErr w:type="gramEnd"/>
+            <w:r>
+              <w:t xml:space="preserve"> et 1 PM par monstre qui meurt</w:t>
             </w:r>
           </w:p>
           <w:p>
@@ -35654,7 +33505,6 @@
                 <w:b/>
                 <w:bCs/>
               </w:rPr>
-              <w:lastRenderedPageBreak/>
               <w:t>Sphincter Cell</w:t>
             </w:r>
           </w:p>
@@ -35724,17 +33574,41 @@
             </w:r>
             <w:proofErr w:type="spellEnd"/>
             <w:r>
-              <w:t xml:space="preserve"> une glyphe par le disciple en croix. </w:t>
-            </w:r>
-          </w:p>
-          <w:p>
-            <w:r>
-              <w:t>Tous personnages débutant son tour sur la croix est one shot</w:t>
-            </w:r>
-          </w:p>
-          <w:p>
-            <w:r>
-              <w:t xml:space="preserve">Si le Kimbo commence son tour sur la glyphe, il perd ses résistances dans les 2 éléments liés </w:t>
+              <w:t xml:space="preserve"> </w:t>
+            </w:r>
+            <w:proofErr w:type="gramStart"/>
+            <w:r>
+              <w:t>une glyphe</w:t>
+            </w:r>
+            <w:proofErr w:type="gramEnd"/>
+            <w:r>
+              <w:t xml:space="preserve"> par le disciple en croix. </w:t>
+            </w:r>
+          </w:p>
+          <w:p>
+            <w:r>
+              <w:t xml:space="preserve">Tous personnages débutant son tour sur la croix </w:t>
+            </w:r>
+            <w:proofErr w:type="gramStart"/>
+            <w:r>
+              <w:t>est</w:t>
+            </w:r>
+            <w:proofErr w:type="gramEnd"/>
+            <w:r>
+              <w:t xml:space="preserve"> one shot</w:t>
+            </w:r>
+          </w:p>
+          <w:p>
+            <w:r>
+              <w:t xml:space="preserve">Si le Kimbo commence son tour sur </w:t>
+            </w:r>
+            <w:proofErr w:type="gramStart"/>
+            <w:r>
+              <w:t>la glyphe</w:t>
+            </w:r>
+            <w:proofErr w:type="gramEnd"/>
+            <w:r>
+              <w:t xml:space="preserve">, il perd ses résistances dans les 2 éléments liés </w:t>
             </w:r>
           </w:p>
           <w:p>
@@ -35762,8 +33636,13 @@
             </w:r>
           </w:p>
           <w:p>
-            <w:r>
-              <w:t>La glyphe est définie par le dernier élément ayant frappé le Kimbo</w:t>
+            <w:proofErr w:type="gramStart"/>
+            <w:r>
+              <w:t>La glyphe</w:t>
+            </w:r>
+            <w:proofErr w:type="gramEnd"/>
+            <w:r>
+              <w:t xml:space="preserve"> est définie par le dernier élément ayant frappé le Kimbo</w:t>
             </w:r>
           </w:p>
         </w:tc>
@@ -35813,6 +33692,7 @@
           </w:p>
           <w:p>
             <w:r>
+              <w:lastRenderedPageBreak/>
               <w:t>Invocation de la pougnette qui one shot tous les personnages à plus de 7 PO d’elle au début de son 5</w:t>
             </w:r>
             <w:r>
@@ -35847,6 +33727,7 @@
                 <w:b/>
                 <w:bCs/>
               </w:rPr>
+              <w:lastRenderedPageBreak/>
               <w:t>XLII</w:t>
             </w:r>
           </w:p>
@@ -36083,7 +33964,15 @@
           </w:tcPr>
           <w:p>
             <w:r>
-              <w:t>En début de tour, chaque personnage pose une glyphe à ses pieds. Tout personnage finissant son tour sur une glyphe est OS</w:t>
+              <w:t xml:space="preserve">En début de tour, chaque personnage pose </w:t>
+            </w:r>
+            <w:proofErr w:type="gramStart"/>
+            <w:r>
+              <w:t>une glyphe</w:t>
+            </w:r>
+            <w:proofErr w:type="gramEnd"/>
+            <w:r>
+              <w:t xml:space="preserve"> à ses pieds. Tout personnage finissant son tour sur une glyphe est OS</w:t>
             </w:r>
           </w:p>
         </w:tc>
@@ -36135,7 +34024,23 @@
             </w:r>
             <w:proofErr w:type="spellEnd"/>
             <w:r>
-              <w:t xml:space="preserve"> invoque une tentacule en début de tour en rapport avec le dernier sort élémentaire l’ayant taper.</w:t>
+              <w:t xml:space="preserve"> invoque </w:t>
+            </w:r>
+            <w:proofErr w:type="gramStart"/>
+            <w:r>
+              <w:t>une tentacule</w:t>
+            </w:r>
+            <w:proofErr w:type="gramEnd"/>
+            <w:r>
+              <w:t xml:space="preserve"> en début de tour en rapport avec le dernier sort élémentaire l’ayant </w:t>
+            </w:r>
+            <w:proofErr w:type="gramStart"/>
+            <w:r>
+              <w:t>taper</w:t>
+            </w:r>
+            <w:proofErr w:type="gramEnd"/>
+            <w:r>
+              <w:t>.</w:t>
             </w:r>
           </w:p>
           <w:p>
@@ -36351,7 +34256,15 @@
           </w:tcPr>
           <w:p>
             <w:r>
-              <w:t xml:space="preserve">Tant que Ombre est dans la glyphe invoquée par le </w:t>
+              <w:t xml:space="preserve">Tant </w:t>
+            </w:r>
+            <w:proofErr w:type="gramStart"/>
+            <w:r>
+              <w:t>que Ombre</w:t>
+            </w:r>
+            <w:proofErr w:type="gramEnd"/>
+            <w:r>
+              <w:t xml:space="preserve"> est dans la glyphe invoquée par le </w:t>
             </w:r>
             <w:proofErr w:type="spellStart"/>
             <w:r>
@@ -36571,7 +34484,15 @@
           </w:p>
           <w:p>
             <w:r>
-              <w:t>A chaque début de tour de personnages apparaissent 4 glyphes à leur corps-à-corps. Marcher dans une glyphe soigne le personnage et repousse toutes les entités alignées (zone 6) ou en diagonale (zone 3) et qui désactive l’invulnérabilités des ennemis s’ils ont été repoussés.</w:t>
+              <w:t xml:space="preserve">A chaque début de tour de personnages apparaissent 4 glyphes à leur corps-à-corps. Marcher dans </w:t>
+            </w:r>
+            <w:proofErr w:type="gramStart"/>
+            <w:r>
+              <w:t>une glyphe</w:t>
+            </w:r>
+            <w:proofErr w:type="gramEnd"/>
+            <w:r>
+              <w:t xml:space="preserve"> soigne le personnage et repousse toutes les entités alignées (zone 6) ou en diagonale (zone 3) et qui désactive l’invulnérabilités des ennemis s’ils ont été repoussés.</w:t>
             </w:r>
           </w:p>
         </w:tc>
@@ -36625,7 +34546,15 @@
             </w:r>
             <w:proofErr w:type="spellEnd"/>
             <w:r>
-              <w:t xml:space="preserve"> subit des dégâts indirect de poussée, il perd son </w:t>
+              <w:t xml:space="preserve"> subit </w:t>
+            </w:r>
+            <w:proofErr w:type="gramStart"/>
+            <w:r>
+              <w:t>des dégâts indirect</w:t>
+            </w:r>
+            <w:proofErr w:type="gramEnd"/>
+            <w:r>
+              <w:t xml:space="preserve"> de poussée, il perd son </w:t>
             </w:r>
             <w:proofErr w:type="spellStart"/>
             <w:r>
@@ -36647,7 +34576,15 @@
               <w:t>ème</w:t>
             </w:r>
             <w:r>
-              <w:t xml:space="preserve"> tour, ne pas finir sur une glyphe posée par les monstres en début de tour met l’état pacifiste pour 1 tour.</w:t>
+              <w:t xml:space="preserve"> tour, ne pas finir sur </w:t>
+            </w:r>
+            <w:proofErr w:type="gramStart"/>
+            <w:r>
+              <w:t>une glyphe posée</w:t>
+            </w:r>
+            <w:proofErr w:type="gramEnd"/>
+            <w:r>
+              <w:t xml:space="preserve"> par les monstres en début de tour met l’état pacifiste pour 1 tour.</w:t>
             </w:r>
           </w:p>
         </w:tc>
@@ -36847,7 +34784,6 @@
                 <w:b/>
                 <w:bCs/>
               </w:rPr>
-              <w:lastRenderedPageBreak/>
               <w:t>Koutoulou</w:t>
             </w:r>
             <w:proofErr w:type="spellEnd"/>
@@ -37026,17 +34962,42 @@
             </w:r>
             <w:proofErr w:type="spellEnd"/>
             <w:r>
-              <w:t xml:space="preserve">) qui applique une glyphe en cercle 2. </w:t>
-            </w:r>
-          </w:p>
-          <w:p>
-            <w:r>
-              <w:t>Débuter son tour sur la glyphe OS le personnage</w:t>
-            </w:r>
-          </w:p>
-          <w:p>
-            <w:r>
-              <w:t>Les ennemis débutant leur tour sur la glyphe gagnent 50% de dommages finaux.</w:t>
+              <w:t xml:space="preserve">) qui applique </w:t>
+            </w:r>
+            <w:proofErr w:type="gramStart"/>
+            <w:r>
+              <w:t>une glyphe</w:t>
+            </w:r>
+            <w:proofErr w:type="gramEnd"/>
+            <w:r>
+              <w:t xml:space="preserve"> en cercle 2. </w:t>
+            </w:r>
+          </w:p>
+          <w:p>
+            <w:r>
+              <w:lastRenderedPageBreak/>
+              <w:t xml:space="preserve">Débuter son tour sur </w:t>
+            </w:r>
+            <w:proofErr w:type="gramStart"/>
+            <w:r>
+              <w:t>la glyphe</w:t>
+            </w:r>
+            <w:proofErr w:type="gramEnd"/>
+            <w:r>
+              <w:t xml:space="preserve"> OS le personnage</w:t>
+            </w:r>
+          </w:p>
+          <w:p>
+            <w:r>
+              <w:t xml:space="preserve">Les ennemis débutant leur tour sur </w:t>
+            </w:r>
+            <w:proofErr w:type="gramStart"/>
+            <w:r>
+              <w:t>la glyphe</w:t>
+            </w:r>
+            <w:proofErr w:type="gramEnd"/>
+            <w:r>
+              <w:t xml:space="preserve"> gagnent 50% de dommages finaux.</w:t>
             </w:r>
           </w:p>
         </w:tc>
@@ -37060,6 +35021,7 @@
                 <w:b/>
                 <w:bCs/>
               </w:rPr>
+              <w:lastRenderedPageBreak/>
               <w:t>Roi Nidas</w:t>
             </w:r>
           </w:p>
@@ -37157,7 +35119,15 @@
             </w:r>
             <w:proofErr w:type="spellEnd"/>
             <w:r>
-              <w:t xml:space="preserve"> en fin de tour des dés et une glyphe qui soigne les alliés</w:t>
+              <w:t xml:space="preserve"> en fin de tour des dés et </w:t>
+            </w:r>
+            <w:proofErr w:type="gramStart"/>
+            <w:r>
+              <w:t>une glyphe</w:t>
+            </w:r>
+            <w:proofErr w:type="gramEnd"/>
+            <w:r>
+              <w:t xml:space="preserve"> qui soigne les alliés</w:t>
             </w:r>
           </w:p>
           <w:p>
@@ -37490,7 +35460,15 @@
             </w:r>
             <w:proofErr w:type="spellEnd"/>
             <w:r>
-              <w:t xml:space="preserve"> perd son invulnérabilité pour la fin du combat s’il est récupère toutes les conditions de </w:t>
+              <w:t xml:space="preserve"> perd son invulnérabilité pour la fin du combat s’il est </w:t>
+            </w:r>
+            <w:proofErr w:type="gramStart"/>
+            <w:r>
+              <w:t>récupère</w:t>
+            </w:r>
+            <w:proofErr w:type="gramEnd"/>
+            <w:r>
+              <w:t xml:space="preserve"> toutes les conditions de </w:t>
             </w:r>
             <w:proofErr w:type="spellStart"/>
             <w:r>
@@ -37645,8 +35623,13 @@
             <w:tcW w:w="9093" w:type="dxa"/>
           </w:tcPr>
           <w:p>
-            <w:r>
-              <w:t xml:space="preserve">Objectif  du combat : mettre </w:t>
+            <w:proofErr w:type="gramStart"/>
+            <w:r>
+              <w:t>Objectif  du</w:t>
+            </w:r>
+            <w:proofErr w:type="gramEnd"/>
+            <w:r>
+              <w:t xml:space="preserve"> combat : mettre </w:t>
             </w:r>
             <w:proofErr w:type="spellStart"/>
             <w:r>
@@ -37667,7 +35650,15 @@
             </w:r>
             <w:proofErr w:type="spellEnd"/>
             <w:r>
-              <w:t xml:space="preserve"> à 75% de ses HP, elle va se téléporter à côté d’un personnage, devenir invulnérable, passer son tour et poser une glyphe qui augmente grandement els dommages infligés par les personnages se trouvant dedans pour 2 tours.</w:t>
+              <w:t xml:space="preserve"> à 75% de ses HP, elle va se téléporter à côté d’un personnage, devenir invulnérable, passer son tour et poser </w:t>
+            </w:r>
+            <w:proofErr w:type="gramStart"/>
+            <w:r>
+              <w:t>une glyphe</w:t>
+            </w:r>
+            <w:proofErr w:type="gramEnd"/>
+            <w:r>
+              <w:t xml:space="preserve"> qui augmente grandement els dommages infligés par les personnages se trouvant dedans pour 2 tours.</w:t>
             </w:r>
           </w:p>
         </w:tc>
@@ -37759,7 +35750,15 @@
           </w:p>
           <w:p>
             <w:r>
-              <w:t xml:space="preserve">Seul le Dagon des profondeur peut infliger des </w:t>
+              <w:t xml:space="preserve">Seul le Dagon </w:t>
+            </w:r>
+            <w:proofErr w:type="gramStart"/>
+            <w:r>
+              <w:t>des profondeur</w:t>
+            </w:r>
+            <w:proofErr w:type="gramEnd"/>
+            <w:r>
+              <w:t xml:space="preserve"> peut infliger des </w:t>
             </w:r>
             <w:proofErr w:type="spellStart"/>
             <w:r>
@@ -37777,7 +35776,6 @@
           </w:p>
           <w:p>
             <w:r>
-              <w:lastRenderedPageBreak/>
               <w:t>Si le Dagon meurt : les personnages perdent 75% de leur HP max infini jusqu’à la mort de Bethel</w:t>
             </w:r>
           </w:p>
@@ -37821,7 +35819,6 @@
                 <w:b/>
                 <w:bCs/>
               </w:rPr>
-              <w:lastRenderedPageBreak/>
               <w:t>Roi Dazak</w:t>
             </w:r>
           </w:p>
@@ -37936,12 +35933,21 @@
         <w:pStyle w:val="Titre3"/>
       </w:pPr>
       <w:r>
+        <w:lastRenderedPageBreak/>
         <w:t>Avis de recherche</w:t>
       </w:r>
     </w:p>
     <w:p>
       <w:r>
-        <w:t>Certains avis lancent un sort en début de combat qui leur fait perdre de la vitalité et de la puissance pour chaque monstres en plus dans le combat.</w:t>
+        <w:t xml:space="preserve">Certains avis lancent un sort en début de combat qui leur fait perdre de la vitalité et de la puissance pour chaque </w:t>
+      </w:r>
+      <w:proofErr w:type="gramStart"/>
+      <w:r>
+        <w:t>monstres</w:t>
+      </w:r>
+      <w:proofErr w:type="gramEnd"/>
+      <w:r>
+        <w:t xml:space="preserve"> en plus dans le combat.</w:t>
       </w:r>
     </w:p>
     <w:p>
@@ -38262,7 +36268,15 @@
             </w:r>
             <w:proofErr w:type="spellEnd"/>
             <w:r>
-              <w:t xml:space="preserve"> un glyphe. Un personnage débutant ou finissant son tour sur la glyphe est OS.</w:t>
+              <w:t xml:space="preserve"> un glyphe. Un personnage débutant ou finissant son tour sur </w:t>
+            </w:r>
+            <w:proofErr w:type="gramStart"/>
+            <w:r>
+              <w:t>la glyphe</w:t>
+            </w:r>
+            <w:proofErr w:type="gramEnd"/>
+            <w:r>
+              <w:t xml:space="preserve"> est OS.</w:t>
             </w:r>
           </w:p>
         </w:tc>
@@ -39040,7 +37054,6 @@
           </w:p>
           <w:p>
             <w:r>
-              <w:lastRenderedPageBreak/>
               <w:t>Tous les tours, le Guerrier du K.O. va mettre un de vos personnages dans l’état « Massacre à retardement » via un sort du même nom. Le personnage qui a cet état sera OS s’il a un monstre dans une zone de rayon 6 autour de lui à la fin de son tour.</w:t>
             </w:r>
           </w:p>
@@ -39066,7 +37079,6 @@
                 <w:b/>
                 <w:bCs/>
               </w:rPr>
-              <w:lastRenderedPageBreak/>
               <w:t>Les Guman</w:t>
             </w:r>
           </w:p>
@@ -39254,6 +37266,7 @@
                 <w:b/>
                 <w:bCs/>
               </w:rPr>
+              <w:lastRenderedPageBreak/>
               <w:t xml:space="preserve">Ka </w:t>
             </w:r>
             <w:proofErr w:type="spellStart"/>
@@ -39282,33 +37295,11 @@
                 <w:lang w:val="it-IT"/>
               </w:rPr>
             </w:pPr>
-            <w:proofErr w:type="spellStart"/>
             <w:r>
               <w:rPr>
                 <w:lang w:val="it-IT"/>
               </w:rPr>
-              <w:t>Etat</w:t>
-            </w:r>
-            <w:proofErr w:type="spellEnd"/>
-            <w:r>
-              <w:rPr>
-                <w:lang w:val="it-IT"/>
-              </w:rPr>
-              <w:t xml:space="preserve"> triple </w:t>
-            </w:r>
-            <w:proofErr w:type="spellStart"/>
-            <w:r>
-              <w:rPr>
-                <w:lang w:val="it-IT"/>
-              </w:rPr>
-              <w:t>œil</w:t>
-            </w:r>
-            <w:proofErr w:type="spellEnd"/>
-            <w:r>
-              <w:rPr>
-                <w:lang w:val="it-IT"/>
-              </w:rPr>
-              <w:t xml:space="preserve"> si vita &gt; 70%</w:t>
+              <w:t>Etat triple œil si vita &gt; 70%</w:t>
             </w:r>
           </w:p>
           <w:p>
@@ -40158,7 +38149,15 @@
           </w:tcPr>
           <w:p>
             <w:r>
-              <w:t>Shushu vole 3 PA à chaque alliés dans un cercle 3 autour de lui en début de tour.</w:t>
+              <w:t xml:space="preserve">Shushu vole 3 PA à chaque </w:t>
+            </w:r>
+            <w:proofErr w:type="gramStart"/>
+            <w:r>
+              <w:t>alliés</w:t>
+            </w:r>
+            <w:proofErr w:type="gramEnd"/>
+            <w:r>
+              <w:t xml:space="preserve"> dans un cercle 3 autour de lui en début de tour.</w:t>
             </w:r>
           </w:p>
           <w:p>
@@ -40486,8 +38485,13 @@
             </w:r>
           </w:p>
           <w:p>
-            <w:r>
-              <w:t xml:space="preserve">les </w:t>
+            <w:proofErr w:type="gramStart"/>
+            <w:r>
+              <w:t>les</w:t>
+            </w:r>
+            <w:proofErr w:type="gramEnd"/>
+            <w:r>
+              <w:t xml:space="preserve"> </w:t>
             </w:r>
             <w:r>
               <w:rPr>
@@ -40754,7 +38758,6 @@
                 <w:b/>
                 <w:bCs/>
               </w:rPr>
-              <w:lastRenderedPageBreak/>
               <w:t xml:space="preserve">Armada </w:t>
             </w:r>
             <w:proofErr w:type="spellStart"/>
@@ -40901,7 +38904,6 @@
                 <w:b/>
                 <w:bCs/>
               </w:rPr>
-              <w:lastRenderedPageBreak/>
               <w:t>Yech</w:t>
             </w:r>
             <w:proofErr w:type="spellEnd"/>
@@ -40950,7 +38952,7 @@
 </file>
 
 <file path=word/numbering.xml><?xml version="1.0" encoding="utf-8"?>
-<w:numbering xmlns:wpc="http://schemas.microsoft.com/office/word/2010/wordprocessingCanvas" xmlns:cx="http://schemas.microsoft.com/office/drawing/2014/chartex" xmlns:cx1="http://schemas.microsoft.com/office/drawing/2015/9/8/chartex" xmlns:cx2="http://schemas.microsoft.com/office/drawing/2015/10/21/chartex" xmlns:cx3="http://schemas.microsoft.com/office/drawing/2016/5/9/chartex" xmlns:cx4="http://schemas.microsoft.com/office/drawing/2016/5/10/chartex" xmlns:cx5="http://schemas.microsoft.com/office/drawing/2016/5/11/chartex" xmlns:cx6="http://schemas.microsoft.com/office/drawing/2016/5/12/chartex" xmlns:cx7="http://schemas.microsoft.com/office/drawing/2016/5/13/chartex" xmlns:cx8="http://schemas.microsoft.com/office/drawing/2016/5/14/chartex" xmlns:mc="http://schemas.openxmlformats.org/markup-compatibility/2006" xmlns:aink="http://schemas.microsoft.com/office/drawing/2016/ink" xmlns:am3d="http://schemas.microsoft.com/office/drawing/2017/model3d" xmlns:o="urn:schemas-microsoft-com:office:office" xmlns:oel="http://schemas.microsoft.com/office/2019/extlst" xmlns:r="http://schemas.openxmlformats.org/officeDocument/2006/relationships" xmlns:m="http://schemas.openxmlformats.org/officeDocument/2006/math" xmlns:v="urn:schemas-microsoft-com:vml" xmlns:wp14="http://schemas.microsoft.com/office/word/2010/wordprocessingDrawing" xmlns:wp="http://schemas.openxmlformats.org/drawingml/2006/wordprocessingDrawing" xmlns:w10="urn:schemas-microsoft-com:office:word" xmlns:w="http://schemas.openxmlformats.org/wordprocessingml/2006/main" xmlns:w14="http://schemas.microsoft.com/office/word/2010/wordml" xmlns:w15="http://schemas.microsoft.com/office/word/2012/wordml" xmlns:w16cex="http://schemas.microsoft.com/office/word/2018/wordml/cex" xmlns:w16cid="http://schemas.microsoft.com/office/word/2016/wordml/cid" xmlns:w16="http://schemas.microsoft.com/office/word/2018/wordml" xmlns:w16du="http://schemas.microsoft.com/office/word/2023/wordml/word16du" xmlns:w16sdtdh="http://schemas.microsoft.com/office/word/2020/wordml/sdtdatahash" xmlns:w16sdtfl="http://schemas.microsoft.com/office/word/2024/wordml/sdtformatlock" xmlns:w16se="http://schemas.microsoft.com/office/word/2015/wordml/symex" xmlns:wpg="http://schemas.microsoft.com/office/word/2010/wordprocessingGroup" xmlns:wpi="http://schemas.microsoft.com/office/word/2010/wordprocessingInk" xmlns:wne="http://schemas.microsoft.com/office/word/2006/wordml" xmlns:wps="http://schemas.microsoft.com/office/word/2010/wordprocessingShape" mc:Ignorable="w14 w15 w16se w16cid w16 w16cex w16sdtdh w16sdtfl w16du wp14">
+<w:numbering xmlns:wpc="http://schemas.microsoft.com/office/word/2010/wordprocessingCanvas" xmlns:cx="http://schemas.microsoft.com/office/drawing/2014/chartex" xmlns:cx1="http://schemas.microsoft.com/office/drawing/2015/9/8/chartex" xmlns:cx2="http://schemas.microsoft.com/office/drawing/2015/10/21/chartex" xmlns:cx3="http://schemas.microsoft.com/office/drawing/2016/5/9/chartex" xmlns:cx4="http://schemas.microsoft.com/office/drawing/2016/5/10/chartex" xmlns:cx5="http://schemas.microsoft.com/office/drawing/2016/5/11/chartex" xmlns:cx6="http://schemas.microsoft.com/office/drawing/2016/5/12/chartex" xmlns:cx7="http://schemas.microsoft.com/office/drawing/2016/5/13/chartex" xmlns:cx8="http://schemas.microsoft.com/office/drawing/2016/5/14/chartex" xmlns:mc="http://schemas.openxmlformats.org/markup-compatibility/2006" xmlns:aink="http://schemas.microsoft.com/office/drawing/2016/ink" xmlns:am3d="http://schemas.microsoft.com/office/drawing/2017/model3d" xmlns:o="urn:schemas-microsoft-com:office:office" xmlns:oel="http://schemas.microsoft.com/office/2019/extlst" xmlns:r="http://schemas.openxmlformats.org/officeDocument/2006/relationships" xmlns:m="http://schemas.openxmlformats.org/officeDocument/2006/math" xmlns:v="urn:schemas-microsoft-com:vml" xmlns:wp14="http://schemas.microsoft.com/office/word/2010/wordprocessingDrawing" xmlns:wp="http://schemas.openxmlformats.org/drawingml/2006/wordprocessingDrawing" xmlns:w10="urn:schemas-microsoft-com:office:word" xmlns:w="http://schemas.openxmlformats.org/wordprocessingml/2006/main" xmlns:w14="http://schemas.microsoft.com/office/word/2010/wordml" xmlns:w15="http://schemas.microsoft.com/office/word/2012/wordml" xmlns:w16cei="http://schemas.microsoft.com/office/word/2026/wordml/cei" xmlns:w16cex="http://schemas.microsoft.com/office/word/2018/wordml/cex" xmlns:w16cid="http://schemas.microsoft.com/office/word/2016/wordml/cid" xmlns:w16="http://schemas.microsoft.com/office/word/2018/wordml" xmlns:w16du="http://schemas.microsoft.com/office/word/2023/wordml/word16du" xmlns:w16sdtdh="http://schemas.microsoft.com/office/word/2020/wordml/sdtdatahash" xmlns:w16sdtfl="http://schemas.microsoft.com/office/word/2024/wordml/sdtformatlock" xmlns:w16se="http://schemas.microsoft.com/office/word/2015/wordml/symex" xmlns:wpg="http://schemas.microsoft.com/office/word/2010/wordprocessingGroup" xmlns:wpi="http://schemas.microsoft.com/office/word/2010/wordprocessingInk" xmlns:wne="http://schemas.microsoft.com/office/word/2006/wordml" xmlns:wps="http://schemas.microsoft.com/office/word/2010/wordprocessingShape" mc:Ignorable="w14 w15 w16se w16cid w16 w16cex w16sdtdh w16sdtfl w16du wp14">
   <w:numPicBullet w:numPicBulletId="0">
     <w:pict>
       <v:shapetype id="_x0000_t75" coordsize="21600,21600" o:spt="75" o:preferrelative="t" path="m@4@5l@4@11@9@11@9@5xe" filled="f" stroked="f">
@@ -40972,28 +38974,28 @@
         <v:path o:extrusionok="f" gradientshapeok="t" o:connecttype="rect"/>
         <o:lock v:ext="edit" aspectratio="t"/>
       </v:shapetype>
-      <v:shape id="_x0000_i1025" type="#_x0000_t75" style="width:10.3pt;height:10.3pt" o:bullet="t">
+      <v:shape id="_x0000_i1025" type="#_x0000_t75" style="width:10.5pt;height:10.5pt" o:bullet="t">
         <v:imagedata r:id="rId1" o:title="msoA7B8"/>
       </v:shape>
     </w:pict>
   </w:numPicBullet>
   <w:numPicBullet w:numPicBulletId="1">
     <w:pict>
-      <v:shape id="Image 192" o:spid="_x0000_i1026" type="#_x0000_t75" style="width:46.3pt;height:46.3pt;visibility:visible;mso-wrap-style:square" o:bullet="t">
+      <v:shape id="Image 192" o:spid="_x0000_i1026" type="#_x0000_t75" style="width:48pt;height:48pt;visibility:visible;mso-wrap-style:square" o:bullet="t">
         <v:imagedata r:id="rId2" o:title=""/>
       </v:shape>
     </w:pict>
   </w:numPicBullet>
   <w:numPicBullet w:numPicBulletId="2">
     <w:pict>
-      <v:shape id="Image 171" o:spid="_x0000_i1027" type="#_x0000_t75" style="width:46.3pt;height:46.3pt;visibility:visible;mso-wrap-style:square" o:bullet="t">
+      <v:shape id="Image 171" o:spid="_x0000_i1027" type="#_x0000_t75" style="width:48pt;height:48pt;visibility:visible;mso-wrap-style:square" o:bullet="t">
         <v:imagedata r:id="rId3" o:title=""/>
       </v:shape>
     </w:pict>
   </w:numPicBullet>
   <w:numPicBullet w:numPicBulletId="3">
     <w:pict>
-      <v:shape id="Image 138" o:spid="_x0000_i1028" type="#_x0000_t75" style="width:46.3pt;height:46.3pt;visibility:visible;mso-wrap-style:square" o:bullet="t">
+      <v:shape id="Image 138" o:spid="_x0000_i1028" type="#_x0000_t75" style="width:48pt;height:48pt;visibility:visible;mso-wrap-style:square" o:bullet="t">
         <v:imagedata r:id="rId4" o:title=""/>
       </v:shape>
     </w:pict>

</xml_diff>

<commit_message>
Add items 13483/13484 (Krosmapeau/Krosmape, converted from Krosmaster apparats to real Coiffe/Cape) and their new panoplie; update wiki PDF/docx
</commit_message>
<xml_diff>
--- a/docs/wiki-askawawa.docx
+++ b/docs/wiki-askawawa.docx
@@ -36755,13 +36755,7 @@
         <w:rPr>
           <w:lang w:val="fr-FR"/>
         </w:rPr>
-        <w:t xml:space="preserve"> et </w:t>
-      </w:r>
-      <w:r>
-        <w:rPr>
-          <w:lang w:val="fr-FR"/>
-        </w:rPr>
-        <w:t>équilibrage boost Cra</w:t>
+        <w:t xml:space="preserve"> </w:t>
       </w:r>
     </w:p>
     <w:p>
@@ -36802,6 +36796,11 @@
         <w:t>Bourasque : le sort passe à portée modifiable</w:t>
       </w:r>
     </w:p>
+    <w:p>
+      <w:r>
+        <w:t>Les glyphes malus n’affectent plus les alliés</w:t>
+      </w:r>
+    </w:p>
     <w:p/>
     <w:p>
       <w:pPr>
@@ -36907,6 +36906,19 @@
     <w:p>
       <w:r>
         <w:t>Fracture met 15% érosion</w:t>
+      </w:r>
+    </w:p>
+    <w:p>
+      <w:r>
+        <w:t>Epée céleste passe à 5 de PO à tous les grades</w:t>
+      </w:r>
+    </w:p>
+    <w:p>
+      <w:r>
+        <w:t xml:space="preserve">Epée du jugement </w:t>
+      </w:r>
+      <w:r>
+        <w:t>redevient comme historiquement un sort air + vol feu</w:t>
       </w:r>
     </w:p>
     <w:p/>
@@ -36954,6 +36966,20 @@
         <w:pStyle w:val="Titre3"/>
       </w:pPr>
       <w:r>
+        <w:t>Sadida</w:t>
+      </w:r>
+    </w:p>
+    <w:p>
+      <w:r>
+        <w:t>L’état infecté appliqué par la folle passe à 4 tours</w:t>
+      </w:r>
+    </w:p>
+    <w:p/>
+    <w:p>
+      <w:pPr>
+        <w:pStyle w:val="Titre3"/>
+      </w:pPr>
+      <w:r>
         <w:t>Pandawa</w:t>
       </w:r>
     </w:p>
@@ -36983,7 +37009,10 @@
     </w:p>
     <w:p>
       <w:r>
-        <w:t>Les masque n’ont plus de coût en PA</w:t>
+        <w:t>Les masques</w:t>
+      </w:r>
+      <w:r>
+        <w:t xml:space="preserve"> n’ont plus de coût en PA</w:t>
       </w:r>
     </w:p>
     <w:p>
@@ -37024,6 +37053,11 @@
       </w:r>
       <w:r>
         <w:t>.</w:t>
+      </w:r>
+    </w:p>
+    <w:p>
+      <w:r>
+        <w:t>Inversion des variantes de Marée et Ressac.</w:t>
       </w:r>
     </w:p>
     <w:p/>
@@ -37346,6 +37380,7 @@
     </w:p>
     <w:p>
       <w:r>
+        <w:lastRenderedPageBreak/>
         <w:t>Ces combats permettent de dropper les légendes des équipements légendaires.</w:t>
       </w:r>
     </w:p>
@@ -37499,7 +37534,6 @@
                 <w:b/>
                 <w:bCs/>
               </w:rPr>
-              <w:lastRenderedPageBreak/>
               <w:t>Grand Jeu</w:t>
             </w:r>
           </w:p>
@@ -38599,6 +38633,7 @@
                 <w:b/>
                 <w:bCs/>
               </w:rPr>
+              <w:lastRenderedPageBreak/>
               <w:t>Royalmouth</w:t>
             </w:r>
           </w:p>
@@ -38654,7 +38689,6 @@
           </w:p>
           <w:p>
             <w:r>
-              <w:lastRenderedPageBreak/>
               <w:t xml:space="preserve">Il perd son invulnérabilité pour </w:t>
             </w:r>
             <w:r>
@@ -38686,7 +38720,6 @@
                 <w:b/>
                 <w:bCs/>
               </w:rPr>
-              <w:lastRenderedPageBreak/>
               <w:t>Ben le Ripate</w:t>
             </w:r>
           </w:p>
@@ -39421,6 +39454,7 @@
           </w:p>
           <w:p>
             <w:r>
+              <w:lastRenderedPageBreak/>
               <w:t>Tous alliés ayant &gt; 90% de leur HP au moment de la mort d’un monstre sons mis pacifistes pour 1 tour.</w:t>
             </w:r>
           </w:p>
@@ -39446,6 +39480,7 @@
                 <w:b/>
                 <w:bCs/>
               </w:rPr>
+              <w:lastRenderedPageBreak/>
               <w:t>Missiz Frizz</w:t>
             </w:r>
           </w:p>
@@ -39510,7 +39545,6 @@
           </w:p>
           <w:p>
             <w:r>
-              <w:lastRenderedPageBreak/>
               <w:t>Au bout du 3</w:t>
             </w:r>
             <w:r>
@@ -39545,7 +39579,6 @@
                 <w:b/>
                 <w:bCs/>
               </w:rPr>
-              <w:lastRenderedPageBreak/>
               <w:t>Nileza</w:t>
             </w:r>
           </w:p>
@@ -40168,6 +40201,7 @@
               </w:numPr>
             </w:pPr>
             <w:r>
+              <w:lastRenderedPageBreak/>
               <w:t>DoPou</w:t>
             </w:r>
           </w:p>
@@ -40246,6 +40280,7 @@
                 <w:b/>
                 <w:bCs/>
               </w:rPr>
+              <w:lastRenderedPageBreak/>
               <w:t>Tal Kasha</w:t>
             </w:r>
           </w:p>
@@ -40280,7 +40315,6 @@
                 <w:b/>
                 <w:bCs/>
               </w:rPr>
-              <w:lastRenderedPageBreak/>
               <w:t>Ilyzaelle</w:t>
             </w:r>
           </w:p>
@@ -41137,6 +41171,7 @@
           </w:p>
           <w:p>
             <w:r>
+              <w:lastRenderedPageBreak/>
               <w:t>A chaque début de tour, Fou met aléatoirement un état Pierre Feuille ou Ciseau sur les personnages.</w:t>
             </w:r>
           </w:p>
@@ -41172,6 +41207,7 @@
                 <w:b/>
                 <w:bCs/>
               </w:rPr>
+              <w:lastRenderedPageBreak/>
               <w:t>Frakacia</w:t>
             </w:r>
           </w:p>
@@ -41312,7 +41348,6 @@
                 <w:b/>
                 <w:bCs/>
               </w:rPr>
-              <w:lastRenderedPageBreak/>
               <w:t>Glourdorak</w:t>
             </w:r>
           </w:p>
@@ -42405,6 +42440,7 @@
                 <w:b/>
                 <w:bCs/>
               </w:rPr>
+              <w:lastRenderedPageBreak/>
               <w:t>Trukipik</w:t>
             </w:r>
           </w:p>
@@ -42566,7 +42602,6 @@
               </w:numPr>
             </w:pPr>
             <w:r>
-              <w:lastRenderedPageBreak/>
               <w:t xml:space="preserve">Si un personnage </w:t>
             </w:r>
             <w:r>
@@ -42705,7 +42740,6 @@
                 <w:b/>
                 <w:bCs/>
               </w:rPr>
-              <w:lastRenderedPageBreak/>
               <w:t>Voldelor</w:t>
             </w:r>
           </w:p>

</xml_diff>

<commit_message>
Sync wiki docs from master (added stat caps: 14 PA / 8 PM / 8 PO / 50% res.)
</commit_message>
<xml_diff>
--- a/docs/wiki-askawawa.docx
+++ b/docs/wiki-askawawa.docx
@@ -2356,8 +2356,13 @@
     </w:p>
     <w:p>
       <w:r>
-        <w:t>Il n’y a pas de maximum de PA / PM / PO</w:t>
-      </w:r>
+        <w:t xml:space="preserve">Maximum 14 PA – 8 PM – 8 PO – 50% </w:t>
+      </w:r>
+      <w:proofErr w:type="spellStart"/>
+      <w:r>
+        <w:t>res</w:t>
+      </w:r>
+      <w:proofErr w:type="spellEnd"/>
       <w:r>
         <w:t xml:space="preserve">. </w:t>
       </w:r>

</xml_diff>

<commit_message>
Update wiki (docx + pdf)
</commit_message>
<xml_diff>
--- a/docs/wiki-askawawa.docx
+++ b/docs/wiki-askawawa.docx
@@ -14386,6 +14386,17 @@
               <w:jc w:val="center"/>
             </w:pPr>
             <w:r>
+              <w:t>Dragon cochon</w:t>
+            </w:r>
+            <w:r>
+              <w:t xml:space="preserve"> </w:t>
+            </w:r>
+          </w:p>
+          <w:p>
+            <w:pPr>
+              <w:jc w:val="center"/>
+            </w:pPr>
+            <w:r>
               <w:t>Chêne Mou</w:t>
             </w:r>
           </w:p>
@@ -14393,9 +14404,6 @@
             <w:pPr>
               <w:jc w:val="center"/>
             </w:pPr>
-            <w:r>
-              <w:t>Dragon cochon</w:t>
-            </w:r>
           </w:p>
         </w:tc>
         <w:tc>
@@ -14408,11 +14416,24 @@
               <w:jc w:val="center"/>
             </w:pPr>
             <w:r>
+              <w:t>0,3%</w:t>
+            </w:r>
+          </w:p>
+          <w:p>
+            <w:pPr>
+              <w:jc w:val="center"/>
+            </w:pPr>
+            <w:r>
               <w:t>0,6</w:t>
             </w:r>
             <w:r>
               <w:t>%</w:t>
             </w:r>
+          </w:p>
+          <w:p>
+            <w:pPr>
+              <w:jc w:val="center"/>
+            </w:pPr>
           </w:p>
         </w:tc>
       </w:tr>
@@ -14472,6 +14493,14 @@
               <w:jc w:val="center"/>
             </w:pPr>
             <w:r>
+              <w:t>Minotoror</w:t>
+            </w:r>
+          </w:p>
+          <w:p>
+            <w:pPr>
+              <w:jc w:val="center"/>
+            </w:pPr>
+            <w:r>
               <w:t>Minotot</w:t>
             </w:r>
           </w:p>
@@ -14481,6 +14510,14 @@
             <w:tcW w:w="1985" w:type="dxa"/>
             <w:vAlign w:val="center"/>
           </w:tcPr>
+          <w:p>
+            <w:pPr>
+              <w:jc w:val="center"/>
+            </w:pPr>
+            <w:r>
+              <w:t>0,3%</w:t>
+            </w:r>
+          </w:p>
           <w:p>
             <w:pPr>
               <w:jc w:val="center"/>
@@ -43162,28 +43199,28 @@
         <v:path o:extrusionok="f" gradientshapeok="t" o:connecttype="rect"/>
         <o:lock v:ext="edit" aspectratio="t"/>
       </v:shapetype>
-      <v:shape id="_x0000_i1025" type="#_x0000_t75" style="width:10.35pt;height:10.35pt" o:bullet="t">
+      <v:shape id="_x0000_i1025" type="#_x0000_t75" style="width:10.5pt;height:10.5pt" o:bullet="t">
         <v:imagedata r:id="rId1" o:title="msoA7B8"/>
       </v:shape>
     </w:pict>
   </w:numPicBullet>
   <w:numPicBullet w:numPicBulletId="1">
     <w:pict>
-      <v:shape id="Image 192" o:spid="_x0000_i1026" type="#_x0000_t75" style="width:47.8pt;height:47.8pt;visibility:visible;mso-wrap-style:square" o:bullet="t">
+      <v:shape id="Image 192" o:spid="_x0000_i1026" type="#_x0000_t75" style="width:48pt;height:48pt;visibility:visible;mso-wrap-style:square" o:bullet="t">
         <v:imagedata r:id="rId2" o:title=""/>
       </v:shape>
     </w:pict>
   </w:numPicBullet>
   <w:numPicBullet w:numPicBulletId="2">
     <w:pict>
-      <v:shape id="Image 171" o:spid="_x0000_i1027" type="#_x0000_t75" style="width:47.8pt;height:47.8pt;visibility:visible;mso-wrap-style:square" o:bullet="t">
+      <v:shape id="Image 171" o:spid="_x0000_i1027" type="#_x0000_t75" style="width:48pt;height:48pt;visibility:visible;mso-wrap-style:square" o:bullet="t">
         <v:imagedata r:id="rId3" o:title=""/>
       </v:shape>
     </w:pict>
   </w:numPicBullet>
   <w:numPicBullet w:numPicBulletId="3">
     <w:pict>
-      <v:shape id="Image 138" o:spid="_x0000_i1028" type="#_x0000_t75" style="width:47.8pt;height:47.8pt;visibility:visible;mso-wrap-style:square" o:bullet="t">
+      <v:shape id="Image 138" o:spid="_x0000_i1028" type="#_x0000_t75" style="width:48pt;height:48pt;visibility:visible;mso-wrap-style:square" o:bullet="t">
         <v:imagedata r:id="rId4" o:title=""/>
       </v:shape>
     </w:pict>

</xml_diff>

<commit_message>
Wiki: refonte du tableau de classes en 1ère page
</commit_message>
<xml_diff>
--- a/docs/wiki-askawawa.docx
+++ b/docs/wiki-askawawa.docx
@@ -20,20 +20,24 @@
     <w:tbl>
       <w:tblPr>
         <w:tblStyle w:val="Grilledutableau"/>
-        <w:tblW w:w="0" w:type="auto"/>
+        <w:tblW w:w="15115" w:type="dxa"/>
         <w:tblLook w:val="04A0" w:firstRow="1" w:lastRow="0" w:firstColumn="1" w:lastColumn="0" w:noHBand="0" w:noVBand="1"/>
       </w:tblPr>
       <w:tblGrid>
-        <w:gridCol w:w="1869"/>
+        <w:gridCol w:w="1868"/>
         <w:gridCol w:w="1280"/>
-        <w:gridCol w:w="2516"/>
-        <w:gridCol w:w="2552"/>
-        <w:gridCol w:w="1701"/>
+        <w:gridCol w:w="1667"/>
+        <w:gridCol w:w="2268"/>
+        <w:gridCol w:w="1606"/>
+        <w:gridCol w:w="1607"/>
+        <w:gridCol w:w="1606"/>
+        <w:gridCol w:w="1607"/>
+        <w:gridCol w:w="1606"/>
       </w:tblGrid>
       <w:tr>
         <w:tc>
           <w:tcPr>
-            <w:tcW w:w="1869" w:type="dxa"/>
+            <w:tcW w:w="1868" w:type="dxa"/>
             <w:shd w:val="clear" w:color="auto" w:fill="BFBFBF" w:themeFill="background1" w:themeFillShade="BF"/>
             <w:vAlign w:val="center"/>
           </w:tcPr>
@@ -51,6 +55,22 @@
                 <w:bCs/>
               </w:rPr>
               <w:t>Classe</w:t>
+            </w:r>
+          </w:p>
+          <w:p>
+            <w:pPr>
+              <w:jc w:val="center"/>
+              <w:rPr>
+                <w:b/>
+                <w:bCs/>
+              </w:rPr>
+            </w:pPr>
+            <w:r>
+              <w:rPr>
+                <w:b/>
+                <w:bCs/>
+              </w:rPr>
+              <w:t>Conseils éléments</w:t>
             </w:r>
           </w:p>
         </w:tc>
@@ -79,7 +99,7 @@
         </w:tc>
         <w:tc>
           <w:tcPr>
-            <w:tcW w:w="2516" w:type="dxa"/>
+            <w:tcW w:w="1667" w:type="dxa"/>
             <w:shd w:val="clear" w:color="auto" w:fill="BFBFBF" w:themeFill="background1" w:themeFillShade="BF"/>
             <w:vAlign w:val="center"/>
           </w:tcPr>
@@ -102,7 +122,7 @@
         </w:tc>
         <w:tc>
           <w:tcPr>
-            <w:tcW w:w="2552" w:type="dxa"/>
+            <w:tcW w:w="2268" w:type="dxa"/>
             <w:shd w:val="clear" w:color="auto" w:fill="BFBFBF" w:themeFill="background1" w:themeFillShade="BF"/>
             <w:vAlign w:val="center"/>
           </w:tcPr>
@@ -125,24 +145,69 @@
         </w:tc>
         <w:tc>
           <w:tcPr>
-            <w:tcW w:w="1701" w:type="dxa"/>
+            <w:tcW w:w="8032" w:type="dxa"/>
+            <w:gridSpan w:val="5"/>
             <w:shd w:val="clear" w:color="auto" w:fill="BFBFBF" w:themeFill="background1" w:themeFillShade="BF"/>
-            <w:vAlign w:val="center"/>
-          </w:tcPr>
-          <w:p>
-            <w:pPr>
-              <w:jc w:val="center"/>
-              <w:rPr>
-                <w:b/>
-                <w:bCs/>
-              </w:rPr>
-            </w:pPr>
-            <w:r>
-              <w:rPr>
-                <w:b/>
-                <w:bCs/>
-              </w:rPr>
-              <w:t>Potentiel de dégâts</w:t>
+          </w:tcPr>
+          <w:p>
+            <w:pPr>
+              <w:jc w:val="center"/>
+              <w:rPr>
+                <w:b/>
+                <w:bCs/>
+              </w:rPr>
+            </w:pPr>
+            <w:r>
+              <w:rPr>
+                <w:b/>
+                <w:bCs/>
+              </w:rPr>
+              <w:t xml:space="preserve">Elément Majeur - Zone </w:t>
+            </w:r>
+            <w:r>
+              <w:rPr>
+                <w:rFonts w:cstheme="minorHAnsi"/>
+              </w:rPr>
+              <w:t>⌂</w:t>
+            </w:r>
+            <w:r>
+              <w:rPr>
+                <w:rFonts w:cstheme="minorHAnsi"/>
+              </w:rPr>
+              <w:t xml:space="preserve"> - </w:t>
+            </w:r>
+            <w:r>
+              <w:rPr>
+                <w:b/>
+                <w:bCs/>
+              </w:rPr>
+              <w:t xml:space="preserve">Dégâts </w:t>
+            </w:r>
+            <w:r>
+              <w:rPr>
+                <w:rFonts w:cstheme="minorHAnsi"/>
+                <w:b/>
+                <w:bCs/>
+              </w:rPr>
+              <w:t>Ω</w:t>
+            </w:r>
+          </w:p>
+          <w:p>
+            <w:pPr>
+              <w:jc w:val="center"/>
+              <w:rPr>
+                <w:rFonts w:cstheme="minorHAnsi"/>
+                <w:b/>
+                <w:bCs/>
+              </w:rPr>
+            </w:pPr>
+            <w:r>
+              <w:rPr>
+                <w:rFonts w:cstheme="minorHAnsi"/>
+                <w:b/>
+                <w:bCs/>
+              </w:rPr>
+              <w:t xml:space="preserve">Level - Distance M D </w:t>
             </w:r>
           </w:p>
         </w:tc>
@@ -150,7 +215,7 @@
       <w:tr>
         <w:tc>
           <w:tcPr>
-            <w:tcW w:w="1869" w:type="dxa"/>
+            <w:tcW w:w="1868" w:type="dxa"/>
             <w:vAlign w:val="center"/>
           </w:tcPr>
           <w:p>
@@ -161,6 +226,31 @@
               <w:t>Feca</w:t>
             </w:r>
           </w:p>
+          <w:p>
+            <w:pPr>
+              <w:jc w:val="center"/>
+            </w:pPr>
+            <w:r>
+              <w:rPr>
+                <w:rFonts w:ascii="Segoe UI Emoji" w:hAnsi="Segoe UI Emoji" w:cs="Segoe UI Emoji"/>
+                <w:b/>
+                <w:bCs/>
+              </w:rPr>
+              <w:t>🔥</w:t>
+            </w:r>
+            <w:r>
+              <w:rPr>
+                <w:rFonts w:ascii="Segoe UI Emoji" w:hAnsi="Segoe UI Emoji" w:cs="Segoe UI Emoji"/>
+              </w:rPr>
+              <w:t xml:space="preserve"> 💧</w:t>
+            </w:r>
+            <w:r>
+              <w:rPr>
+                <w:rFonts w:ascii="Segoe UI Emoji" w:hAnsi="Segoe UI Emoji" w:cs="Segoe UI Emoji"/>
+              </w:rPr>
+              <w:t>⚡</w:t>
+            </w:r>
+          </w:p>
         </w:tc>
         <w:tc>
           <w:tcPr>
@@ -184,7 +274,7 @@
         </w:tc>
         <w:tc>
           <w:tcPr>
-            <w:tcW w:w="2516" w:type="dxa"/>
+            <w:tcW w:w="1667" w:type="dxa"/>
             <w:vAlign w:val="center"/>
           </w:tcPr>
           <w:p>
@@ -198,18 +288,15 @@
         </w:tc>
         <w:tc>
           <w:tcPr>
-            <w:tcW w:w="2552" w:type="dxa"/>
-            <w:vAlign w:val="center"/>
-          </w:tcPr>
-          <w:p>
-            <w:pPr>
-              <w:jc w:val="center"/>
-            </w:pPr>
-            <w:r>
-              <w:t xml:space="preserve">Réduction des </w:t>
-            </w:r>
-            <w:r>
-              <w:t>dégâts</w:t>
+            <w:tcW w:w="2268" w:type="dxa"/>
+            <w:vAlign w:val="center"/>
+          </w:tcPr>
+          <w:p>
+            <w:pPr>
+              <w:jc w:val="center"/>
+            </w:pPr>
+            <w:r>
+              <w:t>Réduction des dégâts</w:t>
             </w:r>
           </w:p>
           <w:p>
@@ -239,28 +326,199 @@
         </w:tc>
         <w:tc>
           <w:tcPr>
-            <w:tcW w:w="1701" w:type="dxa"/>
-            <w:vAlign w:val="center"/>
-          </w:tcPr>
-          <w:p>
-            <w:pPr>
-              <w:jc w:val="center"/>
-            </w:pPr>
+            <w:tcW w:w="1606" w:type="dxa"/>
+            <w:vAlign w:val="center"/>
+          </w:tcPr>
+          <w:p>
+            <w:pPr>
+              <w:jc w:val="center"/>
+              <w:rPr>
+                <w:rFonts w:ascii="Segoe UI Emoji" w:hAnsi="Segoe UI Emoji" w:cs="Segoe UI Emoji"/>
+                <w:b/>
+                <w:bCs/>
+              </w:rPr>
+            </w:pPr>
+            <w:r>
+              <w:rPr>
+                <w:rFonts w:ascii="Segoe UI Emoji" w:hAnsi="Segoe UI Emoji" w:cs="Segoe UI Emoji"/>
+                <w:b/>
+                <w:bCs/>
+              </w:rPr>
+              <w:t>🔥</w:t>
+            </w:r>
+            <w:r>
+              <w:rPr>
+                <w:rFonts w:ascii="Segoe UI Emoji" w:hAnsi="Segoe UI Emoji" w:cs="Segoe UI Emoji"/>
+                <w:b/>
+                <w:bCs/>
+              </w:rPr>
+              <w:t xml:space="preserve"> </w:t>
+            </w:r>
             <w:r>
               <w:rPr>
                 <w:rFonts w:cstheme="minorHAnsi"/>
-                <w:b/>
-                <w:bCs/>
-              </w:rPr>
-              <w:t>Ω Ω Ω</w:t>
-            </w:r>
+                <w:lang w:val="it-IT"/>
+              </w:rPr>
+              <w:t xml:space="preserve">⌂ </w:t>
+            </w:r>
+            <w:r>
+              <w:rPr>
+                <w:rFonts w:cstheme="minorHAnsi"/>
+                <w:b/>
+                <w:bCs/>
+              </w:rPr>
+              <w:t xml:space="preserve">Ω </w:t>
+            </w:r>
+          </w:p>
+          <w:p>
+            <w:pPr>
+              <w:jc w:val="center"/>
+            </w:pPr>
+            <w:r>
+              <w:t xml:space="preserve">lvl 1 </w:t>
+            </w:r>
+            <w:r>
+              <w:t>MD</w:t>
+            </w:r>
+          </w:p>
+        </w:tc>
+        <w:tc>
+          <w:tcPr>
+            <w:tcW w:w="1607" w:type="dxa"/>
+            <w:vAlign w:val="center"/>
+          </w:tcPr>
+          <w:p>
+            <w:pPr>
+              <w:jc w:val="center"/>
+            </w:pPr>
+            <w:r>
+              <w:rPr>
+                <w:rFonts w:ascii="Segoe UI Emoji" w:hAnsi="Segoe UI Emoji" w:cs="Segoe UI Emoji"/>
+              </w:rPr>
+              <w:t>💧</w:t>
+            </w:r>
+            <w:r>
+              <w:rPr>
+                <w:rFonts w:cstheme="minorHAnsi"/>
+                <w:lang w:val="it-IT"/>
+              </w:rPr>
+              <w:t xml:space="preserve">⌂ </w:t>
+            </w:r>
+            <w:r>
+              <w:rPr>
+                <w:rFonts w:cstheme="minorHAnsi"/>
+                <w:b/>
+                <w:bCs/>
+              </w:rPr>
+              <w:t xml:space="preserve">Ω </w:t>
+            </w:r>
+          </w:p>
+          <w:p>
+            <w:pPr>
+              <w:jc w:val="center"/>
+            </w:pPr>
+            <w:r>
+              <w:t xml:space="preserve">lvl 22 </w:t>
+            </w:r>
+            <w:r>
+              <w:t>D</w:t>
+            </w:r>
+          </w:p>
+        </w:tc>
+        <w:tc>
+          <w:tcPr>
+            <w:tcW w:w="1606" w:type="dxa"/>
+            <w:vAlign w:val="center"/>
+          </w:tcPr>
+          <w:p>
+            <w:pPr>
+              <w:jc w:val="center"/>
+              <w:rPr>
+                <w:rFonts w:ascii="Segoe UI Emoji" w:hAnsi="Segoe UI Emoji" w:cs="Segoe UI Emoji"/>
+              </w:rPr>
+            </w:pPr>
+            <w:r>
+              <w:rPr>
+                <w:rFonts w:ascii="Segoe UI Emoji" w:hAnsi="Segoe UI Emoji" w:cs="Segoe UI Emoji"/>
+              </w:rPr>
+              <w:t>⚡</w:t>
+            </w:r>
+            <w:r>
+              <w:rPr>
+                <w:rFonts w:cstheme="minorHAnsi"/>
+                <w:lang w:val="it-IT"/>
+              </w:rPr>
+              <w:t xml:space="preserve">⌂ </w:t>
+            </w:r>
+            <w:r>
+              <w:rPr>
+                <w:rFonts w:cstheme="minorHAnsi"/>
+                <w:b/>
+                <w:bCs/>
+              </w:rPr>
+              <w:t xml:space="preserve">Ω </w:t>
+            </w:r>
+          </w:p>
+          <w:p>
+            <w:pPr>
+              <w:jc w:val="center"/>
+              <w:rPr>
+                <w:rFonts w:ascii="Segoe UI Emoji" w:hAnsi="Segoe UI Emoji" w:cs="Segoe UI Emoji"/>
+              </w:rPr>
+            </w:pPr>
+            <w:r>
+              <w:rPr>
+                <w:rFonts w:cstheme="minorHAnsi"/>
+              </w:rPr>
+              <w:t>lvl 92</w:t>
+            </w:r>
+            <w:r>
+              <w:rPr>
+                <w:rFonts w:cstheme="minorHAnsi"/>
+              </w:rPr>
+              <w:t xml:space="preserve"> </w:t>
+            </w:r>
+            <w:r>
+              <w:rPr>
+                <w:rFonts w:ascii="Segoe UI Emoji" w:hAnsi="Segoe UI Emoji" w:cs="Segoe UI Emoji"/>
+              </w:rPr>
+              <w:t>MD</w:t>
+            </w:r>
+          </w:p>
+        </w:tc>
+        <w:tc>
+          <w:tcPr>
+            <w:tcW w:w="1607" w:type="dxa"/>
+            <w:shd w:val="clear" w:color="auto" w:fill="000000" w:themeFill="text1"/>
+            <w:vAlign w:val="center"/>
+          </w:tcPr>
+          <w:p>
+            <w:pPr>
+              <w:jc w:val="center"/>
+              <w:rPr>
+                <w:b/>
+                <w:bCs/>
+              </w:rPr>
+            </w:pPr>
+          </w:p>
+        </w:tc>
+        <w:tc>
+          <w:tcPr>
+            <w:tcW w:w="1606" w:type="dxa"/>
+            <w:shd w:val="clear" w:color="auto" w:fill="000000" w:themeFill="text1"/>
+            <w:vAlign w:val="center"/>
+          </w:tcPr>
+          <w:p>
+            <w:pPr>
+              <w:jc w:val="center"/>
+            </w:pPr>
           </w:p>
         </w:tc>
       </w:tr>
       <w:tr>
         <w:tc>
           <w:tcPr>
-            <w:tcW w:w="1869" w:type="dxa"/>
+            <w:tcW w:w="1868" w:type="dxa"/>
             <w:vAlign w:val="center"/>
           </w:tcPr>
           <w:p>
@@ -271,6 +529,25 @@
               <w:t>Enutrof</w:t>
             </w:r>
           </w:p>
+          <w:p>
+            <w:pPr>
+              <w:jc w:val="center"/>
+            </w:pPr>
+            <w:r>
+              <w:rPr>
+                <w:rFonts w:ascii="Segoe UI Emoji" w:hAnsi="Segoe UI Emoji" w:cs="Segoe UI Emoji"/>
+              </w:rPr>
+              <w:t>💧 🟤</w:t>
+            </w:r>
+            <w:r>
+              <w:rPr>
+                <w:rFonts w:ascii="Segoe UI Emoji" w:hAnsi="Segoe UI Emoji" w:cs="Segoe UI Emoji"/>
+                <w:b/>
+                <w:bCs/>
+              </w:rPr>
+              <w:t xml:space="preserve"> 🔥</w:t>
+            </w:r>
+          </w:p>
         </w:tc>
         <w:tc>
           <w:tcPr>
@@ -294,7 +571,7 @@
         </w:tc>
         <w:tc>
           <w:tcPr>
-            <w:tcW w:w="2516" w:type="dxa"/>
+            <w:tcW w:w="1667" w:type="dxa"/>
             <w:vAlign w:val="center"/>
           </w:tcPr>
           <w:p>
@@ -308,7 +585,7 @@
         </w:tc>
         <w:tc>
           <w:tcPr>
-            <w:tcW w:w="2552" w:type="dxa"/>
+            <w:tcW w:w="2268" w:type="dxa"/>
             <w:vAlign w:val="center"/>
           </w:tcPr>
           <w:p>
@@ -359,33 +636,217 @@
         </w:tc>
         <w:tc>
           <w:tcPr>
-            <w:tcW w:w="1701" w:type="dxa"/>
-            <w:vAlign w:val="center"/>
-          </w:tcPr>
-          <w:p>
-            <w:pPr>
-              <w:jc w:val="center"/>
+            <w:tcW w:w="1606" w:type="dxa"/>
+            <w:vAlign w:val="center"/>
+          </w:tcPr>
+          <w:p>
+            <w:pPr>
+              <w:jc w:val="center"/>
+            </w:pPr>
+            <w:r>
+              <w:rPr>
+                <w:rFonts w:ascii="Segoe UI Emoji" w:hAnsi="Segoe UI Emoji" w:cs="Segoe UI Emoji"/>
+              </w:rPr>
+              <w:t>💧</w:t>
+            </w:r>
+            <w:r>
               <w:rPr>
                 <w:rFonts w:cstheme="minorHAnsi"/>
-                <w:b/>
-                <w:bCs/>
-              </w:rPr>
-            </w:pPr>
+                <w:lang w:val="it-IT"/>
+              </w:rPr>
+              <w:t xml:space="preserve"> </w:t>
+            </w:r>
             <w:r>
               <w:rPr>
                 <w:rFonts w:cstheme="minorHAnsi"/>
                 <w:b/>
                 <w:bCs/>
               </w:rPr>
-              <w:t>Ω Ω Ω</w:t>
-            </w:r>
+              <w:t>Ω Ω</w:t>
+            </w:r>
+          </w:p>
+          <w:p>
+            <w:pPr>
+              <w:jc w:val="center"/>
+            </w:pPr>
+            <w:r>
+              <w:t xml:space="preserve">lvl 1 </w:t>
+            </w:r>
+            <w:r>
+              <w:t>D</w:t>
+            </w:r>
+          </w:p>
+        </w:tc>
+        <w:tc>
+          <w:tcPr>
+            <w:tcW w:w="1607" w:type="dxa"/>
+            <w:vAlign w:val="center"/>
+          </w:tcPr>
+          <w:p>
+            <w:pPr>
+              <w:jc w:val="center"/>
+            </w:pPr>
+            <w:r>
+              <w:rPr>
+                <w:rFonts w:ascii="Segoe UI Emoji" w:hAnsi="Segoe UI Emoji" w:cs="Segoe UI Emoji"/>
+              </w:rPr>
+              <w:t>🟤</w:t>
+            </w:r>
+            <w:r>
+              <w:rPr>
+                <w:rFonts w:cstheme="minorHAnsi"/>
+                <w:b/>
+                <w:bCs/>
+              </w:rPr>
+              <w:t xml:space="preserve"> </w:t>
+            </w:r>
+            <w:r>
+              <w:rPr>
+                <w:rFonts w:cstheme="minorHAnsi"/>
+                <w:lang w:val="it-IT"/>
+              </w:rPr>
+              <w:t xml:space="preserve">⌂ </w:t>
+            </w:r>
+            <w:r>
+              <w:rPr>
+                <w:rFonts w:cstheme="minorHAnsi"/>
+                <w:b/>
+                <w:bCs/>
+              </w:rPr>
+              <w:t>Ω Ω</w:t>
+            </w:r>
+            <w:r>
+              <w:rPr>
+                <w:rFonts w:cstheme="minorHAnsi"/>
+                <w:b/>
+                <w:bCs/>
+              </w:rPr>
+              <w:t xml:space="preserve"> Ω</w:t>
+            </w:r>
+          </w:p>
+          <w:p>
+            <w:pPr>
+              <w:jc w:val="center"/>
+            </w:pPr>
+            <w:r>
+              <w:t xml:space="preserve">lvl 1 </w:t>
+            </w:r>
+            <w:r>
+              <w:t>M</w:t>
+            </w:r>
+            <w:r>
+              <w:t>D</w:t>
+            </w:r>
+          </w:p>
+        </w:tc>
+        <w:tc>
+          <w:tcPr>
+            <w:tcW w:w="1606" w:type="dxa"/>
+            <w:vAlign w:val="center"/>
+          </w:tcPr>
+          <w:p>
+            <w:pPr>
+              <w:jc w:val="center"/>
+              <w:rPr>
+                <w:rFonts w:cstheme="minorHAnsi"/>
+                <w:b/>
+                <w:bCs/>
+              </w:rPr>
+            </w:pPr>
+            <w:r>
+              <w:rPr>
+                <w:rFonts w:ascii="Segoe UI Emoji" w:hAnsi="Segoe UI Emoji" w:cs="Segoe UI Emoji"/>
+                <w:b/>
+                <w:bCs/>
+              </w:rPr>
+              <w:t>🔥</w:t>
+            </w:r>
+            <w:r>
+              <w:rPr>
+                <w:rFonts w:ascii="Segoe UI Emoji" w:hAnsi="Segoe UI Emoji" w:cs="Segoe UI Emoji"/>
+                <w:b/>
+                <w:bCs/>
+              </w:rPr>
+              <w:t xml:space="preserve"> </w:t>
+            </w:r>
+            <w:r>
+              <w:rPr>
+                <w:rFonts w:cstheme="minorHAnsi"/>
+                <w:lang w:val="it-IT"/>
+              </w:rPr>
+              <w:t xml:space="preserve">⌂ </w:t>
+            </w:r>
+            <w:r>
+              <w:rPr>
+                <w:rFonts w:cstheme="minorHAnsi"/>
+                <w:b/>
+                <w:bCs/>
+              </w:rPr>
+              <w:t>Ω Ω</w:t>
+            </w:r>
+          </w:p>
+          <w:p>
+            <w:pPr>
+              <w:jc w:val="center"/>
+              <w:rPr>
+                <w:lang w:val="it-IT"/>
+              </w:rPr>
+            </w:pPr>
+            <w:r>
+              <w:rPr>
+                <w:rFonts w:cstheme="minorHAnsi"/>
+              </w:rPr>
+              <w:t xml:space="preserve">lvl </w:t>
+            </w:r>
+            <w:r>
+              <w:rPr>
+                <w:rFonts w:cstheme="minorHAnsi"/>
+              </w:rPr>
+              <w:t xml:space="preserve">180 </w:t>
+            </w:r>
+            <w:r>
+              <w:rPr>
+                <w:rFonts w:ascii="Segoe UI Emoji" w:hAnsi="Segoe UI Emoji" w:cs="Segoe UI Emoji"/>
+              </w:rPr>
+              <w:t>MD</w:t>
+            </w:r>
+          </w:p>
+        </w:tc>
+        <w:tc>
+          <w:tcPr>
+            <w:tcW w:w="1607" w:type="dxa"/>
+            <w:shd w:val="clear" w:color="auto" w:fill="000000" w:themeFill="text1"/>
+            <w:vAlign w:val="center"/>
+          </w:tcPr>
+          <w:p>
+            <w:pPr>
+              <w:jc w:val="center"/>
+              <w:rPr>
+                <w:lang w:val="it-IT"/>
+              </w:rPr>
+            </w:pPr>
+          </w:p>
+        </w:tc>
+        <w:tc>
+          <w:tcPr>
+            <w:tcW w:w="1606" w:type="dxa"/>
+            <w:shd w:val="clear" w:color="auto" w:fill="000000" w:themeFill="text1"/>
+            <w:vAlign w:val="center"/>
+          </w:tcPr>
+          <w:p>
+            <w:pPr>
+              <w:jc w:val="center"/>
+              <w:rPr>
+                <w:lang w:val="it-IT"/>
+              </w:rPr>
+            </w:pPr>
           </w:p>
         </w:tc>
       </w:tr>
       <w:tr>
         <w:tc>
           <w:tcPr>
-            <w:tcW w:w="1869" w:type="dxa"/>
+            <w:tcW w:w="1868" w:type="dxa"/>
             <w:vAlign w:val="center"/>
           </w:tcPr>
           <w:p>
@@ -396,6 +857,31 @@
               <w:t>Eniripsa</w:t>
             </w:r>
           </w:p>
+          <w:p>
+            <w:pPr>
+              <w:jc w:val="center"/>
+            </w:pPr>
+            <w:r>
+              <w:rPr>
+                <w:rFonts w:ascii="Segoe UI Emoji" w:hAnsi="Segoe UI Emoji" w:cs="Segoe UI Emoji"/>
+                <w:b/>
+                <w:bCs/>
+              </w:rPr>
+              <w:t>🔥</w:t>
+            </w:r>
+            <w:r>
+              <w:rPr>
+                <w:rFonts w:ascii="Segoe UI Emoji" w:hAnsi="Segoe UI Emoji" w:cs="Segoe UI Emoji"/>
+              </w:rPr>
+              <w:t xml:space="preserve"> 🍃</w:t>
+            </w:r>
+            <w:r>
+              <w:rPr>
+                <w:rFonts w:ascii="Segoe UI Emoji" w:hAnsi="Segoe UI Emoji" w:cs="Segoe UI Emoji"/>
+              </w:rPr>
+              <w:t xml:space="preserve"> 💧 🟤</w:t>
+            </w:r>
+          </w:p>
         </w:tc>
         <w:tc>
           <w:tcPr>
@@ -419,7 +905,7 @@
         </w:tc>
         <w:tc>
           <w:tcPr>
-            <w:tcW w:w="2516" w:type="dxa"/>
+            <w:tcW w:w="1667" w:type="dxa"/>
             <w:vAlign w:val="center"/>
           </w:tcPr>
           <w:p>
@@ -433,7 +919,7 @@
         </w:tc>
         <w:tc>
           <w:tcPr>
-            <w:tcW w:w="2552" w:type="dxa"/>
+            <w:tcW w:w="2268" w:type="dxa"/>
             <w:vAlign w:val="center"/>
           </w:tcPr>
           <w:p>
@@ -458,33 +944,221 @@
         </w:tc>
         <w:tc>
           <w:tcPr>
-            <w:tcW w:w="1701" w:type="dxa"/>
-            <w:vAlign w:val="center"/>
-          </w:tcPr>
-          <w:p>
-            <w:pPr>
-              <w:jc w:val="center"/>
+            <w:tcW w:w="1606" w:type="dxa"/>
+            <w:vAlign w:val="center"/>
+          </w:tcPr>
+          <w:p>
+            <w:pPr>
+              <w:jc w:val="center"/>
+              <w:rPr>
+                <w:rFonts w:ascii="Segoe UI Emoji" w:hAnsi="Segoe UI Emoji" w:cs="Segoe UI Emoji"/>
+                <w:b/>
+                <w:bCs/>
+              </w:rPr>
+            </w:pPr>
+            <w:r>
+              <w:rPr>
+                <w:rFonts w:ascii="Segoe UI Emoji" w:hAnsi="Segoe UI Emoji" w:cs="Segoe UI Emoji"/>
+                <w:b/>
+                <w:bCs/>
+              </w:rPr>
+              <w:t>🔥</w:t>
+            </w:r>
+            <w:r>
+              <w:rPr>
+                <w:rFonts w:ascii="Segoe UI Emoji" w:hAnsi="Segoe UI Emoji" w:cs="Segoe UI Emoji"/>
+                <w:b/>
+                <w:bCs/>
+              </w:rPr>
+              <w:t xml:space="preserve"> </w:t>
+            </w:r>
+            <w:r>
               <w:rPr>
                 <w:rFonts w:cstheme="minorHAnsi"/>
-                <w:b/>
-                <w:bCs/>
-              </w:rPr>
-            </w:pPr>
+                <w:lang w:val="it-IT"/>
+              </w:rPr>
+              <w:t xml:space="preserve">⌂ </w:t>
+            </w:r>
             <w:r>
               <w:rPr>
                 <w:rFonts w:cstheme="minorHAnsi"/>
                 <w:b/>
                 <w:bCs/>
               </w:rPr>
+              <w:t xml:space="preserve">Ω </w:t>
+            </w:r>
+            <w:r>
+              <w:rPr>
+                <w:rFonts w:cstheme="minorHAnsi"/>
+                <w:b/>
+                <w:bCs/>
+              </w:rPr>
+              <w:t>Ω</w:t>
+            </w:r>
+          </w:p>
+          <w:p>
+            <w:pPr>
+              <w:jc w:val="center"/>
+            </w:pPr>
+            <w:r>
+              <w:t>lvl 1 MD</w:t>
+            </w:r>
+          </w:p>
+        </w:tc>
+        <w:tc>
+          <w:tcPr>
+            <w:tcW w:w="1607" w:type="dxa"/>
+            <w:vAlign w:val="center"/>
+          </w:tcPr>
+          <w:p>
+            <w:pPr>
+              <w:jc w:val="center"/>
+              <w:rPr>
+                <w:rFonts w:ascii="Segoe UI Emoji" w:hAnsi="Segoe UI Emoji" w:cs="Segoe UI Emoji"/>
+              </w:rPr>
+            </w:pPr>
+            <w:r>
+              <w:rPr>
+                <w:rFonts w:ascii="Segoe UI Emoji" w:hAnsi="Segoe UI Emoji" w:cs="Segoe UI Emoji"/>
+              </w:rPr>
+              <w:t>🍃</w:t>
+            </w:r>
+            <w:r>
+              <w:rPr>
+                <w:rFonts w:cstheme="minorHAnsi"/>
+                <w:b/>
+                <w:bCs/>
+              </w:rPr>
+              <w:t xml:space="preserve"> Ω Ω</w:t>
+            </w:r>
+          </w:p>
+          <w:p>
+            <w:pPr>
+              <w:jc w:val="center"/>
+            </w:pPr>
+            <w:r>
+              <w:t>lvl 101 D</w:t>
+            </w:r>
+          </w:p>
+        </w:tc>
+        <w:tc>
+          <w:tcPr>
+            <w:tcW w:w="1606" w:type="dxa"/>
+            <w:vAlign w:val="center"/>
+          </w:tcPr>
+          <w:p>
+            <w:pPr>
+              <w:jc w:val="center"/>
+              <w:rPr>
+                <w:rFonts w:ascii="Segoe UI Emoji" w:hAnsi="Segoe UI Emoji" w:cs="Segoe UI Emoji"/>
+                <w:b/>
+                <w:bCs/>
+              </w:rPr>
+            </w:pPr>
+            <w:r>
+              <w:rPr>
+                <w:rFonts w:ascii="Segoe UI Emoji" w:hAnsi="Segoe UI Emoji" w:cs="Segoe UI Emoji"/>
+              </w:rPr>
+              <w:t>💧</w:t>
+            </w:r>
+            <w:r>
+              <w:rPr>
+                <w:rFonts w:ascii="Segoe UI Emoji" w:hAnsi="Segoe UI Emoji" w:cs="Segoe UI Emoji"/>
+                <w:b/>
+                <w:bCs/>
+              </w:rPr>
+              <w:t xml:space="preserve"> </w:t>
+            </w:r>
+            <w:r>
+              <w:rPr>
+                <w:rFonts w:cstheme="minorHAnsi"/>
+                <w:lang w:val="it-IT"/>
+              </w:rPr>
+              <w:t xml:space="preserve">⌂ </w:t>
+            </w:r>
+            <w:r>
+              <w:rPr>
+                <w:rFonts w:cstheme="minorHAnsi"/>
+                <w:b/>
+                <w:bCs/>
+              </w:rPr>
+              <w:t>Ω Ω</w:t>
+            </w:r>
+          </w:p>
+          <w:p>
+            <w:pPr>
+              <w:jc w:val="center"/>
+            </w:pPr>
+            <w:r>
+              <w:t>lvl 130 MD</w:t>
+            </w:r>
+          </w:p>
+        </w:tc>
+        <w:tc>
+          <w:tcPr>
+            <w:tcW w:w="1607" w:type="dxa"/>
+            <w:vAlign w:val="center"/>
+          </w:tcPr>
+          <w:p>
+            <w:pPr>
+              <w:jc w:val="center"/>
+            </w:pPr>
+            <w:r>
+              <w:rPr>
+                <w:rFonts w:ascii="Segoe UI Emoji" w:hAnsi="Segoe UI Emoji" w:cs="Segoe UI Emoji"/>
+              </w:rPr>
+              <w:t>🟤</w:t>
+            </w:r>
+            <w:r>
+              <w:rPr>
+                <w:rFonts w:cstheme="minorHAnsi"/>
+                <w:b/>
+                <w:bCs/>
+              </w:rPr>
+              <w:t xml:space="preserve"> </w:t>
+            </w:r>
+            <w:r>
+              <w:rPr>
+                <w:rFonts w:cstheme="minorHAnsi"/>
+                <w:lang w:val="it-IT"/>
+              </w:rPr>
+              <w:t xml:space="preserve">⌂ </w:t>
+            </w:r>
+            <w:r>
+              <w:rPr>
+                <w:rFonts w:cstheme="minorHAnsi"/>
+                <w:b/>
+                <w:bCs/>
+              </w:rPr>
               <w:t>Ω Ω Ω</w:t>
             </w:r>
+          </w:p>
+          <w:p>
+            <w:pPr>
+              <w:jc w:val="center"/>
+            </w:pPr>
+            <w:r>
+              <w:t>lvl 135 MD</w:t>
+            </w:r>
+          </w:p>
+        </w:tc>
+        <w:tc>
+          <w:tcPr>
+            <w:tcW w:w="1606" w:type="dxa"/>
+            <w:shd w:val="clear" w:color="auto" w:fill="000000" w:themeFill="text1"/>
+            <w:vAlign w:val="center"/>
+          </w:tcPr>
+          <w:p>
+            <w:pPr>
+              <w:jc w:val="center"/>
+            </w:pPr>
           </w:p>
         </w:tc>
       </w:tr>
       <w:tr>
         <w:tc>
           <w:tcPr>
-            <w:tcW w:w="1869" w:type="dxa"/>
+            <w:tcW w:w="1868" w:type="dxa"/>
             <w:vAlign w:val="center"/>
           </w:tcPr>
           <w:p>
@@ -495,6 +1169,31 @@
               <w:t>Iop</w:t>
             </w:r>
           </w:p>
+          <w:p>
+            <w:pPr>
+              <w:jc w:val="center"/>
+            </w:pPr>
+            <w:r>
+              <w:rPr>
+                <w:rFonts w:ascii="Segoe UI Emoji" w:hAnsi="Segoe UI Emoji" w:cs="Segoe UI Emoji"/>
+              </w:rPr>
+              <w:t>🟤</w:t>
+            </w:r>
+            <w:r>
+              <w:rPr>
+                <w:rFonts w:ascii="Segoe UI Emoji" w:hAnsi="Segoe UI Emoji" w:cs="Segoe UI Emoji"/>
+              </w:rPr>
+              <w:t xml:space="preserve"> 🍃</w:t>
+            </w:r>
+            <w:r>
+              <w:rPr>
+                <w:rFonts w:ascii="Segoe UI Emoji" w:hAnsi="Segoe UI Emoji" w:cs="Segoe UI Emoji"/>
+                <w:b/>
+                <w:bCs/>
+              </w:rPr>
+              <w:t xml:space="preserve"> 🔥</w:t>
+            </w:r>
+          </w:p>
         </w:tc>
         <w:tc>
           <w:tcPr>
@@ -518,7 +1217,7 @@
         </w:tc>
         <w:tc>
           <w:tcPr>
-            <w:tcW w:w="2516" w:type="dxa"/>
+            <w:tcW w:w="1667" w:type="dxa"/>
             <w:vAlign w:val="center"/>
           </w:tcPr>
           <w:p>
@@ -532,7 +1231,7 @@
         </w:tc>
         <w:tc>
           <w:tcPr>
-            <w:tcW w:w="2552" w:type="dxa"/>
+            <w:tcW w:w="2268" w:type="dxa"/>
             <w:vAlign w:val="center"/>
           </w:tcPr>
           <w:p>
@@ -554,33 +1253,223 @@
         </w:tc>
         <w:tc>
           <w:tcPr>
-            <w:tcW w:w="1701" w:type="dxa"/>
-            <w:vAlign w:val="center"/>
-          </w:tcPr>
-          <w:p>
-            <w:pPr>
-              <w:jc w:val="center"/>
+            <w:tcW w:w="1606" w:type="dxa"/>
+            <w:vAlign w:val="center"/>
+          </w:tcPr>
+          <w:p>
+            <w:pPr>
+              <w:jc w:val="center"/>
+            </w:pPr>
+            <w:r>
+              <w:rPr>
+                <w:rFonts w:ascii="Segoe UI Emoji" w:hAnsi="Segoe UI Emoji" w:cs="Segoe UI Emoji"/>
+              </w:rPr>
+              <w:t>🟤</w:t>
+            </w:r>
+            <w:r>
               <w:rPr>
                 <w:rFonts w:cstheme="minorHAnsi"/>
                 <w:b/>
                 <w:bCs/>
               </w:rPr>
-            </w:pPr>
+              <w:t xml:space="preserve"> </w:t>
+            </w:r>
             <w:r>
               <w:rPr>
                 <w:rFonts w:cstheme="minorHAnsi"/>
-                <w:b/>
-                <w:bCs/>
-              </w:rPr>
-              <w:t>Ω Ω Ω Ω Ω</w:t>
-            </w:r>
+                <w:lang w:val="it-IT"/>
+              </w:rPr>
+              <w:t xml:space="preserve">⌂ </w:t>
+            </w:r>
+            <w:r>
+              <w:rPr>
+                <w:rFonts w:cstheme="minorHAnsi"/>
+                <w:b/>
+                <w:bCs/>
+              </w:rPr>
+              <w:t>Ω Ω Ω</w:t>
+            </w:r>
+          </w:p>
+          <w:p>
+            <w:pPr>
+              <w:jc w:val="center"/>
+            </w:pPr>
+            <w:r>
+              <w:t>lvl 1 M</w:t>
+            </w:r>
+          </w:p>
+        </w:tc>
+        <w:tc>
+          <w:tcPr>
+            <w:tcW w:w="1607" w:type="dxa"/>
+            <w:vAlign w:val="center"/>
+          </w:tcPr>
+          <w:p>
+            <w:pPr>
+              <w:jc w:val="center"/>
+              <w:rPr>
+                <w:rFonts w:ascii="Segoe UI Emoji" w:hAnsi="Segoe UI Emoji" w:cs="Segoe UI Emoji"/>
+              </w:rPr>
+            </w:pPr>
+            <w:r>
+              <w:rPr>
+                <w:rFonts w:ascii="Segoe UI Emoji" w:hAnsi="Segoe UI Emoji" w:cs="Segoe UI Emoji"/>
+              </w:rPr>
+              <w:t>🍃</w:t>
+            </w:r>
+            <w:r>
+              <w:rPr>
+                <w:rFonts w:cstheme="minorHAnsi"/>
+                <w:b/>
+                <w:bCs/>
+              </w:rPr>
+              <w:t xml:space="preserve"> </w:t>
+            </w:r>
+            <w:r>
+              <w:rPr>
+                <w:rFonts w:cstheme="minorHAnsi"/>
+                <w:lang w:val="it-IT"/>
+              </w:rPr>
+              <w:t xml:space="preserve">⌂⌂ </w:t>
+            </w:r>
+            <w:r>
+              <w:rPr>
+                <w:rFonts w:cstheme="minorHAnsi"/>
+                <w:b/>
+                <w:bCs/>
+              </w:rPr>
+              <w:t>Ω Ω Ω</w:t>
+            </w:r>
+          </w:p>
+          <w:p>
+            <w:pPr>
+              <w:jc w:val="center"/>
+            </w:pPr>
+            <w:r>
+              <w:t xml:space="preserve">lvl 6 </w:t>
+            </w:r>
+            <w:r>
+              <w:t>M</w:t>
+            </w:r>
+            <w:r>
+              <w:t>D</w:t>
+            </w:r>
+          </w:p>
+        </w:tc>
+        <w:tc>
+          <w:tcPr>
+            <w:tcW w:w="1606" w:type="dxa"/>
+            <w:vAlign w:val="center"/>
+          </w:tcPr>
+          <w:p>
+            <w:pPr>
+              <w:jc w:val="center"/>
+              <w:rPr>
+                <w:rFonts w:cstheme="minorHAnsi"/>
+                <w:b/>
+                <w:bCs/>
+              </w:rPr>
+            </w:pPr>
+            <w:r>
+              <w:rPr>
+                <w:rFonts w:ascii="Segoe UI Emoji" w:hAnsi="Segoe UI Emoji" w:cs="Segoe UI Emoji"/>
+                <w:b/>
+                <w:bCs/>
+              </w:rPr>
+              <w:t>🔥</w:t>
+            </w:r>
+            <w:r>
+              <w:rPr>
+                <w:rFonts w:ascii="Segoe UI Emoji" w:hAnsi="Segoe UI Emoji" w:cs="Segoe UI Emoji"/>
+                <w:b/>
+                <w:bCs/>
+              </w:rPr>
+              <w:t xml:space="preserve"> </w:t>
+            </w:r>
+            <w:r>
+              <w:rPr>
+                <w:rFonts w:cstheme="minorHAnsi"/>
+                <w:lang w:val="it-IT"/>
+              </w:rPr>
+              <w:t xml:space="preserve">⌂ </w:t>
+            </w:r>
+            <w:r>
+              <w:rPr>
+                <w:rFonts w:cstheme="minorHAnsi"/>
+                <w:b/>
+                <w:bCs/>
+              </w:rPr>
+              <w:t>Ω Ω Ω</w:t>
+            </w:r>
+          </w:p>
+          <w:p>
+            <w:pPr>
+              <w:jc w:val="center"/>
+            </w:pPr>
+            <w:r>
+              <w:rPr>
+                <w:rFonts w:cstheme="minorHAnsi"/>
+              </w:rPr>
+              <w:t xml:space="preserve">lvl </w:t>
+            </w:r>
+            <w:r>
+              <w:rPr>
+                <w:rFonts w:cstheme="minorHAnsi"/>
+              </w:rPr>
+              <w:t xml:space="preserve">62 </w:t>
+            </w:r>
+            <w:r>
+              <w:rPr>
+                <w:rFonts w:ascii="Segoe UI Emoji" w:hAnsi="Segoe UI Emoji" w:cs="Segoe UI Emoji"/>
+              </w:rPr>
+              <w:t>M</w:t>
+            </w:r>
+          </w:p>
+        </w:tc>
+        <w:tc>
+          <w:tcPr>
+            <w:tcW w:w="1607" w:type="dxa"/>
+            <w:vAlign w:val="center"/>
+          </w:tcPr>
+          <w:p>
+            <w:pPr>
+              <w:jc w:val="center"/>
+            </w:pPr>
+            <w:r>
+              <w:rPr>
+                <w:b/>
+                <w:bCs/>
+                <w:color w:val="7030A0"/>
+              </w:rPr>
+              <w:t>→</w:t>
+            </w:r>
+            <w:r>
+              <w:rPr>
+                <w:rFonts w:cstheme="minorHAnsi"/>
+                <w:b/>
+                <w:bCs/>
+              </w:rPr>
+              <w:t xml:space="preserve"> </w:t>
+            </w:r>
+          </w:p>
+        </w:tc>
+        <w:tc>
+          <w:tcPr>
+            <w:tcW w:w="1606" w:type="dxa"/>
+            <w:shd w:val="clear" w:color="auto" w:fill="000000" w:themeFill="text1"/>
+            <w:vAlign w:val="center"/>
+          </w:tcPr>
+          <w:p>
+            <w:pPr>
+              <w:jc w:val="center"/>
+            </w:pPr>
           </w:p>
         </w:tc>
       </w:tr>
       <w:tr>
         <w:tc>
           <w:tcPr>
-            <w:tcW w:w="1869" w:type="dxa"/>
+            <w:tcW w:w="1868" w:type="dxa"/>
             <w:vAlign w:val="center"/>
           </w:tcPr>
           <w:p>
@@ -591,6 +1480,31 @@
               <w:t>Cra</w:t>
             </w:r>
           </w:p>
+          <w:p>
+            <w:pPr>
+              <w:jc w:val="center"/>
+            </w:pPr>
+            <w:r>
+              <w:rPr>
+                <w:rFonts w:ascii="Segoe UI Emoji" w:hAnsi="Segoe UI Emoji" w:cs="Segoe UI Emoji"/>
+              </w:rPr>
+              <w:t>⚡</w:t>
+            </w:r>
+            <w:r>
+              <w:rPr>
+                <w:rFonts w:ascii="Segoe UI Emoji" w:hAnsi="Segoe UI Emoji" w:cs="Segoe UI Emoji"/>
+              </w:rPr>
+              <w:t>🟤</w:t>
+            </w:r>
+            <w:r>
+              <w:rPr>
+                <w:rFonts w:ascii="Segoe UI Emoji" w:hAnsi="Segoe UI Emoji" w:cs="Segoe UI Emoji"/>
+                <w:b/>
+                <w:bCs/>
+              </w:rPr>
+              <w:t xml:space="preserve"> 🔥</w:t>
+            </w:r>
+          </w:p>
         </w:tc>
         <w:tc>
           <w:tcPr>
@@ -614,7 +1528,7 @@
         </w:tc>
         <w:tc>
           <w:tcPr>
-            <w:tcW w:w="2516" w:type="dxa"/>
+            <w:tcW w:w="1667" w:type="dxa"/>
             <w:vAlign w:val="center"/>
           </w:tcPr>
           <w:p>
@@ -628,7 +1542,7 @@
         </w:tc>
         <w:tc>
           <w:tcPr>
-            <w:tcW w:w="2552" w:type="dxa"/>
+            <w:tcW w:w="2268" w:type="dxa"/>
             <w:vAlign w:val="center"/>
           </w:tcPr>
           <w:p>
@@ -681,25 +1595,233 @@
         </w:tc>
         <w:tc>
           <w:tcPr>
-            <w:tcW w:w="1701" w:type="dxa"/>
-            <w:vAlign w:val="center"/>
-          </w:tcPr>
-          <w:p>
-            <w:pPr>
-              <w:jc w:val="center"/>
+            <w:tcW w:w="1606" w:type="dxa"/>
+            <w:vAlign w:val="center"/>
+          </w:tcPr>
+          <w:p>
+            <w:pPr>
+              <w:jc w:val="center"/>
+              <w:rPr>
+                <w:rFonts w:ascii="Segoe UI Emoji" w:hAnsi="Segoe UI Emoji" w:cs="Segoe UI Emoji"/>
+              </w:rPr>
+            </w:pPr>
+            <w:r>
+              <w:rPr>
+                <w:rFonts w:ascii="Segoe UI Emoji" w:hAnsi="Segoe UI Emoji" w:cs="Segoe UI Emoji"/>
+              </w:rPr>
+              <w:t>🍃</w:t>
+            </w:r>
+            <w:r>
               <w:rPr>
                 <w:rFonts w:cstheme="minorHAnsi"/>
                 <w:b/>
                 <w:bCs/>
               </w:rPr>
-            </w:pPr>
-            <w:r>
+              <w:t xml:space="preserve"> Ω Ω</w:t>
+            </w:r>
+          </w:p>
+          <w:p>
+            <w:pPr>
+              <w:jc w:val="center"/>
+            </w:pPr>
+            <w:r>
+              <w:t>lvl 1 D</w:t>
+            </w:r>
+          </w:p>
+        </w:tc>
+        <w:tc>
+          <w:tcPr>
+            <w:tcW w:w="1607" w:type="dxa"/>
+            <w:vAlign w:val="center"/>
+          </w:tcPr>
+          <w:p>
+            <w:pPr>
+              <w:jc w:val="center"/>
               <w:rPr>
                 <w:rFonts w:cstheme="minorHAnsi"/>
                 <w:b/>
                 <w:bCs/>
               </w:rPr>
-              <w:t>Ω Ω Ω Ω Ω</w:t>
+            </w:pPr>
+            <w:r>
+              <w:rPr>
+                <w:rFonts w:ascii="Segoe UI Emoji" w:hAnsi="Segoe UI Emoji" w:cs="Segoe UI Emoji"/>
+              </w:rPr>
+              <w:t>⚡</w:t>
+            </w:r>
+            <w:r>
+              <w:rPr>
+                <w:rFonts w:cstheme="minorHAnsi"/>
+                <w:lang w:val="it-IT"/>
+              </w:rPr>
+              <w:t xml:space="preserve">⌂ </w:t>
+            </w:r>
+            <w:r>
+              <w:rPr>
+                <w:rFonts w:cstheme="minorHAnsi"/>
+                <w:b/>
+                <w:bCs/>
+              </w:rPr>
+              <w:t>Ω Ω Ω</w:t>
+            </w:r>
+          </w:p>
+          <w:p>
+            <w:pPr>
+              <w:jc w:val="center"/>
+            </w:pPr>
+            <w:r>
+              <w:t>lvl 56 D</w:t>
+            </w:r>
+          </w:p>
+        </w:tc>
+        <w:tc>
+          <w:tcPr>
+            <w:tcW w:w="1606" w:type="dxa"/>
+            <w:vAlign w:val="center"/>
+          </w:tcPr>
+          <w:p>
+            <w:pPr>
+              <w:jc w:val="center"/>
+            </w:pPr>
+            <w:r>
+              <w:rPr>
+                <w:rFonts w:ascii="Segoe UI Emoji" w:hAnsi="Segoe UI Emoji" w:cs="Segoe UI Emoji"/>
+              </w:rPr>
+              <w:t>🟤</w:t>
+            </w:r>
+            <w:r>
+              <w:rPr>
+                <w:rFonts w:cstheme="minorHAnsi"/>
+                <w:lang w:val="it-IT"/>
+              </w:rPr>
+              <w:t xml:space="preserve"> </w:t>
+            </w:r>
+            <w:r>
+              <w:rPr>
+                <w:rFonts w:cstheme="minorHAnsi"/>
+                <w:b/>
+                <w:bCs/>
+              </w:rPr>
+              <w:t>Ω Ω Ω</w:t>
+            </w:r>
+          </w:p>
+          <w:p>
+            <w:pPr>
+              <w:jc w:val="center"/>
+            </w:pPr>
+            <w:r>
+              <w:t>lvl 62 D</w:t>
+            </w:r>
+          </w:p>
+        </w:tc>
+        <w:tc>
+          <w:tcPr>
+            <w:tcW w:w="1607" w:type="dxa"/>
+            <w:vAlign w:val="center"/>
+          </w:tcPr>
+          <w:p>
+            <w:pPr>
+              <w:jc w:val="center"/>
+              <w:rPr>
+                <w:rFonts w:ascii="Segoe UI Emoji" w:hAnsi="Segoe UI Emoji" w:cs="Segoe UI Emoji"/>
+                <w:b/>
+                <w:bCs/>
+              </w:rPr>
+            </w:pPr>
+            <w:r>
+              <w:rPr>
+                <w:rFonts w:ascii="Segoe UI Emoji" w:hAnsi="Segoe UI Emoji" w:cs="Segoe UI Emoji"/>
+                <w:b/>
+                <w:bCs/>
+              </w:rPr>
+              <w:t>🔥</w:t>
+            </w:r>
+            <w:r>
+              <w:rPr>
+                <w:rFonts w:ascii="Segoe UI Emoji" w:hAnsi="Segoe UI Emoji" w:cs="Segoe UI Emoji"/>
+                <w:b/>
+                <w:bCs/>
+              </w:rPr>
+              <w:t xml:space="preserve"> </w:t>
+            </w:r>
+            <w:r>
+              <w:rPr>
+                <w:rFonts w:cstheme="minorHAnsi"/>
+                <w:lang w:val="it-IT"/>
+              </w:rPr>
+              <w:t xml:space="preserve">⌂⌂ </w:t>
+            </w:r>
+            <w:r>
+              <w:rPr>
+                <w:rFonts w:cstheme="minorHAnsi"/>
+                <w:b/>
+                <w:bCs/>
+              </w:rPr>
+              <w:t xml:space="preserve">Ω Ω </w:t>
+            </w:r>
+          </w:p>
+          <w:p>
+            <w:pPr>
+              <w:jc w:val="center"/>
+            </w:pPr>
+            <w:r>
+              <w:t>lvl 92 D</w:t>
+            </w:r>
+          </w:p>
+        </w:tc>
+        <w:tc>
+          <w:tcPr>
+            <w:tcW w:w="1606" w:type="dxa"/>
+            <w:vAlign w:val="center"/>
+          </w:tcPr>
+          <w:p>
+            <w:pPr>
+              <w:jc w:val="center"/>
+              <w:rPr>
+                <w:rFonts w:ascii="Segoe UI Emoji" w:hAnsi="Segoe UI Emoji" w:cs="Segoe UI Emoji"/>
+                <w:b/>
+                <w:bCs/>
+              </w:rPr>
+            </w:pPr>
+            <w:r>
+              <w:rPr>
+                <w:rFonts w:ascii="Segoe UI Emoji" w:hAnsi="Segoe UI Emoji" w:cs="Segoe UI Emoji"/>
+              </w:rPr>
+              <w:t>💧</w:t>
+            </w:r>
+            <w:r>
+              <w:rPr>
+                <w:rFonts w:ascii="Segoe UI Emoji" w:hAnsi="Segoe UI Emoji" w:cs="Segoe UI Emoji"/>
+                <w:b/>
+                <w:bCs/>
+              </w:rPr>
+              <w:t xml:space="preserve"> </w:t>
+            </w:r>
+            <w:r>
+              <w:rPr>
+                <w:rFonts w:cstheme="minorHAnsi"/>
+                <w:lang w:val="it-IT"/>
+              </w:rPr>
+              <w:t xml:space="preserve">⌂⌂ </w:t>
+            </w:r>
+            <w:r>
+              <w:rPr>
+                <w:rFonts w:cstheme="minorHAnsi"/>
+                <w:b/>
+                <w:bCs/>
+              </w:rPr>
+              <w:t>Ω Ω Ω</w:t>
+            </w:r>
+          </w:p>
+          <w:p>
+            <w:pPr>
+              <w:jc w:val="center"/>
+              <w:rPr>
+                <w:lang w:val="it-IT"/>
+              </w:rPr>
+            </w:pPr>
+            <w:r>
+              <w:t>lvl 145 D</w:t>
             </w:r>
           </w:p>
         </w:tc>
@@ -707,7 +1829,7 @@
       <w:tr>
         <w:tc>
           <w:tcPr>
-            <w:tcW w:w="1869" w:type="dxa"/>
+            <w:tcW w:w="1868" w:type="dxa"/>
             <w:vAlign w:val="center"/>
           </w:tcPr>
           <w:p>
@@ -718,6 +1840,31 @@
               <w:t>Ouginak</w:t>
             </w:r>
           </w:p>
+          <w:p>
+            <w:pPr>
+              <w:jc w:val="center"/>
+            </w:pPr>
+            <w:r>
+              <w:rPr>
+                <w:rFonts w:ascii="Segoe UI Emoji" w:hAnsi="Segoe UI Emoji" w:cs="Segoe UI Emoji"/>
+              </w:rPr>
+              <w:t>🟤 💧</w:t>
+            </w:r>
+            <w:r>
+              <w:rPr>
+                <w:rFonts w:ascii="Segoe UI Emoji" w:hAnsi="Segoe UI Emoji" w:cs="Segoe UI Emoji"/>
+              </w:rPr>
+              <w:t xml:space="preserve"> 🍃</w:t>
+            </w:r>
+            <w:r>
+              <w:rPr>
+                <w:rFonts w:ascii="Segoe UI Emoji" w:hAnsi="Segoe UI Emoji" w:cs="Segoe UI Emoji"/>
+                <w:b/>
+                <w:bCs/>
+              </w:rPr>
+              <w:t xml:space="preserve"> 🔥</w:t>
+            </w:r>
+          </w:p>
         </w:tc>
         <w:tc>
           <w:tcPr>
@@ -741,7 +1888,7 @@
         </w:tc>
         <w:tc>
           <w:tcPr>
-            <w:tcW w:w="2516" w:type="dxa"/>
+            <w:tcW w:w="1667" w:type="dxa"/>
             <w:vAlign w:val="center"/>
           </w:tcPr>
           <w:p>
@@ -755,7 +1902,7 @@
         </w:tc>
         <w:tc>
           <w:tcPr>
-            <w:tcW w:w="2552" w:type="dxa"/>
+            <w:tcW w:w="2268" w:type="dxa"/>
             <w:vAlign w:val="center"/>
           </w:tcPr>
           <w:p>
@@ -785,33 +1932,184 @@
         </w:tc>
         <w:tc>
           <w:tcPr>
-            <w:tcW w:w="1701" w:type="dxa"/>
-            <w:vAlign w:val="center"/>
-          </w:tcPr>
-          <w:p>
-            <w:pPr>
-              <w:jc w:val="center"/>
+            <w:tcW w:w="1606" w:type="dxa"/>
+            <w:vAlign w:val="center"/>
+          </w:tcPr>
+          <w:p>
+            <w:pPr>
+              <w:jc w:val="center"/>
+            </w:pPr>
+            <w:r>
+              <w:rPr>
+                <w:rFonts w:ascii="Segoe UI Emoji" w:hAnsi="Segoe UI Emoji" w:cs="Segoe UI Emoji"/>
+              </w:rPr>
+              <w:t>🟤</w:t>
+            </w:r>
+            <w:r>
               <w:rPr>
                 <w:rFonts w:cstheme="minorHAnsi"/>
-                <w:b/>
-                <w:bCs/>
-              </w:rPr>
-            </w:pPr>
+                <w:lang w:val="it-IT"/>
+              </w:rPr>
+              <w:t xml:space="preserve"> </w:t>
+            </w:r>
             <w:r>
               <w:rPr>
                 <w:rFonts w:cstheme="minorHAnsi"/>
                 <w:b/>
                 <w:bCs/>
               </w:rPr>
-              <w:t>Ω Ω Ω Ω Ω</w:t>
-            </w:r>
+              <w:t>Ω Ω Ω</w:t>
+            </w:r>
+          </w:p>
+          <w:p>
+            <w:pPr>
+              <w:jc w:val="center"/>
+            </w:pPr>
+            <w:r>
+              <w:t>lvl 1 M</w:t>
+            </w:r>
+          </w:p>
+        </w:tc>
+        <w:tc>
+          <w:tcPr>
+            <w:tcW w:w="1607" w:type="dxa"/>
+            <w:vAlign w:val="center"/>
+          </w:tcPr>
+          <w:p>
+            <w:pPr>
+              <w:jc w:val="center"/>
+            </w:pPr>
+            <w:r>
+              <w:rPr>
+                <w:rFonts w:ascii="Segoe UI Emoji" w:hAnsi="Segoe UI Emoji" w:cs="Segoe UI Emoji"/>
+              </w:rPr>
+              <w:t>💧</w:t>
+            </w:r>
+            <w:r>
+              <w:rPr>
+                <w:rFonts w:cstheme="minorHAnsi"/>
+                <w:lang w:val="it-IT"/>
+              </w:rPr>
+              <w:t xml:space="preserve"> </w:t>
+            </w:r>
+            <w:r>
+              <w:rPr>
+                <w:rFonts w:cstheme="minorHAnsi"/>
+                <w:b/>
+                <w:bCs/>
+              </w:rPr>
+              <w:t>Ω Ω</w:t>
+            </w:r>
+          </w:p>
+          <w:p>
+            <w:pPr>
+              <w:jc w:val="center"/>
+            </w:pPr>
+            <w:r>
+              <w:t>lvl 1 D</w:t>
+            </w:r>
+          </w:p>
+        </w:tc>
+        <w:tc>
+          <w:tcPr>
+            <w:tcW w:w="1606" w:type="dxa"/>
+            <w:vAlign w:val="center"/>
+          </w:tcPr>
+          <w:p>
+            <w:pPr>
+              <w:jc w:val="center"/>
+              <w:rPr>
+                <w:rFonts w:ascii="Segoe UI Emoji" w:hAnsi="Segoe UI Emoji" w:cs="Segoe UI Emoji"/>
+                <w:b/>
+                <w:bCs/>
+              </w:rPr>
+            </w:pPr>
+            <w:r>
+              <w:rPr>
+                <w:rFonts w:ascii="Segoe UI Emoji" w:hAnsi="Segoe UI Emoji" w:cs="Segoe UI Emoji"/>
+                <w:b/>
+                <w:bCs/>
+              </w:rPr>
+              <w:t>🔥</w:t>
+            </w:r>
+            <w:r>
+              <w:rPr>
+                <w:rFonts w:cstheme="minorHAnsi"/>
+                <w:lang w:val="it-IT"/>
+              </w:rPr>
+              <w:t xml:space="preserve"> ⌂ </w:t>
+            </w:r>
+            <w:r>
+              <w:rPr>
+                <w:rFonts w:cstheme="minorHAnsi"/>
+                <w:b/>
+                <w:bCs/>
+              </w:rPr>
+              <w:t>Ω Ω Ω</w:t>
+            </w:r>
+          </w:p>
+          <w:p>
+            <w:pPr>
+              <w:jc w:val="center"/>
+            </w:pPr>
+            <w:r>
+              <w:t>lvl 6 M</w:t>
+            </w:r>
+          </w:p>
+        </w:tc>
+        <w:tc>
+          <w:tcPr>
+            <w:tcW w:w="1607" w:type="dxa"/>
+            <w:vAlign w:val="center"/>
+          </w:tcPr>
+          <w:p>
+            <w:pPr>
+              <w:jc w:val="center"/>
+              <w:rPr>
+                <w:rFonts w:ascii="Segoe UI Emoji" w:hAnsi="Segoe UI Emoji" w:cs="Segoe UI Emoji"/>
+              </w:rPr>
+            </w:pPr>
+            <w:r>
+              <w:rPr>
+                <w:rFonts w:ascii="Segoe UI Emoji" w:hAnsi="Segoe UI Emoji" w:cs="Segoe UI Emoji"/>
+              </w:rPr>
+              <w:t>🍃</w:t>
+            </w:r>
+            <w:r>
+              <w:rPr>
+                <w:rFonts w:cstheme="minorHAnsi"/>
+                <w:b/>
+                <w:bCs/>
+              </w:rPr>
+              <w:t xml:space="preserve"> Ω Ω Ω</w:t>
+            </w:r>
+          </w:p>
+          <w:p>
+            <w:pPr>
+              <w:jc w:val="center"/>
+            </w:pPr>
+            <w:r>
+              <w:t>lvl 32 M</w:t>
+            </w:r>
+          </w:p>
+        </w:tc>
+        <w:tc>
+          <w:tcPr>
+            <w:tcW w:w="1606" w:type="dxa"/>
+            <w:shd w:val="clear" w:color="auto" w:fill="000000" w:themeFill="text1"/>
+            <w:vAlign w:val="center"/>
+          </w:tcPr>
+          <w:p>
+            <w:pPr>
+              <w:jc w:val="center"/>
+            </w:pPr>
           </w:p>
         </w:tc>
       </w:tr>
       <w:tr>
         <w:tc>
           <w:tcPr>
-            <w:tcW w:w="1869" w:type="dxa"/>
+            <w:tcW w:w="1868" w:type="dxa"/>
             <w:vAlign w:val="center"/>
           </w:tcPr>
           <w:p>
@@ -822,6 +2120,25 @@
               <w:t>Sacrieur</w:t>
             </w:r>
           </w:p>
+          <w:p>
+            <w:pPr>
+              <w:jc w:val="center"/>
+            </w:pPr>
+            <w:r>
+              <w:rPr>
+                <w:rFonts w:ascii="Segoe UI Emoji" w:hAnsi="Segoe UI Emoji" w:cs="Segoe UI Emoji"/>
+              </w:rPr>
+              <w:t>💧</w:t>
+            </w:r>
+            <w:r>
+              <w:rPr>
+                <w:rFonts w:ascii="Segoe UI Emoji" w:hAnsi="Segoe UI Emoji" w:cs="Segoe UI Emoji"/>
+                <w:b/>
+                <w:bCs/>
+              </w:rPr>
+              <w:t xml:space="preserve"> 🔥</w:t>
+            </w:r>
+          </w:p>
         </w:tc>
         <w:tc>
           <w:tcPr>
@@ -845,7 +2162,7 @@
         </w:tc>
         <w:tc>
           <w:tcPr>
-            <w:tcW w:w="2516" w:type="dxa"/>
+            <w:tcW w:w="1667" w:type="dxa"/>
             <w:vAlign w:val="center"/>
           </w:tcPr>
           <w:p>
@@ -865,7 +2182,7 @@
         </w:tc>
         <w:tc>
           <w:tcPr>
-            <w:tcW w:w="2552" w:type="dxa"/>
+            <w:tcW w:w="2268" w:type="dxa"/>
             <w:vAlign w:val="center"/>
           </w:tcPr>
           <w:p>
@@ -895,33 +2212,195 @@
         </w:tc>
         <w:tc>
           <w:tcPr>
-            <w:tcW w:w="1701" w:type="dxa"/>
-            <w:vAlign w:val="center"/>
-          </w:tcPr>
-          <w:p>
-            <w:pPr>
-              <w:jc w:val="center"/>
+            <w:tcW w:w="1606" w:type="dxa"/>
+            <w:vAlign w:val="center"/>
+          </w:tcPr>
+          <w:p>
+            <w:pPr>
+              <w:jc w:val="center"/>
+              <w:rPr>
+                <w:rFonts w:ascii="Segoe UI Emoji" w:hAnsi="Segoe UI Emoji" w:cs="Segoe UI Emoji"/>
+              </w:rPr>
+            </w:pPr>
+            <w:r>
+              <w:rPr>
+                <w:rFonts w:ascii="Segoe UI Emoji" w:hAnsi="Segoe UI Emoji" w:cs="Segoe UI Emoji"/>
+              </w:rPr>
+              <w:t>🍃</w:t>
+            </w:r>
+            <w:r>
               <w:rPr>
                 <w:rFonts w:cstheme="minorHAnsi"/>
                 <w:b/>
                 <w:bCs/>
               </w:rPr>
-            </w:pPr>
+              <w:t xml:space="preserve"> Ω Ω</w:t>
+            </w:r>
             <w:r>
               <w:rPr>
                 <w:rFonts w:cstheme="minorHAnsi"/>
                 <w:b/>
                 <w:bCs/>
               </w:rPr>
-              <w:t>Ω Ω Ω Ω Ω</w:t>
-            </w:r>
+              <w:t xml:space="preserve"> Ω</w:t>
+            </w:r>
+          </w:p>
+          <w:p>
+            <w:pPr>
+              <w:jc w:val="center"/>
+            </w:pPr>
+            <w:r>
+              <w:t xml:space="preserve">lvl 1 </w:t>
+            </w:r>
+            <w:r>
+              <w:t>M</w:t>
+            </w:r>
+          </w:p>
+        </w:tc>
+        <w:tc>
+          <w:tcPr>
+            <w:tcW w:w="1607" w:type="dxa"/>
+            <w:vAlign w:val="center"/>
+          </w:tcPr>
+          <w:p>
+            <w:pPr>
+              <w:jc w:val="center"/>
+              <w:rPr>
+                <w:rFonts w:ascii="Segoe UI Emoji" w:hAnsi="Segoe UI Emoji" w:cs="Segoe UI Emoji"/>
+                <w:b/>
+                <w:bCs/>
+              </w:rPr>
+            </w:pPr>
+            <w:r>
+              <w:rPr>
+                <w:rFonts w:ascii="Segoe UI Emoji" w:hAnsi="Segoe UI Emoji" w:cs="Segoe UI Emoji"/>
+                <w:b/>
+                <w:bCs/>
+              </w:rPr>
+              <w:t>🔥</w:t>
+            </w:r>
+            <w:r>
+              <w:rPr>
+                <w:rFonts w:cstheme="minorHAnsi"/>
+                <w:lang w:val="it-IT"/>
+              </w:rPr>
+              <w:t xml:space="preserve"> ⌂ </w:t>
+            </w:r>
+            <w:r>
+              <w:rPr>
+                <w:rFonts w:cstheme="minorHAnsi"/>
+                <w:b/>
+                <w:bCs/>
+              </w:rPr>
+              <w:t>Ω Ω Ω</w:t>
+            </w:r>
+          </w:p>
+          <w:p>
+            <w:pPr>
+              <w:jc w:val="center"/>
+            </w:pPr>
+            <w:r>
+              <w:t>lvl 6 M</w:t>
+            </w:r>
+          </w:p>
+        </w:tc>
+        <w:tc>
+          <w:tcPr>
+            <w:tcW w:w="1606" w:type="dxa"/>
+            <w:vAlign w:val="center"/>
+          </w:tcPr>
+          <w:p>
+            <w:pPr>
+              <w:jc w:val="center"/>
+            </w:pPr>
+            <w:r>
+              <w:rPr>
+                <w:rFonts w:ascii="Segoe UI Emoji" w:hAnsi="Segoe UI Emoji" w:cs="Segoe UI Emoji"/>
+              </w:rPr>
+              <w:t>💧</w:t>
+            </w:r>
+            <w:r>
+              <w:rPr>
+                <w:rFonts w:cstheme="minorHAnsi"/>
+                <w:lang w:val="it-IT"/>
+              </w:rPr>
+              <w:t xml:space="preserve"> </w:t>
+            </w:r>
+            <w:r>
+              <w:rPr>
+                <w:rFonts w:cstheme="minorHAnsi"/>
+                <w:b/>
+                <w:bCs/>
+              </w:rPr>
+              <w:t>Ω Ω Ω</w:t>
+            </w:r>
+          </w:p>
+          <w:p>
+            <w:pPr>
+              <w:jc w:val="center"/>
+            </w:pPr>
+            <w:r>
+              <w:t>lvl 32 M</w:t>
+            </w:r>
+          </w:p>
+        </w:tc>
+        <w:tc>
+          <w:tcPr>
+            <w:tcW w:w="1607" w:type="dxa"/>
+            <w:vAlign w:val="center"/>
+          </w:tcPr>
+          <w:p>
+            <w:pPr>
+              <w:jc w:val="center"/>
+            </w:pPr>
+            <w:r>
+              <w:rPr>
+                <w:rFonts w:ascii="Segoe UI Emoji" w:hAnsi="Segoe UI Emoji" w:cs="Segoe UI Emoji"/>
+              </w:rPr>
+              <w:t>🟤</w:t>
+            </w:r>
+            <w:r>
+              <w:rPr>
+                <w:rFonts w:cstheme="minorHAnsi"/>
+                <w:lang w:val="it-IT"/>
+              </w:rPr>
+              <w:t xml:space="preserve"> </w:t>
+            </w:r>
+            <w:r>
+              <w:rPr>
+                <w:rFonts w:cstheme="minorHAnsi"/>
+                <w:b/>
+                <w:bCs/>
+              </w:rPr>
+              <w:t>Ω Ω Ω</w:t>
+            </w:r>
+          </w:p>
+          <w:p>
+            <w:pPr>
+              <w:jc w:val="center"/>
+            </w:pPr>
+            <w:r>
+              <w:t>lvl 195 M</w:t>
+            </w:r>
+          </w:p>
+        </w:tc>
+        <w:tc>
+          <w:tcPr>
+            <w:tcW w:w="1606" w:type="dxa"/>
+            <w:shd w:val="clear" w:color="auto" w:fill="000000" w:themeFill="text1"/>
+            <w:vAlign w:val="center"/>
+          </w:tcPr>
+          <w:p>
+            <w:pPr>
+              <w:jc w:val="center"/>
+            </w:pPr>
           </w:p>
         </w:tc>
       </w:tr>
       <w:tr>
         <w:tc>
           <w:tcPr>
-            <w:tcW w:w="1869" w:type="dxa"/>
+            <w:tcW w:w="1868" w:type="dxa"/>
             <w:vAlign w:val="center"/>
           </w:tcPr>
           <w:p>
@@ -932,6 +2411,31 @@
               <w:t>Ecaflip</w:t>
             </w:r>
           </w:p>
+          <w:p>
+            <w:pPr>
+              <w:jc w:val="center"/>
+            </w:pPr>
+            <w:r>
+              <w:rPr>
+                <w:rFonts w:ascii="Segoe UI Emoji" w:hAnsi="Segoe UI Emoji" w:cs="Segoe UI Emoji"/>
+              </w:rPr>
+              <w:t>🟤 💧</w:t>
+            </w:r>
+            <w:r>
+              <w:rPr>
+                <w:rFonts w:ascii="Segoe UI Emoji" w:hAnsi="Segoe UI Emoji" w:cs="Segoe UI Emoji"/>
+                <w:b/>
+                <w:bCs/>
+              </w:rPr>
+              <w:t xml:space="preserve"> 🔥</w:t>
+            </w:r>
+            <w:r>
+              <w:rPr>
+                <w:rFonts w:ascii="Segoe UI Emoji" w:hAnsi="Segoe UI Emoji" w:cs="Segoe UI Emoji"/>
+              </w:rPr>
+              <w:t xml:space="preserve"> 🍃</w:t>
+            </w:r>
+          </w:p>
         </w:tc>
         <w:tc>
           <w:tcPr>
@@ -955,7 +2459,7 @@
         </w:tc>
         <w:tc>
           <w:tcPr>
-            <w:tcW w:w="2516" w:type="dxa"/>
+            <w:tcW w:w="1667" w:type="dxa"/>
             <w:vAlign w:val="center"/>
           </w:tcPr>
           <w:p>
@@ -969,7 +2473,7 @@
         </w:tc>
         <w:tc>
           <w:tcPr>
-            <w:tcW w:w="2552" w:type="dxa"/>
+            <w:tcW w:w="2268" w:type="dxa"/>
             <w:vAlign w:val="center"/>
           </w:tcPr>
           <w:p>
@@ -991,25 +2495,192 @@
         </w:tc>
         <w:tc>
           <w:tcPr>
-            <w:tcW w:w="1701" w:type="dxa"/>
-            <w:vAlign w:val="center"/>
-          </w:tcPr>
-          <w:p>
-            <w:pPr>
-              <w:jc w:val="center"/>
+            <w:tcW w:w="1606" w:type="dxa"/>
+            <w:vAlign w:val="center"/>
+          </w:tcPr>
+          <w:p>
+            <w:pPr>
+              <w:jc w:val="center"/>
+              <w:rPr>
+                <w:rFonts w:ascii="Segoe UI Emoji" w:hAnsi="Segoe UI Emoji" w:cs="Segoe UI Emoji"/>
+                <w:b/>
+                <w:bCs/>
+              </w:rPr>
+            </w:pPr>
+            <w:r>
+              <w:rPr>
+                <w:rFonts w:ascii="Segoe UI Emoji" w:hAnsi="Segoe UI Emoji" w:cs="Segoe UI Emoji"/>
+                <w:b/>
+                <w:bCs/>
+              </w:rPr>
+              <w:t>🔥</w:t>
+            </w:r>
+            <w:r>
               <w:rPr>
                 <w:rFonts w:cstheme="minorHAnsi"/>
-                <w:b/>
-                <w:bCs/>
-              </w:rPr>
-            </w:pPr>
+                <w:lang w:val="it-IT"/>
+              </w:rPr>
+              <w:t xml:space="preserve"> </w:t>
+            </w:r>
             <w:r>
               <w:rPr>
                 <w:rFonts w:cstheme="minorHAnsi"/>
                 <w:b/>
                 <w:bCs/>
               </w:rPr>
-              <w:t>Ω Ω Ω Ω Ω</w:t>
+              <w:t>Ω Ω</w:t>
+            </w:r>
+          </w:p>
+          <w:p>
+            <w:pPr>
+              <w:jc w:val="center"/>
+            </w:pPr>
+            <w:r>
+              <w:t>lvl 9 D</w:t>
+            </w:r>
+          </w:p>
+        </w:tc>
+        <w:tc>
+          <w:tcPr>
+            <w:tcW w:w="1607" w:type="dxa"/>
+            <w:vAlign w:val="center"/>
+          </w:tcPr>
+          <w:p>
+            <w:pPr>
+              <w:jc w:val="center"/>
+            </w:pPr>
+            <w:r>
+              <w:rPr>
+                <w:rFonts w:ascii="Segoe UI Emoji" w:hAnsi="Segoe UI Emoji" w:cs="Segoe UI Emoji"/>
+              </w:rPr>
+              <w:t>🟤</w:t>
+            </w:r>
+            <w:r>
+              <w:rPr>
+                <w:rFonts w:cstheme="minorHAnsi"/>
+                <w:lang w:val="it-IT"/>
+              </w:rPr>
+              <w:t xml:space="preserve"> </w:t>
+            </w:r>
+            <w:r>
+              <w:rPr>
+                <w:rFonts w:cstheme="minorHAnsi"/>
+                <w:b/>
+                <w:bCs/>
+              </w:rPr>
+              <w:t>Ω Ω Ω</w:t>
+            </w:r>
+          </w:p>
+          <w:p>
+            <w:pPr>
+              <w:jc w:val="center"/>
+            </w:pPr>
+            <w:r>
+              <w:t>lvl 69 D</w:t>
+            </w:r>
+          </w:p>
+        </w:tc>
+        <w:tc>
+          <w:tcPr>
+            <w:tcW w:w="1606" w:type="dxa"/>
+            <w:vAlign w:val="center"/>
+          </w:tcPr>
+          <w:p>
+            <w:pPr>
+              <w:jc w:val="center"/>
+              <w:rPr>
+                <w:rFonts w:ascii="Segoe UI Emoji" w:hAnsi="Segoe UI Emoji" w:cs="Segoe UI Emoji"/>
+              </w:rPr>
+            </w:pPr>
+            <w:r>
+              <w:rPr>
+                <w:rFonts w:ascii="Segoe UI Emoji" w:hAnsi="Segoe UI Emoji" w:cs="Segoe UI Emoji"/>
+              </w:rPr>
+              <w:t>🍃</w:t>
+            </w:r>
+            <w:r>
+              <w:rPr>
+                <w:rFonts w:cstheme="minorHAnsi"/>
+                <w:b/>
+                <w:bCs/>
+              </w:rPr>
+              <w:t xml:space="preserve"> Ω Ω </w:t>
+            </w:r>
+          </w:p>
+          <w:p>
+            <w:pPr>
+              <w:jc w:val="center"/>
+            </w:pPr>
+            <w:r>
+              <w:t>lvl 1</w:t>
+            </w:r>
+            <w:r>
+              <w:t>15</w:t>
+            </w:r>
+            <w:r>
+              <w:t xml:space="preserve"> </w:t>
+            </w:r>
+            <w:r>
+              <w:t>D</w:t>
+            </w:r>
+          </w:p>
+        </w:tc>
+        <w:tc>
+          <w:tcPr>
+            <w:tcW w:w="1607" w:type="dxa"/>
+            <w:vAlign w:val="center"/>
+          </w:tcPr>
+          <w:p>
+            <w:pPr>
+              <w:jc w:val="center"/>
+            </w:pPr>
+            <w:r>
+              <w:rPr>
+                <w:rFonts w:ascii="Segoe UI Emoji" w:hAnsi="Segoe UI Emoji" w:cs="Segoe UI Emoji"/>
+              </w:rPr>
+              <w:t>💧</w:t>
+            </w:r>
+            <w:r>
+              <w:rPr>
+                <w:rFonts w:cstheme="minorHAnsi"/>
+                <w:lang w:val="it-IT"/>
+              </w:rPr>
+              <w:t xml:space="preserve"> </w:t>
+            </w:r>
+            <w:r>
+              <w:rPr>
+                <w:rFonts w:cstheme="minorHAnsi"/>
+                <w:b/>
+                <w:bCs/>
+              </w:rPr>
+              <w:t>Ω Ω</w:t>
+            </w:r>
+          </w:p>
+          <w:p>
+            <w:pPr>
+              <w:jc w:val="center"/>
+            </w:pPr>
+            <w:r>
+              <w:t>lvl 190 D</w:t>
+            </w:r>
+          </w:p>
+        </w:tc>
+        <w:tc>
+          <w:tcPr>
+            <w:tcW w:w="1606" w:type="dxa"/>
+            <w:vAlign w:val="center"/>
+          </w:tcPr>
+          <w:p>
+            <w:pPr>
+              <w:jc w:val="center"/>
+            </w:pPr>
+            <w:r>
+              <w:rPr>
+                <w:b/>
+                <w:bCs/>
+                <w:color w:val="7030A0"/>
+              </w:rPr>
+              <w:t>→</w:t>
             </w:r>
           </w:p>
         </w:tc>
@@ -1017,7 +2688,7 @@
       <w:tr>
         <w:tc>
           <w:tcPr>
-            <w:tcW w:w="1869" w:type="dxa"/>
+            <w:tcW w:w="1868" w:type="dxa"/>
             <w:vAlign w:val="center"/>
           </w:tcPr>
           <w:p>
@@ -1028,6 +2699,25 @@
               <w:t>Sram</w:t>
             </w:r>
           </w:p>
+          <w:p>
+            <w:pPr>
+              <w:jc w:val="center"/>
+            </w:pPr>
+            <w:r>
+              <w:rPr>
+                <w:rFonts w:ascii="Segoe UI Emoji" w:hAnsi="Segoe UI Emoji" w:cs="Segoe UI Emoji"/>
+              </w:rPr>
+              <w:t>🟤</w:t>
+            </w:r>
+            <w:r>
+              <w:rPr>
+                <w:rFonts w:ascii="Segoe UI Emoji" w:hAnsi="Segoe UI Emoji" w:cs="Segoe UI Emoji"/>
+                <w:b/>
+                <w:bCs/>
+              </w:rPr>
+              <w:t xml:space="preserve"> 🔥</w:t>
+            </w:r>
+          </w:p>
         </w:tc>
         <w:tc>
           <w:tcPr>
@@ -1051,7 +2741,7 @@
         </w:tc>
         <w:tc>
           <w:tcPr>
-            <w:tcW w:w="2516" w:type="dxa"/>
+            <w:tcW w:w="1667" w:type="dxa"/>
             <w:vAlign w:val="center"/>
           </w:tcPr>
           <w:p>
@@ -1065,7 +2755,7 @@
         </w:tc>
         <w:tc>
           <w:tcPr>
-            <w:tcW w:w="2552" w:type="dxa"/>
+            <w:tcW w:w="2268" w:type="dxa"/>
             <w:vAlign w:val="center"/>
           </w:tcPr>
           <w:p>
@@ -1103,33 +2793,188 @@
         </w:tc>
         <w:tc>
           <w:tcPr>
-            <w:tcW w:w="1701" w:type="dxa"/>
-            <w:vAlign w:val="center"/>
-          </w:tcPr>
-          <w:p>
-            <w:pPr>
-              <w:jc w:val="center"/>
+            <w:tcW w:w="1606" w:type="dxa"/>
+            <w:vAlign w:val="center"/>
+          </w:tcPr>
+          <w:p>
+            <w:pPr>
+              <w:jc w:val="center"/>
+            </w:pPr>
+            <w:r>
+              <w:rPr>
+                <w:rFonts w:ascii="Segoe UI Emoji" w:hAnsi="Segoe UI Emoji" w:cs="Segoe UI Emoji"/>
+              </w:rPr>
+              <w:t>🟤</w:t>
+            </w:r>
+            <w:r>
               <w:rPr>
                 <w:rFonts w:cstheme="minorHAnsi"/>
-                <w:b/>
-                <w:bCs/>
-              </w:rPr>
-            </w:pPr>
+                <w:lang w:val="it-IT"/>
+              </w:rPr>
+              <w:t xml:space="preserve"> </w:t>
+            </w:r>
             <w:r>
               <w:rPr>
                 <w:rFonts w:cstheme="minorHAnsi"/>
                 <w:b/>
                 <w:bCs/>
               </w:rPr>
-              <w:t>Ω Ω Ω Ω Ω</w:t>
-            </w:r>
+              <w:t>Ω Ω Ω</w:t>
+            </w:r>
+          </w:p>
+          <w:p>
+            <w:pPr>
+              <w:jc w:val="center"/>
+            </w:pPr>
+            <w:r>
+              <w:t>lvl 1 MD</w:t>
+            </w:r>
+          </w:p>
+        </w:tc>
+        <w:tc>
+          <w:tcPr>
+            <w:tcW w:w="1607" w:type="dxa"/>
+            <w:vAlign w:val="center"/>
+          </w:tcPr>
+          <w:p>
+            <w:pPr>
+              <w:jc w:val="center"/>
+            </w:pPr>
+            <w:r>
+              <w:rPr>
+                <w:rFonts w:ascii="Segoe UI Emoji" w:hAnsi="Segoe UI Emoji" w:cs="Segoe UI Emoji"/>
+              </w:rPr>
+              <w:t>💧</w:t>
+            </w:r>
+            <w:r>
+              <w:rPr>
+                <w:rFonts w:cstheme="minorHAnsi"/>
+                <w:lang w:val="it-IT"/>
+              </w:rPr>
+              <w:t xml:space="preserve"> </w:t>
+            </w:r>
+            <w:r>
+              <w:rPr>
+                <w:rFonts w:cstheme="minorHAnsi"/>
+                <w:b/>
+                <w:bCs/>
+              </w:rPr>
+              <w:t>Ω Ω</w:t>
+            </w:r>
+          </w:p>
+          <w:p>
+            <w:pPr>
+              <w:jc w:val="center"/>
+            </w:pPr>
+            <w:r>
+              <w:t>lvl 27 MD</w:t>
+            </w:r>
+          </w:p>
+        </w:tc>
+        <w:tc>
+          <w:tcPr>
+            <w:tcW w:w="1606" w:type="dxa"/>
+            <w:vAlign w:val="center"/>
+          </w:tcPr>
+          <w:p>
+            <w:pPr>
+              <w:jc w:val="center"/>
+            </w:pPr>
+            <w:r>
+              <w:rPr>
+                <w:rFonts w:ascii="Segoe UI Emoji" w:hAnsi="Segoe UI Emoji" w:cs="Segoe UI Emoji"/>
+              </w:rPr>
+              <w:t>🍃</w:t>
+            </w:r>
+            <w:r>
+              <w:rPr>
+                <w:rFonts w:cstheme="minorHAnsi"/>
+                <w:lang w:val="it-IT"/>
+              </w:rPr>
+              <w:t xml:space="preserve"> </w:t>
+            </w:r>
+            <w:r>
+              <w:rPr>
+                <w:rFonts w:cstheme="minorHAnsi"/>
+                <w:b/>
+                <w:bCs/>
+              </w:rPr>
+              <w:t xml:space="preserve">Ω Ω </w:t>
+            </w:r>
+          </w:p>
+          <w:p>
+            <w:pPr>
+              <w:jc w:val="center"/>
+            </w:pPr>
+            <w:r>
+              <w:t>lvl 69 D</w:t>
+            </w:r>
+          </w:p>
+        </w:tc>
+        <w:tc>
+          <w:tcPr>
+            <w:tcW w:w="1607" w:type="dxa"/>
+            <w:vAlign w:val="center"/>
+          </w:tcPr>
+          <w:p>
+            <w:pPr>
+              <w:jc w:val="center"/>
+              <w:rPr>
+                <w:rFonts w:ascii="Segoe UI Emoji" w:hAnsi="Segoe UI Emoji" w:cs="Segoe UI Emoji"/>
+                <w:b/>
+                <w:bCs/>
+              </w:rPr>
+            </w:pPr>
+            <w:r>
+              <w:rPr>
+                <w:rFonts w:ascii="Segoe UI Emoji" w:hAnsi="Segoe UI Emoji" w:cs="Segoe UI Emoji"/>
+                <w:b/>
+                <w:bCs/>
+              </w:rPr>
+              <w:t>🔥</w:t>
+            </w:r>
+            <w:r>
+              <w:rPr>
+                <w:rFonts w:cstheme="minorHAnsi"/>
+                <w:lang w:val="it-IT"/>
+              </w:rPr>
+              <w:t xml:space="preserve"> </w:t>
+            </w:r>
+            <w:r>
+              <w:rPr>
+                <w:rFonts w:cstheme="minorHAnsi"/>
+                <w:b/>
+                <w:bCs/>
+              </w:rPr>
+              <w:t>Ω Ω Ω</w:t>
+            </w:r>
+          </w:p>
+          <w:p>
+            <w:pPr>
+              <w:jc w:val="center"/>
+            </w:pPr>
+            <w:r>
+              <w:t>lvl 145 MD</w:t>
+            </w:r>
+          </w:p>
+        </w:tc>
+        <w:tc>
+          <w:tcPr>
+            <w:tcW w:w="1606" w:type="dxa"/>
+            <w:shd w:val="clear" w:color="auto" w:fill="000000" w:themeFill="text1"/>
+            <w:vAlign w:val="center"/>
+          </w:tcPr>
+          <w:p>
+            <w:pPr>
+              <w:jc w:val="center"/>
+            </w:pPr>
           </w:p>
         </w:tc>
       </w:tr>
       <w:tr>
         <w:tc>
           <w:tcPr>
-            <w:tcW w:w="1869" w:type="dxa"/>
+            <w:tcW w:w="1868" w:type="dxa"/>
             <w:vAlign w:val="center"/>
           </w:tcPr>
           <w:p>
@@ -1140,6 +2985,31 @@
               <w:t>Pandawa</w:t>
             </w:r>
           </w:p>
+          <w:p>
+            <w:pPr>
+              <w:jc w:val="center"/>
+            </w:pPr>
+            <w:r>
+              <w:rPr>
+                <w:rFonts w:ascii="Segoe UI Emoji" w:hAnsi="Segoe UI Emoji" w:cs="Segoe UI Emoji"/>
+              </w:rPr>
+              <w:t>🍃</w:t>
+            </w:r>
+            <w:r>
+              <w:rPr>
+                <w:rFonts w:ascii="Segoe UI Emoji" w:hAnsi="Segoe UI Emoji" w:cs="Segoe UI Emoji"/>
+              </w:rPr>
+              <w:t xml:space="preserve"> 💧 🟤</w:t>
+            </w:r>
+            <w:r>
+              <w:rPr>
+                <w:rFonts w:ascii="Segoe UI Emoji" w:hAnsi="Segoe UI Emoji" w:cs="Segoe UI Emoji"/>
+                <w:b/>
+                <w:bCs/>
+              </w:rPr>
+              <w:t xml:space="preserve"> 🔥</w:t>
+            </w:r>
+          </w:p>
         </w:tc>
         <w:tc>
           <w:tcPr>
@@ -1163,7 +3033,7 @@
         </w:tc>
         <w:tc>
           <w:tcPr>
-            <w:tcW w:w="2516" w:type="dxa"/>
+            <w:tcW w:w="1667" w:type="dxa"/>
             <w:vAlign w:val="center"/>
           </w:tcPr>
           <w:p>
@@ -1177,7 +3047,7 @@
         </w:tc>
         <w:tc>
           <w:tcPr>
-            <w:tcW w:w="2552" w:type="dxa"/>
+            <w:tcW w:w="2268" w:type="dxa"/>
             <w:vAlign w:val="center"/>
           </w:tcPr>
           <w:p>
@@ -1207,33 +3077,202 @@
         </w:tc>
         <w:tc>
           <w:tcPr>
-            <w:tcW w:w="1701" w:type="dxa"/>
-            <w:vAlign w:val="center"/>
-          </w:tcPr>
-          <w:p>
-            <w:pPr>
-              <w:jc w:val="center"/>
+            <w:tcW w:w="1606" w:type="dxa"/>
+            <w:vAlign w:val="center"/>
+          </w:tcPr>
+          <w:p>
+            <w:pPr>
+              <w:jc w:val="center"/>
+            </w:pPr>
+            <w:r>
+              <w:rPr>
+                <w:rFonts w:ascii="Segoe UI Emoji" w:hAnsi="Segoe UI Emoji" w:cs="Segoe UI Emoji"/>
+              </w:rPr>
+              <w:t>💧</w:t>
+            </w:r>
+            <w:r>
               <w:rPr>
                 <w:rFonts w:cstheme="minorHAnsi"/>
-                <w:b/>
-                <w:bCs/>
-              </w:rPr>
-            </w:pPr>
+                <w:lang w:val="it-IT"/>
+              </w:rPr>
+              <w:t xml:space="preserve"> </w:t>
+            </w:r>
             <w:r>
               <w:rPr>
                 <w:rFonts w:cstheme="minorHAnsi"/>
+                <w:lang w:val="it-IT"/>
+              </w:rPr>
+              <w:t xml:space="preserve">⌂ </w:t>
+            </w:r>
+            <w:r>
+              <w:rPr>
+                <w:rFonts w:cstheme="minorHAnsi"/>
                 <w:b/>
                 <w:bCs/>
               </w:rPr>
               <w:t>Ω Ω</w:t>
             </w:r>
+          </w:p>
+          <w:p>
+            <w:pPr>
+              <w:jc w:val="center"/>
+            </w:pPr>
+            <w:r>
+              <w:t>lvl 56 D</w:t>
+            </w:r>
+          </w:p>
+        </w:tc>
+        <w:tc>
+          <w:tcPr>
+            <w:tcW w:w="1607" w:type="dxa"/>
+            <w:vAlign w:val="center"/>
+          </w:tcPr>
+          <w:p>
+            <w:pPr>
+              <w:jc w:val="center"/>
+            </w:pPr>
+            <w:r>
+              <w:rPr>
+                <w:rFonts w:ascii="Segoe UI Emoji" w:hAnsi="Segoe UI Emoji" w:cs="Segoe UI Emoji"/>
+              </w:rPr>
+              <w:t>🟤</w:t>
+            </w:r>
+            <w:r>
+              <w:rPr>
+                <w:rFonts w:cstheme="minorHAnsi"/>
+                <w:lang w:val="it-IT"/>
+              </w:rPr>
+              <w:t xml:space="preserve"> </w:t>
+            </w:r>
+            <w:r>
+              <w:rPr>
+                <w:rFonts w:cstheme="minorHAnsi"/>
+                <w:lang w:val="it-IT"/>
+              </w:rPr>
+              <w:t xml:space="preserve">⌂ </w:t>
+            </w:r>
+            <w:r>
+              <w:rPr>
+                <w:rFonts w:cstheme="minorHAnsi"/>
+                <w:b/>
+                <w:bCs/>
+              </w:rPr>
+              <w:t>Ω Ω</w:t>
+            </w:r>
+          </w:p>
+          <w:p>
+            <w:pPr>
+              <w:jc w:val="center"/>
+            </w:pPr>
+            <w:r>
+              <w:t>lvl 84 MD</w:t>
+            </w:r>
+          </w:p>
+        </w:tc>
+        <w:tc>
+          <w:tcPr>
+            <w:tcW w:w="1606" w:type="dxa"/>
+            <w:vAlign w:val="center"/>
+          </w:tcPr>
+          <w:p>
+            <w:pPr>
+              <w:jc w:val="center"/>
+              <w:rPr>
+                <w:rFonts w:ascii="Segoe UI Emoji" w:hAnsi="Segoe UI Emoji" w:cs="Segoe UI Emoji"/>
+                <w:b/>
+                <w:bCs/>
+              </w:rPr>
+            </w:pPr>
+            <w:r>
+              <w:rPr>
+                <w:rFonts w:ascii="Segoe UI Emoji" w:hAnsi="Segoe UI Emoji" w:cs="Segoe UI Emoji"/>
+                <w:b/>
+                <w:bCs/>
+              </w:rPr>
+              <w:t>🔥</w:t>
+            </w:r>
+            <w:r>
+              <w:rPr>
+                <w:rFonts w:cstheme="minorHAnsi"/>
+                <w:lang w:val="it-IT"/>
+              </w:rPr>
+              <w:t xml:space="preserve"> ⌂ </w:t>
+            </w:r>
+            <w:r>
+              <w:rPr>
+                <w:rFonts w:cstheme="minorHAnsi"/>
+                <w:b/>
+                <w:bCs/>
+              </w:rPr>
+              <w:t>Ω Ω Ω</w:t>
+            </w:r>
+          </w:p>
+          <w:p>
+            <w:pPr>
+              <w:jc w:val="center"/>
+            </w:pPr>
+            <w:r>
+              <w:t>lvl 120 MD</w:t>
+            </w:r>
+          </w:p>
+        </w:tc>
+        <w:tc>
+          <w:tcPr>
+            <w:tcW w:w="1607" w:type="dxa"/>
+            <w:vAlign w:val="center"/>
+          </w:tcPr>
+          <w:p>
+            <w:pPr>
+              <w:jc w:val="center"/>
+            </w:pPr>
+            <w:r>
+              <w:rPr>
+                <w:rFonts w:ascii="Segoe UI Emoji" w:hAnsi="Segoe UI Emoji" w:cs="Segoe UI Emoji"/>
+              </w:rPr>
+              <w:t>🍃</w:t>
+            </w:r>
+            <w:r>
+              <w:rPr>
+                <w:rFonts w:cstheme="minorHAnsi"/>
+                <w:lang w:val="it-IT"/>
+              </w:rPr>
+              <w:t xml:space="preserve"> </w:t>
+            </w:r>
+            <w:r>
+              <w:rPr>
+                <w:rFonts w:cstheme="minorHAnsi"/>
+                <w:b/>
+                <w:bCs/>
+              </w:rPr>
+              <w:t xml:space="preserve">Ω Ω </w:t>
+            </w:r>
+          </w:p>
+          <w:p>
+            <w:pPr>
+              <w:jc w:val="center"/>
+            </w:pPr>
+            <w:r>
+              <w:t>lvl 130 D</w:t>
+            </w:r>
+          </w:p>
+        </w:tc>
+        <w:tc>
+          <w:tcPr>
+            <w:tcW w:w="1606" w:type="dxa"/>
+            <w:shd w:val="clear" w:color="auto" w:fill="000000" w:themeFill="text1"/>
+            <w:vAlign w:val="center"/>
+          </w:tcPr>
+          <w:p>
+            <w:pPr>
+              <w:jc w:val="center"/>
+            </w:pPr>
           </w:p>
         </w:tc>
       </w:tr>
       <w:tr>
         <w:tc>
           <w:tcPr>
-            <w:tcW w:w="1869" w:type="dxa"/>
+            <w:tcW w:w="1868" w:type="dxa"/>
             <w:vAlign w:val="center"/>
           </w:tcPr>
           <w:p>
@@ -1244,6 +3283,17 @@
               <w:t>Zobal</w:t>
             </w:r>
           </w:p>
+          <w:p>
+            <w:pPr>
+              <w:jc w:val="center"/>
+            </w:pPr>
+            <w:r>
+              <w:rPr>
+                <w:rFonts w:ascii="Segoe UI Emoji" w:hAnsi="Segoe UI Emoji" w:cs="Segoe UI Emoji"/>
+              </w:rPr>
+              <w:t>🟤 💧</w:t>
+            </w:r>
+          </w:p>
         </w:tc>
         <w:tc>
           <w:tcPr>
@@ -1267,7 +3317,7 @@
         </w:tc>
         <w:tc>
           <w:tcPr>
-            <w:tcW w:w="2516" w:type="dxa"/>
+            <w:tcW w:w="1667" w:type="dxa"/>
             <w:vAlign w:val="center"/>
           </w:tcPr>
           <w:p>
@@ -1281,7 +3331,7 @@
         </w:tc>
         <w:tc>
           <w:tcPr>
-            <w:tcW w:w="2552" w:type="dxa"/>
+            <w:tcW w:w="2268" w:type="dxa"/>
             <w:vAlign w:val="center"/>
           </w:tcPr>
           <w:p>
@@ -1319,33 +3369,168 @@
         </w:tc>
         <w:tc>
           <w:tcPr>
-            <w:tcW w:w="1701" w:type="dxa"/>
-            <w:vAlign w:val="center"/>
-          </w:tcPr>
-          <w:p>
-            <w:pPr>
-              <w:jc w:val="center"/>
+            <w:tcW w:w="1606" w:type="dxa"/>
+            <w:vAlign w:val="center"/>
+          </w:tcPr>
+          <w:p>
+            <w:pPr>
+              <w:jc w:val="center"/>
+            </w:pPr>
+            <w:r>
+              <w:rPr>
+                <w:rFonts w:ascii="Segoe UI Emoji" w:hAnsi="Segoe UI Emoji" w:cs="Segoe UI Emoji"/>
+              </w:rPr>
+              <w:t>🟤</w:t>
+            </w:r>
+            <w:r>
               <w:rPr>
                 <w:rFonts w:cstheme="minorHAnsi"/>
-                <w:b/>
-                <w:bCs/>
-              </w:rPr>
-            </w:pPr>
+                <w:lang w:val="it-IT"/>
+              </w:rPr>
+              <w:t xml:space="preserve"> </w:t>
+            </w:r>
             <w:r>
               <w:rPr>
                 <w:rFonts w:cstheme="minorHAnsi"/>
                 <w:b/>
                 <w:bCs/>
               </w:rPr>
-              <w:t>Ω Ω Ω Ω</w:t>
-            </w:r>
+              <w:t>Ω Ω</w:t>
+            </w:r>
+          </w:p>
+          <w:p>
+            <w:pPr>
+              <w:jc w:val="center"/>
+            </w:pPr>
+            <w:r>
+              <w:t>lvl 1 MD</w:t>
+            </w:r>
+          </w:p>
+        </w:tc>
+        <w:tc>
+          <w:tcPr>
+            <w:tcW w:w="1607" w:type="dxa"/>
+            <w:vAlign w:val="center"/>
+          </w:tcPr>
+          <w:p>
+            <w:pPr>
+              <w:jc w:val="center"/>
+            </w:pPr>
+            <w:r>
+              <w:rPr>
+                <w:rFonts w:ascii="Segoe UI Emoji" w:hAnsi="Segoe UI Emoji" w:cs="Segoe UI Emoji"/>
+              </w:rPr>
+              <w:t>💧</w:t>
+            </w:r>
+            <w:r>
+              <w:rPr>
+                <w:rFonts w:cstheme="minorHAnsi"/>
+                <w:lang w:val="it-IT"/>
+              </w:rPr>
+              <w:t xml:space="preserve"> </w:t>
+            </w:r>
+            <w:r>
+              <w:rPr>
+                <w:rFonts w:cstheme="minorHAnsi"/>
+                <w:b/>
+                <w:bCs/>
+              </w:rPr>
+              <w:t>Ω Ω</w:t>
+            </w:r>
+          </w:p>
+          <w:p>
+            <w:pPr>
+              <w:jc w:val="center"/>
+            </w:pPr>
+            <w:r>
+              <w:t>lvl 32 MD</w:t>
+            </w:r>
+          </w:p>
+        </w:tc>
+        <w:tc>
+          <w:tcPr>
+            <w:tcW w:w="1606" w:type="dxa"/>
+            <w:vAlign w:val="center"/>
+          </w:tcPr>
+          <w:p>
+            <w:pPr>
+              <w:jc w:val="center"/>
+            </w:pPr>
+            <w:r>
+              <w:rPr>
+                <w:rFonts w:ascii="Segoe UI Emoji" w:hAnsi="Segoe UI Emoji" w:cs="Segoe UI Emoji"/>
+              </w:rPr>
+              <w:t>🍃</w:t>
+            </w:r>
+            <w:r>
+              <w:rPr>
+                <w:rFonts w:cstheme="minorHAnsi"/>
+                <w:lang w:val="it-IT"/>
+              </w:rPr>
+              <w:t xml:space="preserve"> </w:t>
+            </w:r>
+            <w:r>
+              <w:rPr>
+                <w:rFonts w:cstheme="minorHAnsi"/>
+                <w:b/>
+                <w:bCs/>
+              </w:rPr>
+              <w:t xml:space="preserve">Ω Ω </w:t>
+            </w:r>
+          </w:p>
+          <w:p>
+            <w:pPr>
+              <w:jc w:val="center"/>
+            </w:pPr>
+            <w:r>
+              <w:t>lvl 145 m</w:t>
+            </w:r>
+          </w:p>
+        </w:tc>
+        <w:tc>
+          <w:tcPr>
+            <w:tcW w:w="1607" w:type="dxa"/>
+            <w:vAlign w:val="center"/>
+          </w:tcPr>
+          <w:p>
+            <w:pPr>
+              <w:jc w:val="center"/>
+            </w:pPr>
+            <w:r>
+              <w:rPr>
+                <w:b/>
+                <w:bCs/>
+                <w:color w:val="7030A0"/>
+              </w:rPr>
+              <w:t>→</w:t>
+            </w:r>
+            <w:r>
+              <w:rPr>
+                <w:rFonts w:cstheme="minorHAnsi"/>
+                <w:b/>
+                <w:bCs/>
+              </w:rPr>
+              <w:t xml:space="preserve"> </w:t>
+            </w:r>
+          </w:p>
+        </w:tc>
+        <w:tc>
+          <w:tcPr>
+            <w:tcW w:w="1606" w:type="dxa"/>
+            <w:shd w:val="clear" w:color="auto" w:fill="000000" w:themeFill="text1"/>
+            <w:vAlign w:val="center"/>
+          </w:tcPr>
+          <w:p>
+            <w:pPr>
+              <w:jc w:val="center"/>
+            </w:pPr>
           </w:p>
         </w:tc>
       </w:tr>
       <w:tr>
         <w:tc>
           <w:tcPr>
-            <w:tcW w:w="1869" w:type="dxa"/>
+            <w:tcW w:w="1868" w:type="dxa"/>
             <w:vAlign w:val="center"/>
           </w:tcPr>
           <w:p>
@@ -1356,6 +3541,31 @@
               <w:t>Steameur</w:t>
             </w:r>
           </w:p>
+          <w:p>
+            <w:pPr>
+              <w:jc w:val="center"/>
+            </w:pPr>
+            <w:r>
+              <w:rPr>
+                <w:rFonts w:ascii="Segoe UI Emoji" w:hAnsi="Segoe UI Emoji" w:cs="Segoe UI Emoji"/>
+              </w:rPr>
+              <w:t>⚡</w:t>
+            </w:r>
+            <w:r>
+              <w:rPr>
+                <w:rFonts w:ascii="Segoe UI Emoji" w:hAnsi="Segoe UI Emoji" w:cs="Segoe UI Emoji"/>
+              </w:rPr>
+              <w:t xml:space="preserve"> 🟤</w:t>
+            </w:r>
+            <w:r>
+              <w:rPr>
+                <w:rFonts w:ascii="Segoe UI Emoji" w:hAnsi="Segoe UI Emoji" w:cs="Segoe UI Emoji"/>
+                <w:b/>
+                <w:bCs/>
+              </w:rPr>
+              <w:t xml:space="preserve"> 🔥</w:t>
+            </w:r>
+          </w:p>
         </w:tc>
         <w:tc>
           <w:tcPr>
@@ -1379,7 +3589,7 @@
         </w:tc>
         <w:tc>
           <w:tcPr>
-            <w:tcW w:w="2516" w:type="dxa"/>
+            <w:tcW w:w="1667" w:type="dxa"/>
             <w:vAlign w:val="center"/>
           </w:tcPr>
           <w:p>
@@ -1393,7 +3603,7 @@
         </w:tc>
         <w:tc>
           <w:tcPr>
-            <w:tcW w:w="2552" w:type="dxa"/>
+            <w:tcW w:w="2268" w:type="dxa"/>
             <w:vAlign w:val="center"/>
           </w:tcPr>
           <w:p>
@@ -1439,43 +3649,186 @@
         </w:tc>
         <w:tc>
           <w:tcPr>
-            <w:tcW w:w="1701" w:type="dxa"/>
-            <w:vAlign w:val="center"/>
-          </w:tcPr>
-          <w:p>
-            <w:pPr>
-              <w:jc w:val="center"/>
+            <w:tcW w:w="1606" w:type="dxa"/>
+            <w:vAlign w:val="center"/>
+          </w:tcPr>
+          <w:p>
+            <w:pPr>
+              <w:jc w:val="center"/>
+            </w:pPr>
+            <w:r>
+              <w:rPr>
+                <w:rFonts w:ascii="Segoe UI Emoji" w:hAnsi="Segoe UI Emoji" w:cs="Segoe UI Emoji"/>
+              </w:rPr>
+              <w:t>🟤</w:t>
+            </w:r>
+            <w:r>
               <w:rPr>
                 <w:rFonts w:cstheme="minorHAnsi"/>
-                <w:b/>
-                <w:bCs/>
-              </w:rPr>
-            </w:pPr>
+                <w:lang w:val="it-IT"/>
+              </w:rPr>
+              <w:t xml:space="preserve"> </w:t>
+            </w:r>
             <w:r>
               <w:rPr>
                 <w:rFonts w:cstheme="minorHAnsi"/>
                 <w:b/>
                 <w:bCs/>
               </w:rPr>
-              <w:t xml:space="preserve">Ω Ω Ω Ω </w:t>
-            </w:r>
+              <w:t>Ω Ω</w:t>
+            </w:r>
+          </w:p>
+          <w:p>
+            <w:pPr>
+              <w:jc w:val="center"/>
+            </w:pPr>
+            <w:r>
+              <w:t>lvl 1 MD</w:t>
+            </w:r>
+          </w:p>
+        </w:tc>
+        <w:tc>
+          <w:tcPr>
+            <w:tcW w:w="1607" w:type="dxa"/>
+            <w:vAlign w:val="center"/>
+          </w:tcPr>
+          <w:p>
+            <w:pPr>
+              <w:jc w:val="center"/>
+              <w:rPr>
+                <w:rFonts w:cstheme="minorHAnsi"/>
+                <w:b/>
+                <w:bCs/>
+              </w:rPr>
+            </w:pPr>
+            <w:r>
+              <w:rPr>
+                <w:rFonts w:ascii="Segoe UI Emoji" w:hAnsi="Segoe UI Emoji" w:cs="Segoe UI Emoji"/>
+              </w:rPr>
+              <w:t>⚡</w:t>
+            </w:r>
+            <w:r>
+              <w:rPr>
+                <w:rFonts w:cstheme="minorHAnsi"/>
+                <w:b/>
+                <w:bCs/>
+              </w:rPr>
+              <w:t>Ω Ω Ω</w:t>
+            </w:r>
+          </w:p>
+          <w:p>
+            <w:pPr>
+              <w:jc w:val="center"/>
+            </w:pPr>
+            <w:r>
+              <w:t>lvl 69 MD</w:t>
+            </w:r>
+          </w:p>
+        </w:tc>
+        <w:tc>
+          <w:tcPr>
+            <w:tcW w:w="1606" w:type="dxa"/>
+            <w:vAlign w:val="center"/>
+          </w:tcPr>
+          <w:p>
+            <w:pPr>
+              <w:jc w:val="center"/>
+              <w:rPr>
+                <w:rFonts w:ascii="Segoe UI Emoji" w:hAnsi="Segoe UI Emoji" w:cs="Segoe UI Emoji"/>
+                <w:b/>
+                <w:bCs/>
+              </w:rPr>
+            </w:pPr>
+            <w:r>
+              <w:rPr>
+                <w:rFonts w:ascii="Segoe UI Emoji" w:hAnsi="Segoe UI Emoji" w:cs="Segoe UI Emoji"/>
+                <w:b/>
+                <w:bCs/>
+              </w:rPr>
+              <w:t>🔥</w:t>
+            </w:r>
+            <w:r>
+              <w:rPr>
+                <w:rFonts w:cstheme="minorHAnsi"/>
+                <w:b/>
+                <w:bCs/>
+              </w:rPr>
+              <w:t xml:space="preserve"> Ω Ω</w:t>
+            </w:r>
+          </w:p>
+          <w:p>
+            <w:pPr>
+              <w:jc w:val="center"/>
+            </w:pPr>
+            <w:r>
+              <w:t>lvl 110 MD</w:t>
+            </w:r>
+          </w:p>
+        </w:tc>
+        <w:tc>
+          <w:tcPr>
+            <w:tcW w:w="1607" w:type="dxa"/>
+            <w:vAlign w:val="center"/>
+          </w:tcPr>
+          <w:p>
+            <w:pPr>
+              <w:jc w:val="center"/>
+            </w:pPr>
+            <w:r>
+              <w:rPr>
+                <w:b/>
+                <w:bCs/>
+                <w:color w:val="7030A0"/>
+              </w:rPr>
+              <w:t>→</w:t>
+            </w:r>
+          </w:p>
+        </w:tc>
+        <w:tc>
+          <w:tcPr>
+            <w:tcW w:w="1606" w:type="dxa"/>
+            <w:shd w:val="clear" w:color="auto" w:fill="000000" w:themeFill="text1"/>
+            <w:vAlign w:val="center"/>
+          </w:tcPr>
+          <w:p>
+            <w:pPr>
+              <w:jc w:val="center"/>
+            </w:pPr>
           </w:p>
         </w:tc>
       </w:tr>
       <w:tr>
         <w:tc>
           <w:tcPr>
-            <w:tcW w:w="1869" w:type="dxa"/>
-            <w:vAlign w:val="center"/>
-          </w:tcPr>
-          <w:p>
-            <w:pPr>
-              <w:jc w:val="center"/>
-            </w:pPr>
-            <w:r>
+            <w:tcW w:w="1868" w:type="dxa"/>
+            <w:vAlign w:val="center"/>
+          </w:tcPr>
+          <w:p>
+            <w:pPr>
+              <w:jc w:val="center"/>
+            </w:pPr>
+            <w:r>
+              <w:lastRenderedPageBreak/>
               <w:t>Huppermage</w:t>
             </w:r>
           </w:p>
+          <w:p>
+            <w:pPr>
+              <w:jc w:val="center"/>
+            </w:pPr>
+            <w:r>
+              <w:rPr>
+                <w:rFonts w:ascii="Segoe UI Emoji" w:hAnsi="Segoe UI Emoji" w:cs="Segoe UI Emoji"/>
+              </w:rPr>
+              <w:t>🟤</w:t>
+            </w:r>
+            <w:r>
+              <w:rPr>
+                <w:rFonts w:ascii="Segoe UI Emoji" w:hAnsi="Segoe UI Emoji" w:cs="Segoe UI Emoji"/>
+              </w:rPr>
+              <w:t>⚡</w:t>
+            </w:r>
+          </w:p>
         </w:tc>
         <w:tc>
           <w:tcPr>
@@ -1499,7 +3852,7 @@
         </w:tc>
         <w:tc>
           <w:tcPr>
-            <w:tcW w:w="2516" w:type="dxa"/>
+            <w:tcW w:w="1667" w:type="dxa"/>
             <w:vAlign w:val="center"/>
           </w:tcPr>
           <w:p>
@@ -1513,7 +3866,7 @@
         </w:tc>
         <w:tc>
           <w:tcPr>
-            <w:tcW w:w="2552" w:type="dxa"/>
+            <w:tcW w:w="2268" w:type="dxa"/>
             <w:vAlign w:val="center"/>
           </w:tcPr>
           <w:p>
@@ -1535,25 +3888,197 @@
         </w:tc>
         <w:tc>
           <w:tcPr>
-            <w:tcW w:w="1701" w:type="dxa"/>
-            <w:vAlign w:val="center"/>
-          </w:tcPr>
-          <w:p>
-            <w:pPr>
-              <w:jc w:val="center"/>
+            <w:tcW w:w="1606" w:type="dxa"/>
+            <w:vAlign w:val="center"/>
+          </w:tcPr>
+          <w:p>
+            <w:pPr>
+              <w:jc w:val="center"/>
+            </w:pPr>
+            <w:r>
+              <w:rPr>
+                <w:rFonts w:ascii="Segoe UI Emoji" w:hAnsi="Segoe UI Emoji" w:cs="Segoe UI Emoji"/>
+              </w:rPr>
+              <w:t>🟤</w:t>
+            </w:r>
+            <w:r>
               <w:rPr>
                 <w:rFonts w:cstheme="minorHAnsi"/>
-                <w:b/>
-                <w:bCs/>
-              </w:rPr>
-            </w:pPr>
+                <w:lang w:val="it-IT"/>
+              </w:rPr>
+              <w:t xml:space="preserve"> </w:t>
+            </w:r>
             <w:r>
               <w:rPr>
                 <w:rFonts w:cstheme="minorHAnsi"/>
                 <w:b/>
                 <w:bCs/>
               </w:rPr>
-              <w:t>Ω Ω Ω Ω</w:t>
+              <w:t>Ω Ω Ω</w:t>
+            </w:r>
+          </w:p>
+          <w:p>
+            <w:pPr>
+              <w:jc w:val="center"/>
+            </w:pPr>
+            <w:r>
+              <w:t>lvl 1 D</w:t>
+            </w:r>
+          </w:p>
+        </w:tc>
+        <w:tc>
+          <w:tcPr>
+            <w:tcW w:w="1607" w:type="dxa"/>
+            <w:vAlign w:val="center"/>
+          </w:tcPr>
+          <w:p>
+            <w:pPr>
+              <w:jc w:val="center"/>
+            </w:pPr>
+            <w:r>
+              <w:rPr>
+                <w:rFonts w:ascii="Segoe UI Emoji" w:hAnsi="Segoe UI Emoji" w:cs="Segoe UI Emoji"/>
+              </w:rPr>
+              <w:t>🍃</w:t>
+            </w:r>
+            <w:r>
+              <w:rPr>
+                <w:rFonts w:cstheme="minorHAnsi"/>
+                <w:lang w:val="it-IT"/>
+              </w:rPr>
+              <w:t xml:space="preserve"> </w:t>
+            </w:r>
+            <w:r>
+              <w:rPr>
+                <w:rFonts w:cstheme="minorHAnsi"/>
+                <w:b/>
+                <w:bCs/>
+              </w:rPr>
+              <w:t xml:space="preserve">Ω Ω Ω </w:t>
+            </w:r>
+          </w:p>
+          <w:p>
+            <w:pPr>
+              <w:jc w:val="center"/>
+            </w:pPr>
+            <w:r>
+              <w:t>lvl 1 D</w:t>
+            </w:r>
+          </w:p>
+        </w:tc>
+        <w:tc>
+          <w:tcPr>
+            <w:tcW w:w="1606" w:type="dxa"/>
+            <w:vAlign w:val="center"/>
+          </w:tcPr>
+          <w:p>
+            <w:pPr>
+              <w:jc w:val="center"/>
+              <w:rPr>
+                <w:rFonts w:ascii="Segoe UI Emoji" w:hAnsi="Segoe UI Emoji" w:cs="Segoe UI Emoji"/>
+                <w:b/>
+                <w:bCs/>
+              </w:rPr>
+            </w:pPr>
+            <w:r>
+              <w:rPr>
+                <w:rFonts w:ascii="Segoe UI Emoji" w:hAnsi="Segoe UI Emoji" w:cs="Segoe UI Emoji"/>
+                <w:b/>
+                <w:bCs/>
+              </w:rPr>
+              <w:t>🔥</w:t>
+            </w:r>
+            <w:r>
+              <w:rPr>
+                <w:rFonts w:cstheme="minorHAnsi"/>
+                <w:b/>
+                <w:bCs/>
+              </w:rPr>
+              <w:t xml:space="preserve"> Ω Ω Ω</w:t>
+            </w:r>
+          </w:p>
+          <w:p>
+            <w:pPr>
+              <w:jc w:val="center"/>
+            </w:pPr>
+            <w:r>
+              <w:t>lvl 3 D</w:t>
+            </w:r>
+          </w:p>
+        </w:tc>
+        <w:tc>
+          <w:tcPr>
+            <w:tcW w:w="1607" w:type="dxa"/>
+            <w:vAlign w:val="center"/>
+          </w:tcPr>
+          <w:p>
+            <w:pPr>
+              <w:jc w:val="center"/>
+            </w:pPr>
+            <w:r>
+              <w:rPr>
+                <w:rFonts w:ascii="Segoe UI Emoji" w:hAnsi="Segoe UI Emoji" w:cs="Segoe UI Emoji"/>
+              </w:rPr>
+              <w:t>💧</w:t>
+            </w:r>
+            <w:r>
+              <w:rPr>
+                <w:rFonts w:cstheme="minorHAnsi"/>
+                <w:lang w:val="it-IT"/>
+              </w:rPr>
+              <w:t xml:space="preserve"> </w:t>
+            </w:r>
+            <w:r>
+              <w:rPr>
+                <w:rFonts w:cstheme="minorHAnsi"/>
+                <w:b/>
+                <w:bCs/>
+              </w:rPr>
+              <w:t>Ω Ω Ω</w:t>
+            </w:r>
+          </w:p>
+          <w:p>
+            <w:pPr>
+              <w:jc w:val="center"/>
+            </w:pPr>
+            <w:r>
+              <w:t>lvl 62 M</w:t>
+            </w:r>
+          </w:p>
+        </w:tc>
+        <w:tc>
+          <w:tcPr>
+            <w:tcW w:w="1606" w:type="dxa"/>
+            <w:vAlign w:val="center"/>
+          </w:tcPr>
+          <w:p>
+            <w:pPr>
+              <w:jc w:val="center"/>
+              <w:rPr>
+                <w:rFonts w:ascii="Segoe UI Emoji" w:hAnsi="Segoe UI Emoji" w:cs="Segoe UI Emoji"/>
+              </w:rPr>
+            </w:pPr>
+            <w:r>
+              <w:rPr>
+                <w:rFonts w:ascii="Segoe UI Emoji" w:hAnsi="Segoe UI Emoji" w:cs="Segoe UI Emoji"/>
+              </w:rPr>
+              <w:t>⚡</w:t>
+            </w:r>
+            <w:r>
+              <w:rPr>
+                <w:rFonts w:cstheme="minorHAnsi"/>
+                <w:b/>
+                <w:bCs/>
+              </w:rPr>
+              <w:t xml:space="preserve"> Ω Ω Ω</w:t>
+            </w:r>
+          </w:p>
+          <w:p>
+            <w:pPr>
+              <w:jc w:val="center"/>
+            </w:pPr>
+            <w:r>
+              <w:t>lvl 120 D</w:t>
             </w:r>
           </w:p>
         </w:tc>
@@ -1561,7 +4086,7 @@
       <w:tr>
         <w:tc>
           <w:tcPr>
-            <w:tcW w:w="1869" w:type="dxa"/>
+            <w:tcW w:w="1868" w:type="dxa"/>
             <w:vAlign w:val="center"/>
           </w:tcPr>
           <w:p>
@@ -1572,6 +4097,31 @@
               <w:t>Osamodas</w:t>
             </w:r>
           </w:p>
+          <w:p>
+            <w:pPr>
+              <w:jc w:val="center"/>
+            </w:pPr>
+            <w:r>
+              <w:rPr>
+                <w:rFonts w:ascii="Segoe UI Emoji" w:hAnsi="Segoe UI Emoji" w:cs="Segoe UI Emoji"/>
+                <w:b/>
+                <w:bCs/>
+              </w:rPr>
+              <w:t>🔥</w:t>
+            </w:r>
+            <w:r>
+              <w:rPr>
+                <w:rFonts w:ascii="Segoe UI Emoji" w:hAnsi="Segoe UI Emoji" w:cs="Segoe UI Emoji"/>
+              </w:rPr>
+              <w:t xml:space="preserve"> 🍃</w:t>
+            </w:r>
+            <w:r>
+              <w:rPr>
+                <w:rFonts w:ascii="Segoe UI Emoji" w:hAnsi="Segoe UI Emoji" w:cs="Segoe UI Emoji"/>
+              </w:rPr>
+              <w:t xml:space="preserve"> 💧</w:t>
+            </w:r>
+          </w:p>
         </w:tc>
         <w:tc>
           <w:tcPr>
@@ -1595,7 +4145,7 @@
         </w:tc>
         <w:tc>
           <w:tcPr>
-            <w:tcW w:w="2516" w:type="dxa"/>
+            <w:tcW w:w="1667" w:type="dxa"/>
             <w:vAlign w:val="center"/>
           </w:tcPr>
           <w:p>
@@ -1609,7 +4159,7 @@
         </w:tc>
         <w:tc>
           <w:tcPr>
-            <w:tcW w:w="2552" w:type="dxa"/>
+            <w:tcW w:w="2268" w:type="dxa"/>
             <w:vAlign w:val="center"/>
           </w:tcPr>
           <w:p>
@@ -1631,33 +4181,162 @@
         </w:tc>
         <w:tc>
           <w:tcPr>
-            <w:tcW w:w="1701" w:type="dxa"/>
-            <w:vAlign w:val="center"/>
-          </w:tcPr>
-          <w:p>
-            <w:pPr>
-              <w:jc w:val="center"/>
+            <w:tcW w:w="1606" w:type="dxa"/>
+            <w:vAlign w:val="center"/>
+          </w:tcPr>
+          <w:p>
+            <w:pPr>
+              <w:jc w:val="center"/>
+            </w:pPr>
+            <w:r>
+              <w:rPr>
+                <w:rFonts w:ascii="Segoe UI Emoji" w:hAnsi="Segoe UI Emoji" w:cs="Segoe UI Emoji"/>
+              </w:rPr>
+              <w:t>🍃</w:t>
+            </w:r>
+            <w:r>
               <w:rPr>
                 <w:rFonts w:cstheme="minorHAnsi"/>
-                <w:b/>
-                <w:bCs/>
-              </w:rPr>
-            </w:pPr>
+                <w:lang w:val="it-IT"/>
+              </w:rPr>
+              <w:t xml:space="preserve"> </w:t>
+            </w:r>
             <w:r>
               <w:rPr>
                 <w:rFonts w:cstheme="minorHAnsi"/>
                 <w:b/>
                 <w:bCs/>
               </w:rPr>
-              <w:t>Ω Ω Ω Ω</w:t>
-            </w:r>
+              <w:t xml:space="preserve">Ω Ω Ω </w:t>
+            </w:r>
+          </w:p>
+          <w:p>
+            <w:pPr>
+              <w:jc w:val="center"/>
+            </w:pPr>
+            <w:r>
+              <w:t>lvl 1 MD</w:t>
+            </w:r>
+          </w:p>
+        </w:tc>
+        <w:tc>
+          <w:tcPr>
+            <w:tcW w:w="1607" w:type="dxa"/>
+            <w:vAlign w:val="center"/>
+          </w:tcPr>
+          <w:p>
+            <w:pPr>
+              <w:jc w:val="center"/>
+            </w:pPr>
+            <w:r>
+              <w:rPr>
+                <w:rFonts w:ascii="Segoe UI Emoji" w:hAnsi="Segoe UI Emoji" w:cs="Segoe UI Emoji"/>
+              </w:rPr>
+              <w:t>💧</w:t>
+            </w:r>
+            <w:r>
+              <w:rPr>
+                <w:rFonts w:cstheme="minorHAnsi"/>
+                <w:lang w:val="it-IT"/>
+              </w:rPr>
+              <w:t xml:space="preserve"> </w:t>
+            </w:r>
+            <w:r>
+              <w:rPr>
+                <w:rFonts w:cstheme="minorHAnsi"/>
+                <w:b/>
+                <w:bCs/>
+              </w:rPr>
+              <w:t>Ω Ω Ω</w:t>
+            </w:r>
+          </w:p>
+          <w:p>
+            <w:pPr>
+              <w:jc w:val="center"/>
+            </w:pPr>
+            <w:r>
+              <w:t>lvl 6</w:t>
+            </w:r>
+            <w:r>
+              <w:t>9</w:t>
+            </w:r>
+            <w:r>
+              <w:t xml:space="preserve"> M</w:t>
+            </w:r>
+            <w:r>
+              <w:t>D</w:t>
+            </w:r>
+          </w:p>
+        </w:tc>
+        <w:tc>
+          <w:tcPr>
+            <w:tcW w:w="1606" w:type="dxa"/>
+            <w:vAlign w:val="center"/>
+          </w:tcPr>
+          <w:p>
+            <w:pPr>
+              <w:jc w:val="center"/>
+              <w:rPr>
+                <w:rFonts w:ascii="Segoe UI Emoji" w:hAnsi="Segoe UI Emoji" w:cs="Segoe UI Emoji"/>
+                <w:b/>
+                <w:bCs/>
+              </w:rPr>
+            </w:pPr>
+            <w:r>
+              <w:rPr>
+                <w:rFonts w:ascii="Segoe UI Emoji" w:hAnsi="Segoe UI Emoji" w:cs="Segoe UI Emoji"/>
+                <w:b/>
+                <w:bCs/>
+              </w:rPr>
+              <w:t>🔥</w:t>
+            </w:r>
+            <w:r>
+              <w:rPr>
+                <w:rFonts w:cstheme="minorHAnsi"/>
+                <w:b/>
+                <w:bCs/>
+              </w:rPr>
+              <w:t xml:space="preserve"> Ω Ω</w:t>
+            </w:r>
+          </w:p>
+          <w:p>
+            <w:pPr>
+              <w:jc w:val="center"/>
+            </w:pPr>
+            <w:r>
+              <w:t>lvl 84 MD</w:t>
+            </w:r>
+          </w:p>
+        </w:tc>
+        <w:tc>
+          <w:tcPr>
+            <w:tcW w:w="1607" w:type="dxa"/>
+            <w:shd w:val="clear" w:color="auto" w:fill="000000" w:themeFill="text1"/>
+            <w:vAlign w:val="center"/>
+          </w:tcPr>
+          <w:p>
+            <w:pPr>
+              <w:jc w:val="center"/>
+            </w:pPr>
+          </w:p>
+        </w:tc>
+        <w:tc>
+          <w:tcPr>
+            <w:tcW w:w="1606" w:type="dxa"/>
+            <w:shd w:val="clear" w:color="auto" w:fill="000000" w:themeFill="text1"/>
+            <w:vAlign w:val="center"/>
+          </w:tcPr>
+          <w:p>
+            <w:pPr>
+              <w:jc w:val="center"/>
+            </w:pPr>
           </w:p>
         </w:tc>
       </w:tr>
       <w:tr>
         <w:tc>
           <w:tcPr>
-            <w:tcW w:w="1869" w:type="dxa"/>
+            <w:tcW w:w="1868" w:type="dxa"/>
             <w:vAlign w:val="center"/>
           </w:tcPr>
           <w:p>
@@ -1668,6 +4347,25 @@
               <w:t>Sadida</w:t>
             </w:r>
           </w:p>
+          <w:p>
+            <w:pPr>
+              <w:jc w:val="center"/>
+            </w:pPr>
+            <w:r>
+              <w:rPr>
+                <w:rFonts w:ascii="Segoe UI Emoji" w:hAnsi="Segoe UI Emoji" w:cs="Segoe UI Emoji"/>
+              </w:rPr>
+              <w:t>🟤</w:t>
+            </w:r>
+            <w:r>
+              <w:rPr>
+                <w:rFonts w:ascii="Segoe UI Emoji" w:hAnsi="Segoe UI Emoji" w:cs="Segoe UI Emoji"/>
+                <w:b/>
+                <w:bCs/>
+              </w:rPr>
+              <w:t xml:space="preserve"> 🔥</w:t>
+            </w:r>
+          </w:p>
         </w:tc>
         <w:tc>
           <w:tcPr>
@@ -1691,7 +4389,7 @@
         </w:tc>
         <w:tc>
           <w:tcPr>
-            <w:tcW w:w="2516" w:type="dxa"/>
+            <w:tcW w:w="1667" w:type="dxa"/>
             <w:vAlign w:val="center"/>
           </w:tcPr>
           <w:p>
@@ -1705,7 +4403,7 @@
         </w:tc>
         <w:tc>
           <w:tcPr>
-            <w:tcW w:w="2552" w:type="dxa"/>
+            <w:tcW w:w="2268" w:type="dxa"/>
             <w:vAlign w:val="center"/>
           </w:tcPr>
           <w:p>
@@ -1730,28 +4428,155 @@
         </w:tc>
         <w:tc>
           <w:tcPr>
-            <w:tcW w:w="1701" w:type="dxa"/>
-            <w:vAlign w:val="center"/>
-          </w:tcPr>
-          <w:p>
-            <w:pPr>
-              <w:jc w:val="center"/>
-            </w:pPr>
+            <w:tcW w:w="1606" w:type="dxa"/>
+            <w:vAlign w:val="center"/>
+          </w:tcPr>
+          <w:p>
+            <w:pPr>
+              <w:jc w:val="center"/>
+            </w:pPr>
+            <w:r>
+              <w:rPr>
+                <w:rFonts w:ascii="Segoe UI Emoji" w:hAnsi="Segoe UI Emoji" w:cs="Segoe UI Emoji"/>
+              </w:rPr>
+              <w:t>🟤</w:t>
+            </w:r>
             <w:r>
               <w:rPr>
                 <w:rFonts w:cstheme="minorHAnsi"/>
-                <w:b/>
-                <w:bCs/>
-              </w:rPr>
-              <w:t>Ω Ω Ω Ω Ω</w:t>
-            </w:r>
+                <w:lang w:val="it-IT"/>
+              </w:rPr>
+              <w:t xml:space="preserve"> </w:t>
+            </w:r>
+            <w:r>
+              <w:rPr>
+                <w:rFonts w:cstheme="minorHAnsi"/>
+                <w:b/>
+                <w:bCs/>
+              </w:rPr>
+              <w:t>Ω Ω Ω</w:t>
+            </w:r>
+          </w:p>
+          <w:p>
+            <w:pPr>
+              <w:jc w:val="center"/>
+            </w:pPr>
+            <w:r>
+              <w:t>lvl 1 D</w:t>
+            </w:r>
+          </w:p>
+        </w:tc>
+        <w:tc>
+          <w:tcPr>
+            <w:tcW w:w="1607" w:type="dxa"/>
+            <w:vAlign w:val="center"/>
+          </w:tcPr>
+          <w:p>
+            <w:pPr>
+              <w:jc w:val="center"/>
+            </w:pPr>
+            <w:r>
+              <w:rPr>
+                <w:rFonts w:ascii="Segoe UI Emoji" w:hAnsi="Segoe UI Emoji" w:cs="Segoe UI Emoji"/>
+                <w:b/>
+                <w:bCs/>
+              </w:rPr>
+              <w:t>🔥</w:t>
+            </w:r>
+            <w:r>
+              <w:rPr>
+                <w:rFonts w:cstheme="minorHAnsi"/>
+                <w:lang w:val="it-IT"/>
+              </w:rPr>
+              <w:t xml:space="preserve"> </w:t>
+            </w:r>
+            <w:r>
+              <w:rPr>
+                <w:rFonts w:cstheme="minorHAnsi"/>
+                <w:b/>
+                <w:bCs/>
+              </w:rPr>
+              <w:t xml:space="preserve">Ω Ω </w:t>
+            </w:r>
+          </w:p>
+          <w:p>
+            <w:pPr>
+              <w:jc w:val="center"/>
+            </w:pPr>
+            <w:r>
+              <w:t>lvl 84 D</w:t>
+            </w:r>
+          </w:p>
+        </w:tc>
+        <w:tc>
+          <w:tcPr>
+            <w:tcW w:w="1606" w:type="dxa"/>
+            <w:vAlign w:val="center"/>
+          </w:tcPr>
+          <w:p>
+            <w:pPr>
+              <w:jc w:val="center"/>
+            </w:pPr>
+            <w:r>
+              <w:rPr>
+                <w:rFonts w:ascii="Segoe UI Emoji" w:hAnsi="Segoe UI Emoji" w:cs="Segoe UI Emoji"/>
+              </w:rPr>
+              <w:t>🍃</w:t>
+            </w:r>
+            <w:r>
+              <w:rPr>
+                <w:rFonts w:cstheme="minorHAnsi"/>
+                <w:lang w:val="it-IT"/>
+              </w:rPr>
+              <w:t xml:space="preserve"> </w:t>
+            </w:r>
+            <w:r>
+              <w:rPr>
+                <w:rFonts w:cstheme="minorHAnsi"/>
+                <w:b/>
+                <w:bCs/>
+              </w:rPr>
+              <w:t>Ω Ω</w:t>
+            </w:r>
+          </w:p>
+          <w:p>
+            <w:pPr>
+              <w:jc w:val="center"/>
+            </w:pPr>
+            <w:r>
+              <w:t>lvl 195 MD</w:t>
+            </w:r>
+          </w:p>
+        </w:tc>
+        <w:tc>
+          <w:tcPr>
+            <w:tcW w:w="1607" w:type="dxa"/>
+            <w:shd w:val="clear" w:color="auto" w:fill="000000" w:themeFill="text1"/>
+            <w:vAlign w:val="center"/>
+          </w:tcPr>
+          <w:p>
+            <w:pPr>
+              <w:jc w:val="center"/>
+            </w:pPr>
+          </w:p>
+        </w:tc>
+        <w:tc>
+          <w:tcPr>
+            <w:tcW w:w="1606" w:type="dxa"/>
+            <w:shd w:val="clear" w:color="auto" w:fill="000000" w:themeFill="text1"/>
+            <w:vAlign w:val="center"/>
+          </w:tcPr>
+          <w:p>
+            <w:pPr>
+              <w:jc w:val="center"/>
+            </w:pPr>
           </w:p>
         </w:tc>
       </w:tr>
       <w:tr>
         <w:tc>
           <w:tcPr>
-            <w:tcW w:w="1869" w:type="dxa"/>
+            <w:tcW w:w="1868" w:type="dxa"/>
             <w:vAlign w:val="center"/>
           </w:tcPr>
           <w:p>
@@ -1762,6 +4587,37 @@
               <w:t>Xelor</w:t>
             </w:r>
           </w:p>
+          <w:p>
+            <w:pPr>
+              <w:jc w:val="center"/>
+            </w:pPr>
+            <w:r>
+              <w:rPr>
+                <w:rFonts w:ascii="Segoe UI Emoji" w:hAnsi="Segoe UI Emoji" w:cs="Segoe UI Emoji"/>
+                <w:b/>
+                <w:bCs/>
+              </w:rPr>
+              <w:t>🔥</w:t>
+            </w:r>
+            <w:r>
+              <w:rPr>
+                <w:rFonts w:ascii="Segoe UI Emoji" w:hAnsi="Segoe UI Emoji" w:cs="Segoe UI Emoji"/>
+              </w:rPr>
+              <w:t xml:space="preserve"> 💧</w:t>
+            </w:r>
+            <w:r>
+              <w:rPr>
+                <w:rFonts w:ascii="Segoe UI Emoji" w:hAnsi="Segoe UI Emoji" w:cs="Segoe UI Emoji"/>
+              </w:rPr>
+              <w:t>⚡</w:t>
+            </w:r>
+            <w:r>
+              <w:rPr>
+                <w:rFonts w:ascii="Segoe UI Emoji" w:hAnsi="Segoe UI Emoji" w:cs="Segoe UI Emoji"/>
+              </w:rPr>
+              <w:t xml:space="preserve"> 🟤</w:t>
+            </w:r>
+          </w:p>
         </w:tc>
         <w:tc>
           <w:tcPr>
@@ -1782,7 +4638,7 @@
         </w:tc>
         <w:tc>
           <w:tcPr>
-            <w:tcW w:w="2516" w:type="dxa"/>
+            <w:tcW w:w="1667" w:type="dxa"/>
             <w:vAlign w:val="center"/>
           </w:tcPr>
           <w:p>
@@ -1796,7 +4652,7 @@
         </w:tc>
         <w:tc>
           <w:tcPr>
-            <w:tcW w:w="2552" w:type="dxa"/>
+            <w:tcW w:w="2268" w:type="dxa"/>
             <w:vAlign w:val="center"/>
           </w:tcPr>
           <w:p>
@@ -1818,20 +4674,188 @@
         </w:tc>
         <w:tc>
           <w:tcPr>
-            <w:tcW w:w="1701" w:type="dxa"/>
-            <w:vAlign w:val="center"/>
-          </w:tcPr>
-          <w:p>
-            <w:pPr>
-              <w:jc w:val="center"/>
-            </w:pPr>
+            <w:tcW w:w="1606" w:type="dxa"/>
+            <w:vAlign w:val="center"/>
+          </w:tcPr>
+          <w:p>
+            <w:pPr>
+              <w:jc w:val="center"/>
+            </w:pPr>
+            <w:r>
+              <w:rPr>
+                <w:rFonts w:ascii="Segoe UI Emoji" w:hAnsi="Segoe UI Emoji" w:cs="Segoe UI Emoji"/>
+                <w:b/>
+                <w:bCs/>
+              </w:rPr>
+              <w:t>🔥</w:t>
+            </w:r>
             <w:r>
               <w:rPr>
                 <w:rFonts w:cstheme="minorHAnsi"/>
-                <w:b/>
-                <w:bCs/>
-              </w:rPr>
-              <w:t>Ω Ω Ω Ω Ω</w:t>
+                <w:lang w:val="it-IT"/>
+              </w:rPr>
+              <w:t xml:space="preserve"> </w:t>
+            </w:r>
+            <w:r>
+              <w:rPr>
+                <w:rFonts w:cstheme="minorHAnsi"/>
+                <w:b/>
+                <w:bCs/>
+              </w:rPr>
+              <w:t xml:space="preserve">Ω Ω </w:t>
+            </w:r>
+          </w:p>
+          <w:p>
+            <w:pPr>
+              <w:jc w:val="center"/>
+            </w:pPr>
+            <w:r>
+              <w:t>lvl 1 D</w:t>
+            </w:r>
+          </w:p>
+        </w:tc>
+        <w:tc>
+          <w:tcPr>
+            <w:tcW w:w="1607" w:type="dxa"/>
+            <w:vAlign w:val="center"/>
+          </w:tcPr>
+          <w:p>
+            <w:pPr>
+              <w:jc w:val="center"/>
+            </w:pPr>
+            <w:r>
+              <w:rPr>
+                <w:rFonts w:ascii="Segoe UI Emoji" w:hAnsi="Segoe UI Emoji" w:cs="Segoe UI Emoji"/>
+              </w:rPr>
+              <w:t>🍃</w:t>
+            </w:r>
+            <w:r>
+              <w:rPr>
+                <w:rFonts w:cstheme="minorHAnsi"/>
+                <w:lang w:val="it-IT"/>
+              </w:rPr>
+              <w:t xml:space="preserve"> </w:t>
+            </w:r>
+            <w:r>
+              <w:rPr>
+                <w:rFonts w:cstheme="minorHAnsi"/>
+                <w:b/>
+                <w:bCs/>
+              </w:rPr>
+              <w:t>Ω Ω</w:t>
+            </w:r>
+          </w:p>
+          <w:p>
+            <w:pPr>
+              <w:jc w:val="center"/>
+            </w:pPr>
+            <w:r>
+              <w:t>lvl 3 MD</w:t>
+            </w:r>
+          </w:p>
+        </w:tc>
+        <w:tc>
+          <w:tcPr>
+            <w:tcW w:w="1606" w:type="dxa"/>
+            <w:vAlign w:val="center"/>
+          </w:tcPr>
+          <w:p>
+            <w:pPr>
+              <w:jc w:val="center"/>
+            </w:pPr>
+            <w:r>
+              <w:rPr>
+                <w:rFonts w:ascii="Segoe UI Emoji" w:hAnsi="Segoe UI Emoji" w:cs="Segoe UI Emoji"/>
+              </w:rPr>
+              <w:t>🟤</w:t>
+            </w:r>
+            <w:r>
+              <w:rPr>
+                <w:rFonts w:cstheme="minorHAnsi"/>
+                <w:lang w:val="it-IT"/>
+              </w:rPr>
+              <w:t xml:space="preserve"> </w:t>
+            </w:r>
+            <w:r>
+              <w:rPr>
+                <w:rFonts w:cstheme="minorHAnsi"/>
+                <w:b/>
+                <w:bCs/>
+              </w:rPr>
+              <w:t>Ω Ω Ω</w:t>
+            </w:r>
+          </w:p>
+          <w:p>
+            <w:pPr>
+              <w:jc w:val="center"/>
+            </w:pPr>
+            <w:r>
+              <w:t>lvl 92 MD</w:t>
+            </w:r>
+          </w:p>
+        </w:tc>
+        <w:tc>
+          <w:tcPr>
+            <w:tcW w:w="1607" w:type="dxa"/>
+            <w:vAlign w:val="center"/>
+          </w:tcPr>
+          <w:p>
+            <w:pPr>
+              <w:jc w:val="center"/>
+            </w:pPr>
+            <w:r>
+              <w:rPr>
+                <w:rFonts w:ascii="Segoe UI Emoji" w:hAnsi="Segoe UI Emoji" w:cs="Segoe UI Emoji"/>
+              </w:rPr>
+              <w:t>💧</w:t>
+            </w:r>
+            <w:r>
+              <w:rPr>
+                <w:rFonts w:cstheme="minorHAnsi"/>
+                <w:lang w:val="it-IT"/>
+              </w:rPr>
+              <w:t xml:space="preserve"> </w:t>
+            </w:r>
+            <w:r>
+              <w:rPr>
+                <w:rFonts w:cstheme="minorHAnsi"/>
+                <w:b/>
+                <w:bCs/>
+              </w:rPr>
+              <w:t>Ω Ω Ω</w:t>
+            </w:r>
+          </w:p>
+          <w:p>
+            <w:pPr>
+              <w:jc w:val="center"/>
+            </w:pPr>
+            <w:r>
+              <w:t>lvl 110 MD</w:t>
+            </w:r>
+          </w:p>
+        </w:tc>
+        <w:tc>
+          <w:tcPr>
+            <w:tcW w:w="1606" w:type="dxa"/>
+            <w:vAlign w:val="center"/>
+          </w:tcPr>
+          <w:p>
+            <w:pPr>
+              <w:jc w:val="center"/>
+            </w:pPr>
+            <w:r>
+              <w:rPr>
+                <w:rFonts w:ascii="Segoe UI Emoji" w:hAnsi="Segoe UI Emoji" w:cs="Segoe UI Emoji"/>
+              </w:rPr>
+              <w:t>⚡</w:t>
+            </w:r>
+            <w:r>
+              <w:rPr>
+                <w:rFonts w:cstheme="minorHAnsi"/>
+                <w:b/>
+                <w:bCs/>
+              </w:rPr>
+              <w:t xml:space="preserve"> Ω Ω Ω</w:t>
             </w:r>
           </w:p>
         </w:tc>
@@ -1839,7 +4863,7 @@
       <w:tr>
         <w:tc>
           <w:tcPr>
-            <w:tcW w:w="1869" w:type="dxa"/>
+            <w:tcW w:w="1868" w:type="dxa"/>
             <w:vAlign w:val="center"/>
           </w:tcPr>
           <w:p>
@@ -1850,6 +4874,31 @@
               <w:t>Roublard</w:t>
             </w:r>
           </w:p>
+          <w:p>
+            <w:pPr>
+              <w:jc w:val="center"/>
+            </w:pPr>
+            <w:r>
+              <w:rPr>
+                <w:rFonts w:ascii="Segoe UI Emoji" w:hAnsi="Segoe UI Emoji" w:cs="Segoe UI Emoji"/>
+                <w:b/>
+                <w:bCs/>
+              </w:rPr>
+              <w:t>🔥</w:t>
+            </w:r>
+            <w:r>
+              <w:rPr>
+                <w:rFonts w:ascii="Segoe UI Emoji" w:hAnsi="Segoe UI Emoji" w:cs="Segoe UI Emoji"/>
+              </w:rPr>
+              <w:t xml:space="preserve"> 🍃</w:t>
+            </w:r>
+            <w:r>
+              <w:rPr>
+                <w:rFonts w:ascii="Segoe UI Emoji" w:hAnsi="Segoe UI Emoji" w:cs="Segoe UI Emoji"/>
+              </w:rPr>
+              <w:t xml:space="preserve"> 🟤</w:t>
+            </w:r>
+          </w:p>
         </w:tc>
         <w:tc>
           <w:tcPr>
@@ -1870,7 +4919,7 @@
         </w:tc>
         <w:tc>
           <w:tcPr>
-            <w:tcW w:w="2516" w:type="dxa"/>
+            <w:tcW w:w="1667" w:type="dxa"/>
             <w:vAlign w:val="center"/>
           </w:tcPr>
           <w:p>
@@ -1884,7 +4933,7 @@
         </w:tc>
         <w:tc>
           <w:tcPr>
-            <w:tcW w:w="2552" w:type="dxa"/>
+            <w:tcW w:w="2268" w:type="dxa"/>
             <w:vAlign w:val="center"/>
           </w:tcPr>
           <w:p>
@@ -1930,20 +4979,26 @@
         </w:tc>
         <w:tc>
           <w:tcPr>
-            <w:tcW w:w="1701" w:type="dxa"/>
-            <w:vAlign w:val="center"/>
-          </w:tcPr>
-          <w:p>
-            <w:pPr>
-              <w:jc w:val="center"/>
-            </w:pPr>
+            <w:tcW w:w="1606" w:type="dxa"/>
+            <w:vAlign w:val="center"/>
+          </w:tcPr>
+          <w:p>
+            <w:pPr>
+              <w:jc w:val="center"/>
+            </w:pPr>
+            <w:r>
+              <w:rPr>
+                <w:rFonts w:ascii="Segoe UI Emoji" w:hAnsi="Segoe UI Emoji" w:cs="Segoe UI Emoji"/>
+                <w:b/>
+                <w:bCs/>
+              </w:rPr>
+              <w:t>🔥</w:t>
+            </w:r>
             <w:r>
               <w:rPr>
                 <w:rFonts w:cstheme="minorHAnsi"/>
-                <w:b/>
-                <w:bCs/>
-              </w:rPr>
-              <w:t>Ω Ω Ω Ω Ω</w:t>
+              </w:rPr>
+              <w:t xml:space="preserve"> </w:t>
             </w:r>
             <w:r>
               <w:rPr>
@@ -1951,15 +5006,151 @@
                 <w:b/>
                 <w:bCs/>
               </w:rPr>
+              <w:t>Ω Ω Ω</w:t>
+            </w:r>
+            <w:r>
+              <w:rPr>
+                <w:rFonts w:cstheme="minorHAnsi"/>
+                <w:b/>
+                <w:bCs/>
+              </w:rPr>
               <w:t>+</w:t>
             </w:r>
+          </w:p>
+          <w:p>
+            <w:pPr>
+              <w:jc w:val="center"/>
+            </w:pPr>
+            <w:r>
+              <w:t>lvl 1 MD</w:t>
+            </w:r>
+          </w:p>
+        </w:tc>
+        <w:tc>
+          <w:tcPr>
+            <w:tcW w:w="1607" w:type="dxa"/>
+            <w:vAlign w:val="center"/>
+          </w:tcPr>
+          <w:p>
+            <w:pPr>
+              <w:jc w:val="center"/>
+            </w:pPr>
+            <w:r>
+              <w:rPr>
+                <w:rFonts w:ascii="Segoe UI Emoji" w:hAnsi="Segoe UI Emoji" w:cs="Segoe UI Emoji"/>
+              </w:rPr>
+              <w:t>🍃</w:t>
+            </w:r>
+            <w:r>
+              <w:rPr>
+                <w:rFonts w:cstheme="minorHAnsi"/>
+                <w:lang w:val="it-IT"/>
+              </w:rPr>
+              <w:t xml:space="preserve"> </w:t>
+            </w:r>
+            <w:r>
+              <w:rPr>
+                <w:rFonts w:cstheme="minorHAnsi"/>
+                <w:b/>
+                <w:bCs/>
+              </w:rPr>
+              <w:t>Ω Ω Ω</w:t>
+            </w:r>
+            <w:r>
+              <w:rPr>
+                <w:rFonts w:cstheme="minorHAnsi"/>
+                <w:b/>
+                <w:bCs/>
+              </w:rPr>
+              <w:t>+</w:t>
+            </w:r>
+          </w:p>
+          <w:p>
+            <w:pPr>
+              <w:jc w:val="center"/>
+            </w:pPr>
+            <w:r>
+              <w:t>lvl 9 MD</w:t>
+            </w:r>
+          </w:p>
+        </w:tc>
+        <w:tc>
+          <w:tcPr>
+            <w:tcW w:w="1606" w:type="dxa"/>
+            <w:vAlign w:val="center"/>
+          </w:tcPr>
+          <w:p>
+            <w:pPr>
+              <w:jc w:val="center"/>
+            </w:pPr>
+            <w:r>
+              <w:rPr>
+                <w:rFonts w:ascii="Segoe UI Emoji" w:hAnsi="Segoe UI Emoji" w:cs="Segoe UI Emoji"/>
+              </w:rPr>
+              <w:t>🟤</w:t>
+            </w:r>
+            <w:r>
+              <w:rPr>
+                <w:rFonts w:cstheme="minorHAnsi"/>
+                <w:lang w:val="it-IT"/>
+              </w:rPr>
+              <w:t xml:space="preserve"> </w:t>
+            </w:r>
+            <w:r>
+              <w:rPr>
+                <w:rFonts w:cstheme="minorHAnsi"/>
+                <w:b/>
+                <w:bCs/>
+              </w:rPr>
+              <w:t>Ω Ω Ω</w:t>
+            </w:r>
+            <w:r>
+              <w:rPr>
+                <w:rFonts w:cstheme="minorHAnsi"/>
+                <w:b/>
+                <w:bCs/>
+              </w:rPr>
+              <w:t>+</w:t>
+            </w:r>
+          </w:p>
+          <w:p>
+            <w:pPr>
+              <w:jc w:val="center"/>
+            </w:pPr>
+            <w:r>
+              <w:t>lvl 195 MD</w:t>
+            </w:r>
+          </w:p>
+        </w:tc>
+        <w:tc>
+          <w:tcPr>
+            <w:tcW w:w="1607" w:type="dxa"/>
+            <w:shd w:val="clear" w:color="auto" w:fill="000000" w:themeFill="text1"/>
+            <w:vAlign w:val="center"/>
+          </w:tcPr>
+          <w:p>
+            <w:pPr>
+              <w:jc w:val="center"/>
+            </w:pPr>
+          </w:p>
+        </w:tc>
+        <w:tc>
+          <w:tcPr>
+            <w:tcW w:w="1606" w:type="dxa"/>
+            <w:shd w:val="clear" w:color="auto" w:fill="000000" w:themeFill="text1"/>
+            <w:vAlign w:val="center"/>
+          </w:tcPr>
+          <w:p>
+            <w:pPr>
+              <w:jc w:val="center"/>
+            </w:pPr>
           </w:p>
         </w:tc>
       </w:tr>
       <w:tr>
         <w:tc>
           <w:tcPr>
-            <w:tcW w:w="1869" w:type="dxa"/>
+            <w:tcW w:w="1868" w:type="dxa"/>
             <w:vAlign w:val="center"/>
           </w:tcPr>
           <w:p>
@@ -1970,6 +5161,31 @@
               <w:t>Eliotrope</w:t>
             </w:r>
           </w:p>
+          <w:p>
+            <w:pPr>
+              <w:jc w:val="center"/>
+            </w:pPr>
+            <w:r>
+              <w:rPr>
+                <w:rFonts w:ascii="Segoe UI Emoji" w:hAnsi="Segoe UI Emoji" w:cs="Segoe UI Emoji"/>
+                <w:b/>
+                <w:bCs/>
+              </w:rPr>
+              <w:t>🔥</w:t>
+            </w:r>
+            <w:r>
+              <w:rPr>
+                <w:rFonts w:ascii="Segoe UI Emoji" w:hAnsi="Segoe UI Emoji" w:cs="Segoe UI Emoji"/>
+              </w:rPr>
+              <w:t xml:space="preserve"> 🍃</w:t>
+            </w:r>
+            <w:r>
+              <w:rPr>
+                <w:rFonts w:ascii="Segoe UI Emoji" w:hAnsi="Segoe UI Emoji" w:cs="Segoe UI Emoji"/>
+              </w:rPr>
+              <w:t xml:space="preserve"> 💧</w:t>
+            </w:r>
+          </w:p>
         </w:tc>
         <w:tc>
           <w:tcPr>
@@ -1990,7 +5206,7 @@
         </w:tc>
         <w:tc>
           <w:tcPr>
-            <w:tcW w:w="2516" w:type="dxa"/>
+            <w:tcW w:w="1667" w:type="dxa"/>
             <w:vAlign w:val="center"/>
           </w:tcPr>
           <w:p>
@@ -2004,7 +5220,7 @@
         </w:tc>
         <w:tc>
           <w:tcPr>
-            <w:tcW w:w="2552" w:type="dxa"/>
+            <w:tcW w:w="2268" w:type="dxa"/>
             <w:vAlign w:val="center"/>
           </w:tcPr>
           <w:p>
@@ -2042,25 +5258,168 @@
         </w:tc>
         <w:tc>
           <w:tcPr>
-            <w:tcW w:w="1701" w:type="dxa"/>
-            <w:vAlign w:val="center"/>
-          </w:tcPr>
-          <w:p>
-            <w:pPr>
-              <w:jc w:val="center"/>
-            </w:pPr>
+            <w:tcW w:w="1606" w:type="dxa"/>
+            <w:vAlign w:val="center"/>
+          </w:tcPr>
+          <w:p>
+            <w:pPr>
+              <w:jc w:val="center"/>
+            </w:pPr>
+            <w:r>
+              <w:rPr>
+                <w:rFonts w:ascii="Segoe UI Emoji" w:hAnsi="Segoe UI Emoji" w:cs="Segoe UI Emoji"/>
+              </w:rPr>
+              <w:t>💧</w:t>
+            </w:r>
             <w:r>
               <w:rPr>
                 <w:rFonts w:cstheme="minorHAnsi"/>
-                <w:b/>
-                <w:bCs/>
-              </w:rPr>
-              <w:t xml:space="preserve">Ω Ω Ω Ω </w:t>
-            </w:r>
+                <w:lang w:val="it-IT"/>
+              </w:rPr>
+              <w:t xml:space="preserve"> </w:t>
+            </w:r>
+            <w:r>
+              <w:rPr>
+                <w:rFonts w:cstheme="minorHAnsi"/>
+                <w:b/>
+                <w:bCs/>
+              </w:rPr>
+              <w:t>Ω Ω Ω</w:t>
+            </w:r>
+          </w:p>
+          <w:p>
+            <w:pPr>
+              <w:jc w:val="center"/>
+            </w:pPr>
+            <w:r>
+              <w:t>lvl 1 D</w:t>
+            </w:r>
+          </w:p>
+        </w:tc>
+        <w:tc>
+          <w:tcPr>
+            <w:tcW w:w="1607" w:type="dxa"/>
+            <w:vAlign w:val="center"/>
+          </w:tcPr>
+          <w:p>
+            <w:pPr>
+              <w:jc w:val="center"/>
+            </w:pPr>
+            <w:r>
+              <w:rPr>
+                <w:rFonts w:ascii="Segoe UI Emoji" w:hAnsi="Segoe UI Emoji" w:cs="Segoe UI Emoji"/>
+                <w:b/>
+                <w:bCs/>
+              </w:rPr>
+              <w:t>🔥</w:t>
+            </w:r>
+            <w:r>
+              <w:rPr>
+                <w:rFonts w:cstheme="minorHAnsi"/>
+              </w:rPr>
+              <w:t xml:space="preserve"> </w:t>
+            </w:r>
+            <w:r>
+              <w:rPr>
+                <w:rFonts w:cstheme="minorHAnsi"/>
+                <w:b/>
+                <w:bCs/>
+              </w:rPr>
+              <w:t>Ω Ω Ω</w:t>
+            </w:r>
+          </w:p>
+          <w:p>
+            <w:pPr>
+              <w:jc w:val="center"/>
+            </w:pPr>
+            <w:r>
+              <w:t>lvl 6 D</w:t>
+            </w:r>
+          </w:p>
+        </w:tc>
+        <w:tc>
+          <w:tcPr>
+            <w:tcW w:w="1606" w:type="dxa"/>
+            <w:vAlign w:val="center"/>
+          </w:tcPr>
+          <w:p>
+            <w:pPr>
+              <w:jc w:val="center"/>
+            </w:pPr>
+            <w:r>
+              <w:rPr>
+                <w:rFonts w:ascii="Segoe UI Emoji" w:hAnsi="Segoe UI Emoji" w:cs="Segoe UI Emoji"/>
+              </w:rPr>
+              <w:t>🍃</w:t>
+            </w:r>
+            <w:r>
+              <w:rPr>
+                <w:rFonts w:cstheme="minorHAnsi"/>
+                <w:lang w:val="it-IT"/>
+              </w:rPr>
+              <w:t xml:space="preserve"> </w:t>
+            </w:r>
+            <w:r>
+              <w:rPr>
+                <w:rFonts w:cstheme="minorHAnsi"/>
+                <w:b/>
+                <w:bCs/>
+              </w:rPr>
+              <w:t>Ω Ω Ω</w:t>
+            </w:r>
+          </w:p>
+          <w:p>
+            <w:pPr>
+              <w:jc w:val="center"/>
+            </w:pPr>
+            <w:r>
+              <w:t>lvl 92 D</w:t>
+            </w:r>
+          </w:p>
+        </w:tc>
+        <w:tc>
+          <w:tcPr>
+            <w:tcW w:w="1607" w:type="dxa"/>
+            <w:shd w:val="clear" w:color="auto" w:fill="000000" w:themeFill="text1"/>
+            <w:vAlign w:val="center"/>
+          </w:tcPr>
+          <w:p>
+            <w:pPr>
+              <w:jc w:val="center"/>
+            </w:pPr>
+          </w:p>
+        </w:tc>
+        <w:tc>
+          <w:tcPr>
+            <w:tcW w:w="1606" w:type="dxa"/>
+            <w:shd w:val="clear" w:color="auto" w:fill="000000" w:themeFill="text1"/>
+            <w:vAlign w:val="center"/>
+          </w:tcPr>
+          <w:p>
+            <w:pPr>
+              <w:jc w:val="center"/>
+            </w:pPr>
           </w:p>
         </w:tc>
       </w:tr>
     </w:tbl>
+    <w:p/>
+    <w:p/>
+    <w:p/>
+    <w:p/>
+    <w:p/>
+    <w:p/>
+    <w:p/>
+    <w:p>
+      <w:pPr>
+        <w:sectPr>
+          <w:pgSz w:w="16838" w:h="11906" w:orient="landscape"/>
+          <w:pgMar w:top="57" w:right="57" w:bottom="57" w:left="57" w:header="708" w:footer="708" w:gutter="0"/>
+          <w:cols w:space="708"/>
+          <w:docGrid w:linePitch="360"/>
+        </w:sectPr>
+      </w:pPr>
+    </w:p>
     <w:p/>
     <w:p>
       <w:pPr>
@@ -2073,7 +5432,6 @@
         <w:rPr>
           <w:lang w:val="fr-FR"/>
         </w:rPr>
-        <w:lastRenderedPageBreak/>
         <w:t>Les multiplicateurs</w:t>
       </w:r>
     </w:p>

</xml_diff>

<commit_message>
Wiki: mise à jour (nouvelle révision)
</commit_message>
<xml_diff>
--- a/docs/wiki-askawawa.docx
+++ b/docs/wiki-askawawa.docx
@@ -2501,14 +2501,256 @@
                 <w:rFonts w:cstheme="minorHAnsi"/>
                 <w:lang w:val="it-IT"/>
               </w:rPr>
-              <w:t xml:space="preserve"> </w:t>
+              <w:t xml:space="preserve"> ⌂ </w:t>
+            </w:r>
+            <w:r>
+              <w:rPr>
+                <w:rFonts w:cstheme="minorHAnsi"/>
+                <w:b/>
+                <w:bCs/>
+              </w:rPr>
+              <w:t>Ω Ω Ω</w:t>
+            </w:r>
+          </w:p>
+          <w:p>
+            <w:pPr>
+              <w:jc w:val="center"/>
+            </w:pPr>
+            <w:r>
+              <w:t>lvl 69 D</w:t>
+            </w:r>
+          </w:p>
+        </w:tc>
+        <w:tc>
+          <w:tcPr>
+            <w:tcW w:w="1606" w:type="dxa"/>
+            <w:vAlign w:val="center"/>
+          </w:tcPr>
+          <w:p>
+            <w:pPr>
+              <w:jc w:val="center"/>
+              <w:rPr>
+                <w:rFonts w:ascii="Segoe UI Emoji" w:hAnsi="Segoe UI Emoji" w:cs="Segoe UI Emoji"/>
+              </w:rPr>
+            </w:pPr>
+            <w:r>
+              <w:rPr>
+                <w:rFonts w:ascii="Segoe UI Emoji" w:hAnsi="Segoe UI Emoji" w:cs="Segoe UI Emoji"/>
+              </w:rPr>
+              <w:t>🍃</w:t>
+            </w:r>
+            <w:r>
+              <w:rPr>
+                <w:rFonts w:cstheme="minorHAnsi"/>
+                <w:b/>
+                <w:bCs/>
+              </w:rPr>
+              <w:t xml:space="preserve"> Ω Ω </w:t>
+            </w:r>
+          </w:p>
+          <w:p>
+            <w:pPr>
+              <w:jc w:val="center"/>
+            </w:pPr>
+            <w:r>
+              <w:t>lvl 115 D</w:t>
+            </w:r>
+          </w:p>
+        </w:tc>
+        <w:tc>
+          <w:tcPr>
+            <w:tcW w:w="1607" w:type="dxa"/>
+            <w:vAlign w:val="center"/>
+          </w:tcPr>
+          <w:p>
+            <w:pPr>
+              <w:jc w:val="center"/>
+            </w:pPr>
+            <w:r>
+              <w:rPr>
+                <w:rFonts w:ascii="Segoe UI Emoji" w:hAnsi="Segoe UI Emoji" w:cs="Segoe UI Emoji"/>
+              </w:rPr>
+              <w:t>💧</w:t>
             </w:r>
             <w:r>
               <w:rPr>
                 <w:rFonts w:cstheme="minorHAnsi"/>
                 <w:lang w:val="it-IT"/>
               </w:rPr>
-              <w:t>⌂</w:t>
+              <w:t xml:space="preserve"> </w:t>
+            </w:r>
+            <w:r>
+              <w:rPr>
+                <w:rFonts w:cstheme="minorHAnsi"/>
+                <w:b/>
+                <w:bCs/>
+              </w:rPr>
+              <w:t>Ω Ω</w:t>
+            </w:r>
+          </w:p>
+          <w:p>
+            <w:pPr>
+              <w:jc w:val="center"/>
+            </w:pPr>
+            <w:r>
+              <w:t>lvl 190 D</w:t>
+            </w:r>
+          </w:p>
+        </w:tc>
+        <w:tc>
+          <w:tcPr>
+            <w:tcW w:w="1606" w:type="dxa"/>
+            <w:vAlign w:val="center"/>
+          </w:tcPr>
+          <w:p>
+            <w:pPr>
+              <w:jc w:val="center"/>
+              <w:rPr>
+                <w:rFonts w:ascii="Segoe UI Emoji" w:hAnsi="Segoe UI Emoji" w:cs="Segoe UI Emoji"/>
+              </w:rPr>
+            </w:pPr>
+            <w:r>
+              <w:rPr>
+                <w:rFonts w:ascii="Segoe UI Emoji" w:hAnsi="Segoe UI Emoji" w:cs="Segoe UI Emoji"/>
+              </w:rPr>
+              <w:t>⚡</w:t>
+            </w:r>
+          </w:p>
+          <w:p>
+            <w:pPr>
+              <w:jc w:val="center"/>
+            </w:pPr>
+            <w:r>
+              <w:rPr>
+                <w:b/>
+                <w:bCs/>
+                <w:color w:val="7030A0"/>
+              </w:rPr>
+              <w:t>→</w:t>
+            </w:r>
+          </w:p>
+        </w:tc>
+      </w:tr>
+      <w:tr>
+        <w:tc>
+          <w:tcPr>
+            <w:tcW w:w="1868" w:type="dxa"/>
+            <w:vAlign w:val="center"/>
+          </w:tcPr>
+          <w:p>
+            <w:pPr>
+              <w:jc w:val="center"/>
+            </w:pPr>
+            <w:r>
+              <w:t>Sram</w:t>
+            </w:r>
+          </w:p>
+          <w:p>
+            <w:pPr>
+              <w:jc w:val="center"/>
+            </w:pPr>
+            <w:r>
+              <w:rPr>
+                <w:rFonts w:ascii="Segoe UI Emoji" w:hAnsi="Segoe UI Emoji" w:cs="Segoe UI Emoji"/>
+              </w:rPr>
+              <w:t>🟤</w:t>
+            </w:r>
+            <w:r>
+              <w:rPr>
+                <w:rFonts w:ascii="Segoe UI Emoji" w:hAnsi="Segoe UI Emoji" w:cs="Segoe UI Emoji"/>
+                <w:b/>
+                <w:bCs/>
+              </w:rPr>
+              <w:t xml:space="preserve"> 🔥</w:t>
+            </w:r>
+          </w:p>
+        </w:tc>
+        <w:tc>
+          <w:tcPr>
+            <w:tcW w:w="1280" w:type="dxa"/>
+            <w:vAlign w:val="center"/>
+          </w:tcPr>
+          <w:p>
+            <w:pPr>
+              <w:jc w:val="center"/>
+              <w:rPr>
+                <w:rFonts w:ascii="Segoe UI Symbol" w:hAnsi="Segoe UI Symbol" w:cs="Segoe UI Symbol"/>
+              </w:rPr>
+            </w:pPr>
+            <w:r>
+              <w:rPr>
+                <w:rFonts w:ascii="Segoe UI Symbol" w:hAnsi="Segoe UI Symbol" w:cs="Segoe UI Symbol"/>
+              </w:rPr>
+              <w:t>★★★</w:t>
+            </w:r>
+          </w:p>
+        </w:tc>
+        <w:tc>
+          <w:tcPr>
+            <w:tcW w:w="1667" w:type="dxa"/>
+            <w:vAlign w:val="center"/>
+          </w:tcPr>
+          <w:p>
+            <w:pPr>
+              <w:jc w:val="center"/>
+            </w:pPr>
+            <w:r>
+              <w:t>Attaquant mêlée</w:t>
+            </w:r>
+          </w:p>
+        </w:tc>
+        <w:tc>
+          <w:tcPr>
+            <w:tcW w:w="2268" w:type="dxa"/>
+            <w:vAlign w:val="center"/>
+          </w:tcPr>
+          <w:p>
+            <w:pPr>
+              <w:jc w:val="center"/>
+            </w:pPr>
+            <w:r>
+              <w:t>Pièges</w:t>
+            </w:r>
+          </w:p>
+          <w:p>
+            <w:pPr>
+              <w:jc w:val="center"/>
+            </w:pPr>
+            <w:r>
+              <w:t>Placement</w:t>
+            </w:r>
+          </w:p>
+          <w:p>
+            <w:pPr>
+              <w:jc w:val="center"/>
+            </w:pPr>
+            <w:r>
+              <w:t>Invisibilité</w:t>
+            </w:r>
+          </w:p>
+          <w:p>
+            <w:pPr>
+              <w:jc w:val="center"/>
+            </w:pPr>
+            <w:r>
+              <w:t>Erosion</w:t>
+            </w:r>
+          </w:p>
+        </w:tc>
+        <w:tc>
+          <w:tcPr>
+            <w:tcW w:w="1606" w:type="dxa"/>
+            <w:vAlign w:val="center"/>
+          </w:tcPr>
+          <w:p>
+            <w:pPr>
+              <w:jc w:val="center"/>
+            </w:pPr>
+            <w:r>
+              <w:rPr>
+                <w:rFonts w:ascii="Segoe UI Emoji" w:hAnsi="Segoe UI Emoji" w:cs="Segoe UI Emoji"/>
+              </w:rPr>
+              <w:t>🟤</w:t>
             </w:r>
             <w:r>
               <w:rPr>
@@ -2531,43 +2773,7 @@
               <w:jc w:val="center"/>
             </w:pPr>
             <w:r>
-              <w:t>lvl 69 D</w:t>
-            </w:r>
-          </w:p>
-        </w:tc>
-        <w:tc>
-          <w:tcPr>
-            <w:tcW w:w="1606" w:type="dxa"/>
-            <w:vAlign w:val="center"/>
-          </w:tcPr>
-          <w:p>
-            <w:pPr>
-              <w:jc w:val="center"/>
-              <w:rPr>
-                <w:rFonts w:ascii="Segoe UI Emoji" w:hAnsi="Segoe UI Emoji" w:cs="Segoe UI Emoji"/>
-              </w:rPr>
-            </w:pPr>
-            <w:r>
-              <w:rPr>
-                <w:rFonts w:ascii="Segoe UI Emoji" w:hAnsi="Segoe UI Emoji" w:cs="Segoe UI Emoji"/>
-              </w:rPr>
-              <w:t>🍃</w:t>
-            </w:r>
-            <w:r>
-              <w:rPr>
-                <w:rFonts w:cstheme="minorHAnsi"/>
-                <w:b/>
-                <w:bCs/>
-              </w:rPr>
-              <w:t xml:space="preserve"> Ω Ω </w:t>
-            </w:r>
-          </w:p>
-          <w:p>
-            <w:pPr>
-              <w:jc w:val="center"/>
-            </w:pPr>
-            <w:r>
-              <w:t>lvl 115 D</w:t>
+              <w:t>lvl 1 MD</w:t>
             </w:r>
           </w:p>
         </w:tc>
@@ -2607,7 +2813,7 @@
               <w:jc w:val="center"/>
             </w:pPr>
             <w:r>
-              <w:t>lvl 190 D</w:t>
+              <w:t>lvl 27 MD</w:t>
             </w:r>
           </w:p>
         </w:tc>
@@ -2619,29 +2825,95 @@
           <w:p>
             <w:pPr>
               <w:jc w:val="center"/>
+            </w:pPr>
+            <w:r>
               <w:rPr>
                 <w:rFonts w:ascii="Segoe UI Emoji" w:hAnsi="Segoe UI Emoji" w:cs="Segoe UI Emoji"/>
               </w:rPr>
-            </w:pPr>
-            <w:r>
+              <w:t>🍃</w:t>
+            </w:r>
+            <w:r>
+              <w:rPr>
+                <w:rFonts w:cstheme="minorHAnsi"/>
+                <w:lang w:val="it-IT"/>
+              </w:rPr>
+              <w:t xml:space="preserve"> </w:t>
+            </w:r>
+            <w:r>
+              <w:rPr>
+                <w:rFonts w:cstheme="minorHAnsi"/>
+                <w:b/>
+                <w:bCs/>
+              </w:rPr>
+              <w:t xml:space="preserve">Ω Ω </w:t>
+            </w:r>
+          </w:p>
+          <w:p>
+            <w:pPr>
+              <w:jc w:val="center"/>
+            </w:pPr>
+            <w:r>
+              <w:t>lvl 69 D</w:t>
+            </w:r>
+          </w:p>
+        </w:tc>
+        <w:tc>
+          <w:tcPr>
+            <w:tcW w:w="1607" w:type="dxa"/>
+            <w:vAlign w:val="center"/>
+          </w:tcPr>
+          <w:p>
+            <w:pPr>
+              <w:jc w:val="center"/>
               <w:rPr>
                 <w:rFonts w:ascii="Segoe UI Emoji" w:hAnsi="Segoe UI Emoji" w:cs="Segoe UI Emoji"/>
-              </w:rPr>
-              <w:t>⚡</w:t>
-            </w:r>
-          </w:p>
-          <w:p>
-            <w:pPr>
-              <w:jc w:val="center"/>
-            </w:pPr>
-            <w:r>
-              <w:rPr>
-                <w:b/>
-                <w:bCs/>
-                <w:color w:val="7030A0"/>
-              </w:rPr>
-              <w:t>→</w:t>
-            </w:r>
+                <w:b/>
+                <w:bCs/>
+              </w:rPr>
+            </w:pPr>
+            <w:r>
+              <w:rPr>
+                <w:rFonts w:ascii="Segoe UI Emoji" w:hAnsi="Segoe UI Emoji" w:cs="Segoe UI Emoji"/>
+                <w:b/>
+                <w:bCs/>
+              </w:rPr>
+              <w:t>🔥</w:t>
+            </w:r>
+            <w:r>
+              <w:rPr>
+                <w:rFonts w:cstheme="minorHAnsi"/>
+                <w:lang w:val="it-IT"/>
+              </w:rPr>
+              <w:t xml:space="preserve"> </w:t>
+            </w:r>
+            <w:r>
+              <w:rPr>
+                <w:rFonts w:cstheme="minorHAnsi"/>
+                <w:b/>
+                <w:bCs/>
+              </w:rPr>
+              <w:t>Ω Ω Ω</w:t>
+            </w:r>
+          </w:p>
+          <w:p>
+            <w:pPr>
+              <w:jc w:val="center"/>
+            </w:pPr>
+            <w:r>
+              <w:t>lvl 145 MD</w:t>
+            </w:r>
+          </w:p>
+        </w:tc>
+        <w:tc>
+          <w:tcPr>
+            <w:tcW w:w="1606" w:type="dxa"/>
+            <w:shd w:val="clear" w:color="auto" w:fill="000000" w:themeFill="text1"/>
+            <w:vAlign w:val="center"/>
+          </w:tcPr>
+          <w:p>
+            <w:pPr>
+              <w:jc w:val="center"/>
+            </w:pPr>
           </w:p>
         </w:tc>
       </w:tr>
@@ -2656,7 +2928,7 @@
               <w:jc w:val="center"/>
             </w:pPr>
             <w:r>
-              <w:t>Sram</w:t>
+              <w:t>Pandawa</w:t>
             </w:r>
           </w:p>
           <w:p>
@@ -2667,11 +2939,17 @@
               <w:rPr>
                 <w:rFonts w:ascii="Segoe UI Emoji" w:hAnsi="Segoe UI Emoji" w:cs="Segoe UI Emoji"/>
               </w:rPr>
-              <w:t>🟤</w:t>
+              <w:t>🍃</w:t>
             </w:r>
             <w:r>
               <w:rPr>
                 <w:rFonts w:ascii="Segoe UI Emoji" w:hAnsi="Segoe UI Emoji" w:cs="Segoe UI Emoji"/>
+              </w:rPr>
+              <w:t xml:space="preserve"> 💧 🟤</w:t>
+            </w:r>
+            <w:r>
+              <w:rPr>
+                <w:rFonts w:ascii="Segoe UI Emoji" w:hAnsi="Segoe UI Emoji" w:cs="Segoe UI Emoji"/>
                 <w:b/>
                 <w:bCs/>
               </w:rPr>
@@ -2709,7 +2987,7 @@
               <w:jc w:val="center"/>
             </w:pPr>
             <w:r>
-              <w:t>Attaquant mêlée</w:t>
+              <w:t>Placeur mêlée</w:t>
             </w:r>
           </w:p>
         </w:tc>
@@ -2723,7 +3001,7 @@
               <w:jc w:val="center"/>
             </w:pPr>
             <w:r>
-              <w:t>Pièges</w:t>
+              <w:t>Mobilité</w:t>
             </w:r>
           </w:p>
           <w:p>
@@ -2739,15 +3017,7 @@
               <w:jc w:val="center"/>
             </w:pPr>
             <w:r>
-              <w:t>Invisibilité</w:t>
-            </w:r>
-          </w:p>
-          <w:p>
-            <w:pPr>
-              <w:jc w:val="center"/>
-            </w:pPr>
-            <w:r>
-              <w:t>Erosion</w:t>
+              <w:t>Tank</w:t>
             </w:r>
           </w:p>
         </w:tc>
@@ -2764,14 +3034,14 @@
               <w:rPr>
                 <w:rFonts w:ascii="Segoe UI Emoji" w:hAnsi="Segoe UI Emoji" w:cs="Segoe UI Emoji"/>
               </w:rPr>
-              <w:t>🟤</w:t>
+              <w:t>💧</w:t>
             </w:r>
             <w:r>
               <w:rPr>
                 <w:rFonts w:cstheme="minorHAnsi"/>
                 <w:lang w:val="it-IT"/>
               </w:rPr>
-              <w:t xml:space="preserve"> </w:t>
+              <w:t xml:space="preserve"> ⌂ </w:t>
             </w:r>
             <w:r>
               <w:rPr>
@@ -2779,15 +3049,15 @@
                 <w:b/>
                 <w:bCs/>
               </w:rPr>
-              <w:t>Ω Ω Ω</w:t>
-            </w:r>
-          </w:p>
-          <w:p>
-            <w:pPr>
-              <w:jc w:val="center"/>
-            </w:pPr>
-            <w:r>
-              <w:t>lvl 1 MD</w:t>
+              <w:t>Ω Ω</w:t>
+            </w:r>
+          </w:p>
+          <w:p>
+            <w:pPr>
+              <w:jc w:val="center"/>
+            </w:pPr>
+            <w:r>
+              <w:t>lvl 56 D</w:t>
             </w:r>
           </w:p>
         </w:tc>
@@ -2804,14 +3074,14 @@
               <w:rPr>
                 <w:rFonts w:ascii="Segoe UI Emoji" w:hAnsi="Segoe UI Emoji" w:cs="Segoe UI Emoji"/>
               </w:rPr>
-              <w:t>💧</w:t>
+              <w:t>🟤</w:t>
             </w:r>
             <w:r>
               <w:rPr>
                 <w:rFonts w:cstheme="minorHAnsi"/>
                 <w:lang w:val="it-IT"/>
               </w:rPr>
-              <w:t xml:space="preserve"> </w:t>
+              <w:t xml:space="preserve"> ⌂ </w:t>
             </w:r>
             <w:r>
               <w:rPr>
@@ -2827,7 +3097,7 @@
               <w:jc w:val="center"/>
             </w:pPr>
             <w:r>
-              <w:t>lvl 27 MD</w:t>
+              <w:t>lvl 84 MD</w:t>
             </w:r>
           </w:p>
         </w:tc>
@@ -2839,19 +3109,26 @@
           <w:p>
             <w:pPr>
               <w:jc w:val="center"/>
-            </w:pPr>
-            <w:r>
               <w:rPr>
                 <w:rFonts w:ascii="Segoe UI Emoji" w:hAnsi="Segoe UI Emoji" w:cs="Segoe UI Emoji"/>
-              </w:rPr>
-              <w:t>🍃</w:t>
+                <w:b/>
+                <w:bCs/>
+              </w:rPr>
+            </w:pPr>
+            <w:r>
+              <w:rPr>
+                <w:rFonts w:ascii="Segoe UI Emoji" w:hAnsi="Segoe UI Emoji" w:cs="Segoe UI Emoji"/>
+                <w:b/>
+                <w:bCs/>
+              </w:rPr>
+              <w:t>🔥</w:t>
             </w:r>
             <w:r>
               <w:rPr>
                 <w:rFonts w:cstheme="minorHAnsi"/>
                 <w:lang w:val="it-IT"/>
               </w:rPr>
-              <w:t xml:space="preserve"> </w:t>
+              <w:t xml:space="preserve"> ⌂ </w:t>
             </w:r>
             <w:r>
               <w:rPr>
@@ -2859,15 +3136,15 @@
                 <w:b/>
                 <w:bCs/>
               </w:rPr>
-              <w:t xml:space="preserve">Ω Ω </w:t>
-            </w:r>
-          </w:p>
-          <w:p>
-            <w:pPr>
-              <w:jc w:val="center"/>
-            </w:pPr>
-            <w:r>
-              <w:t>lvl 69 D</w:t>
+              <w:t>Ω Ω Ω</w:t>
+            </w:r>
+          </w:p>
+          <w:p>
+            <w:pPr>
+              <w:jc w:val="center"/>
+            </w:pPr>
+            <w:r>
+              <w:t>lvl 120 MD</w:t>
             </w:r>
           </w:p>
         </w:tc>
@@ -2879,19 +3156,12 @@
           <w:p>
             <w:pPr>
               <w:jc w:val="center"/>
+            </w:pPr>
+            <w:r>
               <w:rPr>
                 <w:rFonts w:ascii="Segoe UI Emoji" w:hAnsi="Segoe UI Emoji" w:cs="Segoe UI Emoji"/>
-                <w:b/>
-                <w:bCs/>
-              </w:rPr>
-            </w:pPr>
-            <w:r>
-              <w:rPr>
-                <w:rFonts w:ascii="Segoe UI Emoji" w:hAnsi="Segoe UI Emoji" w:cs="Segoe UI Emoji"/>
-                <w:b/>
-                <w:bCs/>
-              </w:rPr>
-              <w:t>🔥</w:t>
+              </w:rPr>
+              <w:t>🍃</w:t>
             </w:r>
             <w:r>
               <w:rPr>
@@ -2906,15 +3176,295 @@
                 <w:b/>
                 <w:bCs/>
               </w:rPr>
-              <w:t>Ω Ω Ω</w:t>
-            </w:r>
-          </w:p>
-          <w:p>
-            <w:pPr>
-              <w:jc w:val="center"/>
-            </w:pPr>
-            <w:r>
-              <w:t>lvl 145 MD</w:t>
+              <w:t xml:space="preserve">Ω Ω </w:t>
+            </w:r>
+          </w:p>
+          <w:p>
+            <w:pPr>
+              <w:jc w:val="center"/>
+            </w:pPr>
+            <w:r>
+              <w:t>lvl 130 D</w:t>
+            </w:r>
+          </w:p>
+        </w:tc>
+        <w:tc>
+          <w:tcPr>
+            <w:tcW w:w="1606" w:type="dxa"/>
+            <w:vAlign w:val="center"/>
+          </w:tcPr>
+          <w:p>
+            <w:pPr>
+              <w:jc w:val="center"/>
+              <w:rPr>
+                <w:rFonts w:ascii="Segoe UI Emoji" w:hAnsi="Segoe UI Emoji" w:cs="Segoe UI Emoji"/>
+              </w:rPr>
+            </w:pPr>
+            <w:r>
+              <w:rPr>
+                <w:rFonts w:ascii="Segoe UI Emoji" w:hAnsi="Segoe UI Emoji" w:cs="Segoe UI Emoji"/>
+              </w:rPr>
+              <w:t>⚡</w:t>
+            </w:r>
+          </w:p>
+        </w:tc>
+      </w:tr>
+      <w:tr>
+        <w:tc>
+          <w:tcPr>
+            <w:tcW w:w="1868" w:type="dxa"/>
+            <w:vAlign w:val="center"/>
+          </w:tcPr>
+          <w:p>
+            <w:pPr>
+              <w:jc w:val="center"/>
+            </w:pPr>
+            <w:r>
+              <w:t>Zobal</w:t>
+            </w:r>
+          </w:p>
+          <w:p>
+            <w:pPr>
+              <w:jc w:val="center"/>
+            </w:pPr>
+            <w:r>
+              <w:rPr>
+                <w:rFonts w:ascii="Segoe UI Emoji" w:hAnsi="Segoe UI Emoji" w:cs="Segoe UI Emoji"/>
+              </w:rPr>
+              <w:t>🟤 💧</w:t>
+            </w:r>
+          </w:p>
+        </w:tc>
+        <w:tc>
+          <w:tcPr>
+            <w:tcW w:w="1280" w:type="dxa"/>
+            <w:vAlign w:val="center"/>
+          </w:tcPr>
+          <w:p>
+            <w:pPr>
+              <w:jc w:val="center"/>
+              <w:rPr>
+                <w:rFonts w:ascii="Segoe UI Symbol" w:hAnsi="Segoe UI Symbol" w:cs="Segoe UI Symbol"/>
+              </w:rPr>
+            </w:pPr>
+            <w:r>
+              <w:rPr>
+                <w:rFonts w:ascii="Segoe UI Symbol" w:hAnsi="Segoe UI Symbol" w:cs="Segoe UI Symbol"/>
+              </w:rPr>
+              <w:t>★★★</w:t>
+            </w:r>
+          </w:p>
+        </w:tc>
+        <w:tc>
+          <w:tcPr>
+            <w:tcW w:w="1667" w:type="dxa"/>
+            <w:vAlign w:val="center"/>
+          </w:tcPr>
+          <w:p>
+            <w:pPr>
+              <w:jc w:val="center"/>
+            </w:pPr>
+            <w:r>
+              <w:t>Protecteur mid-range</w:t>
+            </w:r>
+          </w:p>
+        </w:tc>
+        <w:tc>
+          <w:tcPr>
+            <w:tcW w:w="2268" w:type="dxa"/>
+            <w:vAlign w:val="center"/>
+          </w:tcPr>
+          <w:p>
+            <w:pPr>
+              <w:jc w:val="center"/>
+            </w:pPr>
+            <w:r>
+              <w:t>Bouclier</w:t>
+            </w:r>
+          </w:p>
+          <w:p>
+            <w:pPr>
+              <w:jc w:val="center"/>
+            </w:pPr>
+            <w:r>
+              <w:t>Mobilité</w:t>
+            </w:r>
+          </w:p>
+          <w:p>
+            <w:pPr>
+              <w:jc w:val="center"/>
+            </w:pPr>
+            <w:r>
+              <w:t>Placement</w:t>
+            </w:r>
+          </w:p>
+          <w:p>
+            <w:pPr>
+              <w:jc w:val="center"/>
+            </w:pPr>
+            <w:r>
+              <w:t>Tank</w:t>
+            </w:r>
+          </w:p>
+        </w:tc>
+        <w:tc>
+          <w:tcPr>
+            <w:tcW w:w="1606" w:type="dxa"/>
+            <w:vAlign w:val="center"/>
+          </w:tcPr>
+          <w:p>
+            <w:pPr>
+              <w:jc w:val="center"/>
+            </w:pPr>
+            <w:r>
+              <w:rPr>
+                <w:rFonts w:ascii="Segoe UI Emoji" w:hAnsi="Segoe UI Emoji" w:cs="Segoe UI Emoji"/>
+              </w:rPr>
+              <w:t>🟤</w:t>
+            </w:r>
+            <w:r>
+              <w:rPr>
+                <w:rFonts w:cstheme="minorHAnsi"/>
+                <w:lang w:val="it-IT"/>
+              </w:rPr>
+              <w:t xml:space="preserve"> </w:t>
+            </w:r>
+            <w:r>
+              <w:rPr>
+                <w:rFonts w:cstheme="minorHAnsi"/>
+                <w:b/>
+                <w:bCs/>
+              </w:rPr>
+              <w:t>Ω Ω</w:t>
+            </w:r>
+          </w:p>
+          <w:p>
+            <w:pPr>
+              <w:jc w:val="center"/>
+            </w:pPr>
+            <w:r>
+              <w:t>lvl 1 MD</w:t>
+            </w:r>
+          </w:p>
+        </w:tc>
+        <w:tc>
+          <w:tcPr>
+            <w:tcW w:w="1607" w:type="dxa"/>
+            <w:vAlign w:val="center"/>
+          </w:tcPr>
+          <w:p>
+            <w:pPr>
+              <w:jc w:val="center"/>
+            </w:pPr>
+            <w:r>
+              <w:rPr>
+                <w:rFonts w:ascii="Segoe UI Emoji" w:hAnsi="Segoe UI Emoji" w:cs="Segoe UI Emoji"/>
+              </w:rPr>
+              <w:t>💧</w:t>
+            </w:r>
+            <w:r>
+              <w:rPr>
+                <w:rFonts w:cstheme="minorHAnsi"/>
+                <w:lang w:val="it-IT"/>
+              </w:rPr>
+              <w:t xml:space="preserve"> </w:t>
+            </w:r>
+            <w:r>
+              <w:rPr>
+                <w:rFonts w:cstheme="minorHAnsi"/>
+                <w:b/>
+                <w:bCs/>
+              </w:rPr>
+              <w:t>Ω Ω</w:t>
+            </w:r>
+          </w:p>
+          <w:p>
+            <w:pPr>
+              <w:jc w:val="center"/>
+            </w:pPr>
+            <w:r>
+              <w:t>lvl 32 MD</w:t>
+            </w:r>
+          </w:p>
+        </w:tc>
+        <w:tc>
+          <w:tcPr>
+            <w:tcW w:w="1606" w:type="dxa"/>
+            <w:vAlign w:val="center"/>
+          </w:tcPr>
+          <w:p>
+            <w:pPr>
+              <w:jc w:val="center"/>
+            </w:pPr>
+            <w:r>
+              <w:rPr>
+                <w:rFonts w:ascii="Segoe UI Emoji" w:hAnsi="Segoe UI Emoji" w:cs="Segoe UI Emoji"/>
+              </w:rPr>
+              <w:t>🍃</w:t>
+            </w:r>
+            <w:r>
+              <w:rPr>
+                <w:rFonts w:cstheme="minorHAnsi"/>
+                <w:lang w:val="it-IT"/>
+              </w:rPr>
+              <w:t xml:space="preserve"> </w:t>
+            </w:r>
+            <w:r>
+              <w:rPr>
+                <w:rFonts w:cstheme="minorHAnsi"/>
+                <w:b/>
+                <w:bCs/>
+              </w:rPr>
+              <w:t xml:space="preserve">Ω Ω </w:t>
+            </w:r>
+          </w:p>
+          <w:p>
+            <w:pPr>
+              <w:jc w:val="center"/>
+            </w:pPr>
+            <w:r>
+              <w:t>lvl 145 m</w:t>
+            </w:r>
+          </w:p>
+        </w:tc>
+        <w:tc>
+          <w:tcPr>
+            <w:tcW w:w="1607" w:type="dxa"/>
+            <w:vAlign w:val="center"/>
+          </w:tcPr>
+          <w:p>
+            <w:pPr>
+              <w:jc w:val="center"/>
+              <w:rPr>
+                <w:rFonts w:ascii="Segoe UI Emoji" w:hAnsi="Segoe UI Emoji" w:cs="Segoe UI Emoji"/>
+              </w:rPr>
+            </w:pPr>
+            <w:r>
+              <w:rPr>
+                <w:rFonts w:ascii="Segoe UI Emoji" w:hAnsi="Segoe UI Emoji" w:cs="Segoe UI Emoji"/>
+              </w:rPr>
+              <w:t>⚡</w:t>
+            </w:r>
+          </w:p>
+          <w:p>
+            <w:pPr>
+              <w:jc w:val="center"/>
+            </w:pPr>
+            <w:r>
+              <w:rPr>
+                <w:b/>
+                <w:bCs/>
+                <w:color w:val="7030A0"/>
+              </w:rPr>
+              <w:t>→</w:t>
+            </w:r>
+            <w:r>
+              <w:rPr>
+                <w:rFonts w:cstheme="minorHAnsi"/>
+                <w:b/>
+                <w:bCs/>
+              </w:rPr>
+              <w:t xml:space="preserve"> </w:t>
             </w:r>
           </w:p>
         </w:tc>
@@ -2942,7 +3492,7 @@
               <w:jc w:val="center"/>
             </w:pPr>
             <w:r>
-              <w:t>Pandawa</w:t>
+              <w:t>Steameur</w:t>
             </w:r>
           </w:p>
           <w:p>
@@ -2953,13 +3503,13 @@
               <w:rPr>
                 <w:rFonts w:ascii="Segoe UI Emoji" w:hAnsi="Segoe UI Emoji" w:cs="Segoe UI Emoji"/>
               </w:rPr>
-              <w:t>🍃</w:t>
+              <w:t>⚡</w:t>
             </w:r>
             <w:r>
               <w:rPr>
                 <w:rFonts w:ascii="Segoe UI Emoji" w:hAnsi="Segoe UI Emoji" w:cs="Segoe UI Emoji"/>
               </w:rPr>
-              <w:t xml:space="preserve"> 💧 🟤</w:t>
+              <w:t xml:space="preserve"> 🟤</w:t>
             </w:r>
             <w:r>
               <w:rPr>
@@ -3001,7 +3551,7 @@
               <w:jc w:val="center"/>
             </w:pPr>
             <w:r>
-              <w:t>Placeur mêlée</w:t>
+              <w:t>Attaquant mid-range</w:t>
             </w:r>
           </w:p>
         </w:tc>
@@ -3015,23 +3565,39 @@
               <w:jc w:val="center"/>
             </w:pPr>
             <w:r>
-              <w:t>Mobilité</w:t>
-            </w:r>
-          </w:p>
-          <w:p>
-            <w:pPr>
-              <w:jc w:val="center"/>
-            </w:pPr>
-            <w:r>
-              <w:t>Placement</w:t>
-            </w:r>
-          </w:p>
-          <w:p>
-            <w:pPr>
-              <w:jc w:val="center"/>
-            </w:pPr>
-            <w:r>
-              <w:t>Tank</w:t>
+              <w:t>Multi-tâche</w:t>
+            </w:r>
+          </w:p>
+          <w:p>
+            <w:pPr>
+              <w:jc w:val="center"/>
+            </w:pPr>
+            <w:r>
+              <w:t>Tourelles</w:t>
+            </w:r>
+          </w:p>
+          <w:p>
+            <w:pPr>
+              <w:jc w:val="center"/>
+            </w:pPr>
+            <w:r>
+              <w:t>Soin</w:t>
+            </w:r>
+          </w:p>
+          <w:p>
+            <w:pPr>
+              <w:jc w:val="center"/>
+            </w:pPr>
+            <w:r>
+              <w:t>Boost</w:t>
+            </w:r>
+          </w:p>
+          <w:p>
+            <w:pPr>
+              <w:jc w:val="center"/>
+            </w:pPr>
+            <w:r>
+              <w:t>Erosion</w:t>
             </w:r>
           </w:p>
         </w:tc>
@@ -3048,14 +3614,14 @@
               <w:rPr>
                 <w:rFonts w:ascii="Segoe UI Emoji" w:hAnsi="Segoe UI Emoji" w:cs="Segoe UI Emoji"/>
               </w:rPr>
-              <w:t>💧</w:t>
+              <w:t>🟤</w:t>
             </w:r>
             <w:r>
               <w:rPr>
                 <w:rFonts w:cstheme="minorHAnsi"/>
                 <w:lang w:val="it-IT"/>
               </w:rPr>
-              <w:t xml:space="preserve"> ⌂ </w:t>
+              <w:t xml:space="preserve"> </w:t>
             </w:r>
             <w:r>
               <w:rPr>
@@ -3071,13 +3637,197 @@
               <w:jc w:val="center"/>
             </w:pPr>
             <w:r>
-              <w:t>lvl 56 D</w:t>
+              <w:t>lvl 1 MD</w:t>
             </w:r>
           </w:p>
         </w:tc>
         <w:tc>
           <w:tcPr>
             <w:tcW w:w="1607" w:type="dxa"/>
+            <w:vAlign w:val="center"/>
+          </w:tcPr>
+          <w:p>
+            <w:pPr>
+              <w:jc w:val="center"/>
+              <w:rPr>
+                <w:rFonts w:ascii="Segoe UI Emoji" w:hAnsi="Segoe UI Emoji" w:cs="Segoe UI Emoji"/>
+                <w:b/>
+                <w:bCs/>
+              </w:rPr>
+            </w:pPr>
+            <w:r>
+              <w:rPr>
+                <w:rFonts w:ascii="Segoe UI Emoji" w:hAnsi="Segoe UI Emoji" w:cs="Segoe UI Emoji"/>
+                <w:b/>
+                <w:bCs/>
+              </w:rPr>
+              <w:t>🔥</w:t>
+            </w:r>
+            <w:r>
+              <w:rPr>
+                <w:rFonts w:cstheme="minorHAnsi"/>
+                <w:b/>
+                <w:bCs/>
+              </w:rPr>
+              <w:t xml:space="preserve"> Ω Ω</w:t>
+            </w:r>
+          </w:p>
+          <w:p>
+            <w:pPr>
+              <w:jc w:val="center"/>
+            </w:pPr>
+            <w:r>
+              <w:t>lvl 110 MD</w:t>
+            </w:r>
+          </w:p>
+        </w:tc>
+        <w:tc>
+          <w:tcPr>
+            <w:tcW w:w="1606" w:type="dxa"/>
+            <w:vAlign w:val="center"/>
+          </w:tcPr>
+          <w:p>
+            <w:pPr>
+              <w:jc w:val="center"/>
+            </w:pPr>
+            <w:r>
+              <w:rPr>
+                <w:rFonts w:ascii="Segoe UI Emoji" w:hAnsi="Segoe UI Emoji" w:cs="Segoe UI Emoji"/>
+              </w:rPr>
+              <w:t>⚡</w:t>
+            </w:r>
+          </w:p>
+          <w:p>
+            <w:pPr>
+              <w:jc w:val="center"/>
+            </w:pPr>
+            <w:r>
+              <w:rPr>
+                <w:b/>
+                <w:bCs/>
+                <w:color w:val="7030A0"/>
+              </w:rPr>
+              <w:t>→</w:t>
+            </w:r>
+          </w:p>
+        </w:tc>
+        <w:tc>
+          <w:tcPr>
+            <w:tcW w:w="1607" w:type="dxa"/>
+            <w:shd w:val="clear" w:color="auto" w:fill="000000" w:themeFill="text1"/>
+            <w:vAlign w:val="center"/>
+          </w:tcPr>
+          <w:p>
+            <w:pPr>
+              <w:jc w:val="center"/>
+            </w:pPr>
+          </w:p>
+        </w:tc>
+        <w:tc>
+          <w:tcPr>
+            <w:tcW w:w="1606" w:type="dxa"/>
+            <w:shd w:val="clear" w:color="auto" w:fill="000000" w:themeFill="text1"/>
+            <w:vAlign w:val="center"/>
+          </w:tcPr>
+          <w:p>
+            <w:pPr>
+              <w:jc w:val="center"/>
+            </w:pPr>
+          </w:p>
+        </w:tc>
+      </w:tr>
+      <w:tr>
+        <w:tc>
+          <w:tcPr>
+            <w:tcW w:w="1868" w:type="dxa"/>
+            <w:vAlign w:val="center"/>
+          </w:tcPr>
+          <w:p>
+            <w:pPr>
+              <w:jc w:val="center"/>
+            </w:pPr>
+            <w:r>
+              <w:lastRenderedPageBreak/>
+              <w:t>Huppermage</w:t>
+            </w:r>
+          </w:p>
+          <w:p>
+            <w:pPr>
+              <w:jc w:val="center"/>
+            </w:pPr>
+            <w:r>
+              <w:rPr>
+                <w:rFonts w:ascii="Segoe UI Emoji" w:hAnsi="Segoe UI Emoji" w:cs="Segoe UI Emoji"/>
+              </w:rPr>
+              <w:t>🟤</w:t>
+            </w:r>
+            <w:r>
+              <w:rPr>
+                <w:rFonts w:ascii="Segoe UI Emoji" w:hAnsi="Segoe UI Emoji" w:cs="Segoe UI Emoji"/>
+              </w:rPr>
+              <w:t>⚡</w:t>
+            </w:r>
+          </w:p>
+        </w:tc>
+        <w:tc>
+          <w:tcPr>
+            <w:tcW w:w="1280" w:type="dxa"/>
+            <w:vAlign w:val="center"/>
+          </w:tcPr>
+          <w:p>
+            <w:pPr>
+              <w:jc w:val="center"/>
+              <w:rPr>
+                <w:rFonts w:ascii="Segoe UI Symbol" w:hAnsi="Segoe UI Symbol" w:cs="Segoe UI Symbol"/>
+              </w:rPr>
+            </w:pPr>
+            <w:r>
+              <w:rPr>
+                <w:rFonts w:ascii="Segoe UI Symbol" w:hAnsi="Segoe UI Symbol" w:cs="Segoe UI Symbol"/>
+              </w:rPr>
+              <w:t>★★★</w:t>
+            </w:r>
+          </w:p>
+        </w:tc>
+        <w:tc>
+          <w:tcPr>
+            <w:tcW w:w="1667" w:type="dxa"/>
+            <w:vAlign w:val="center"/>
+          </w:tcPr>
+          <w:p>
+            <w:pPr>
+              <w:jc w:val="center"/>
+            </w:pPr>
+            <w:r>
+              <w:t>Attaquant distance</w:t>
+            </w:r>
+          </w:p>
+        </w:tc>
+        <w:tc>
+          <w:tcPr>
+            <w:tcW w:w="2268" w:type="dxa"/>
+            <w:vAlign w:val="center"/>
+          </w:tcPr>
+          <w:p>
+            <w:pPr>
+              <w:jc w:val="center"/>
+            </w:pPr>
+            <w:r>
+              <w:t>Combinaisons élémentaires</w:t>
+            </w:r>
+          </w:p>
+          <w:p>
+            <w:pPr>
+              <w:jc w:val="center"/>
+            </w:pPr>
+            <w:r>
+              <w:t>Multi-tâche</w:t>
+            </w:r>
+          </w:p>
+        </w:tc>
+        <w:tc>
+          <w:tcPr>
+            <w:tcW w:w="1606" w:type="dxa"/>
             <w:vAlign w:val="center"/>
           </w:tcPr>
           <w:p>
@@ -3095,7 +3845,7 @@
                 <w:rFonts w:cstheme="minorHAnsi"/>
                 <w:lang w:val="it-IT"/>
               </w:rPr>
-              <w:t xml:space="preserve"> ⌂ </w:t>
+              <w:t xml:space="preserve"> </w:t>
             </w:r>
             <w:r>
               <w:rPr>
@@ -3103,46 +3853,39 @@
                 <w:b/>
                 <w:bCs/>
               </w:rPr>
-              <w:t>Ω Ω</w:t>
-            </w:r>
-          </w:p>
-          <w:p>
-            <w:pPr>
-              <w:jc w:val="center"/>
-            </w:pPr>
-            <w:r>
-              <w:t>lvl 84 MD</w:t>
-            </w:r>
-          </w:p>
-        </w:tc>
-        <w:tc>
-          <w:tcPr>
-            <w:tcW w:w="1606" w:type="dxa"/>
-            <w:vAlign w:val="center"/>
-          </w:tcPr>
-          <w:p>
-            <w:pPr>
-              <w:jc w:val="center"/>
+              <w:t>Ω Ω Ω</w:t>
+            </w:r>
+          </w:p>
+          <w:p>
+            <w:pPr>
+              <w:jc w:val="center"/>
+            </w:pPr>
+            <w:r>
+              <w:t>lvl 1 D</w:t>
+            </w:r>
+          </w:p>
+        </w:tc>
+        <w:tc>
+          <w:tcPr>
+            <w:tcW w:w="1607" w:type="dxa"/>
+            <w:vAlign w:val="center"/>
+          </w:tcPr>
+          <w:p>
+            <w:pPr>
+              <w:jc w:val="center"/>
+            </w:pPr>
+            <w:r>
               <w:rPr>
                 <w:rFonts w:ascii="Segoe UI Emoji" w:hAnsi="Segoe UI Emoji" w:cs="Segoe UI Emoji"/>
-                <w:b/>
-                <w:bCs/>
-              </w:rPr>
-            </w:pPr>
-            <w:r>
-              <w:rPr>
-                <w:rFonts w:ascii="Segoe UI Emoji" w:hAnsi="Segoe UI Emoji" w:cs="Segoe UI Emoji"/>
-                <w:b/>
-                <w:bCs/>
-              </w:rPr>
-              <w:t>🔥</w:t>
+              </w:rPr>
+              <w:t>🍃</w:t>
             </w:r>
             <w:r>
               <w:rPr>
                 <w:rFonts w:cstheme="minorHAnsi"/>
                 <w:lang w:val="it-IT"/>
               </w:rPr>
-              <w:t xml:space="preserve"> ⌂ </w:t>
+              <w:t xml:space="preserve"> </w:t>
             </w:r>
             <w:r>
               <w:rPr>
@@ -3150,15 +3893,55 @@
                 <w:b/>
                 <w:bCs/>
               </w:rPr>
-              <w:t>Ω Ω Ω</w:t>
-            </w:r>
-          </w:p>
-          <w:p>
-            <w:pPr>
-              <w:jc w:val="center"/>
-            </w:pPr>
-            <w:r>
-              <w:t>lvl 120 MD</w:t>
+              <w:t xml:space="preserve">Ω Ω Ω </w:t>
+            </w:r>
+          </w:p>
+          <w:p>
+            <w:pPr>
+              <w:jc w:val="center"/>
+            </w:pPr>
+            <w:r>
+              <w:t>lvl 1 D</w:t>
+            </w:r>
+          </w:p>
+        </w:tc>
+        <w:tc>
+          <w:tcPr>
+            <w:tcW w:w="1606" w:type="dxa"/>
+            <w:vAlign w:val="center"/>
+          </w:tcPr>
+          <w:p>
+            <w:pPr>
+              <w:jc w:val="center"/>
+              <w:rPr>
+                <w:rFonts w:ascii="Segoe UI Emoji" w:hAnsi="Segoe UI Emoji" w:cs="Segoe UI Emoji"/>
+                <w:b/>
+                <w:bCs/>
+              </w:rPr>
+            </w:pPr>
+            <w:r>
+              <w:rPr>
+                <w:rFonts w:ascii="Segoe UI Emoji" w:hAnsi="Segoe UI Emoji" w:cs="Segoe UI Emoji"/>
+                <w:b/>
+                <w:bCs/>
+              </w:rPr>
+              <w:t>🔥</w:t>
+            </w:r>
+            <w:r>
+              <w:rPr>
+                <w:rFonts w:cstheme="minorHAnsi"/>
+                <w:b/>
+                <w:bCs/>
+              </w:rPr>
+              <w:t xml:space="preserve"> Ω Ω Ω</w:t>
+            </w:r>
+          </w:p>
+          <w:p>
+            <w:pPr>
+              <w:jc w:val="center"/>
+            </w:pPr>
+            <w:r>
+              <w:t>lvl 3 D</w:t>
             </w:r>
           </w:p>
         </w:tc>
@@ -3175,7 +3958,7 @@
               <w:rPr>
                 <w:rFonts w:ascii="Segoe UI Emoji" w:hAnsi="Segoe UI Emoji" w:cs="Segoe UI Emoji"/>
               </w:rPr>
-              <w:t>🍃</w:t>
+              <w:t>💧</w:t>
             </w:r>
             <w:r>
               <w:rPr>
@@ -3190,15 +3973,15 @@
                 <w:b/>
                 <w:bCs/>
               </w:rPr>
-              <w:t xml:space="preserve">Ω Ω </w:t>
-            </w:r>
-          </w:p>
-          <w:p>
-            <w:pPr>
-              <w:jc w:val="center"/>
-            </w:pPr>
-            <w:r>
-              <w:t>lvl 130 D</w:t>
+              <w:t>Ω Ω Ω</w:t>
+            </w:r>
+          </w:p>
+          <w:p>
+            <w:pPr>
+              <w:jc w:val="center"/>
+            </w:pPr>
+            <w:r>
+              <w:t>lvl 62 M</w:t>
             </w:r>
           </w:p>
         </w:tc>
@@ -3234,7 +4017,7 @@
               <w:jc w:val="center"/>
             </w:pPr>
             <w:r>
-              <w:t>Zobal</w:t>
+              <w:t>Osamodas</w:t>
             </w:r>
           </w:p>
           <w:p>
@@ -3244,8 +4027,22 @@
             <w:r>
               <w:rPr>
                 <w:rFonts w:ascii="Segoe UI Emoji" w:hAnsi="Segoe UI Emoji" w:cs="Segoe UI Emoji"/>
-              </w:rPr>
-              <w:t>🟤 💧</w:t>
+                <w:b/>
+                <w:bCs/>
+              </w:rPr>
+              <w:t>🔥</w:t>
+            </w:r>
+            <w:r>
+              <w:rPr>
+                <w:rFonts w:ascii="Segoe UI Emoji" w:hAnsi="Segoe UI Emoji" w:cs="Segoe UI Emoji"/>
+              </w:rPr>
+              <w:t xml:space="preserve"> 🍃</w:t>
+            </w:r>
+            <w:r>
+              <w:rPr>
+                <w:rFonts w:ascii="Segoe UI Emoji" w:hAnsi="Segoe UI Emoji" w:cs="Segoe UI Emoji"/>
+              </w:rPr>
+              <w:t xml:space="preserve"> 💧</w:t>
             </w:r>
           </w:p>
         </w:tc>
@@ -3265,7 +4062,7 @@
               <w:rPr>
                 <w:rFonts w:ascii="Segoe UI Symbol" w:hAnsi="Segoe UI Symbol" w:cs="Segoe UI Symbol"/>
               </w:rPr>
-              <w:t>★★★</w:t>
+              <w:t>★★★★</w:t>
             </w:r>
           </w:p>
         </w:tc>
@@ -3279,7 +4076,7 @@
               <w:jc w:val="center"/>
             </w:pPr>
             <w:r>
-              <w:t>Protecteur mid-range</w:t>
+              <w:t>Invocateur mid-range</w:t>
             </w:r>
           </w:p>
         </w:tc>
@@ -3293,31 +4090,15 @@
               <w:jc w:val="center"/>
             </w:pPr>
             <w:r>
-              <w:t>Bouclier</w:t>
-            </w:r>
-          </w:p>
-          <w:p>
-            <w:pPr>
-              <w:jc w:val="center"/>
-            </w:pPr>
-            <w:r>
-              <w:t>Mobilité</w:t>
-            </w:r>
-          </w:p>
-          <w:p>
-            <w:pPr>
-              <w:jc w:val="center"/>
-            </w:pPr>
-            <w:r>
-              <w:t>Placement</w:t>
-            </w:r>
-          </w:p>
-          <w:p>
-            <w:pPr>
-              <w:jc w:val="center"/>
-            </w:pPr>
-            <w:r>
-              <w:t>Tank</w:t>
+              <w:t>Boost</w:t>
+            </w:r>
+          </w:p>
+          <w:p>
+            <w:pPr>
+              <w:jc w:val="center"/>
+            </w:pPr>
+            <w:r>
+              <w:t>Soin</w:t>
             </w:r>
           </w:p>
         </w:tc>
@@ -3334,7 +4115,7 @@
               <w:rPr>
                 <w:rFonts w:ascii="Segoe UI Emoji" w:hAnsi="Segoe UI Emoji" w:cs="Segoe UI Emoji"/>
               </w:rPr>
-              <w:t>🟤</w:t>
+              <w:t>🍃</w:t>
             </w:r>
             <w:r>
               <w:rPr>
@@ -3349,7 +4130,7 @@
                 <w:b/>
                 <w:bCs/>
               </w:rPr>
-              <w:t>Ω Ω</w:t>
+              <w:t xml:space="preserve">Ω Ω Ω </w:t>
             </w:r>
           </w:p>
           <w:p>
@@ -3389,15 +4170,15 @@
                 <w:b/>
                 <w:bCs/>
               </w:rPr>
-              <w:t>Ω Ω</w:t>
-            </w:r>
-          </w:p>
-          <w:p>
-            <w:pPr>
-              <w:jc w:val="center"/>
-            </w:pPr>
-            <w:r>
-              <w:t>lvl 32 MD</w:t>
+              <w:t>Ω Ω Ω</w:t>
+            </w:r>
+          </w:p>
+          <w:p>
+            <w:pPr>
+              <w:jc w:val="center"/>
+            </w:pPr>
+            <w:r>
+              <w:t>lvl 69 MD</w:t>
             </w:r>
           </w:p>
         </w:tc>
@@ -3409,19 +4190,177 @@
           <w:p>
             <w:pPr>
               <w:jc w:val="center"/>
-            </w:pPr>
-            <w:r>
               <w:rPr>
                 <w:rFonts w:ascii="Segoe UI Emoji" w:hAnsi="Segoe UI Emoji" w:cs="Segoe UI Emoji"/>
-              </w:rPr>
-              <w:t>🍃</w:t>
+                <w:b/>
+                <w:bCs/>
+              </w:rPr>
+            </w:pPr>
+            <w:r>
+              <w:rPr>
+                <w:rFonts w:ascii="Segoe UI Emoji" w:hAnsi="Segoe UI Emoji" w:cs="Segoe UI Emoji"/>
+                <w:b/>
+                <w:bCs/>
+              </w:rPr>
+              <w:t>🔥</w:t>
+            </w:r>
+            <w:r>
+              <w:rPr>
+                <w:rFonts w:cstheme="minorHAnsi"/>
+                <w:b/>
+                <w:bCs/>
+              </w:rPr>
+              <w:t xml:space="preserve"> Ω Ω</w:t>
+            </w:r>
+          </w:p>
+          <w:p>
+            <w:pPr>
+              <w:jc w:val="center"/>
+            </w:pPr>
+            <w:r>
+              <w:t>lvl 84 MD</w:t>
+            </w:r>
+          </w:p>
+        </w:tc>
+        <w:tc>
+          <w:tcPr>
+            <w:tcW w:w="1607" w:type="dxa"/>
+            <w:shd w:val="clear" w:color="auto" w:fill="000000" w:themeFill="text1"/>
+            <w:vAlign w:val="center"/>
+          </w:tcPr>
+          <w:p>
+            <w:pPr>
+              <w:jc w:val="center"/>
+            </w:pPr>
+          </w:p>
+        </w:tc>
+        <w:tc>
+          <w:tcPr>
+            <w:tcW w:w="1606" w:type="dxa"/>
+            <w:shd w:val="clear" w:color="auto" w:fill="000000" w:themeFill="text1"/>
+            <w:vAlign w:val="center"/>
+          </w:tcPr>
+          <w:p>
+            <w:pPr>
+              <w:jc w:val="center"/>
+            </w:pPr>
+          </w:p>
+        </w:tc>
+      </w:tr>
+      <w:tr>
+        <w:tc>
+          <w:tcPr>
+            <w:tcW w:w="1868" w:type="dxa"/>
+            <w:vAlign w:val="center"/>
+          </w:tcPr>
+          <w:p>
+            <w:pPr>
+              <w:jc w:val="center"/>
+            </w:pPr>
+            <w:r>
+              <w:t>Sadida</w:t>
+            </w:r>
+          </w:p>
+          <w:p>
+            <w:pPr>
+              <w:jc w:val="center"/>
+            </w:pPr>
+            <w:r>
+              <w:rPr>
+                <w:rFonts w:ascii="Segoe UI Emoji" w:hAnsi="Segoe UI Emoji" w:cs="Segoe UI Emoji"/>
+              </w:rPr>
+              <w:t>🟤</w:t>
+            </w:r>
+            <w:r>
+              <w:rPr>
+                <w:rFonts w:ascii="Segoe UI Emoji" w:hAnsi="Segoe UI Emoji" w:cs="Segoe UI Emoji"/>
+                <w:b/>
+                <w:bCs/>
+              </w:rPr>
+              <w:t xml:space="preserve"> 🔥</w:t>
+            </w:r>
+          </w:p>
+        </w:tc>
+        <w:tc>
+          <w:tcPr>
+            <w:tcW w:w="1280" w:type="dxa"/>
+            <w:vAlign w:val="center"/>
+          </w:tcPr>
+          <w:p>
+            <w:pPr>
+              <w:jc w:val="center"/>
+              <w:rPr>
+                <w:rFonts w:ascii="Segoe UI Symbol" w:hAnsi="Segoe UI Symbol" w:cs="Segoe UI Symbol"/>
+              </w:rPr>
+            </w:pPr>
+            <w:r>
+              <w:rPr>
+                <w:rFonts w:ascii="Segoe UI Symbol" w:hAnsi="Segoe UI Symbol" w:cs="Segoe UI Symbol"/>
+              </w:rPr>
+              <w:t>★★★★</w:t>
+            </w:r>
+          </w:p>
+        </w:tc>
+        <w:tc>
+          <w:tcPr>
+            <w:tcW w:w="1667" w:type="dxa"/>
+            <w:vAlign w:val="center"/>
+          </w:tcPr>
+          <w:p>
+            <w:pPr>
+              <w:jc w:val="center"/>
+            </w:pPr>
+            <w:r>
+              <w:t>Invocateur distance</w:t>
+            </w:r>
+          </w:p>
+        </w:tc>
+        <w:tc>
+          <w:tcPr>
+            <w:tcW w:w="2268" w:type="dxa"/>
+            <w:vAlign w:val="center"/>
+          </w:tcPr>
+          <w:p>
+            <w:pPr>
+              <w:jc w:val="center"/>
+            </w:pPr>
+            <w:r>
+              <w:t>Multi-tâche</w:t>
+            </w:r>
+          </w:p>
+          <w:p>
+            <w:pPr>
+              <w:jc w:val="center"/>
+            </w:pPr>
+            <w:r>
+              <w:rPr>
+                <w:lang w:val="it-IT"/>
+              </w:rPr>
+              <w:t>Entrave PM</w:t>
+            </w:r>
+          </w:p>
+        </w:tc>
+        <w:tc>
+          <w:tcPr>
+            <w:tcW w:w="1606" w:type="dxa"/>
+            <w:vAlign w:val="center"/>
+          </w:tcPr>
+          <w:p>
+            <w:pPr>
+              <w:jc w:val="center"/>
+            </w:pPr>
+            <w:r>
+              <w:rPr>
+                <w:rFonts w:ascii="Segoe UI Emoji" w:hAnsi="Segoe UI Emoji" w:cs="Segoe UI Emoji"/>
+              </w:rPr>
+              <w:t>🟤</w:t>
             </w:r>
             <w:r>
               <w:rPr>
                 <w:rFonts w:cstheme="minorHAnsi"/>
                 <w:lang w:val="it-IT"/>
               </w:rPr>
-              <w:t xml:space="preserve"> </w:t>
+              <w:t xml:space="preserve"> ⌂⌂ </w:t>
             </w:r>
             <w:r>
               <w:rPr>
@@ -3429,6 +4368,48 @@
                 <w:b/>
                 <w:bCs/>
               </w:rPr>
+              <w:t>Ω Ω Ω</w:t>
+            </w:r>
+          </w:p>
+          <w:p>
+            <w:pPr>
+              <w:jc w:val="center"/>
+            </w:pPr>
+            <w:r>
+              <w:t>lvl 1 D</w:t>
+            </w:r>
+          </w:p>
+        </w:tc>
+        <w:tc>
+          <w:tcPr>
+            <w:tcW w:w="1607" w:type="dxa"/>
+            <w:vAlign w:val="center"/>
+          </w:tcPr>
+          <w:p>
+            <w:pPr>
+              <w:jc w:val="center"/>
+            </w:pPr>
+            <w:r>
+              <w:rPr>
+                <w:rFonts w:ascii="Segoe UI Emoji" w:hAnsi="Segoe UI Emoji" w:cs="Segoe UI Emoji"/>
+                <w:b/>
+                <w:bCs/>
+              </w:rPr>
+              <w:t>🔥</w:t>
+            </w:r>
+            <w:r>
+              <w:rPr>
+                <w:rFonts w:cstheme="minorHAnsi"/>
+                <w:lang w:val="it-IT"/>
+              </w:rPr>
+              <w:t xml:space="preserve">⌂⌂ </w:t>
+            </w:r>
+            <w:r>
+              <w:rPr>
+                <w:rFonts w:cstheme="minorHAnsi"/>
+                <w:b/>
+                <w:bCs/>
+              </w:rPr>
               <w:t xml:space="preserve">Ω Ω </w:t>
             </w:r>
           </w:p>
@@ -3437,49 +4418,60 @@
               <w:jc w:val="center"/>
             </w:pPr>
             <w:r>
-              <w:t>lvl 145 m</w:t>
+              <w:t>lvl 84 D</w:t>
+            </w:r>
+          </w:p>
+        </w:tc>
+        <w:tc>
+          <w:tcPr>
+            <w:tcW w:w="1606" w:type="dxa"/>
+            <w:vAlign w:val="center"/>
+          </w:tcPr>
+          <w:p>
+            <w:pPr>
+              <w:jc w:val="center"/>
+            </w:pPr>
+            <w:r>
+              <w:rPr>
+                <w:rFonts w:ascii="Segoe UI Emoji" w:hAnsi="Segoe UI Emoji" w:cs="Segoe UI Emoji"/>
+              </w:rPr>
+              <w:t>🍃</w:t>
+            </w:r>
+            <w:r>
+              <w:rPr>
+                <w:rFonts w:cstheme="minorHAnsi"/>
+                <w:lang w:val="it-IT"/>
+              </w:rPr>
+              <w:t xml:space="preserve"> ⌂⌂ </w:t>
+            </w:r>
+            <w:r>
+              <w:rPr>
+                <w:rFonts w:cstheme="minorHAnsi"/>
+                <w:b/>
+                <w:bCs/>
+              </w:rPr>
+              <w:t>Ω Ω</w:t>
+            </w:r>
+          </w:p>
+          <w:p>
+            <w:pPr>
+              <w:jc w:val="center"/>
+            </w:pPr>
+            <w:r>
+              <w:t>lvl 195 MD</w:t>
             </w:r>
           </w:p>
         </w:tc>
         <w:tc>
           <w:tcPr>
             <w:tcW w:w="1607" w:type="dxa"/>
-            <w:vAlign w:val="center"/>
-          </w:tcPr>
-          <w:p>
-            <w:pPr>
-              <w:jc w:val="center"/>
-              <w:rPr>
-                <w:rFonts w:ascii="Segoe UI Emoji" w:hAnsi="Segoe UI Emoji" w:cs="Segoe UI Emoji"/>
-              </w:rPr>
-            </w:pPr>
-            <w:r>
-              <w:rPr>
-                <w:rFonts w:ascii="Segoe UI Emoji" w:hAnsi="Segoe UI Emoji" w:cs="Segoe UI Emoji"/>
-              </w:rPr>
-              <w:t>⚡</w:t>
-            </w:r>
-          </w:p>
-          <w:p>
-            <w:pPr>
-              <w:jc w:val="center"/>
-            </w:pPr>
-            <w:r>
-              <w:rPr>
-                <w:b/>
-                <w:bCs/>
-                <w:color w:val="7030A0"/>
-              </w:rPr>
-              <w:t>→</w:t>
-            </w:r>
-            <w:r>
-              <w:rPr>
-                <w:rFonts w:cstheme="minorHAnsi"/>
-                <w:b/>
-                <w:bCs/>
-              </w:rPr>
-              <w:t xml:space="preserve"> </w:t>
-            </w:r>
+            <w:shd w:val="clear" w:color="auto" w:fill="000000" w:themeFill="text1"/>
+            <w:vAlign w:val="center"/>
+          </w:tcPr>
+          <w:p>
+            <w:pPr>
+              <w:jc w:val="center"/>
+            </w:pPr>
           </w:p>
         </w:tc>
         <w:tc>
@@ -3506,7 +4498,7 @@
               <w:jc w:val="center"/>
             </w:pPr>
             <w:r>
-              <w:t>Steameur</w:t>
+              <w:t>Xelor</w:t>
             </w:r>
           </w:p>
           <w:p>
@@ -3516,6 +4508,20 @@
             <w:r>
               <w:rPr>
                 <w:rFonts w:ascii="Segoe UI Emoji" w:hAnsi="Segoe UI Emoji" w:cs="Segoe UI Emoji"/>
+                <w:b/>
+                <w:bCs/>
+              </w:rPr>
+              <w:t>🔥</w:t>
+            </w:r>
+            <w:r>
+              <w:rPr>
+                <w:rFonts w:ascii="Segoe UI Emoji" w:hAnsi="Segoe UI Emoji" w:cs="Segoe UI Emoji"/>
+              </w:rPr>
+              <w:t xml:space="preserve"> 💧</w:t>
+            </w:r>
+            <w:r>
+              <w:rPr>
+                <w:rFonts w:ascii="Segoe UI Emoji" w:hAnsi="Segoe UI Emoji" w:cs="Segoe UI Emoji"/>
               </w:rPr>
               <w:t>⚡</w:t>
             </w:r>
@@ -3525,116 +4531,123 @@
               </w:rPr>
               <w:t xml:space="preserve"> 🟤</w:t>
             </w:r>
+          </w:p>
+        </w:tc>
+        <w:tc>
+          <w:tcPr>
+            <w:tcW w:w="1280" w:type="dxa"/>
+            <w:vAlign w:val="center"/>
+          </w:tcPr>
+          <w:p>
+            <w:pPr>
+              <w:jc w:val="center"/>
+            </w:pPr>
+            <w:r>
+              <w:rPr>
+                <w:rFonts w:ascii="Segoe UI Symbol" w:hAnsi="Segoe UI Symbol" w:cs="Segoe UI Symbol"/>
+              </w:rPr>
+              <w:t>★★★★★</w:t>
+            </w:r>
+          </w:p>
+        </w:tc>
+        <w:tc>
+          <w:tcPr>
+            <w:tcW w:w="1667" w:type="dxa"/>
+            <w:vAlign w:val="center"/>
+          </w:tcPr>
+          <w:p>
+            <w:pPr>
+              <w:jc w:val="center"/>
+            </w:pPr>
+            <w:r>
+              <w:t>Attaquant mid-range</w:t>
+            </w:r>
+          </w:p>
+        </w:tc>
+        <w:tc>
+          <w:tcPr>
+            <w:tcW w:w="2268" w:type="dxa"/>
+            <w:vAlign w:val="center"/>
+          </w:tcPr>
+          <w:p>
+            <w:pPr>
+              <w:jc w:val="center"/>
+            </w:pPr>
+            <w:r>
+              <w:t>Mobilité</w:t>
+            </w:r>
+          </w:p>
+          <w:p>
+            <w:pPr>
+              <w:jc w:val="center"/>
+            </w:pPr>
+            <w:r>
+              <w:t>Retrait PA</w:t>
+            </w:r>
+          </w:p>
+        </w:tc>
+        <w:tc>
+          <w:tcPr>
+            <w:tcW w:w="1606" w:type="dxa"/>
+            <w:vAlign w:val="center"/>
+          </w:tcPr>
+          <w:p>
+            <w:pPr>
+              <w:jc w:val="center"/>
+            </w:pPr>
             <w:r>
               <w:rPr>
                 <w:rFonts w:ascii="Segoe UI Emoji" w:hAnsi="Segoe UI Emoji" w:cs="Segoe UI Emoji"/>
                 <w:b/>
                 <w:bCs/>
               </w:rPr>
-              <w:t xml:space="preserve"> 🔥</w:t>
-            </w:r>
-          </w:p>
-        </w:tc>
-        <w:tc>
-          <w:tcPr>
-            <w:tcW w:w="1280" w:type="dxa"/>
-            <w:vAlign w:val="center"/>
-          </w:tcPr>
-          <w:p>
-            <w:pPr>
-              <w:jc w:val="center"/>
-              <w:rPr>
-                <w:rFonts w:ascii="Segoe UI Symbol" w:hAnsi="Segoe UI Symbol" w:cs="Segoe UI Symbol"/>
-              </w:rPr>
-            </w:pPr>
-            <w:r>
-              <w:rPr>
-                <w:rFonts w:ascii="Segoe UI Symbol" w:hAnsi="Segoe UI Symbol" w:cs="Segoe UI Symbol"/>
-              </w:rPr>
-              <w:t>★★★</w:t>
-            </w:r>
-          </w:p>
-        </w:tc>
-        <w:tc>
-          <w:tcPr>
-            <w:tcW w:w="1667" w:type="dxa"/>
-            <w:vAlign w:val="center"/>
-          </w:tcPr>
-          <w:p>
-            <w:pPr>
-              <w:jc w:val="center"/>
-            </w:pPr>
-            <w:r>
-              <w:t>Attaquant mid-range</w:t>
-            </w:r>
-          </w:p>
-        </w:tc>
-        <w:tc>
-          <w:tcPr>
-            <w:tcW w:w="2268" w:type="dxa"/>
-            <w:vAlign w:val="center"/>
-          </w:tcPr>
-          <w:p>
-            <w:pPr>
-              <w:jc w:val="center"/>
-            </w:pPr>
-            <w:r>
-              <w:t>Multi-tâche</w:t>
-            </w:r>
-          </w:p>
-          <w:p>
-            <w:pPr>
-              <w:jc w:val="center"/>
-            </w:pPr>
-            <w:r>
-              <w:t>Tourelles</w:t>
-            </w:r>
-          </w:p>
-          <w:p>
-            <w:pPr>
-              <w:jc w:val="center"/>
-            </w:pPr>
-            <w:r>
-              <w:t>Soin</w:t>
-            </w:r>
-          </w:p>
-          <w:p>
-            <w:pPr>
-              <w:jc w:val="center"/>
-            </w:pPr>
-            <w:r>
-              <w:t>Boost</w:t>
-            </w:r>
-          </w:p>
-          <w:p>
-            <w:pPr>
-              <w:jc w:val="center"/>
-            </w:pPr>
-            <w:r>
-              <w:t>Erosion</w:t>
-            </w:r>
-          </w:p>
-        </w:tc>
-        <w:tc>
-          <w:tcPr>
-            <w:tcW w:w="1606" w:type="dxa"/>
-            <w:vAlign w:val="center"/>
-          </w:tcPr>
-          <w:p>
-            <w:pPr>
-              <w:jc w:val="center"/>
-            </w:pPr>
-            <w:r>
-              <w:rPr>
-                <w:rFonts w:ascii="Segoe UI Emoji" w:hAnsi="Segoe UI Emoji" w:cs="Segoe UI Emoji"/>
-              </w:rPr>
-              <w:t>🟤</w:t>
+              <w:t>🔥</w:t>
             </w:r>
             <w:r>
               <w:rPr>
                 <w:rFonts w:cstheme="minorHAnsi"/>
                 <w:lang w:val="it-IT"/>
               </w:rPr>
+              <w:t xml:space="preserve"> ⌂ </w:t>
+            </w:r>
+            <w:r>
+              <w:rPr>
+                <w:rFonts w:cstheme="minorHAnsi"/>
+                <w:b/>
+                <w:bCs/>
+              </w:rPr>
+              <w:t xml:space="preserve">Ω Ω </w:t>
+            </w:r>
+          </w:p>
+          <w:p>
+            <w:pPr>
+              <w:jc w:val="center"/>
+            </w:pPr>
+            <w:r>
+              <w:t>lvl 1 D</w:t>
+            </w:r>
+          </w:p>
+        </w:tc>
+        <w:tc>
+          <w:tcPr>
+            <w:tcW w:w="1607" w:type="dxa"/>
+            <w:vAlign w:val="center"/>
+          </w:tcPr>
+          <w:p>
+            <w:pPr>
+              <w:jc w:val="center"/>
+            </w:pPr>
+            <w:r>
+              <w:rPr>
+                <w:rFonts w:ascii="Segoe UI Emoji" w:hAnsi="Segoe UI Emoji" w:cs="Segoe UI Emoji"/>
+              </w:rPr>
+              <w:t>🍃</w:t>
+            </w:r>
+            <w:r>
+              <w:rPr>
+                <w:rFonts w:cstheme="minorHAnsi"/>
+                <w:lang w:val="it-IT"/>
+              </w:rPr>
               <w:t xml:space="preserve"> </w:t>
             </w:r>
             <w:r>
@@ -3651,7 +4664,47 @@
               <w:jc w:val="center"/>
             </w:pPr>
             <w:r>
-              <w:t>lvl 1 MD</w:t>
+              <w:t>lvl 3 MD</w:t>
+            </w:r>
+          </w:p>
+        </w:tc>
+        <w:tc>
+          <w:tcPr>
+            <w:tcW w:w="1606" w:type="dxa"/>
+            <w:vAlign w:val="center"/>
+          </w:tcPr>
+          <w:p>
+            <w:pPr>
+              <w:jc w:val="center"/>
+            </w:pPr>
+            <w:r>
+              <w:rPr>
+                <w:rFonts w:ascii="Segoe UI Emoji" w:hAnsi="Segoe UI Emoji" w:cs="Segoe UI Emoji"/>
+              </w:rPr>
+              <w:t>🟤</w:t>
+            </w:r>
+            <w:r>
+              <w:rPr>
+                <w:rFonts w:cstheme="minorHAnsi"/>
+                <w:lang w:val="it-IT"/>
+              </w:rPr>
+              <w:t xml:space="preserve"> </w:t>
+            </w:r>
+            <w:r>
+              <w:rPr>
+                <w:rFonts w:cstheme="minorHAnsi"/>
+                <w:b/>
+                <w:bCs/>
+              </w:rPr>
+              <w:t>Ω Ω Ω</w:t>
+            </w:r>
+          </w:p>
+          <w:p>
+            <w:pPr>
+              <w:jc w:val="center"/>
+            </w:pPr>
+            <w:r>
+              <w:t>lvl 92 MD</w:t>
             </w:r>
           </w:p>
         </w:tc>
@@ -3663,90 +4716,53 @@
           <w:p>
             <w:pPr>
               <w:jc w:val="center"/>
+            </w:pPr>
+            <w:r>
               <w:rPr>
                 <w:rFonts w:ascii="Segoe UI Emoji" w:hAnsi="Segoe UI Emoji" w:cs="Segoe UI Emoji"/>
-                <w:b/>
-                <w:bCs/>
-              </w:rPr>
+              </w:rPr>
+              <w:t>💧</w:t>
+            </w:r>
+            <w:r>
+              <w:rPr>
+                <w:rFonts w:cstheme="minorHAnsi"/>
+                <w:lang w:val="it-IT"/>
+              </w:rPr>
+              <w:t xml:space="preserve"> </w:t>
+            </w:r>
+            <w:r>
+              <w:rPr>
+                <w:rFonts w:cstheme="minorHAnsi"/>
+                <w:b/>
+                <w:bCs/>
+              </w:rPr>
+              <w:t>Ω Ω Ω</w:t>
+            </w:r>
+          </w:p>
+          <w:p>
+            <w:pPr>
+              <w:jc w:val="center"/>
+            </w:pPr>
+            <w:r>
+              <w:t>lvl 110 MD</w:t>
+            </w:r>
+          </w:p>
+        </w:tc>
+        <w:tc>
+          <w:tcPr>
+            <w:tcW w:w="1606" w:type="dxa"/>
+            <w:vAlign w:val="center"/>
+          </w:tcPr>
+          <w:p>
+            <w:pPr>
+              <w:jc w:val="center"/>
             </w:pPr>
             <w:r>
               <w:rPr>
                 <w:rFonts w:ascii="Segoe UI Emoji" w:hAnsi="Segoe UI Emoji" w:cs="Segoe UI Emoji"/>
-                <w:b/>
-                <w:bCs/>
-              </w:rPr>
-              <w:t>🔥</w:t>
-            </w:r>
-            <w:r>
-              <w:rPr>
-                <w:rFonts w:cstheme="minorHAnsi"/>
-                <w:b/>
-                <w:bCs/>
-              </w:rPr>
-              <w:t xml:space="preserve"> Ω Ω</w:t>
-            </w:r>
-          </w:p>
-          <w:p>
-            <w:pPr>
-              <w:jc w:val="center"/>
-            </w:pPr>
-            <w:r>
-              <w:t>lvl 110 MD</w:t>
-            </w:r>
-          </w:p>
-        </w:tc>
-        <w:tc>
-          <w:tcPr>
-            <w:tcW w:w="1606" w:type="dxa"/>
-            <w:vAlign w:val="center"/>
-          </w:tcPr>
-          <w:p>
-            <w:pPr>
-              <w:jc w:val="center"/>
-            </w:pPr>
-            <w:r>
-              <w:rPr>
-                <w:rFonts w:ascii="Segoe UI Emoji" w:hAnsi="Segoe UI Emoji" w:cs="Segoe UI Emoji"/>
               </w:rPr>
               <w:t>⚡</w:t>
             </w:r>
-          </w:p>
-          <w:p>
-            <w:pPr>
-              <w:jc w:val="center"/>
-            </w:pPr>
-            <w:r>
-              <w:rPr>
-                <w:b/>
-                <w:bCs/>
-                <w:color w:val="7030A0"/>
-              </w:rPr>
-              <w:t>→</w:t>
-            </w:r>
-          </w:p>
-        </w:tc>
-        <w:tc>
-          <w:tcPr>
-            <w:tcW w:w="1607" w:type="dxa"/>
-            <w:shd w:val="clear" w:color="auto" w:fill="000000" w:themeFill="text1"/>
-            <w:vAlign w:val="center"/>
-          </w:tcPr>
-          <w:p>
-            <w:pPr>
-              <w:jc w:val="center"/>
-            </w:pPr>
-          </w:p>
-        </w:tc>
-        <w:tc>
-          <w:tcPr>
-            <w:tcW w:w="1606" w:type="dxa"/>
-            <w:shd w:val="clear" w:color="auto" w:fill="000000" w:themeFill="text1"/>
-            <w:vAlign w:val="center"/>
-          </w:tcPr>
-          <w:p>
-            <w:pPr>
-              <w:jc w:val="center"/>
-            </w:pPr>
           </w:p>
         </w:tc>
       </w:tr>
@@ -3761,8 +4777,7 @@
               <w:jc w:val="center"/>
             </w:pPr>
             <w:r>
-              <w:lastRenderedPageBreak/>
-              <w:t>Huppermage</w:t>
+              <w:t>Roublard</w:t>
             </w:r>
           </w:p>
           <w:p>
@@ -3772,14 +4787,22 @@
             <w:r>
               <w:rPr>
                 <w:rFonts w:ascii="Segoe UI Emoji" w:hAnsi="Segoe UI Emoji" w:cs="Segoe UI Emoji"/>
-              </w:rPr>
-              <w:t>🟤</w:t>
+                <w:b/>
+                <w:bCs/>
+              </w:rPr>
+              <w:t>🔥</w:t>
             </w:r>
             <w:r>
               <w:rPr>
                 <w:rFonts w:ascii="Segoe UI Emoji" w:hAnsi="Segoe UI Emoji" w:cs="Segoe UI Emoji"/>
               </w:rPr>
-              <w:t>⚡</w:t>
+              <w:t xml:space="preserve"> 🍃</w:t>
+            </w:r>
+            <w:r>
+              <w:rPr>
+                <w:rFonts w:ascii="Segoe UI Emoji" w:hAnsi="Segoe UI Emoji" w:cs="Segoe UI Emoji"/>
+              </w:rPr>
+              <w:t xml:space="preserve"> 🟤</w:t>
             </w:r>
           </w:p>
         </w:tc>
@@ -3791,15 +4814,12 @@
           <w:p>
             <w:pPr>
               <w:jc w:val="center"/>
+            </w:pPr>
+            <w:r>
               <w:rPr>
                 <w:rFonts w:ascii="Segoe UI Symbol" w:hAnsi="Segoe UI Symbol" w:cs="Segoe UI Symbol"/>
               </w:rPr>
-            </w:pPr>
-            <w:r>
-              <w:rPr>
-                <w:rFonts w:ascii="Segoe UI Symbol" w:hAnsi="Segoe UI Symbol" w:cs="Segoe UI Symbol"/>
-              </w:rPr>
-              <w:t>★★★</w:t>
+              <w:t>★★★★★</w:t>
             </w:r>
           </w:p>
         </w:tc>
@@ -3813,7 +4833,7 @@
               <w:jc w:val="center"/>
             </w:pPr>
             <w:r>
-              <w:t>Attaquant distance</w:t>
+              <w:t>Attaquant mid-range</w:t>
             </w:r>
           </w:p>
         </w:tc>
@@ -3827,15 +4847,39 @@
               <w:jc w:val="center"/>
             </w:pPr>
             <w:r>
-              <w:t>Combinaisons élémentaires</w:t>
-            </w:r>
-          </w:p>
-          <w:p>
-            <w:pPr>
-              <w:jc w:val="center"/>
-            </w:pPr>
-            <w:r>
-              <w:t>Multi-tâche</w:t>
+              <w:t>Bombes</w:t>
+            </w:r>
+          </w:p>
+          <w:p>
+            <w:pPr>
+              <w:jc w:val="center"/>
+            </w:pPr>
+            <w:r>
+              <w:t>Mobilité</w:t>
+            </w:r>
+          </w:p>
+          <w:p>
+            <w:pPr>
+              <w:jc w:val="center"/>
+            </w:pPr>
+            <w:r>
+              <w:t>Placement</w:t>
+            </w:r>
+          </w:p>
+          <w:p>
+            <w:pPr>
+              <w:jc w:val="center"/>
+            </w:pPr>
+            <w:r>
+              <w:t>Boost</w:t>
+            </w:r>
+          </w:p>
+          <w:p>
+            <w:pPr>
+              <w:jc w:val="center"/>
+            </w:pPr>
+            <w:r>
+              <w:t>Erosion</w:t>
             </w:r>
           </w:p>
         </w:tc>
@@ -3851,15 +4895,23 @@
             <w:r>
               <w:rPr>
                 <w:rFonts w:ascii="Segoe UI Emoji" w:hAnsi="Segoe UI Emoji" w:cs="Segoe UI Emoji"/>
-              </w:rPr>
-              <w:t>🟤</w:t>
+                <w:b/>
+                <w:bCs/>
+              </w:rPr>
+              <w:t>🔥</w:t>
+            </w:r>
+            <w:r>
+              <w:rPr>
+                <w:rFonts w:cstheme="minorHAnsi"/>
+              </w:rPr>
+              <w:t xml:space="preserve"> </w:t>
             </w:r>
             <w:r>
               <w:rPr>
                 <w:rFonts w:cstheme="minorHAnsi"/>
                 <w:lang w:val="it-IT"/>
               </w:rPr>
-              <w:t xml:space="preserve"> </w:t>
+              <w:t xml:space="preserve">⌂ </w:t>
             </w:r>
             <w:r>
               <w:rPr>
@@ -3869,13 +4921,21 @@
               </w:rPr>
               <w:t>Ω Ω Ω</w:t>
             </w:r>
-          </w:p>
-          <w:p>
-            <w:pPr>
-              <w:jc w:val="center"/>
-            </w:pPr>
-            <w:r>
-              <w:t>lvl 1 D</w:t>
+            <w:r>
+              <w:rPr>
+                <w:rFonts w:cstheme="minorHAnsi"/>
+                <w:b/>
+                <w:bCs/>
+              </w:rPr>
+              <w:t>+</w:t>
+            </w:r>
+          </w:p>
+          <w:p>
+            <w:pPr>
+              <w:jc w:val="center"/>
+            </w:pPr>
+            <w:r>
+              <w:t>lvl 1 MD</w:t>
             </w:r>
           </w:p>
         </w:tc>
@@ -3904,18 +4964,33 @@
             <w:r>
               <w:rPr>
                 <w:rFonts w:cstheme="minorHAnsi"/>
-                <w:b/>
-                <w:bCs/>
-              </w:rPr>
-              <w:t xml:space="preserve">Ω Ω Ω </w:t>
-            </w:r>
-          </w:p>
-          <w:p>
-            <w:pPr>
-              <w:jc w:val="center"/>
-            </w:pPr>
-            <w:r>
-              <w:t>lvl 1 D</w:t>
+                <w:lang w:val="it-IT"/>
+              </w:rPr>
+              <w:t xml:space="preserve">⌂ </w:t>
+            </w:r>
+            <w:r>
+              <w:rPr>
+                <w:rFonts w:cstheme="minorHAnsi"/>
+                <w:b/>
+                <w:bCs/>
+              </w:rPr>
+              <w:t>Ω Ω Ω</w:t>
+            </w:r>
+            <w:r>
+              <w:rPr>
+                <w:rFonts w:cstheme="minorHAnsi"/>
+                <w:b/>
+                <w:bCs/>
+              </w:rPr>
+              <w:t>+</w:t>
+            </w:r>
+          </w:p>
+          <w:p>
+            <w:pPr>
+              <w:jc w:val="center"/>
+            </w:pPr>
+            <w:r>
+              <w:t>lvl 9 MD</w:t>
             </w:r>
           </w:p>
         </w:tc>
@@ -3927,52 +5002,12 @@
           <w:p>
             <w:pPr>
               <w:jc w:val="center"/>
+            </w:pPr>
+            <w:r>
               <w:rPr>
                 <w:rFonts w:ascii="Segoe UI Emoji" w:hAnsi="Segoe UI Emoji" w:cs="Segoe UI Emoji"/>
-                <w:b/>
-                <w:bCs/>
-              </w:rPr>
-            </w:pPr>
-            <w:r>
-              <w:rPr>
-                <w:rFonts w:ascii="Segoe UI Emoji" w:hAnsi="Segoe UI Emoji" w:cs="Segoe UI Emoji"/>
-                <w:b/>
-                <w:bCs/>
-              </w:rPr>
-              <w:t>🔥</w:t>
-            </w:r>
-            <w:r>
-              <w:rPr>
-                <w:rFonts w:cstheme="minorHAnsi"/>
-                <w:b/>
-                <w:bCs/>
-              </w:rPr>
-              <w:t xml:space="preserve"> Ω Ω Ω</w:t>
-            </w:r>
-          </w:p>
-          <w:p>
-            <w:pPr>
-              <w:jc w:val="center"/>
-            </w:pPr>
-            <w:r>
-              <w:t>lvl 3 D</w:t>
-            </w:r>
-          </w:p>
-        </w:tc>
-        <w:tc>
-          <w:tcPr>
-            <w:tcW w:w="1607" w:type="dxa"/>
-            <w:vAlign w:val="center"/>
-          </w:tcPr>
-          <w:p>
-            <w:pPr>
-              <w:jc w:val="center"/>
-            </w:pPr>
-            <w:r>
-              <w:rPr>
-                <w:rFonts w:ascii="Segoe UI Emoji" w:hAnsi="Segoe UI Emoji" w:cs="Segoe UI Emoji"/>
-              </w:rPr>
-              <w:t>💧</w:t>
+              </w:rPr>
+              <w:t>🟤</w:t>
             </w:r>
             <w:r>
               <w:rPr>
@@ -3984,1128 +5019,9 @@
             <w:r>
               <w:rPr>
                 <w:rFonts w:cstheme="minorHAnsi"/>
-                <w:b/>
-                <w:bCs/>
-              </w:rPr>
-              <w:t>Ω Ω Ω</w:t>
-            </w:r>
-          </w:p>
-          <w:p>
-            <w:pPr>
-              <w:jc w:val="center"/>
-            </w:pPr>
-            <w:r>
-              <w:t>lvl 62 M</w:t>
-            </w:r>
-          </w:p>
-        </w:tc>
-        <w:tc>
-          <w:tcPr>
-            <w:tcW w:w="1606" w:type="dxa"/>
-            <w:vAlign w:val="center"/>
-          </w:tcPr>
-          <w:p>
-            <w:pPr>
-              <w:jc w:val="center"/>
-              <w:rPr>
-                <w:rFonts w:ascii="Segoe UI Emoji" w:hAnsi="Segoe UI Emoji" w:cs="Segoe UI Emoji"/>
-              </w:rPr>
-            </w:pPr>
-            <w:r>
-              <w:rPr>
-                <w:rFonts w:ascii="Segoe UI Emoji" w:hAnsi="Segoe UI Emoji" w:cs="Segoe UI Emoji"/>
-              </w:rPr>
-              <w:t>⚡</w:t>
-            </w:r>
-          </w:p>
-        </w:tc>
-      </w:tr>
-      <w:tr>
-        <w:tc>
-          <w:tcPr>
-            <w:tcW w:w="1868" w:type="dxa"/>
-            <w:vAlign w:val="center"/>
-          </w:tcPr>
-          <w:p>
-            <w:pPr>
-              <w:jc w:val="center"/>
-            </w:pPr>
-            <w:r>
-              <w:t>Osamodas</w:t>
-            </w:r>
-          </w:p>
-          <w:p>
-            <w:pPr>
-              <w:jc w:val="center"/>
-            </w:pPr>
-            <w:r>
-              <w:rPr>
-                <w:rFonts w:ascii="Segoe UI Emoji" w:hAnsi="Segoe UI Emoji" w:cs="Segoe UI Emoji"/>
-                <w:b/>
-                <w:bCs/>
-              </w:rPr>
-              <w:t>🔥</w:t>
-            </w:r>
-            <w:r>
-              <w:rPr>
-                <w:rFonts w:ascii="Segoe UI Emoji" w:hAnsi="Segoe UI Emoji" w:cs="Segoe UI Emoji"/>
-              </w:rPr>
-              <w:t xml:space="preserve"> 🍃</w:t>
-            </w:r>
-            <w:r>
-              <w:rPr>
-                <w:rFonts w:ascii="Segoe UI Emoji" w:hAnsi="Segoe UI Emoji" w:cs="Segoe UI Emoji"/>
-              </w:rPr>
-              <w:t xml:space="preserve"> 💧</w:t>
-            </w:r>
-          </w:p>
-        </w:tc>
-        <w:tc>
-          <w:tcPr>
-            <w:tcW w:w="1280" w:type="dxa"/>
-            <w:vAlign w:val="center"/>
-          </w:tcPr>
-          <w:p>
-            <w:pPr>
-              <w:jc w:val="center"/>
-              <w:rPr>
-                <w:rFonts w:ascii="Segoe UI Symbol" w:hAnsi="Segoe UI Symbol" w:cs="Segoe UI Symbol"/>
-              </w:rPr>
-            </w:pPr>
-            <w:r>
-              <w:rPr>
-                <w:rFonts w:ascii="Segoe UI Symbol" w:hAnsi="Segoe UI Symbol" w:cs="Segoe UI Symbol"/>
-              </w:rPr>
-              <w:t>★★★★</w:t>
-            </w:r>
-          </w:p>
-        </w:tc>
-        <w:tc>
-          <w:tcPr>
-            <w:tcW w:w="1667" w:type="dxa"/>
-            <w:vAlign w:val="center"/>
-          </w:tcPr>
-          <w:p>
-            <w:pPr>
-              <w:jc w:val="center"/>
-            </w:pPr>
-            <w:r>
-              <w:t>Invocateur mid-range</w:t>
-            </w:r>
-          </w:p>
-        </w:tc>
-        <w:tc>
-          <w:tcPr>
-            <w:tcW w:w="2268" w:type="dxa"/>
-            <w:vAlign w:val="center"/>
-          </w:tcPr>
-          <w:p>
-            <w:pPr>
-              <w:jc w:val="center"/>
-            </w:pPr>
-            <w:r>
-              <w:t>Boost</w:t>
-            </w:r>
-          </w:p>
-          <w:p>
-            <w:pPr>
-              <w:jc w:val="center"/>
-            </w:pPr>
-            <w:r>
-              <w:t>Soin</w:t>
-            </w:r>
-          </w:p>
-        </w:tc>
-        <w:tc>
-          <w:tcPr>
-            <w:tcW w:w="1606" w:type="dxa"/>
-            <w:vAlign w:val="center"/>
-          </w:tcPr>
-          <w:p>
-            <w:pPr>
-              <w:jc w:val="center"/>
-            </w:pPr>
-            <w:r>
-              <w:rPr>
-                <w:rFonts w:ascii="Segoe UI Emoji" w:hAnsi="Segoe UI Emoji" w:cs="Segoe UI Emoji"/>
-              </w:rPr>
-              <w:t>🍃</w:t>
-            </w:r>
-            <w:r>
-              <w:rPr>
-                <w:rFonts w:cstheme="minorHAnsi"/>
                 <w:lang w:val="it-IT"/>
               </w:rPr>
-              <w:t xml:space="preserve"> </w:t>
-            </w:r>
-            <w:r>
-              <w:rPr>
-                <w:rFonts w:cstheme="minorHAnsi"/>
-                <w:b/>
-                <w:bCs/>
-              </w:rPr>
-              <w:t xml:space="preserve">Ω Ω Ω </w:t>
-            </w:r>
-          </w:p>
-          <w:p>
-            <w:pPr>
-              <w:jc w:val="center"/>
-            </w:pPr>
-            <w:r>
-              <w:t>lvl 1 MD</w:t>
-            </w:r>
-          </w:p>
-        </w:tc>
-        <w:tc>
-          <w:tcPr>
-            <w:tcW w:w="1607" w:type="dxa"/>
-            <w:vAlign w:val="center"/>
-          </w:tcPr>
-          <w:p>
-            <w:pPr>
-              <w:jc w:val="center"/>
-            </w:pPr>
-            <w:r>
-              <w:rPr>
-                <w:rFonts w:ascii="Segoe UI Emoji" w:hAnsi="Segoe UI Emoji" w:cs="Segoe UI Emoji"/>
-              </w:rPr>
-              <w:t>💧</w:t>
-            </w:r>
-            <w:r>
-              <w:rPr>
-                <w:rFonts w:cstheme="minorHAnsi"/>
-                <w:lang w:val="it-IT"/>
-              </w:rPr>
-              <w:t xml:space="preserve"> </w:t>
-            </w:r>
-            <w:r>
-              <w:rPr>
-                <w:rFonts w:cstheme="minorHAnsi"/>
-                <w:b/>
-                <w:bCs/>
-              </w:rPr>
-              <w:t>Ω Ω Ω</w:t>
-            </w:r>
-          </w:p>
-          <w:p>
-            <w:pPr>
-              <w:jc w:val="center"/>
-            </w:pPr>
-            <w:r>
-              <w:t>lvl 69 MD</w:t>
-            </w:r>
-          </w:p>
-        </w:tc>
-        <w:tc>
-          <w:tcPr>
-            <w:tcW w:w="1606" w:type="dxa"/>
-            <w:vAlign w:val="center"/>
-          </w:tcPr>
-          <w:p>
-            <w:pPr>
-              <w:jc w:val="center"/>
-              <w:rPr>
-                <w:rFonts w:ascii="Segoe UI Emoji" w:hAnsi="Segoe UI Emoji" w:cs="Segoe UI Emoji"/>
-                <w:b/>
-                <w:bCs/>
-              </w:rPr>
-            </w:pPr>
-            <w:r>
-              <w:rPr>
-                <w:rFonts w:ascii="Segoe UI Emoji" w:hAnsi="Segoe UI Emoji" w:cs="Segoe UI Emoji"/>
-                <w:b/>
-                <w:bCs/>
-              </w:rPr>
-              <w:t>🔥</w:t>
-            </w:r>
-            <w:r>
-              <w:rPr>
-                <w:rFonts w:cstheme="minorHAnsi"/>
-                <w:b/>
-                <w:bCs/>
-              </w:rPr>
-              <w:t xml:space="preserve"> Ω Ω</w:t>
-            </w:r>
-          </w:p>
-          <w:p>
-            <w:pPr>
-              <w:jc w:val="center"/>
-            </w:pPr>
-            <w:r>
-              <w:t>lvl 84 MD</w:t>
-            </w:r>
-          </w:p>
-        </w:tc>
-        <w:tc>
-          <w:tcPr>
-            <w:tcW w:w="1607" w:type="dxa"/>
-            <w:shd w:val="clear" w:color="auto" w:fill="000000" w:themeFill="text1"/>
-            <w:vAlign w:val="center"/>
-          </w:tcPr>
-          <w:p>
-            <w:pPr>
-              <w:jc w:val="center"/>
-            </w:pPr>
-          </w:p>
-        </w:tc>
-        <w:tc>
-          <w:tcPr>
-            <w:tcW w:w="1606" w:type="dxa"/>
-            <w:shd w:val="clear" w:color="auto" w:fill="000000" w:themeFill="text1"/>
-            <w:vAlign w:val="center"/>
-          </w:tcPr>
-          <w:p>
-            <w:pPr>
-              <w:jc w:val="center"/>
-            </w:pPr>
-          </w:p>
-        </w:tc>
-      </w:tr>
-      <w:tr>
-        <w:tc>
-          <w:tcPr>
-            <w:tcW w:w="1868" w:type="dxa"/>
-            <w:vAlign w:val="center"/>
-          </w:tcPr>
-          <w:p>
-            <w:pPr>
-              <w:jc w:val="center"/>
-            </w:pPr>
-            <w:r>
-              <w:t>Sadida</w:t>
-            </w:r>
-          </w:p>
-          <w:p>
-            <w:pPr>
-              <w:jc w:val="center"/>
-            </w:pPr>
-            <w:r>
-              <w:rPr>
-                <w:rFonts w:ascii="Segoe UI Emoji" w:hAnsi="Segoe UI Emoji" w:cs="Segoe UI Emoji"/>
-              </w:rPr>
-              <w:t>🟤</w:t>
-            </w:r>
-            <w:r>
-              <w:rPr>
-                <w:rFonts w:ascii="Segoe UI Emoji" w:hAnsi="Segoe UI Emoji" w:cs="Segoe UI Emoji"/>
-                <w:b/>
-                <w:bCs/>
-              </w:rPr>
-              <w:t xml:space="preserve"> 🔥</w:t>
-            </w:r>
-          </w:p>
-        </w:tc>
-        <w:tc>
-          <w:tcPr>
-            <w:tcW w:w="1280" w:type="dxa"/>
-            <w:vAlign w:val="center"/>
-          </w:tcPr>
-          <w:p>
-            <w:pPr>
-              <w:jc w:val="center"/>
-              <w:rPr>
-                <w:rFonts w:ascii="Segoe UI Symbol" w:hAnsi="Segoe UI Symbol" w:cs="Segoe UI Symbol"/>
-              </w:rPr>
-            </w:pPr>
-            <w:r>
-              <w:rPr>
-                <w:rFonts w:ascii="Segoe UI Symbol" w:hAnsi="Segoe UI Symbol" w:cs="Segoe UI Symbol"/>
-              </w:rPr>
-              <w:t>★★★★</w:t>
-            </w:r>
-          </w:p>
-        </w:tc>
-        <w:tc>
-          <w:tcPr>
-            <w:tcW w:w="1667" w:type="dxa"/>
-            <w:vAlign w:val="center"/>
-          </w:tcPr>
-          <w:p>
-            <w:pPr>
-              <w:jc w:val="center"/>
-            </w:pPr>
-            <w:r>
-              <w:t>Invocateur distance</w:t>
-            </w:r>
-          </w:p>
-        </w:tc>
-        <w:tc>
-          <w:tcPr>
-            <w:tcW w:w="2268" w:type="dxa"/>
-            <w:vAlign w:val="center"/>
-          </w:tcPr>
-          <w:p>
-            <w:pPr>
-              <w:jc w:val="center"/>
-            </w:pPr>
-            <w:r>
-              <w:t>Multi-tâche</w:t>
-            </w:r>
-          </w:p>
-          <w:p>
-            <w:pPr>
-              <w:jc w:val="center"/>
-            </w:pPr>
-            <w:r>
-              <w:rPr>
-                <w:lang w:val="it-IT"/>
-              </w:rPr>
-              <w:t>Entrave PM</w:t>
-            </w:r>
-          </w:p>
-        </w:tc>
-        <w:tc>
-          <w:tcPr>
-            <w:tcW w:w="1606" w:type="dxa"/>
-            <w:vAlign w:val="center"/>
-          </w:tcPr>
-          <w:p>
-            <w:pPr>
-              <w:jc w:val="center"/>
-            </w:pPr>
-            <w:r>
-              <w:rPr>
-                <w:rFonts w:ascii="Segoe UI Emoji" w:hAnsi="Segoe UI Emoji" w:cs="Segoe UI Emoji"/>
-              </w:rPr>
-              <w:t>🟤</w:t>
-            </w:r>
-            <w:r>
-              <w:rPr>
-                <w:rFonts w:cstheme="minorHAnsi"/>
-                <w:lang w:val="it-IT"/>
-              </w:rPr>
-              <w:t xml:space="preserve"> </w:t>
-            </w:r>
-            <w:r>
-              <w:rPr>
-                <w:rFonts w:cstheme="minorHAnsi"/>
-                <w:lang w:val="it-IT"/>
-              </w:rPr>
-              <w:t>⌂⌂</w:t>
-            </w:r>
-            <w:r>
-              <w:rPr>
-                <w:rFonts w:cstheme="minorHAnsi"/>
-                <w:lang w:val="it-IT"/>
-              </w:rPr>
-              <w:t xml:space="preserve"> </w:t>
-            </w:r>
-            <w:r>
-              <w:rPr>
-                <w:rFonts w:cstheme="minorHAnsi"/>
-                <w:b/>
-                <w:bCs/>
-              </w:rPr>
-              <w:t>Ω Ω Ω</w:t>
-            </w:r>
-          </w:p>
-          <w:p>
-            <w:pPr>
-              <w:jc w:val="center"/>
-            </w:pPr>
-            <w:r>
-              <w:t>lvl 1 D</w:t>
-            </w:r>
-          </w:p>
-        </w:tc>
-        <w:tc>
-          <w:tcPr>
-            <w:tcW w:w="1607" w:type="dxa"/>
-            <w:vAlign w:val="center"/>
-          </w:tcPr>
-          <w:p>
-            <w:pPr>
-              <w:jc w:val="center"/>
-            </w:pPr>
-            <w:r>
-              <w:rPr>
-                <w:rFonts w:ascii="Segoe UI Emoji" w:hAnsi="Segoe UI Emoji" w:cs="Segoe UI Emoji"/>
-                <w:b/>
-                <w:bCs/>
-              </w:rPr>
-              <w:t>🔥</w:t>
-            </w:r>
-            <w:r>
-              <w:rPr>
-                <w:rFonts w:cstheme="minorHAnsi"/>
-                <w:lang w:val="it-IT"/>
-              </w:rPr>
-              <w:t>⌂⌂</w:t>
-            </w:r>
-            <w:r>
-              <w:rPr>
-                <w:rFonts w:cstheme="minorHAnsi"/>
-                <w:lang w:val="it-IT"/>
-              </w:rPr>
-              <w:t xml:space="preserve"> </w:t>
-            </w:r>
-            <w:r>
-              <w:rPr>
-                <w:rFonts w:cstheme="minorHAnsi"/>
-                <w:b/>
-                <w:bCs/>
-              </w:rPr>
-              <w:t xml:space="preserve">Ω Ω </w:t>
-            </w:r>
-          </w:p>
-          <w:p>
-            <w:pPr>
-              <w:jc w:val="center"/>
-            </w:pPr>
-            <w:r>
-              <w:t>lvl 84 D</w:t>
-            </w:r>
-          </w:p>
-        </w:tc>
-        <w:tc>
-          <w:tcPr>
-            <w:tcW w:w="1606" w:type="dxa"/>
-            <w:vAlign w:val="center"/>
-          </w:tcPr>
-          <w:p>
-            <w:pPr>
-              <w:jc w:val="center"/>
-            </w:pPr>
-            <w:r>
-              <w:rPr>
-                <w:rFonts w:ascii="Segoe UI Emoji" w:hAnsi="Segoe UI Emoji" w:cs="Segoe UI Emoji"/>
-              </w:rPr>
-              <w:t>🍃</w:t>
-            </w:r>
-            <w:r>
-              <w:rPr>
-                <w:rFonts w:cstheme="minorHAnsi"/>
-                <w:lang w:val="it-IT"/>
-              </w:rPr>
-              <w:t xml:space="preserve"> </w:t>
-            </w:r>
-            <w:r>
-              <w:rPr>
-                <w:rFonts w:cstheme="minorHAnsi"/>
-                <w:lang w:val="it-IT"/>
-              </w:rPr>
-              <w:t>⌂⌂</w:t>
-            </w:r>
-            <w:r>
-              <w:rPr>
-                <w:rFonts w:cstheme="minorHAnsi"/>
-                <w:lang w:val="it-IT"/>
-              </w:rPr>
-              <w:t xml:space="preserve"> </w:t>
-            </w:r>
-            <w:r>
-              <w:rPr>
-                <w:rFonts w:cstheme="minorHAnsi"/>
-                <w:b/>
-                <w:bCs/>
-              </w:rPr>
-              <w:t>Ω Ω</w:t>
-            </w:r>
-          </w:p>
-          <w:p>
-            <w:pPr>
-              <w:jc w:val="center"/>
-            </w:pPr>
-            <w:r>
-              <w:t>lvl 195 MD</w:t>
-            </w:r>
-          </w:p>
-        </w:tc>
-        <w:tc>
-          <w:tcPr>
-            <w:tcW w:w="1607" w:type="dxa"/>
-            <w:shd w:val="clear" w:color="auto" w:fill="000000" w:themeFill="text1"/>
-            <w:vAlign w:val="center"/>
-          </w:tcPr>
-          <w:p>
-            <w:pPr>
-              <w:jc w:val="center"/>
-            </w:pPr>
-          </w:p>
-        </w:tc>
-        <w:tc>
-          <w:tcPr>
-            <w:tcW w:w="1606" w:type="dxa"/>
-            <w:shd w:val="clear" w:color="auto" w:fill="000000" w:themeFill="text1"/>
-            <w:vAlign w:val="center"/>
-          </w:tcPr>
-          <w:p>
-            <w:pPr>
-              <w:jc w:val="center"/>
-            </w:pPr>
-          </w:p>
-        </w:tc>
-      </w:tr>
-      <w:tr>
-        <w:tc>
-          <w:tcPr>
-            <w:tcW w:w="1868" w:type="dxa"/>
-            <w:vAlign w:val="center"/>
-          </w:tcPr>
-          <w:p>
-            <w:pPr>
-              <w:jc w:val="center"/>
-            </w:pPr>
-            <w:r>
-              <w:t>Xelor</w:t>
-            </w:r>
-          </w:p>
-          <w:p>
-            <w:pPr>
-              <w:jc w:val="center"/>
-            </w:pPr>
-            <w:r>
-              <w:rPr>
-                <w:rFonts w:ascii="Segoe UI Emoji" w:hAnsi="Segoe UI Emoji" w:cs="Segoe UI Emoji"/>
-                <w:b/>
-                <w:bCs/>
-              </w:rPr>
-              <w:t>🔥</w:t>
-            </w:r>
-            <w:r>
-              <w:rPr>
-                <w:rFonts w:ascii="Segoe UI Emoji" w:hAnsi="Segoe UI Emoji" w:cs="Segoe UI Emoji"/>
-              </w:rPr>
-              <w:t xml:space="preserve"> 💧</w:t>
-            </w:r>
-            <w:r>
-              <w:rPr>
-                <w:rFonts w:ascii="Segoe UI Emoji" w:hAnsi="Segoe UI Emoji" w:cs="Segoe UI Emoji"/>
-              </w:rPr>
-              <w:t>⚡</w:t>
-            </w:r>
-            <w:r>
-              <w:rPr>
-                <w:rFonts w:ascii="Segoe UI Emoji" w:hAnsi="Segoe UI Emoji" w:cs="Segoe UI Emoji"/>
-              </w:rPr>
-              <w:t xml:space="preserve"> 🟤</w:t>
-            </w:r>
-          </w:p>
-        </w:tc>
-        <w:tc>
-          <w:tcPr>
-            <w:tcW w:w="1280" w:type="dxa"/>
-            <w:vAlign w:val="center"/>
-          </w:tcPr>
-          <w:p>
-            <w:pPr>
-              <w:jc w:val="center"/>
-            </w:pPr>
-            <w:r>
-              <w:rPr>
-                <w:rFonts w:ascii="Segoe UI Symbol" w:hAnsi="Segoe UI Symbol" w:cs="Segoe UI Symbol"/>
-              </w:rPr>
-              <w:t>★★★★★</w:t>
-            </w:r>
-          </w:p>
-        </w:tc>
-        <w:tc>
-          <w:tcPr>
-            <w:tcW w:w="1667" w:type="dxa"/>
-            <w:vAlign w:val="center"/>
-          </w:tcPr>
-          <w:p>
-            <w:pPr>
-              <w:jc w:val="center"/>
-            </w:pPr>
-            <w:r>
-              <w:t>Attaquant mid-range</w:t>
-            </w:r>
-          </w:p>
-        </w:tc>
-        <w:tc>
-          <w:tcPr>
-            <w:tcW w:w="2268" w:type="dxa"/>
-            <w:vAlign w:val="center"/>
-          </w:tcPr>
-          <w:p>
-            <w:pPr>
-              <w:jc w:val="center"/>
-            </w:pPr>
-            <w:r>
-              <w:t>Mobilité</w:t>
-            </w:r>
-          </w:p>
-          <w:p>
-            <w:pPr>
-              <w:jc w:val="center"/>
-            </w:pPr>
-            <w:r>
-              <w:t>Retrait PA</w:t>
-            </w:r>
-          </w:p>
-        </w:tc>
-        <w:tc>
-          <w:tcPr>
-            <w:tcW w:w="1606" w:type="dxa"/>
-            <w:vAlign w:val="center"/>
-          </w:tcPr>
-          <w:p>
-            <w:pPr>
-              <w:jc w:val="center"/>
-            </w:pPr>
-            <w:r>
-              <w:rPr>
-                <w:rFonts w:ascii="Segoe UI Emoji" w:hAnsi="Segoe UI Emoji" w:cs="Segoe UI Emoji"/>
-                <w:b/>
-                <w:bCs/>
-              </w:rPr>
-              <w:t>🔥</w:t>
-            </w:r>
-            <w:r>
-              <w:rPr>
-                <w:rFonts w:cstheme="minorHAnsi"/>
-                <w:lang w:val="it-IT"/>
-              </w:rPr>
-              <w:t xml:space="preserve"> </w:t>
-            </w:r>
-            <w:r>
-              <w:rPr>
-                <w:rFonts w:cstheme="minorHAnsi"/>
-                <w:lang w:val="it-IT"/>
-              </w:rPr>
-              <w:t>⌂</w:t>
-            </w:r>
-            <w:r>
-              <w:rPr>
-                <w:rFonts w:cstheme="minorHAnsi"/>
-                <w:lang w:val="it-IT"/>
-              </w:rPr>
-              <w:t xml:space="preserve"> </w:t>
-            </w:r>
-            <w:r>
-              <w:rPr>
-                <w:rFonts w:cstheme="minorHAnsi"/>
-                <w:b/>
-                <w:bCs/>
-              </w:rPr>
-              <w:t xml:space="preserve">Ω Ω </w:t>
-            </w:r>
-          </w:p>
-          <w:p>
-            <w:pPr>
-              <w:jc w:val="center"/>
-            </w:pPr>
-            <w:r>
-              <w:t>lvl 1 D</w:t>
-            </w:r>
-          </w:p>
-        </w:tc>
-        <w:tc>
-          <w:tcPr>
-            <w:tcW w:w="1607" w:type="dxa"/>
-            <w:vAlign w:val="center"/>
-          </w:tcPr>
-          <w:p>
-            <w:pPr>
-              <w:jc w:val="center"/>
-            </w:pPr>
-            <w:r>
-              <w:rPr>
-                <w:rFonts w:ascii="Segoe UI Emoji" w:hAnsi="Segoe UI Emoji" w:cs="Segoe UI Emoji"/>
-              </w:rPr>
-              <w:t>🍃</w:t>
-            </w:r>
-            <w:r>
-              <w:rPr>
-                <w:rFonts w:cstheme="minorHAnsi"/>
-                <w:lang w:val="it-IT"/>
-              </w:rPr>
-              <w:t xml:space="preserve"> </w:t>
-            </w:r>
-            <w:r>
-              <w:rPr>
-                <w:rFonts w:cstheme="minorHAnsi"/>
-                <w:b/>
-                <w:bCs/>
-              </w:rPr>
-              <w:t>Ω Ω</w:t>
-            </w:r>
-          </w:p>
-          <w:p>
-            <w:pPr>
-              <w:jc w:val="center"/>
-            </w:pPr>
-            <w:r>
-              <w:t>lvl 3 MD</w:t>
-            </w:r>
-          </w:p>
-        </w:tc>
-        <w:tc>
-          <w:tcPr>
-            <w:tcW w:w="1606" w:type="dxa"/>
-            <w:vAlign w:val="center"/>
-          </w:tcPr>
-          <w:p>
-            <w:pPr>
-              <w:jc w:val="center"/>
-            </w:pPr>
-            <w:r>
-              <w:rPr>
-                <w:rFonts w:ascii="Segoe UI Emoji" w:hAnsi="Segoe UI Emoji" w:cs="Segoe UI Emoji"/>
-              </w:rPr>
-              <w:t>🟤</w:t>
-            </w:r>
-            <w:r>
-              <w:rPr>
-                <w:rFonts w:cstheme="minorHAnsi"/>
-                <w:lang w:val="it-IT"/>
-              </w:rPr>
-              <w:t xml:space="preserve"> </w:t>
-            </w:r>
-            <w:r>
-              <w:rPr>
-                <w:rFonts w:cstheme="minorHAnsi"/>
-                <w:b/>
-                <w:bCs/>
-              </w:rPr>
-              <w:t>Ω Ω Ω</w:t>
-            </w:r>
-          </w:p>
-          <w:p>
-            <w:pPr>
-              <w:jc w:val="center"/>
-            </w:pPr>
-            <w:r>
-              <w:t>lvl 92 MD</w:t>
-            </w:r>
-          </w:p>
-        </w:tc>
-        <w:tc>
-          <w:tcPr>
-            <w:tcW w:w="1607" w:type="dxa"/>
-            <w:vAlign w:val="center"/>
-          </w:tcPr>
-          <w:p>
-            <w:pPr>
-              <w:jc w:val="center"/>
-            </w:pPr>
-            <w:r>
-              <w:rPr>
-                <w:rFonts w:ascii="Segoe UI Emoji" w:hAnsi="Segoe UI Emoji" w:cs="Segoe UI Emoji"/>
-              </w:rPr>
-              <w:t>💧</w:t>
-            </w:r>
-            <w:r>
-              <w:rPr>
-                <w:rFonts w:cstheme="minorHAnsi"/>
-                <w:lang w:val="it-IT"/>
-              </w:rPr>
-              <w:t xml:space="preserve"> </w:t>
-            </w:r>
-            <w:r>
-              <w:rPr>
-                <w:rFonts w:cstheme="minorHAnsi"/>
-                <w:b/>
-                <w:bCs/>
-              </w:rPr>
-              <w:t>Ω Ω Ω</w:t>
-            </w:r>
-          </w:p>
-          <w:p>
-            <w:pPr>
-              <w:jc w:val="center"/>
-            </w:pPr>
-            <w:r>
-              <w:t>lvl 110 MD</w:t>
-            </w:r>
-          </w:p>
-        </w:tc>
-        <w:tc>
-          <w:tcPr>
-            <w:tcW w:w="1606" w:type="dxa"/>
-            <w:vAlign w:val="center"/>
-          </w:tcPr>
-          <w:p>
-            <w:pPr>
-              <w:jc w:val="center"/>
-            </w:pPr>
-            <w:r>
-              <w:rPr>
-                <w:rFonts w:ascii="Segoe UI Emoji" w:hAnsi="Segoe UI Emoji" w:cs="Segoe UI Emoji"/>
-              </w:rPr>
-              <w:t>⚡</w:t>
-            </w:r>
-          </w:p>
-        </w:tc>
-      </w:tr>
-      <w:tr>
-        <w:tc>
-          <w:tcPr>
-            <w:tcW w:w="1868" w:type="dxa"/>
-            <w:vAlign w:val="center"/>
-          </w:tcPr>
-          <w:p>
-            <w:pPr>
-              <w:jc w:val="center"/>
-            </w:pPr>
-            <w:r>
-              <w:t>Roublard</w:t>
-            </w:r>
-          </w:p>
-          <w:p>
-            <w:pPr>
-              <w:jc w:val="center"/>
-            </w:pPr>
-            <w:r>
-              <w:rPr>
-                <w:rFonts w:ascii="Segoe UI Emoji" w:hAnsi="Segoe UI Emoji" w:cs="Segoe UI Emoji"/>
-                <w:b/>
-                <w:bCs/>
-              </w:rPr>
-              <w:t>🔥</w:t>
-            </w:r>
-            <w:r>
-              <w:rPr>
-                <w:rFonts w:ascii="Segoe UI Emoji" w:hAnsi="Segoe UI Emoji" w:cs="Segoe UI Emoji"/>
-              </w:rPr>
-              <w:t xml:space="preserve"> 🍃</w:t>
-            </w:r>
-            <w:r>
-              <w:rPr>
-                <w:rFonts w:ascii="Segoe UI Emoji" w:hAnsi="Segoe UI Emoji" w:cs="Segoe UI Emoji"/>
-              </w:rPr>
-              <w:t xml:space="preserve"> 🟤</w:t>
-            </w:r>
-          </w:p>
-        </w:tc>
-        <w:tc>
-          <w:tcPr>
-            <w:tcW w:w="1280" w:type="dxa"/>
-            <w:vAlign w:val="center"/>
-          </w:tcPr>
-          <w:p>
-            <w:pPr>
-              <w:jc w:val="center"/>
-            </w:pPr>
-            <w:r>
-              <w:rPr>
-                <w:rFonts w:ascii="Segoe UI Symbol" w:hAnsi="Segoe UI Symbol" w:cs="Segoe UI Symbol"/>
-              </w:rPr>
-              <w:t>★★★★★</w:t>
-            </w:r>
-          </w:p>
-        </w:tc>
-        <w:tc>
-          <w:tcPr>
-            <w:tcW w:w="1667" w:type="dxa"/>
-            <w:vAlign w:val="center"/>
-          </w:tcPr>
-          <w:p>
-            <w:pPr>
-              <w:jc w:val="center"/>
-            </w:pPr>
-            <w:r>
-              <w:t>Attaquant mid-range</w:t>
-            </w:r>
-          </w:p>
-        </w:tc>
-        <w:tc>
-          <w:tcPr>
-            <w:tcW w:w="2268" w:type="dxa"/>
-            <w:vAlign w:val="center"/>
-          </w:tcPr>
-          <w:p>
-            <w:pPr>
-              <w:jc w:val="center"/>
-            </w:pPr>
-            <w:r>
-              <w:t>Bombes</w:t>
-            </w:r>
-          </w:p>
-          <w:p>
-            <w:pPr>
-              <w:jc w:val="center"/>
-            </w:pPr>
-            <w:r>
-              <w:t>Mobilité</w:t>
-            </w:r>
-          </w:p>
-          <w:p>
-            <w:pPr>
-              <w:jc w:val="center"/>
-            </w:pPr>
-            <w:r>
-              <w:t>Placement</w:t>
-            </w:r>
-          </w:p>
-          <w:p>
-            <w:pPr>
-              <w:jc w:val="center"/>
-            </w:pPr>
-            <w:r>
-              <w:t>Boost</w:t>
-            </w:r>
-          </w:p>
-          <w:p>
-            <w:pPr>
-              <w:jc w:val="center"/>
-            </w:pPr>
-            <w:r>
-              <w:t>Erosion</w:t>
-            </w:r>
-          </w:p>
-        </w:tc>
-        <w:tc>
-          <w:tcPr>
-            <w:tcW w:w="1606" w:type="dxa"/>
-            <w:vAlign w:val="center"/>
-          </w:tcPr>
-          <w:p>
-            <w:pPr>
-              <w:jc w:val="center"/>
-            </w:pPr>
-            <w:r>
-              <w:rPr>
-                <w:rFonts w:ascii="Segoe UI Emoji" w:hAnsi="Segoe UI Emoji" w:cs="Segoe UI Emoji"/>
-                <w:b/>
-                <w:bCs/>
-              </w:rPr>
-              <w:t>🔥</w:t>
-            </w:r>
-            <w:r>
-              <w:rPr>
-                <w:rFonts w:cstheme="minorHAnsi"/>
-              </w:rPr>
-              <w:t xml:space="preserve"> </w:t>
-            </w:r>
-            <w:r>
-              <w:rPr>
-                <w:rFonts w:cstheme="minorHAnsi"/>
-                <w:lang w:val="it-IT"/>
-              </w:rPr>
-              <w:t>⌂</w:t>
-            </w:r>
-            <w:r>
-              <w:rPr>
-                <w:rFonts w:cstheme="minorHAnsi"/>
-                <w:lang w:val="it-IT"/>
-              </w:rPr>
-              <w:t xml:space="preserve"> </w:t>
-            </w:r>
-            <w:r>
-              <w:rPr>
-                <w:rFonts w:cstheme="minorHAnsi"/>
-                <w:b/>
-                <w:bCs/>
-              </w:rPr>
-              <w:t>Ω Ω Ω</w:t>
-            </w:r>
-            <w:r>
-              <w:rPr>
-                <w:rFonts w:cstheme="minorHAnsi"/>
-                <w:b/>
-                <w:bCs/>
-              </w:rPr>
-              <w:t>+</w:t>
-            </w:r>
-          </w:p>
-          <w:p>
-            <w:pPr>
-              <w:jc w:val="center"/>
-            </w:pPr>
-            <w:r>
-              <w:t>lvl 1 MD</w:t>
-            </w:r>
-          </w:p>
-        </w:tc>
-        <w:tc>
-          <w:tcPr>
-            <w:tcW w:w="1607" w:type="dxa"/>
-            <w:vAlign w:val="center"/>
-          </w:tcPr>
-          <w:p>
-            <w:pPr>
-              <w:jc w:val="center"/>
-            </w:pPr>
-            <w:r>
-              <w:rPr>
-                <w:rFonts w:ascii="Segoe UI Emoji" w:hAnsi="Segoe UI Emoji" w:cs="Segoe UI Emoji"/>
-              </w:rPr>
-              <w:t>🍃</w:t>
-            </w:r>
-            <w:r>
-              <w:rPr>
-                <w:rFonts w:cstheme="minorHAnsi"/>
-                <w:lang w:val="it-IT"/>
-              </w:rPr>
-              <w:t xml:space="preserve"> </w:t>
-            </w:r>
-            <w:r>
-              <w:rPr>
-                <w:rFonts w:cstheme="minorHAnsi"/>
-                <w:lang w:val="it-IT"/>
-              </w:rPr>
-              <w:t>⌂</w:t>
-            </w:r>
-            <w:r>
-              <w:rPr>
-                <w:rFonts w:cstheme="minorHAnsi"/>
-                <w:lang w:val="it-IT"/>
-              </w:rPr>
-              <w:t xml:space="preserve"> </w:t>
-            </w:r>
-            <w:r>
-              <w:rPr>
-                <w:rFonts w:cstheme="minorHAnsi"/>
-                <w:b/>
-                <w:bCs/>
-              </w:rPr>
-              <w:t>Ω Ω Ω</w:t>
-            </w:r>
-            <w:r>
-              <w:rPr>
-                <w:rFonts w:cstheme="minorHAnsi"/>
-                <w:b/>
-                <w:bCs/>
-              </w:rPr>
-              <w:t>+</w:t>
-            </w:r>
-          </w:p>
-          <w:p>
-            <w:pPr>
-              <w:jc w:val="center"/>
-            </w:pPr>
-            <w:r>
-              <w:t>lvl 9 MD</w:t>
-            </w:r>
-          </w:p>
-        </w:tc>
-        <w:tc>
-          <w:tcPr>
-            <w:tcW w:w="1606" w:type="dxa"/>
-            <w:vAlign w:val="center"/>
-          </w:tcPr>
-          <w:p>
-            <w:pPr>
-              <w:jc w:val="center"/>
-            </w:pPr>
-            <w:r>
-              <w:rPr>
-                <w:rFonts w:ascii="Segoe UI Emoji" w:hAnsi="Segoe UI Emoji" w:cs="Segoe UI Emoji"/>
-              </w:rPr>
-              <w:t>🟤</w:t>
-            </w:r>
-            <w:r>
-              <w:rPr>
-                <w:rFonts w:cstheme="minorHAnsi"/>
-                <w:lang w:val="it-IT"/>
-              </w:rPr>
-              <w:t xml:space="preserve"> </w:t>
-            </w:r>
-            <w:r>
-              <w:rPr>
-                <w:rFonts w:cstheme="minorHAnsi"/>
-                <w:lang w:val="it-IT"/>
-              </w:rPr>
-              <w:t>⌂</w:t>
-            </w:r>
-            <w:r>
-              <w:rPr>
-                <w:rFonts w:cstheme="minorHAnsi"/>
-                <w:lang w:val="it-IT"/>
-              </w:rPr>
-              <w:t xml:space="preserve"> </w:t>
+              <w:t xml:space="preserve">⌂ </w:t>
             </w:r>
             <w:r>
               <w:rPr>
@@ -17267,7 +17183,7 @@
               <w:jc w:val="center"/>
             </w:pPr>
             <w:r>
-              <w:t>0,9</w:t>
+              <w:t>1,2</w:t>
             </w:r>
             <w:r>
               <w:t>%</w:t>
@@ -17337,7 +17253,7 @@
               <w:jc w:val="center"/>
             </w:pPr>
             <w:r>
-              <w:t>0,9</w:t>
+              <w:t>1,2</w:t>
             </w:r>
             <w:r>
               <w:t>%</w:t>
@@ -17415,7 +17331,7 @@
               <w:jc w:val="center"/>
             </w:pPr>
             <w:r>
-              <w:t>0,9</w:t>
+              <w:t>1,2</w:t>
             </w:r>
             <w:r>
               <w:t>%</w:t>
@@ -17485,7 +17401,7 @@
               <w:jc w:val="center"/>
             </w:pPr>
             <w:r>
-              <w:t>0,9</w:t>
+              <w:t>1,2</w:t>
             </w:r>
             <w:r>
               <w:t>%</w:t>
@@ -17622,7 +17538,7 @@
               <w:jc w:val="center"/>
             </w:pPr>
             <w:r>
-              <w:t>0,9</w:t>
+              <w:t>1,2</w:t>
             </w:r>
             <w:r>
               <w:t>%</w:t>
@@ -17705,7 +17621,7 @@
               <w:jc w:val="center"/>
             </w:pPr>
             <w:r>
-              <w:t>0,9</w:t>
+              <w:t>1,2</w:t>
             </w:r>
             <w:r>
               <w:t>%</w:t>
@@ -17796,15 +17712,21 @@
               <w:jc w:val="center"/>
             </w:pPr>
             <w:r>
-              <w:t>0,3%</w:t>
-            </w:r>
-          </w:p>
-          <w:p>
-            <w:pPr>
-              <w:jc w:val="center"/>
-            </w:pPr>
-            <w:r>
-              <w:t>0,9</w:t>
+              <w:t>0,</w:t>
+            </w:r>
+            <w:r>
+              <w:t>6</w:t>
+            </w:r>
+            <w:r>
+              <w:t>%</w:t>
+            </w:r>
+          </w:p>
+          <w:p>
+            <w:pPr>
+              <w:jc w:val="center"/>
+            </w:pPr>
+            <w:r>
+              <w:t>1,2</w:t>
             </w:r>
             <w:r>
               <w:t>%</w:t>
@@ -17895,15 +17817,21 @@
               <w:jc w:val="center"/>
             </w:pPr>
             <w:r>
-              <w:t>0,3%</w:t>
-            </w:r>
-          </w:p>
-          <w:p>
-            <w:pPr>
-              <w:jc w:val="center"/>
-            </w:pPr>
-            <w:r>
-              <w:t>0,9</w:t>
+              <w:t>0,</w:t>
+            </w:r>
+            <w:r>
+              <w:t>6</w:t>
+            </w:r>
+            <w:r>
+              <w:t>%</w:t>
+            </w:r>
+          </w:p>
+          <w:p>
+            <w:pPr>
+              <w:jc w:val="center"/>
+            </w:pPr>
+            <w:r>
+              <w:t>1,2</w:t>
             </w:r>
             <w:r>
               <w:t>%</w:t>
@@ -17989,7 +17917,7 @@
               <w:jc w:val="center"/>
             </w:pPr>
             <w:r>
-              <w:t>0,9</w:t>
+              <w:t>1,2</w:t>
             </w:r>
             <w:r>
               <w:t>%</w:t>
@@ -18088,7 +18016,7 @@
               <w:jc w:val="center"/>
             </w:pPr>
             <w:r>
-              <w:t>0,9</w:t>
+              <w:t>1,2</w:t>
             </w:r>
             <w:r>
               <w:t>%</w:t>
@@ -18166,7 +18094,7 @@
               <w:jc w:val="center"/>
             </w:pPr>
             <w:r>
-              <w:t>0,9</w:t>
+              <w:t>1,2</w:t>
             </w:r>
             <w:r>
               <w:t>%</w:t>
@@ -18239,7 +18167,7 @@
               <w:jc w:val="center"/>
             </w:pPr>
             <w:r>
-              <w:t>0,9</w:t>
+              <w:t>1,2</w:t>
             </w:r>
             <w:r>
               <w:t>%</w:t>
@@ -18309,7 +18237,7 @@
               <w:jc w:val="center"/>
             </w:pPr>
             <w:r>
-              <w:t>0,9</w:t>
+              <w:t>1,2</w:t>
             </w:r>
             <w:r>
               <w:t>%</w:t>
@@ -18379,7 +18307,7 @@
               <w:jc w:val="center"/>
             </w:pPr>
             <w:r>
-              <w:t>0,9</w:t>
+              <w:t>1,2</w:t>
             </w:r>
             <w:r>
               <w:t>%</w:t>
@@ -18457,7 +18385,7 @@
               <w:jc w:val="center"/>
             </w:pPr>
             <w:r>
-              <w:t>0,9</w:t>
+              <w:t>1,2</w:t>
             </w:r>
             <w:r>
               <w:t>%</w:t>
@@ -18584,7 +18512,7 @@
               <w:jc w:val="center"/>
             </w:pPr>
             <w:r>
-              <w:t>0,9</w:t>
+              <w:t>1,2</w:t>
             </w:r>
             <w:r>
               <w:t>%</w:t>
@@ -18665,7 +18593,7 @@
               <w:jc w:val="center"/>
             </w:pPr>
             <w:r>
-              <w:t>0,9</w:t>
+              <w:t>1,2</w:t>
             </w:r>
             <w:r>
               <w:t>%</w:t>
@@ -18735,7 +18663,7 @@
               <w:jc w:val="center"/>
             </w:pPr>
             <w:r>
-              <w:t>0,9</w:t>
+              <w:t>1,2</w:t>
             </w:r>
             <w:r>
               <w:t>%</w:t>
@@ -18837,7 +18765,7 @@
               <w:jc w:val="center"/>
             </w:pPr>
             <w:r>
-              <w:t>0,9</w:t>
+              <w:t>1,2</w:t>
             </w:r>
             <w:r>
               <w:t>%</w:t>
@@ -18931,7 +18859,7 @@
               <w:jc w:val="center"/>
             </w:pPr>
             <w:r>
-              <w:t>0,9</w:t>
+              <w:t>1,2</w:t>
             </w:r>
             <w:r>
               <w:t>%</w:t>

</xml_diff>